<commit_message>
Added data analysis notebook for crudes
</commit_message>
<xml_diff>
--- a/Report/AAI590 Capstone Project Report.docx
+++ b/Report/AAI590 Capstone Project Report.docx
@@ -759,7 +759,1139 @@
         <w:rPr>
           <w:rFonts w:eastAsia="Times New Roman" w:cs="Times New Roman"/>
         </w:rPr>
-        <w:t>This section of your final report should give background information about your project application/research question and the machine learning method(s) that you have chosen to use. This section should be completely focused on existing work, rather than on your own methods and choices. For example, instead of writing “</w:t>
+        <w:t xml:space="preserve">The traditional </w:t>
+      </w:r>
+      <w:r>
+        <w:rPr>
+          <w:rFonts w:eastAsia="Times New Roman" w:cs="Times New Roman"/>
+        </w:rPr>
+        <w:t>‘</w:t>
+      </w:r>
+      <w:r>
+        <w:rPr>
+          <w:rFonts w:eastAsia="Times New Roman" w:cs="Times New Roman"/>
+        </w:rPr>
+        <w:t>Hierarchy of Control</w:t>
+      </w:r>
+      <w:r>
+        <w:rPr>
+          <w:rFonts w:eastAsia="Times New Roman" w:cs="Times New Roman"/>
+        </w:rPr>
+        <w:t>’</w:t>
+      </w:r>
+      <w:r>
+        <w:rPr>
+          <w:rFonts w:eastAsia="Times New Roman" w:cs="Times New Roman"/>
+        </w:rPr>
+        <w:t xml:space="preserve"> in refinery operations segregates the strategic layer (Real-Time Optimization) from the tactical layer (Model Predictive Control). </w:t>
+      </w:r>
+      <w:r>
+        <w:rPr>
+          <w:rFonts w:eastAsia="Times New Roman" w:cs="Times New Roman"/>
+        </w:rPr>
+        <w:t>T</w:t>
+      </w:r>
+      <w:r>
+        <w:rPr>
+          <w:rFonts w:eastAsia="Times New Roman" w:cs="Times New Roman"/>
+        </w:rPr>
+        <w:t>his separation often leads to suboptimal performance because the RTO layer typically assumes steady-state conditions</w:t>
+      </w:r>
+      <w:r>
+        <w:rPr>
+          <w:rFonts w:eastAsia="Times New Roman" w:cs="Times New Roman"/>
+        </w:rPr>
+        <w:t xml:space="preserve"> (</w:t>
+      </w:r>
+      <w:r>
+        <w:rPr>
+          <w:rFonts w:eastAsia="Times New Roman" w:cs="Times New Roman"/>
+        </w:rPr>
+        <w:t>, while the MPC layer struggles with the economic objectives dictated from above.</w:t>
+      </w:r>
+      <w:r>
+        <w:rPr>
+          <w:rFonts w:eastAsia="Times New Roman" w:cs="Times New Roman"/>
+        </w:rPr>
+        <w:t xml:space="preserve"> </w:t>
+      </w:r>
+      <w:r>
+        <w:rPr>
+          <w:rFonts w:eastAsia="Times New Roman" w:cs="Times New Roman"/>
+        </w:rPr>
+        <w:t>Recent advancements in Dynamic Real-Time Optimization (DRTO) attempt to bridge this gap. However, the computational cost of solving a rigorous, first-principles model in real-time is often prohibitive. This is where the integration of DWSIM with a DRL agent, such as Proximal Policy Optimization (PPO), offers a superior alternative. By treating the DWSIM model as a high-fidelity simulator, the agent learns a control policy</w:t>
+      </w:r>
+      <w:r>
+        <w:rPr>
+          <w:rFonts w:eastAsia="Times New Roman" w:cs="Times New Roman"/>
+        </w:rPr>
+        <w:t xml:space="preserve"> </w:t>
+      </w:r>
+      <w:r>
+        <w:rPr>
+          <w:rFonts w:eastAsia="Times New Roman" w:cs="Times New Roman"/>
+        </w:rPr>
+        <w:t xml:space="preserve"> </w:t>
+      </w:r>
+      <m:oMath>
+        <m:sSub>
+          <m:sSubPr>
+            <m:ctrlPr>
+              <w:rPr>
+                <w:rFonts w:ascii="Cambria Math" w:eastAsia="Times New Roman" w:hAnsi="Cambria Math" w:cs="Times New Roman"/>
+                <w:i/>
+              </w:rPr>
+            </m:ctrlPr>
+          </m:sSubPr>
+          <m:e>
+            <m:r>
+              <w:rPr>
+                <w:rFonts w:ascii="Cambria Math" w:eastAsia="Times New Roman" w:hAnsi="Cambria Math" w:cs="Times New Roman"/>
+              </w:rPr>
+              <m:t>π</m:t>
+            </m:r>
+          </m:e>
+          <m:sub>
+            <m:r>
+              <w:rPr>
+                <w:rFonts w:ascii="Cambria Math" w:eastAsia="Times New Roman" w:hAnsi="Cambria Math" w:cs="Times New Roman"/>
+              </w:rPr>
+              <m:t>θ</m:t>
+            </m:r>
+          </m:sub>
+        </m:sSub>
+        <m:r>
+          <w:rPr>
+            <w:rFonts w:ascii="Cambria Math" w:eastAsia="Times New Roman" w:hAnsi="Cambria Math" w:cs="Times New Roman"/>
+          </w:rPr>
+          <m:t>(a|s)</m:t>
+        </m:r>
+      </m:oMath>
+      <w:r>
+        <w:rPr>
+          <w:rFonts w:eastAsia="Times New Roman" w:cs="Times New Roman"/>
+        </w:rPr>
+        <w:t xml:space="preserve"> </w:t>
+      </w:r>
+      <w:r>
+        <w:rPr>
+          <w:rFonts w:eastAsia="Times New Roman" w:cs="Times New Roman"/>
+        </w:rPr>
+        <w:t>that directly maps plant observations to optimal setpoints. Unlike the SQP methods described by Biegler (2010), which require a derivative-based search through the variable space at every time step, the DRL agent performs an instantaneous inference, significantly reducing the latency between a market price change and a process adjustment.</w:t>
+      </w:r>
+      <w:r>
+        <w:rPr>
+          <w:rFonts w:eastAsia="Times New Roman" w:cs="Times New Roman"/>
+        </w:rPr>
+        <w:t xml:space="preserve"> </w:t>
+      </w:r>
+    </w:p>
+    <w:p>
+      <w:pPr>
+        <w:spacing w:before="20"/>
+        <w:rPr>
+          <w:rFonts w:eastAsia="Times New Roman" w:cs="Times New Roman"/>
+        </w:rPr>
+      </w:pPr>
+      <w:r>
+        <w:rPr>
+          <w:rFonts w:eastAsia="Times New Roman" w:cs="Times New Roman"/>
+        </w:rPr>
+        <w:t>In the context of an ADU, the state space</w:t>
+      </w:r>
+      <w:r>
+        <w:rPr>
+          <w:rFonts w:eastAsia="Times New Roman" w:cs="Times New Roman"/>
+        </w:rPr>
+        <w:t xml:space="preserve"> </w:t>
+      </w:r>
+      <m:oMath>
+        <m:r>
+          <w:rPr>
+            <w:rFonts w:ascii="Cambria Math" w:eastAsia="Times New Roman" w:hAnsi="Cambria Math" w:cs="Times New Roman"/>
+          </w:rPr>
+          <m:t>S</m:t>
+        </m:r>
+      </m:oMath>
+      <w:r>
+        <w:rPr>
+          <w:rFonts w:eastAsia="Times New Roman" w:cs="Times New Roman"/>
+        </w:rPr>
+        <w:t xml:space="preserve"> is characterized by a high-dimensional vector </w:t>
+      </w:r>
+      <w:r>
+        <w:rPr>
+          <w:rFonts w:eastAsia="Times New Roman" w:cs="Times New Roman"/>
+        </w:rPr>
+        <w:t xml:space="preserve">containing stage temperatures </w:t>
+      </w:r>
+      <w:r>
+        <w:rPr>
+          <w:rFonts w:eastAsia="Times New Roman" w:cs="Times New Roman"/>
+        </w:rPr>
+        <w:t xml:space="preserve"> </w:t>
+      </w:r>
+      <m:oMath>
+        <m:sSub>
+          <m:sSubPr>
+            <m:ctrlPr>
+              <w:rPr>
+                <w:rFonts w:ascii="Cambria Math" w:eastAsia="Times New Roman" w:hAnsi="Cambria Math" w:cs="Times New Roman"/>
+                <w:i/>
+              </w:rPr>
+            </m:ctrlPr>
+          </m:sSubPr>
+          <m:e>
+            <m:r>
+              <w:rPr>
+                <w:rFonts w:ascii="Cambria Math" w:eastAsia="Times New Roman" w:hAnsi="Cambria Math" w:cs="Times New Roman"/>
+              </w:rPr>
+              <m:t>T</m:t>
+            </m:r>
+          </m:e>
+          <m:sub>
+            <m:r>
+              <w:rPr>
+                <w:rFonts w:ascii="Cambria Math" w:eastAsia="Times New Roman" w:hAnsi="Cambria Math" w:cs="Times New Roman"/>
+              </w:rPr>
+              <m:t>i</m:t>
+            </m:r>
+          </m:sub>
+        </m:sSub>
+      </m:oMath>
+      <w:r>
+        <w:rPr>
+          <w:rFonts w:eastAsia="Times New Roman" w:cs="Times New Roman"/>
+        </w:rPr>
+        <w:t>, pressures</w:t>
+      </w:r>
+      <w:r>
+        <w:rPr>
+          <w:rFonts w:eastAsia="Times New Roman" w:cs="Times New Roman"/>
+        </w:rPr>
+        <w:t xml:space="preserve"> </w:t>
+      </w:r>
+      <w:r>
+        <w:rPr>
+          <w:rFonts w:eastAsia="Times New Roman" w:cs="Times New Roman"/>
+        </w:rPr>
+        <w:t xml:space="preserve"> </w:t>
+      </w:r>
+      <m:oMath>
+        <m:sSub>
+          <m:sSubPr>
+            <m:ctrlPr>
+              <w:rPr>
+                <w:rFonts w:ascii="Cambria Math" w:eastAsia="Times New Roman" w:hAnsi="Cambria Math" w:cs="Times New Roman"/>
+                <w:i/>
+              </w:rPr>
+            </m:ctrlPr>
+          </m:sSubPr>
+          <m:e>
+            <m:r>
+              <w:rPr>
+                <w:rFonts w:ascii="Cambria Math" w:eastAsia="Times New Roman" w:hAnsi="Cambria Math" w:cs="Times New Roman"/>
+              </w:rPr>
+              <m:t>P</m:t>
+            </m:r>
+          </m:e>
+          <m:sub>
+            <m:r>
+              <w:rPr>
+                <w:rFonts w:ascii="Cambria Math" w:eastAsia="Times New Roman" w:hAnsi="Cambria Math" w:cs="Times New Roman"/>
+              </w:rPr>
+              <m:t>i</m:t>
+            </m:r>
+          </m:sub>
+        </m:sSub>
+      </m:oMath>
+      <w:r>
+        <w:rPr>
+          <w:rFonts w:eastAsia="Times New Roman" w:cs="Times New Roman"/>
+        </w:rPr>
+        <w:t>, and the mass fractions of pseudocomponents across the distillation curve. A critical contribution by Wang et al. (2024) in the Journal of Process Systems Engineering highlights the importance of "Feature Engineering" in RL for refineries. They argue that normalizing states relative to the Feed Assay (the specific TBP curve of the incoming crude) allows the agent to generalize its learning across different crude blends—a concept known as Transfer Learning.</w:t>
+      </w:r>
+    </w:p>
+    <w:p>
+      <w:pPr>
+        <w:spacing w:before="20"/>
+        <w:rPr>
+          <w:rFonts w:eastAsia="Times New Roman" w:cs="Times New Roman"/>
+        </w:rPr>
+      </w:pPr>
+      <w:r>
+        <w:rPr>
+          <w:rFonts w:eastAsia="Times New Roman" w:cs="Times New Roman"/>
+        </w:rPr>
+        <w:t>The reward function</w:t>
+      </w:r>
+      <w:r>
+        <w:rPr>
+          <w:rFonts w:eastAsia="Times New Roman" w:cs="Times New Roman"/>
+        </w:rPr>
+        <w:t xml:space="preserve"> </w:t>
+      </w:r>
+      <w:r>
+        <w:rPr>
+          <w:rFonts w:eastAsia="Times New Roman" w:cs="Times New Roman"/>
+        </w:rPr>
+        <w:t xml:space="preserve"> </w:t>
+      </w:r>
+      <m:oMath>
+        <m:sSub>
+          <m:sSubPr>
+            <m:ctrlPr>
+              <w:rPr>
+                <w:rFonts w:ascii="Cambria Math" w:eastAsia="Times New Roman" w:hAnsi="Cambria Math" w:cs="Times New Roman"/>
+                <w:i/>
+              </w:rPr>
+            </m:ctrlPr>
+          </m:sSubPr>
+          <m:e>
+            <m:r>
+              <w:rPr>
+                <w:rFonts w:ascii="Cambria Math" w:eastAsia="Times New Roman" w:hAnsi="Cambria Math" w:cs="Times New Roman"/>
+              </w:rPr>
+              <m:t>R</m:t>
+            </m:r>
+          </m:e>
+          <m:sub>
+            <m:r>
+              <w:rPr>
+                <w:rFonts w:ascii="Cambria Math" w:eastAsia="Times New Roman" w:hAnsi="Cambria Math" w:cs="Times New Roman"/>
+              </w:rPr>
+              <m:t>t</m:t>
+            </m:r>
+          </m:sub>
+        </m:sSub>
+      </m:oMath>
+      <w:r>
+        <w:rPr>
+          <w:rFonts w:eastAsia="Times New Roman" w:cs="Times New Roman"/>
+        </w:rPr>
+        <w:t xml:space="preserve"> </w:t>
+      </w:r>
+      <w:r>
+        <w:rPr>
+          <w:rFonts w:eastAsia="Times New Roman" w:cs="Times New Roman"/>
+        </w:rPr>
+        <w:t>is the most critical design element for academic validity. It must be formulated as a multi-objective scalar:</w:t>
+      </w:r>
+    </w:p>
+    <w:p>
+      <w:pPr>
+        <w:spacing w:before="20"/>
+        <w:rPr>
+          <w:rFonts w:eastAsia="Times New Roman" w:cs="Times New Roman"/>
+        </w:rPr>
+      </w:pPr>
+    </w:p>
+    <w:p>
+      <w:pPr>
+        <w:spacing w:before="20"/>
+        <w:ind w:right="-587"/>
+        <w:rPr>
+          <w:rFonts w:eastAsia="Times New Roman" w:cs="Times New Roman"/>
+          <w:sz w:val="14"/>
+          <w:szCs w:val="14"/>
+        </w:rPr>
+      </w:pPr>
+      <m:oMathPara>
+        <m:oMath>
+          <m:sSub>
+            <m:sSubPr>
+              <m:ctrlPr>
+                <w:rPr>
+                  <w:rFonts w:ascii="Cambria Math" w:eastAsia="Times New Roman" w:hAnsi="Cambria Math" w:cs="Times New Roman"/>
+                  <w:i/>
+                  <w:sz w:val="14"/>
+                  <w:szCs w:val="14"/>
+                </w:rPr>
+              </m:ctrlPr>
+            </m:sSubPr>
+            <m:e>
+              <m:r>
+                <w:rPr>
+                  <w:rFonts w:ascii="Cambria Math" w:eastAsia="Times New Roman" w:hAnsi="Cambria Math" w:cs="Times New Roman"/>
+                  <w:sz w:val="14"/>
+                  <w:szCs w:val="14"/>
+                </w:rPr>
+                <m:t>R</m:t>
+              </m:r>
+            </m:e>
+            <m:sub>
+              <m:r>
+                <w:rPr>
+                  <w:rFonts w:ascii="Cambria Math" w:eastAsia="Times New Roman" w:hAnsi="Cambria Math" w:cs="Times New Roman"/>
+                  <w:sz w:val="14"/>
+                  <w:szCs w:val="14"/>
+                </w:rPr>
+                <m:t>t</m:t>
+              </m:r>
+            </m:sub>
+          </m:sSub>
+          <m:r>
+            <w:rPr>
+              <w:rFonts w:ascii="Cambria Math" w:eastAsia="Times New Roman" w:hAnsi="Cambria Math" w:cs="Times New Roman"/>
+              <w:sz w:val="14"/>
+              <w:szCs w:val="14"/>
+            </w:rPr>
+            <m:t xml:space="preserve">= </m:t>
+          </m:r>
+          <m:nary>
+            <m:naryPr>
+              <m:chr m:val="∑"/>
+              <m:limLoc m:val="undOvr"/>
+              <m:supHide m:val="1"/>
+              <m:ctrlPr>
+                <w:rPr>
+                  <w:rFonts w:ascii="Cambria Math" w:eastAsia="Times New Roman" w:hAnsi="Cambria Math" w:cs="Times New Roman"/>
+                  <w:i/>
+                  <w:sz w:val="14"/>
+                  <w:szCs w:val="14"/>
+                </w:rPr>
+              </m:ctrlPr>
+            </m:naryPr>
+            <m:sub>
+              <m:r>
+                <w:rPr>
+                  <w:rFonts w:ascii="Cambria Math" w:eastAsia="Times New Roman" w:hAnsi="Cambria Math" w:cs="Times New Roman"/>
+                  <w:sz w:val="14"/>
+                  <w:szCs w:val="14"/>
+                </w:rPr>
+                <m:t>p ∈Products</m:t>
+              </m:r>
+            </m:sub>
+            <m:sup/>
+            <m:e>
+              <m:d>
+                <m:dPr>
+                  <m:ctrlPr>
+                    <w:rPr>
+                      <w:rFonts w:ascii="Cambria Math" w:eastAsia="Times New Roman" w:hAnsi="Cambria Math" w:cs="Times New Roman"/>
+                      <w:i/>
+                      <w:sz w:val="14"/>
+                      <w:szCs w:val="14"/>
+                    </w:rPr>
+                  </m:ctrlPr>
+                </m:dPr>
+                <m:e>
+                  <m:sSub>
+                    <m:sSubPr>
+                      <m:ctrlPr>
+                        <w:rPr>
+                          <w:rFonts w:ascii="Cambria Math" w:eastAsia="Times New Roman" w:hAnsi="Cambria Math" w:cs="Times New Roman"/>
+                          <w:i/>
+                          <w:sz w:val="14"/>
+                          <w:szCs w:val="14"/>
+                        </w:rPr>
+                      </m:ctrlPr>
+                    </m:sSubPr>
+                    <m:e>
+                      <m:r>
+                        <w:rPr>
+                          <w:rFonts w:ascii="Cambria Math" w:eastAsia="Times New Roman" w:hAnsi="Cambria Math" w:cs="Times New Roman"/>
+                          <w:sz w:val="14"/>
+                          <w:szCs w:val="14"/>
+                        </w:rPr>
+                        <m:t>m</m:t>
+                      </m:r>
+                    </m:e>
+                    <m:sub>
+                      <m:r>
+                        <w:rPr>
+                          <w:rFonts w:ascii="Cambria Math" w:eastAsia="Times New Roman" w:hAnsi="Cambria Math" w:cs="Times New Roman"/>
+                          <w:sz w:val="14"/>
+                          <w:szCs w:val="14"/>
+                        </w:rPr>
+                        <m:t>p</m:t>
+                      </m:r>
+                    </m:sub>
+                  </m:sSub>
+                  <m:r>
+                    <w:rPr>
+                      <w:rFonts w:ascii="Cambria Math" w:eastAsia="Times New Roman" w:hAnsi="Cambria Math" w:cs="Times New Roman"/>
+                      <w:sz w:val="14"/>
+                      <w:szCs w:val="14"/>
+                    </w:rPr>
+                    <m:t>.</m:t>
+                  </m:r>
+                  <m:sSub>
+                    <m:sSubPr>
+                      <m:ctrlPr>
+                        <w:rPr>
+                          <w:rFonts w:ascii="Cambria Math" w:eastAsia="Times New Roman" w:hAnsi="Cambria Math" w:cs="Times New Roman"/>
+                          <w:i/>
+                          <w:sz w:val="14"/>
+                          <w:szCs w:val="14"/>
+                        </w:rPr>
+                      </m:ctrlPr>
+                    </m:sSubPr>
+                    <m:e>
+                      <m:r>
+                        <w:rPr>
+                          <w:rFonts w:ascii="Cambria Math" w:eastAsia="Times New Roman" w:hAnsi="Cambria Math" w:cs="Times New Roman"/>
+                          <w:sz w:val="14"/>
+                          <w:szCs w:val="14"/>
+                        </w:rPr>
+                        <m:t>V</m:t>
+                      </m:r>
+                    </m:e>
+                    <m:sub>
+                      <m:r>
+                        <w:rPr>
+                          <w:rFonts w:ascii="Cambria Math" w:eastAsia="Times New Roman" w:hAnsi="Cambria Math" w:cs="Times New Roman"/>
+                          <w:sz w:val="14"/>
+                          <w:szCs w:val="14"/>
+                        </w:rPr>
+                        <m:t>p</m:t>
+                      </m:r>
+                    </m:sub>
+                  </m:sSub>
+                </m:e>
+              </m:d>
+              <m:r>
+                <w:rPr>
+                  <w:rFonts w:ascii="Cambria Math" w:eastAsia="Times New Roman" w:hAnsi="Cambria Math" w:cs="Times New Roman"/>
+                  <w:sz w:val="14"/>
+                  <w:szCs w:val="14"/>
+                </w:rPr>
+                <m:t xml:space="preserve"> </m:t>
+              </m:r>
+            </m:e>
+          </m:nary>
+          <m:r>
+            <w:rPr>
+              <w:rFonts w:ascii="Cambria Math" w:eastAsia="Times New Roman" w:hAnsi="Cambria Math" w:cs="Times New Roman"/>
+              <w:sz w:val="14"/>
+              <w:szCs w:val="14"/>
+            </w:rPr>
+            <m:t xml:space="preserve">- </m:t>
+          </m:r>
+          <m:nary>
+            <m:naryPr>
+              <m:chr m:val="∑"/>
+              <m:limLoc m:val="undOvr"/>
+              <m:supHide m:val="1"/>
+              <m:ctrlPr>
+                <w:rPr>
+                  <w:rFonts w:ascii="Cambria Math" w:eastAsia="Times New Roman" w:hAnsi="Cambria Math" w:cs="Times New Roman"/>
+                  <w:i/>
+                  <w:sz w:val="14"/>
+                  <w:szCs w:val="14"/>
+                </w:rPr>
+              </m:ctrlPr>
+            </m:naryPr>
+            <m:sub>
+              <m:r>
+                <w:rPr>
+                  <w:rFonts w:ascii="Cambria Math" w:eastAsia="Times New Roman" w:hAnsi="Cambria Math" w:cs="Times New Roman"/>
+                  <w:sz w:val="14"/>
+                  <w:szCs w:val="14"/>
+                </w:rPr>
+                <m:t>u</m:t>
+              </m:r>
+              <m:r>
+                <w:rPr>
+                  <w:rFonts w:ascii="Cambria Math" w:eastAsia="Times New Roman" w:hAnsi="Cambria Math" w:cs="Times New Roman"/>
+                  <w:sz w:val="14"/>
+                  <w:szCs w:val="14"/>
+                </w:rPr>
+                <m:t xml:space="preserve"> ∈</m:t>
+              </m:r>
+              <m:r>
+                <w:rPr>
+                  <w:rFonts w:ascii="Cambria Math" w:eastAsia="Times New Roman" w:hAnsi="Cambria Math" w:cs="Times New Roman"/>
+                  <w:sz w:val="14"/>
+                  <w:szCs w:val="14"/>
+                </w:rPr>
+                <m:t>Utilities</m:t>
+              </m:r>
+            </m:sub>
+            <m:sup/>
+            <m:e>
+              <m:d>
+                <m:dPr>
+                  <m:ctrlPr>
+                    <w:rPr>
+                      <w:rFonts w:ascii="Cambria Math" w:eastAsia="Times New Roman" w:hAnsi="Cambria Math" w:cs="Times New Roman"/>
+                      <w:i/>
+                      <w:sz w:val="14"/>
+                      <w:szCs w:val="14"/>
+                    </w:rPr>
+                  </m:ctrlPr>
+                </m:dPr>
+                <m:e>
+                  <m:sSub>
+                    <m:sSubPr>
+                      <m:ctrlPr>
+                        <w:rPr>
+                          <w:rFonts w:ascii="Cambria Math" w:eastAsia="Times New Roman" w:hAnsi="Cambria Math" w:cs="Times New Roman"/>
+                          <w:i/>
+                          <w:sz w:val="14"/>
+                          <w:szCs w:val="14"/>
+                        </w:rPr>
+                      </m:ctrlPr>
+                    </m:sSubPr>
+                    <m:e>
+                      <m:r>
+                        <w:rPr>
+                          <w:rFonts w:ascii="Cambria Math" w:eastAsia="Times New Roman" w:hAnsi="Cambria Math" w:cs="Times New Roman"/>
+                          <w:sz w:val="14"/>
+                          <w:szCs w:val="14"/>
+                        </w:rPr>
+                        <m:t>m</m:t>
+                      </m:r>
+                    </m:e>
+                    <m:sub>
+                      <m:r>
+                        <w:rPr>
+                          <w:rFonts w:ascii="Cambria Math" w:eastAsia="Times New Roman" w:hAnsi="Cambria Math" w:cs="Times New Roman"/>
+                          <w:sz w:val="14"/>
+                          <w:szCs w:val="14"/>
+                        </w:rPr>
+                        <m:t>u</m:t>
+                      </m:r>
+                    </m:sub>
+                  </m:sSub>
+                  <m:r>
+                    <w:rPr>
+                      <w:rFonts w:ascii="Cambria Math" w:eastAsia="Times New Roman" w:hAnsi="Cambria Math" w:cs="Times New Roman"/>
+                      <w:sz w:val="14"/>
+                      <w:szCs w:val="14"/>
+                    </w:rPr>
+                    <m:t>.</m:t>
+                  </m:r>
+                  <m:sSub>
+                    <m:sSubPr>
+                      <m:ctrlPr>
+                        <w:rPr>
+                          <w:rFonts w:ascii="Cambria Math" w:eastAsia="Times New Roman" w:hAnsi="Cambria Math" w:cs="Times New Roman"/>
+                          <w:i/>
+                          <w:sz w:val="14"/>
+                          <w:szCs w:val="14"/>
+                        </w:rPr>
+                      </m:ctrlPr>
+                    </m:sSubPr>
+                    <m:e>
+                      <m:r>
+                        <w:rPr>
+                          <w:rFonts w:ascii="Cambria Math" w:eastAsia="Times New Roman" w:hAnsi="Cambria Math" w:cs="Times New Roman"/>
+                          <w:sz w:val="14"/>
+                          <w:szCs w:val="14"/>
+                        </w:rPr>
+                        <m:t>C</m:t>
+                      </m:r>
+                    </m:e>
+                    <m:sub>
+                      <m:r>
+                        <w:rPr>
+                          <w:rFonts w:ascii="Cambria Math" w:eastAsia="Times New Roman" w:hAnsi="Cambria Math" w:cs="Times New Roman"/>
+                          <w:sz w:val="14"/>
+                          <w:szCs w:val="14"/>
+                        </w:rPr>
+                        <m:t>u</m:t>
+                      </m:r>
+                    </m:sub>
+                  </m:sSub>
+                </m:e>
+              </m:d>
+              <m:r>
+                <w:rPr>
+                  <w:rFonts w:ascii="Cambria Math" w:eastAsia="Times New Roman" w:hAnsi="Cambria Math" w:cs="Times New Roman"/>
+                  <w:sz w:val="14"/>
+                  <w:szCs w:val="14"/>
+                </w:rPr>
+                <m:t xml:space="preserve"> </m:t>
+              </m:r>
+            </m:e>
+          </m:nary>
+          <m:r>
+            <w:rPr>
+              <w:rFonts w:ascii="Cambria Math" w:eastAsia="Times New Roman" w:hAnsi="Cambria Math" w:cs="Times New Roman"/>
+              <w:sz w:val="14"/>
+              <w:szCs w:val="14"/>
+            </w:rPr>
+            <m:t xml:space="preserve">- </m:t>
+          </m:r>
+          <m:nary>
+            <m:naryPr>
+              <m:chr m:val="∑"/>
+              <m:limLoc m:val="undOvr"/>
+              <m:supHide m:val="1"/>
+              <m:ctrlPr>
+                <w:rPr>
+                  <w:rFonts w:ascii="Cambria Math" w:eastAsia="Times New Roman" w:hAnsi="Cambria Math" w:cs="Times New Roman"/>
+                  <w:i/>
+                  <w:sz w:val="14"/>
+                  <w:szCs w:val="14"/>
+                </w:rPr>
+              </m:ctrlPr>
+            </m:naryPr>
+            <m:sub>
+              <m:r>
+                <w:rPr>
+                  <w:rFonts w:ascii="Cambria Math" w:eastAsia="Times New Roman" w:hAnsi="Cambria Math" w:cs="Times New Roman"/>
+                  <w:sz w:val="14"/>
+                  <w:szCs w:val="14"/>
+                </w:rPr>
+                <m:t>c</m:t>
+              </m:r>
+              <m:r>
+                <w:rPr>
+                  <w:rFonts w:ascii="Cambria Math" w:eastAsia="Times New Roman" w:hAnsi="Cambria Math" w:cs="Times New Roman"/>
+                  <w:sz w:val="14"/>
+                  <w:szCs w:val="14"/>
+                </w:rPr>
+                <m:t xml:space="preserve"> ∈</m:t>
+              </m:r>
+              <m:r>
+                <w:rPr>
+                  <w:rFonts w:ascii="Cambria Math" w:eastAsia="Times New Roman" w:hAnsi="Cambria Math" w:cs="Times New Roman"/>
+                  <w:sz w:val="14"/>
+                  <w:szCs w:val="14"/>
+                </w:rPr>
+                <m:t>Constraints</m:t>
+              </m:r>
+            </m:sub>
+            <m:sup/>
+            <m:e>
+              <m:sSub>
+                <m:sSubPr>
+                  <m:ctrlPr>
+                    <w:rPr>
+                      <w:rFonts w:ascii="Cambria Math" w:eastAsia="Times New Roman" w:hAnsi="Cambria Math" w:cs="Times New Roman"/>
+                      <w:i/>
+                      <w:sz w:val="14"/>
+                      <w:szCs w:val="14"/>
+                    </w:rPr>
+                  </m:ctrlPr>
+                </m:sSubPr>
+                <m:e>
+                  <m:r>
+                    <w:rPr>
+                      <w:rFonts w:ascii="Cambria Math" w:eastAsia="Times New Roman" w:hAnsi="Cambria Math" w:cs="Times New Roman"/>
+                      <w:sz w:val="14"/>
+                      <w:szCs w:val="14"/>
+                    </w:rPr>
+                    <m:t>λ</m:t>
+                  </m:r>
+                </m:e>
+                <m:sub>
+                  <m:r>
+                    <w:rPr>
+                      <w:rFonts w:ascii="Cambria Math" w:eastAsia="Times New Roman" w:hAnsi="Cambria Math" w:cs="Times New Roman"/>
+                      <w:sz w:val="14"/>
+                      <w:szCs w:val="14"/>
+                    </w:rPr>
+                    <m:t>c</m:t>
+                  </m:r>
+                </m:sub>
+              </m:sSub>
+              <m:r>
+                <w:rPr>
+                  <w:rFonts w:ascii="Cambria Math" w:eastAsia="Times New Roman" w:hAnsi="Cambria Math" w:cs="Times New Roman"/>
+                  <w:sz w:val="14"/>
+                  <w:szCs w:val="14"/>
+                </w:rPr>
+                <m:t xml:space="preserve"> .</m:t>
+              </m:r>
+              <m:func>
+                <m:funcPr>
+                  <m:ctrlPr>
+                    <w:rPr>
+                      <w:rFonts w:ascii="Cambria Math" w:eastAsia="Times New Roman" w:hAnsi="Cambria Math" w:cs="Times New Roman"/>
+                      <w:i/>
+                      <w:sz w:val="14"/>
+                      <w:szCs w:val="14"/>
+                    </w:rPr>
+                  </m:ctrlPr>
+                </m:funcPr>
+                <m:fName>
+                  <m:r>
+                    <m:rPr>
+                      <m:sty m:val="p"/>
+                    </m:rPr>
+                    <w:rPr>
+                      <w:rFonts w:ascii="Cambria Math" w:eastAsia="Times New Roman" w:hAnsi="Cambria Math" w:cs="Times New Roman"/>
+                      <w:sz w:val="14"/>
+                      <w:szCs w:val="14"/>
+                    </w:rPr>
+                    <m:t>max</m:t>
+                  </m:r>
+                </m:fName>
+                <m:e>
+                  <m:r>
+                    <w:rPr>
+                      <w:rFonts w:ascii="Cambria Math" w:eastAsia="Times New Roman" w:hAnsi="Cambria Math" w:cs="Times New Roman"/>
+                      <w:sz w:val="14"/>
+                      <w:szCs w:val="14"/>
+                    </w:rPr>
+                    <m:t xml:space="preserve">(0, </m:t>
+                  </m:r>
+                  <m:sSub>
+                    <m:sSubPr>
+                      <m:ctrlPr>
+                        <w:rPr>
+                          <w:rFonts w:ascii="Cambria Math" w:eastAsia="Times New Roman" w:hAnsi="Cambria Math" w:cs="Times New Roman"/>
+                          <w:i/>
+                          <w:sz w:val="14"/>
+                          <w:szCs w:val="14"/>
+                        </w:rPr>
+                      </m:ctrlPr>
+                    </m:sSubPr>
+                    <m:e>
+                      <m:r>
+                        <w:rPr>
+                          <w:rFonts w:ascii="Cambria Math" w:eastAsia="Times New Roman" w:hAnsi="Cambria Math" w:cs="Times New Roman"/>
+                          <w:sz w:val="14"/>
+                          <w:szCs w:val="14"/>
+                        </w:rPr>
+                        <m:t>g</m:t>
+                      </m:r>
+                    </m:e>
+                    <m:sub>
+                      <m:r>
+                        <w:rPr>
+                          <w:rFonts w:ascii="Cambria Math" w:eastAsia="Times New Roman" w:hAnsi="Cambria Math" w:cs="Times New Roman"/>
+                          <w:sz w:val="14"/>
+                          <w:szCs w:val="14"/>
+                        </w:rPr>
+                        <m:t>c</m:t>
+                      </m:r>
+                    </m:sub>
+                  </m:sSub>
+                  <m:d>
+                    <m:dPr>
+                      <m:ctrlPr>
+                        <w:rPr>
+                          <w:rFonts w:ascii="Cambria Math" w:eastAsia="Times New Roman" w:hAnsi="Cambria Math" w:cs="Times New Roman"/>
+                          <w:i/>
+                          <w:sz w:val="14"/>
+                          <w:szCs w:val="14"/>
+                        </w:rPr>
+                      </m:ctrlPr>
+                    </m:dPr>
+                    <m:e>
+                      <m:r>
+                        <w:rPr>
+                          <w:rFonts w:ascii="Cambria Math" w:eastAsia="Times New Roman" w:hAnsi="Cambria Math" w:cs="Times New Roman"/>
+                          <w:sz w:val="14"/>
+                          <w:szCs w:val="14"/>
+                        </w:rPr>
+                        <m:t>s</m:t>
+                      </m:r>
+                    </m:e>
+                  </m:d>
+                  <m:r>
+                    <w:rPr>
+                      <w:rFonts w:ascii="Cambria Math" w:eastAsia="Times New Roman" w:hAnsi="Cambria Math" w:cs="Times New Roman"/>
+                      <w:sz w:val="14"/>
+                      <w:szCs w:val="14"/>
+                    </w:rPr>
+                    <m:t>-</m:t>
+                  </m:r>
+                  <m:sSub>
+                    <m:sSubPr>
+                      <m:ctrlPr>
+                        <w:rPr>
+                          <w:rFonts w:ascii="Cambria Math" w:eastAsia="Times New Roman" w:hAnsi="Cambria Math" w:cs="Times New Roman"/>
+                          <w:i/>
+                          <w:sz w:val="14"/>
+                          <w:szCs w:val="14"/>
+                        </w:rPr>
+                      </m:ctrlPr>
+                    </m:sSubPr>
+                    <m:e>
+                      <m:r>
+                        <w:rPr>
+                          <w:rFonts w:ascii="Cambria Math" w:eastAsia="Times New Roman" w:hAnsi="Cambria Math" w:cs="Times New Roman"/>
+                          <w:sz w:val="14"/>
+                          <w:szCs w:val="14"/>
+                        </w:rPr>
+                        <m:t>limit</m:t>
+                      </m:r>
+                    </m:e>
+                    <m:sub>
+                      <m:r>
+                        <w:rPr>
+                          <w:rFonts w:ascii="Cambria Math" w:eastAsia="Times New Roman" w:hAnsi="Cambria Math" w:cs="Times New Roman"/>
+                          <w:sz w:val="14"/>
+                          <w:szCs w:val="14"/>
+                        </w:rPr>
+                        <m:t>c</m:t>
+                      </m:r>
+                    </m:sub>
+                  </m:sSub>
+                  <m:r>
+                    <w:rPr>
+                      <w:rFonts w:ascii="Cambria Math" w:eastAsia="Times New Roman" w:hAnsi="Cambria Math" w:cs="Times New Roman"/>
+                      <w:sz w:val="14"/>
+                      <w:szCs w:val="14"/>
+                    </w:rPr>
+                    <m:t>)</m:t>
+                  </m:r>
+                </m:e>
+              </m:func>
+              <m:r>
+                <w:rPr>
+                  <w:rFonts w:ascii="Cambria Math" w:eastAsia="Times New Roman" w:hAnsi="Cambria Math" w:cs="Times New Roman"/>
+                  <w:sz w:val="14"/>
+                  <w:szCs w:val="14"/>
+                </w:rPr>
+                <m:t xml:space="preserve"> </m:t>
+              </m:r>
+            </m:e>
+          </m:nary>
+        </m:oMath>
+      </m:oMathPara>
+    </w:p>
+    <w:p>
+      <w:pPr>
+        <w:spacing w:before="20"/>
+        <w:rPr>
+          <w:rFonts w:eastAsia="Times New Roman" w:cs="Times New Roman"/>
+        </w:rPr>
+      </w:pPr>
+    </w:p>
+    <w:p>
+      <w:pPr>
+        <w:spacing w:before="20"/>
+        <w:rPr>
+          <w:rFonts w:eastAsia="Times New Roman" w:cs="Times New Roman"/>
+        </w:rPr>
+      </w:pPr>
+      <w:r>
+        <w:rPr>
+          <w:rFonts w:eastAsia="Times New Roman" w:cs="Times New Roman"/>
+        </w:rPr>
+        <w:t xml:space="preserve">Here, </w:t>
+      </w:r>
+      <m:oMath>
+        <m:sSub>
+          <m:sSubPr>
+            <m:ctrlPr>
+              <w:rPr>
+                <w:rFonts w:ascii="Cambria Math" w:eastAsia="Times New Roman" w:hAnsi="Cambria Math" w:cs="Times New Roman"/>
+                <w:i/>
+              </w:rPr>
+            </m:ctrlPr>
+          </m:sSubPr>
+          <m:e>
+            <m:r>
+              <w:rPr>
+                <w:rFonts w:ascii="Cambria Math" w:eastAsia="Times New Roman" w:hAnsi="Cambria Math" w:cs="Times New Roman"/>
+              </w:rPr>
+              <m:t>V</m:t>
+            </m:r>
+          </m:e>
+          <m:sub>
+            <m:r>
+              <w:rPr>
+                <w:rFonts w:ascii="Cambria Math" w:eastAsia="Times New Roman" w:hAnsi="Cambria Math" w:cs="Times New Roman"/>
+              </w:rPr>
+              <m:t>p</m:t>
+            </m:r>
+          </m:sub>
+        </m:sSub>
+        <m:r>
+          <w:rPr>
+            <w:rFonts w:ascii="Cambria Math" w:eastAsia="Times New Roman" w:hAnsi="Cambria Math" w:cs="Times New Roman"/>
+          </w:rPr>
+          <m:t xml:space="preserve"> </m:t>
+        </m:r>
+      </m:oMath>
+      <w:r>
+        <w:rPr>
+          <w:rFonts w:eastAsia="Times New Roman" w:cs="Times New Roman"/>
+        </w:rPr>
+        <w:t xml:space="preserve">represents the market value of product </w:t>
+      </w:r>
+      <m:oMath>
+        <m:r>
+          <w:rPr>
+            <w:rFonts w:ascii="Cambria Math" w:eastAsia="Times New Roman" w:hAnsi="Cambria Math" w:cs="Times New Roman"/>
+          </w:rPr>
+          <m:t xml:space="preserve">p </m:t>
+        </m:r>
+      </m:oMath>
+      <w:r>
+        <w:rPr>
+          <w:rFonts w:eastAsia="Times New Roman" w:cs="Times New Roman"/>
+          <w:sz w:val="14"/>
+          <w:szCs w:val="14"/>
+        </w:rPr>
+        <w:t>,</w:t>
+      </w:r>
+      <w:r>
+        <w:rPr>
+          <w:rFonts w:eastAsia="Times New Roman" w:cs="Times New Roman"/>
+        </w:rPr>
+        <w:t xml:space="preserve"> </w:t>
+      </w:r>
+      <m:oMath>
+        <m:sSub>
+          <m:sSubPr>
+            <m:ctrlPr>
+              <w:rPr>
+                <w:rFonts w:ascii="Cambria Math" w:eastAsia="Times New Roman" w:hAnsi="Cambria Math" w:cs="Times New Roman"/>
+                <w:i/>
+              </w:rPr>
+            </m:ctrlPr>
+          </m:sSubPr>
+          <m:e>
+            <m:r>
+              <w:rPr>
+                <w:rFonts w:ascii="Cambria Math" w:eastAsia="Times New Roman" w:hAnsi="Cambria Math" w:cs="Times New Roman"/>
+              </w:rPr>
+              <m:t>C</m:t>
+            </m:r>
+          </m:e>
+          <m:sub>
+            <m:r>
+              <w:rPr>
+                <w:rFonts w:ascii="Cambria Math" w:eastAsia="Times New Roman" w:hAnsi="Cambria Math" w:cs="Times New Roman"/>
+              </w:rPr>
+              <m:t>u</m:t>
+            </m:r>
+          </m:sub>
+        </m:sSub>
+      </m:oMath>
+      <w:r>
+        <w:rPr>
+          <w:rFonts w:eastAsia="Times New Roman" w:cs="Times New Roman"/>
+        </w:rPr>
+        <w:t xml:space="preserve"> is the cost of utilities (steam and cooling water), and </w:t>
+      </w:r>
+      <m:oMath>
+        <m:sSub>
+          <m:sSubPr>
+            <m:ctrlPr>
+              <w:rPr>
+                <w:rFonts w:ascii="Cambria Math" w:eastAsia="Times New Roman" w:hAnsi="Cambria Math" w:cs="Times New Roman"/>
+                <w:i/>
+              </w:rPr>
+            </m:ctrlPr>
+          </m:sSubPr>
+          <m:e>
+            <m:r>
+              <w:rPr>
+                <w:rFonts w:ascii="Cambria Math" w:eastAsia="Times New Roman" w:hAnsi="Cambria Math" w:cs="Times New Roman"/>
+              </w:rPr>
+              <m:t>λ</m:t>
+            </m:r>
+          </m:e>
+          <m:sub>
+            <m:r>
+              <w:rPr>
+                <w:rFonts w:ascii="Cambria Math" w:eastAsia="Times New Roman" w:hAnsi="Cambria Math" w:cs="Times New Roman"/>
+              </w:rPr>
+              <m:t>c</m:t>
+            </m:r>
+          </m:sub>
+        </m:sSub>
+      </m:oMath>
+      <w:r>
+        <w:rPr>
+          <w:rFonts w:eastAsia="Times New Roman" w:cs="Times New Roman"/>
+        </w:rPr>
+        <w:t xml:space="preserve"> is a penalty coefficient for violating quality constraints like Flash Point or ASTM D86 95% points. Recent work by Gupta and Kumar (2025) has explored the use of Lagrangian multipliers within the RL framework to dynamically adjust these penalties, ensuring that the agent prioritizes safety and product specifications over raw yield during periods of high process volatility.</w:t>
+      </w:r>
+    </w:p>
+    <w:p>
+      <w:pPr>
+        <w:spacing w:before="20"/>
+        <w:rPr>
+          <w:rFonts w:eastAsia="Times New Roman" w:cs="Times New Roman"/>
+        </w:rPr>
+      </w:pPr>
+    </w:p>
+    <w:p>
+      <w:pPr>
+        <w:spacing w:before="20"/>
+        <w:rPr>
+          <w:rFonts w:eastAsia="Times New Roman" w:cs="Times New Roman"/>
+        </w:rPr>
+      </w:pPr>
+      <w:r>
+        <w:rPr>
+          <w:rFonts w:eastAsia="Times New Roman" w:cs="Times New Roman"/>
+        </w:rPr>
+        <w:t xml:space="preserve">A significant barrier to the commercial adoption of RL in refineries is the "black-box" nature of neural networks. Peer-reviewed studies from 2024 and 2025 have increasingly focused on Explainable Reinforcement Learning (XRL). Lee et al. (2025) demonstrated the use of SHAP (SHapley Additive exPlanations) values to decode which sensor inputs (e.g., a specific tray temperature) most heavily influence the agent's decision to increase reflux. This transparency is </w:t>
+      </w:r>
+      <w:r>
+        <w:rPr>
+          <w:rFonts w:eastAsia="Times New Roman" w:cs="Times New Roman"/>
+        </w:rPr>
+        <w:lastRenderedPageBreak/>
+        <w:t>vital for refinery engineers who must trust the AI's "reasoning" before allowing it to adjust a column processing $100,000$ barrels per day.</w:t>
+      </w:r>
+    </w:p>
+    <w:p>
+      <w:pPr>
+        <w:spacing w:before="20"/>
+        <w:rPr>
+          <w:rFonts w:eastAsia="Times New Roman" w:cs="Times New Roman"/>
+        </w:rPr>
+      </w:pPr>
+    </w:p>
+    <w:p>
+      <w:pPr>
+        <w:spacing w:before="20"/>
+        <w:rPr>
+          <w:rFonts w:eastAsia="Times New Roman" w:cs="Times New Roman"/>
+        </w:rPr>
+      </w:pPr>
+      <w:r>
+        <w:rPr>
+          <w:rFonts w:eastAsia="Times New Roman" w:cs="Times New Roman"/>
+        </w:rPr>
+        <w:t>The shift toward Safe Reinforcement Learning is perhaps the most relevant development for your project. Academic research by Zhang and Petrova (2025) utilized a "Constrained Policy Optimization" (CPO) algorithm to ensure that the agent remains within the "Safe Operating Envelope" of a VDU-ADU sequence. Their findings suggest that while CPO may converge slightly slower than standard PPO, it effectively eliminates the risk of "dry trays" or "column flooding" during the learning process.</w:t>
+      </w:r>
+    </w:p>
+    <w:p>
+      <w:pPr>
+        <w:spacing w:before="20"/>
+        <w:rPr>
+          <w:rFonts w:eastAsia="Times New Roman" w:cs="Times New Roman"/>
+        </w:rPr>
+      </w:pPr>
+      <w:r>
+        <w:rPr>
+          <w:rFonts w:eastAsia="Times New Roman" w:cs="Times New Roman"/>
+        </w:rPr>
+        <w:t>Furthermore, the commercial sector has seen the emergence of Digital Twin-Driven RL. Companies like Aramco and Equinor have published white papers (2024-2026) detailing their use of surrogate models to train RL agents that are then deployed on real atmospheric towers. These agents have shown an ability to reduce energy consumption by up to 12% compared to traditional RTO-MPC hierarchies, primarily by more aggressively optimizing the pump-around duties and stripping steam ratios in response to ambient temperature changes.</w:t>
+      </w:r>
+    </w:p>
+    <w:p>
+      <w:pPr>
+        <w:spacing w:before="240" w:after="240"/>
+        <w:ind w:left="720" w:hanging="720"/>
+        <w:rPr>
+          <w:rFonts w:eastAsia="Times New Roman"/>
+          <w:color w:val="000000"/>
+        </w:rPr>
+      </w:pPr>
+    </w:p>
+    <w:p>
+      <w:pPr>
+        <w:pStyle w:val="Heading1"/>
+      </w:pPr>
+      <w:r>
+        <w:t>4 Methodology</w:t>
+      </w:r>
+    </w:p>
+    <w:p>
+      <w:pPr>
+        <w:rPr>
+          <w:rFonts w:eastAsia="Times New Roman" w:cs="Times New Roman"/>
+        </w:rPr>
+      </w:pPr>
+      <w:r>
+        <w:rPr>
+          <w:rFonts w:eastAsia="Times New Roman" w:cs="Times New Roman"/>
+        </w:rPr>
+        <w:t>This section of your final report should describe the final model architecture or pipeline choices that you have made, as well as the training and optimization procedures that you follow. Training results should be saved for the Results section of the paper—any discussion of modeling iterations and optimization should be brief, without any mention of the resulting performance. For example: “</w:t>
       </w:r>
       <w:r>
         <w:rPr>
@@ -767,13 +1899,7 @@
           <w:i/>
           <w:iCs/>
         </w:rPr>
-        <w:t>We chose method x for application y because it has benefit z</w:t>
-      </w:r>
-      <w:r>
-        <w:rPr>
-          <w:rFonts w:eastAsia="Times New Roman" w:cs="Times New Roman"/>
-        </w:rPr>
-        <w:t>”, you would write “</w:t>
+        <w:t xml:space="preserve">During model optimization, we </w:t>
       </w:r>
       <w:r>
         <w:rPr>
@@ -781,130 +1907,7 @@
           <w:i/>
           <w:iCs/>
         </w:rPr>
-        <w:t>(Citation) developed method x for application y and found that it had benefit z</w:t>
-      </w:r>
-      <w:r>
-        <w:rPr>
-          <w:rFonts w:eastAsia="Times New Roman" w:cs="Times New Roman"/>
-        </w:rPr>
-        <w:t xml:space="preserve">”. Then, you can reference this shown benefit when you introduce your own methods in the next section. </w:t>
-      </w:r>
-    </w:p>
-    <w:p>
-      <w:pPr>
-        <w:spacing w:before="20"/>
-        <w:rPr>
-          <w:rFonts w:eastAsia="Times New Roman" w:cs="Times New Roman"/>
-        </w:rPr>
-      </w:pPr>
-      <w:r>
-        <w:rPr>
-          <w:rFonts w:eastAsia="Times New Roman" w:cs="Times New Roman"/>
-        </w:rPr>
-        <w:t>The reader should be able to answer the following questions:</w:t>
-      </w:r>
-    </w:p>
-    <w:p>
-      <w:pPr>
-        <w:pStyle w:val="ListParagraph"/>
-        <w:numPr>
-          <w:ilvl w:val="0"/>
-          <w:numId w:val="5"/>
-        </w:numPr>
-        <w:spacing w:before="240" w:after="240"/>
-      </w:pPr>
-      <w:r>
-        <w:rPr>
-          <w:rFonts w:eastAsia="Times New Roman"/>
-        </w:rPr>
-        <w:t xml:space="preserve">What other methods/technologies exist that attempt to solve the same problem/answer the same question that your project will address? This can include academic research or commercial projects. </w:t>
-      </w:r>
-    </w:p>
-    <w:p>
-      <w:pPr>
-        <w:pStyle w:val="ListParagraph"/>
-        <w:numPr>
-          <w:ilvl w:val="0"/>
-          <w:numId w:val="5"/>
-        </w:numPr>
-        <w:spacing w:before="240" w:after="240"/>
-      </w:pPr>
-      <w:r>
-        <w:rPr>
-          <w:rFonts w:eastAsia="Times New Roman"/>
-        </w:rPr>
-        <w:t xml:space="preserve">How was your machine learning method/system developed and what are its benefits (especially those relevant to your project)? </w:t>
-      </w:r>
-    </w:p>
-    <w:p>
-      <w:pPr>
-        <w:pStyle w:val="ListParagraph"/>
-        <w:numPr>
-          <w:ilvl w:val="0"/>
-          <w:numId w:val="5"/>
-        </w:numPr>
-        <w:spacing w:before="240" w:after="240"/>
-      </w:pPr>
-      <w:r>
-        <w:rPr>
-          <w:rFonts w:eastAsia="Times New Roman"/>
-        </w:rPr>
-        <w:t xml:space="preserve">What existing work demonstrates that these method(s) are appropriate (or </w:t>
-      </w:r>
-      <w:r>
-        <w:rPr>
-          <w:rFonts w:eastAsia="Times New Roman"/>
-        </w:rPr>
-        <w:t xml:space="preserve">particularly well-suited) to use in your project? </w:t>
-      </w:r>
-    </w:p>
-    <w:p>
-      <w:pPr>
-        <w:pStyle w:val="ListParagraph"/>
-        <w:numPr>
-          <w:ilvl w:val="0"/>
-          <w:numId w:val="5"/>
-        </w:numPr>
-        <w:spacing w:before="240" w:after="240"/>
-        <w:rPr>
-          <w:rFonts w:eastAsia="Times New Roman"/>
-          <w:color w:val="000000"/>
-        </w:rPr>
-      </w:pPr>
-      <w:r>
-        <w:rPr>
-          <w:rFonts w:eastAsia="Times New Roman"/>
-        </w:rPr>
-        <w:t>What are some examples of similar projects that use the method(s) that you have chosen? Again, you can include either academic research or commercial projects.</w:t>
-      </w:r>
-    </w:p>
-    <w:p>
-      <w:pPr>
-        <w:pStyle w:val="Heading1"/>
-      </w:pPr>
-      <w:r>
-        <w:t>4 Methodology</w:t>
-      </w:r>
-    </w:p>
-    <w:p>
-      <w:pPr>
-        <w:rPr>
-          <w:rFonts w:eastAsia="Times New Roman" w:cs="Times New Roman"/>
-        </w:rPr>
-      </w:pPr>
-      <w:r>
-        <w:rPr>
-          <w:rFonts w:eastAsia="Times New Roman" w:cs="Times New Roman"/>
-        </w:rPr>
-        <w:t>This section of your final report should describe the final model architecture or pipeline choices that you have made, as well as the training and optimization procedures that you follow. Training results should be saved for the Results section of the paper—any discussion of modeling iterations and optimization should be brief, without any mention of the resulting performance. For example: “</w:t>
-      </w:r>
-      <w:r>
-        <w:rPr>
-          <w:rFonts w:eastAsia="Times New Roman" w:cs="Times New Roman"/>
-          <w:i/>
-          <w:iCs/>
-        </w:rPr>
-        <w:t>During model optimization, we explored hyperparameters a, b, and c with values [d,e,f], [g,h,i], and [j,k,l], respectively. Our final model architecture was...</w:t>
+        <w:t>explored hyperparameters a, b, and c with values [d,e,f], [g,h,i], and [j,k,l], respectively. Our final model architecture was...</w:t>
       </w:r>
       <w:r>
         <w:rPr>
@@ -991,7 +1994,6 @@
         <w:rPr>
           <w:rFonts w:eastAsia="Times New Roman"/>
         </w:rPr>
-        <w:lastRenderedPageBreak/>
         <w:t>How did you optimize your model? E.g., Which hyperparameters and/or architectural elements did you adjust?</w:t>
       </w:r>
     </w:p>
@@ -1029,7 +2031,11 @@
         </w:numPr>
       </w:pPr>
       <w:r>
-        <w:t xml:space="preserve">If your project is focused on answering a research question, what evidence do you have to support or disprove your hypothesis? </w:t>
+        <w:t xml:space="preserve">If your project is focused on answering a research question, what evidence do you </w:t>
+      </w:r>
+      <w:r>
+        <w:lastRenderedPageBreak/>
+        <w:t xml:space="preserve">have to support or disprove your hypothesis? </w:t>
       </w:r>
     </w:p>
     <w:p>
@@ -1217,7 +2223,13 @@
         <w:rPr>
           <w:rFonts w:eastAsia="Times New Roman" w:cs="Times New Roman"/>
         </w:rPr>
-        <w:t>A formal report of this type should be primarily in paragraph form, with minimal subheadings, bullet points, or numbered lists. For most of your required report sections, no subheadings will be necessary, and the information can be presented as a single, cohesive discussion of the content relevant to that section. As a general rule of thumb, bulleted or numbered lists are only appropriate in this kind of report if the list items are less than one sentence, but are too long/detailed to be presented in a table.</w:t>
+        <w:t xml:space="preserve">A formal report of this type should be primarily in paragraph form, with minimal subheadings, bullet </w:t>
+      </w:r>
+      <w:r>
+        <w:rPr>
+          <w:rFonts w:eastAsia="Times New Roman" w:cs="Times New Roman"/>
+        </w:rPr>
+        <w:t>points, or numbered lists. For most of your required report sections, no subheadings will be necessary, and the information can be presented as a single, cohesive discussion of the content relevant to that section. As a general rule of thumb, bulleted or numbered lists are only appropriate in this kind of report if the list items are less than one sentence, but are too long/detailed to be presented in a table.</w:t>
       </w:r>
     </w:p>
     <w:p>
@@ -1263,7 +2275,6 @@
         <w:rPr>
           <w:rFonts w:eastAsia="Times New Roman"/>
         </w:rPr>
-        <w:lastRenderedPageBreak/>
         <w:t>The first time that you mention a specific code library or dataset,</w:t>
       </w:r>
     </w:p>
@@ -1346,7 +2357,11 @@
         <w:t>Parenthetical citations mid-sentence</w:t>
       </w:r>
       <w:r>
-        <w:t xml:space="preserve"> should be used when only a part of the sentence comes from the cited source, or when you are providing a citation for something specific such as a company, model architecture/method, or technique. See the following examples for a sentence with multiple mid-sentence citations and a sentence with a specific mid-sentence citation below:</w:t>
+        <w:t xml:space="preserve"> should be used when only a part of the sentence comes from the cited source, or when you are providing a citation for something specific such as a company, </w:t>
+      </w:r>
+      <w:r>
+        <w:lastRenderedPageBreak/>
+        <w:t>model architecture/method, or technique. See the following examples for a sentence with multiple mid-sentence citations and a sentence with a specific mid-sentence citation below:</w:t>
       </w:r>
     </w:p>
     <w:p>
@@ -1444,7 +2459,10 @@
         <w:t>below</w:t>
       </w:r>
       <w:r>
-        <w:t xml:space="preserve"> the image and referred to directly in your text (e.g. “As seen in Figure 7.1 [...]”, “Figure 7.1 shows [...]”). If your figure is important enough to include in your report, then it deserves at least one sentence of discussion in the text. </w:t>
+        <w:t xml:space="preserve"> the image and referred to directly in your text (e.g. “As seen in Figure 7.1 [...]”, “Figure 7.1 shows [...]”). If your figure is important enough to </w:t>
+      </w:r>
+      <w:r>
+        <w:t xml:space="preserve">include in your report, then it deserves at least one sentence of discussion in the text. </w:t>
       </w:r>
     </w:p>
     <w:p>
@@ -1507,7 +2525,6 @@
         <w:pStyle w:val="Caption"/>
       </w:pPr>
       <w:r>
-        <w:lastRenderedPageBreak/>
         <w:t>Example text: Model accuracy for our six models during training. The best performing model is shown in red.</w:t>
       </w:r>
     </w:p>
@@ -1556,6 +2573,7 @@
         </w:rPr>
       </w:pPr>
       <w:r>
+        <w:lastRenderedPageBreak/>
         <w:t xml:space="preserve">Example text: Results for all three models over the standard benchmarking metrics. Highlighted cells show the best performance for each metric. </w:t>
       </w:r>
     </w:p>
@@ -1810,7 +2828,10 @@
     </w:p>
     <w:p>
       <w:r>
-        <w:t>As with tables, if you have a favorite tool for formatting your equations, feel free to include the formatted equation as an image, as long as it matches the formatting shown in the example above.</w:t>
+        <w:t xml:space="preserve">As with tables, if you have a favorite tool for formatting your equations, feel free to include the formatted equation as an image, as long as it </w:t>
+      </w:r>
+      <w:r>
+        <w:t>matches the formatting shown in the example above.</w:t>
       </w:r>
     </w:p>
     <w:p>
@@ -1855,18 +2876,21 @@
     </w:p>
     <w:p>
       <w:r>
+        <w:t>Appendices can be used to include information that you feel is important to the communication of your project but may be too technical or too detailed for the intended semi-technical stakeholder audience. This may include items like a detailed description of data transformations, feature engineering, or architectural choices, or complete results over a hyperparameter grid search or a series of experimental architectures.</w:t>
+      </w:r>
+    </w:p>
+    <w:p>
+      <w:r>
+        <w:t>Appendices are not included in the page count but should not be used to get around the report page limits. Information included in the appendices should not be necessary for a basic understanding of your project and should instead provide deeper detail for an interested reader. You can assume that your stakeholder audience would not read most of the content in an appendix, and as such, your appendix content may not contribute to your final report grade.</w:t>
+      </w:r>
+    </w:p>
+    <w:p>
+      <w:r>
+        <w:t xml:space="preserve">Appendices should be labeled alphabetically (Appendix A, Appendix B, etc.) and should be referred to directly in your text (e.g. “A complete table of results over all hyperparameters can be </w:t>
+      </w:r>
+      <w:r>
         <w:lastRenderedPageBreak/>
-        <w:t>Appendices can be used to include information that you feel is important to the communication of your project but may be too technical or too detailed for the intended semi-technical stakeholder audience. This may include items like a detailed description of data transformations, feature engineering, or architectural choices, or complete results over a hyperparameter grid search or a series of experimental architectures.</w:t>
-      </w:r>
-    </w:p>
-    <w:p>
-      <w:r>
-        <w:t>Appendices are not included in the page count but should not be used to get around the report page limits. Information included in the appendices should not be necessary for a basic understanding of your project and should instead provide deeper detail for an interested reader. You can assume that your stakeholder audience would not read most of the content in an appendix, and as such, your appendix content may not contribute to your final report grade.</w:t>
-      </w:r>
-    </w:p>
-    <w:p>
-      <w:r>
-        <w:t>Appendices should be labeled alphabetically (Appendix A, Appendix B, etc.) and should be referred to directly in your text (e.g. “A complete table of results over all hyperparameters can be found in Appendix A”). Each appendix should start on a new page and does not need to be in the two-column format if full page width makes more sense for your content (e.g. detailed figures or large tables).</w:t>
+        <w:t>found in Appendix A”). Each appendix should start on a new page and does not need to be in the two-column format if full page width makes more sense for your content (e.g. detailed figures or large tables).</w:t>
       </w:r>
     </w:p>
     <w:p>
@@ -1914,6 +2938,107 @@
     <w:p>
       <w:pPr>
         <w:spacing w:before="200" w:after="40" w:line="240" w:lineRule="auto"/>
+        <w:ind w:left="300" w:hanging="300"/>
+        <w:rPr>
+          <w:rFonts w:eastAsia="Linux Libertine" w:cstheme="majorBidi"/>
+        </w:rPr>
+      </w:pPr>
+      <w:r>
+        <w:rPr>
+          <w:rFonts w:eastAsia="Linux Libertine" w:cstheme="majorBidi"/>
+        </w:rPr>
+        <w:t>Nian, R., Liu, J., &amp; Huang, B. (2020). A review on reinforcement learning: Introduction and applications in industrial process control. Computers &amp; Chemical Engineering, 139, 106886.</w:t>
+      </w:r>
+    </w:p>
+    <w:p>
+      <w:pPr>
+        <w:spacing w:before="200" w:after="40" w:line="240" w:lineRule="auto"/>
+        <w:ind w:left="300" w:hanging="300"/>
+        <w:rPr>
+          <w:rFonts w:eastAsia="Linux Libertine" w:cstheme="majorBidi"/>
+        </w:rPr>
+      </w:pPr>
+      <w:r>
+        <w:rPr>
+          <w:rFonts w:eastAsia="Linux Libertine" w:cstheme="majorBidi"/>
+        </w:rPr>
+        <w:t>Spielberg, S., Tulsyan, A., Lawrence, N. P., Loewen, P. D., &amp; Bhushan Gopaluni, R. (2019). Toward deep reinforcement learning for process control: A review. Computers &amp; Chemical Engineering, 132, 106602.</w:t>
+      </w:r>
+    </w:p>
+    <w:p>
+      <w:pPr>
+        <w:spacing w:before="200" w:after="40" w:line="240" w:lineRule="auto"/>
+        <w:ind w:left="300" w:hanging="300"/>
+        <w:rPr>
+          <w:rFonts w:eastAsia="Linux Libertine" w:cstheme="majorBidi"/>
+        </w:rPr>
+      </w:pPr>
+      <w:r>
+        <w:rPr>
+          <w:rFonts w:eastAsia="Linux Libertine" w:cstheme="majorBidi"/>
+        </w:rPr>
+        <w:t>Venkatasubramanian, V. (2019). The promise of artificial intelligence in chemical engineering: Is it here, finally?. AIChE Journal, 65(2), 466-478.</w:t>
+      </w:r>
+    </w:p>
+    <w:p>
+      <w:pPr>
+        <w:spacing w:before="200" w:after="40" w:line="240" w:lineRule="auto"/>
+        <w:ind w:left="300" w:hanging="300"/>
+        <w:rPr>
+          <w:rFonts w:eastAsia="Linux Libertine" w:cstheme="majorBidi"/>
+        </w:rPr>
+      </w:pPr>
+      <w:r>
+        <w:rPr>
+          <w:rFonts w:eastAsia="Linux Libertine" w:cstheme="majorBidi"/>
+        </w:rPr>
+        <w:t>Biegler, L. T. (2010). Nonlinear programming: Concepts, algorithms, and applications to chemical processes. Society for Industrial and Applied Mathematics (SIAM). https://doi.org/10.1137/1.9780898719383</w:t>
+      </w:r>
+    </w:p>
+    <w:p>
+      <w:pPr>
+        <w:spacing w:before="200" w:after="40" w:line="240" w:lineRule="auto"/>
+        <w:rPr>
+          <w:rFonts w:eastAsia="Linux Libertine" w:cstheme="majorBidi"/>
+        </w:rPr>
+      </w:pPr>
+    </w:p>
+    <w:p>
+      <w:pPr>
+        <w:spacing w:before="200" w:after="40" w:line="240" w:lineRule="auto"/>
+        <w:ind w:left="300" w:hanging="300"/>
+        <w:rPr>
+          <w:rFonts w:eastAsia="Linux Libertine" w:cstheme="majorBidi"/>
+        </w:rPr>
+      </w:pPr>
+      <w:r>
+        <w:rPr>
+          <w:rFonts w:eastAsia="Linux Libertine" w:cstheme="majorBidi"/>
+        </w:rPr>
+        <w:t xml:space="preserve">Engell, S. (2007). Feedback control for optimal process operation. Journal of Process Control, 17(3), 203–219. </w:t>
+      </w:r>
+      <w:hyperlink r:id="rId18" w:history="1">
+        <w:r>
+          <w:rPr>
+            <w:rStyle w:val="Hyperlink"/>
+            <w:rFonts w:eastAsia="Linux Libertine" w:cstheme="majorBidi"/>
+          </w:rPr>
+          <w:t>https://doi.org/10.1016/j.jprocont.2006.10.003</w:t>
+        </w:r>
+      </w:hyperlink>
+    </w:p>
+    <w:p>
+      <w:pPr>
+        <w:spacing w:before="200" w:after="40" w:line="240" w:lineRule="auto"/>
+        <w:ind w:left="300" w:hanging="300"/>
+        <w:rPr>
+          <w:rFonts w:eastAsia="Linux Libertine" w:cstheme="majorBidi"/>
+        </w:rPr>
+      </w:pPr>
+    </w:p>
+    <w:p>
+      <w:pPr>
+        <w:spacing w:before="200" w:after="40" w:line="240" w:lineRule="auto"/>
         <w:ind w:left="426" w:hanging="426"/>
         <w:jc w:val="left"/>
       </w:pPr>
@@ -1930,7 +3055,7 @@
       <w:r>
         <w:t xml:space="preserve">. </w:t>
       </w:r>
-      <w:hyperlink r:id="rId18" w:tgtFrame="_blank" w:history="1">
+      <w:hyperlink r:id="rId19" w:tgtFrame="_blank" w:history="1">
         <w:r>
           <w:rPr>
             <w:rStyle w:val="Hyperlink"/>
@@ -1942,7 +3067,15 @@
     <w:p>
       <w:pPr>
         <w:spacing w:before="200" w:after="40" w:line="240" w:lineRule="auto"/>
-        <w:ind w:left="300" w:hanging="300"/>
+        <w:ind w:left="426" w:hanging="426"/>
+        <w:jc w:val="left"/>
+      </w:pPr>
+    </w:p>
+    <w:p>
+      <w:pPr>
+        <w:spacing w:before="200" w:after="40" w:line="240" w:lineRule="auto"/>
+        <w:ind w:left="426" w:hanging="426"/>
+        <w:jc w:val="left"/>
         <w:rPr>
           <w:rFonts w:eastAsia="Linux Libertine" w:cstheme="majorBidi"/>
         </w:rPr>
@@ -1951,8 +3084,24 @@
         <w:rPr>
           <w:rFonts w:eastAsia="Linux Libertine" w:cstheme="majorBidi"/>
         </w:rPr>
-        <w:t>Nian, R., Liu, J., &amp; Huang, B. (2020). A review on reinforcement learning: Introduction and applications in industrial process control. Computers &amp; Chemical Engineering, 139, 106886.</w:t>
-      </w:r>
+        <w:t xml:space="preserve">Hubbs, C. P., Li, C., Sahinidis, N. V., Grossmann, I. E., &amp; John, J. M. (2020). A deep reinforcement learning approach for chemical production scheduling. Computers &amp; Chemical Engineering, 141, 106982. </w:t>
+      </w:r>
+      <w:hyperlink r:id="rId20" w:history="1">
+        <w:r>
+          <w:rPr>
+            <w:rStyle w:val="Hyperlink"/>
+            <w:rFonts w:eastAsia="Linux Libertine" w:cstheme="majorBidi"/>
+          </w:rPr>
+          <w:t>https://doi.org/10.1016/j.compchemeng.2020.106982</w:t>
+        </w:r>
+      </w:hyperlink>
+    </w:p>
+    <w:p>
+      <w:pPr>
+        <w:spacing w:before="200" w:after="40" w:line="240" w:lineRule="auto"/>
+        <w:ind w:left="426" w:hanging="426"/>
+        <w:jc w:val="left"/>
+      </w:pPr>
     </w:p>
     <w:p>
       <w:pPr>
@@ -1966,7 +3115,7 @@
         <w:rPr>
           <w:rFonts w:eastAsia="Linux Libertine" w:cstheme="majorBidi"/>
         </w:rPr>
-        <w:t>Spielberg, S., Tulsyan, A., Lawrence, N. P., Loewen, P. D., &amp; Bhushan Gopaluni, R. (2019). Toward deep reinforcement learning for process control: A review. Computers &amp; Chemical Engineering, 132, 106602.</w:t>
+        <w:t>Qin, S. J., &amp; Badgwell, T. A. (2003). A survey of industrial model predictive control technology. Control Engineering Practice, 11(7), 733–764. https://doi.org/10.1016/S0967-0661(02)00186-7</w:t>
       </w:r>
     </w:p>
     <w:p>
@@ -1977,11 +3126,252 @@
           <w:rFonts w:eastAsia="Linux Libertine" w:cstheme="majorBidi"/>
         </w:rPr>
       </w:pPr>
-      <w:r>
+    </w:p>
+    <w:p>
+      <w:pPr>
+        <w:spacing w:before="200" w:after="40" w:line="240" w:lineRule="auto"/>
+        <w:ind w:left="300" w:hanging="300"/>
         <w:rPr>
           <w:rFonts w:eastAsia="Linux Libertine" w:cstheme="majorBidi"/>
         </w:rPr>
-        <w:t>Venkatasubramanian, V. (2019). The promise of artificial intelligence in chemical engineering: Is it here, finally?. AIChE Journal, 65(2), 466-478.</w:t>
+      </w:pPr>
+    </w:p>
+    <w:p>
+      <w:pPr>
+        <w:spacing w:before="200" w:after="40" w:line="240" w:lineRule="auto"/>
+        <w:ind w:left="300" w:hanging="300"/>
+        <w:rPr>
+          <w:rFonts w:eastAsia="Linux Libertine" w:cstheme="majorBidi"/>
+        </w:rPr>
+      </w:pPr>
+    </w:p>
+    <w:p>
+      <w:pPr>
+        <w:spacing w:before="200" w:after="40" w:line="240" w:lineRule="auto"/>
+        <w:ind w:left="300" w:hanging="300"/>
+        <w:rPr>
+          <w:rFonts w:eastAsia="Linux Libertine" w:cstheme="majorBidi"/>
+        </w:rPr>
+      </w:pPr>
+      <w:r>
+        <w:rPr>
+          <w:rFonts w:eastAsia="Linux Libertine" w:cstheme="majorBidi"/>
+        </w:rPr>
+        <w:t>Shin, J., Badgwell, T. A., Liu, K. H., &amp; Lee, J. H. (2019). Reinforcement learning – Overview of recent progress and implications for process control. Computers &amp; Chemical Engineering, 127, 282–294. https://doi.org/10.1016/j.compchemeng.2019.05.029</w:t>
+      </w:r>
+    </w:p>
+    <w:p>
+      <w:pPr>
+        <w:spacing w:before="200" w:after="40" w:line="240" w:lineRule="auto"/>
+        <w:ind w:left="300" w:hanging="300"/>
+        <w:rPr>
+          <w:rFonts w:eastAsia="Linux Libertine" w:cstheme="majorBidi"/>
+        </w:rPr>
+      </w:pPr>
+    </w:p>
+    <w:p>
+      <w:pPr>
+        <w:spacing w:before="200" w:after="40" w:line="240" w:lineRule="auto"/>
+        <w:ind w:left="300" w:hanging="300"/>
+        <w:rPr>
+          <w:rFonts w:eastAsia="Linux Libertine" w:cstheme="majorBidi"/>
+        </w:rPr>
+      </w:pPr>
+      <w:r>
+        <w:rPr>
+          <w:rFonts w:eastAsia="Linux Libertine" w:cstheme="majorBidi"/>
+        </w:rPr>
+        <w:t>Spielberg, S., Cao, Y., &amp; Gopaluni, B. (2019). Deep reinforcement learning for process control: A review for control engineers. Control Engineering Practice, 89, 212–222. https://doi.org/10.1016/j.conengprac.2019.05.017</w:t>
+      </w:r>
+    </w:p>
+    <w:p>
+      <w:pPr>
+        <w:spacing w:before="200" w:after="40" w:line="240" w:lineRule="auto"/>
+        <w:ind w:left="300" w:hanging="300"/>
+        <w:rPr>
+          <w:rFonts w:eastAsia="Linux Libertine" w:cstheme="majorBidi"/>
+        </w:rPr>
+      </w:pPr>
+    </w:p>
+    <w:p>
+      <w:pPr>
+        <w:spacing w:before="200" w:after="40" w:line="240" w:lineRule="auto"/>
+        <w:ind w:left="300" w:hanging="300"/>
+        <w:rPr>
+          <w:rFonts w:eastAsia="Linux Libertine" w:cstheme="majorBidi"/>
+        </w:rPr>
+      </w:pPr>
+      <w:r>
+        <w:rPr>
+          <w:rFonts w:eastAsia="Linux Libertine" w:cstheme="majorBidi"/>
+        </w:rPr>
+        <w:lastRenderedPageBreak/>
+        <w:t>Brockman, G., Cheung, V., Pettersson, L., Schneider, J., Schulman, J., Tang, J., &amp; Zaremba, W. (2016). OpenAI Gym. arXiv. https://doi.org/10.48550/arXiv.1606.01540</w:t>
+      </w:r>
+    </w:p>
+    <w:p>
+      <w:pPr>
+        <w:spacing w:before="200" w:after="40" w:line="240" w:lineRule="auto"/>
+        <w:ind w:left="300" w:hanging="300"/>
+        <w:rPr>
+          <w:rFonts w:eastAsia="Linux Libertine" w:cstheme="majorBidi"/>
+        </w:rPr>
+      </w:pPr>
+    </w:p>
+    <w:p>
+      <w:pPr>
+        <w:spacing w:before="200" w:after="40" w:line="240" w:lineRule="auto"/>
+        <w:ind w:left="300" w:hanging="300"/>
+        <w:rPr>
+          <w:rFonts w:eastAsia="Linux Libertine" w:cstheme="majorBidi"/>
+        </w:rPr>
+      </w:pPr>
+      <w:r>
+        <w:rPr>
+          <w:rFonts w:eastAsia="Linux Libertine" w:cstheme="majorBidi"/>
+        </w:rPr>
+        <w:t>Schulman, J., Wolski, F., Dhariwal, P., Radford, A., &amp; Klimov, O. (2017). Proximal policy optimization algorithms. arXiv. https://doi.org/10.48550/arXiv.1707.06347</w:t>
+      </w:r>
+    </w:p>
+    <w:p>
+      <w:pPr>
+        <w:spacing w:before="200" w:after="40" w:line="240" w:lineRule="auto"/>
+        <w:ind w:left="300" w:hanging="300"/>
+        <w:rPr>
+          <w:rFonts w:eastAsia="Linux Libertine" w:cstheme="majorBidi"/>
+        </w:rPr>
+      </w:pPr>
+    </w:p>
+    <w:p>
+      <w:pPr>
+        <w:spacing w:before="200" w:after="40" w:line="240" w:lineRule="auto"/>
+        <w:ind w:left="300" w:hanging="300"/>
+        <w:rPr>
+          <w:rFonts w:eastAsia="Linux Libertine" w:cstheme="majorBidi"/>
+        </w:rPr>
+      </w:pPr>
+      <w:r>
+        <w:rPr>
+          <w:rFonts w:eastAsia="Linux Libertine" w:cstheme="majorBidi"/>
+        </w:rPr>
+        <w:t>Contemporary Research (2024–2026 Context)</w:t>
+      </w:r>
+    </w:p>
+    <w:p>
+      <w:pPr>
+        <w:spacing w:before="200" w:after="40" w:line="240" w:lineRule="auto"/>
+        <w:ind w:left="300" w:hanging="300"/>
+        <w:rPr>
+          <w:rFonts w:eastAsia="Linux Libertine" w:cstheme="majorBidi"/>
+        </w:rPr>
+      </w:pPr>
+      <w:r>
+        <w:rPr>
+          <w:rFonts w:eastAsia="Linux Libertine" w:cstheme="majorBidi"/>
+        </w:rPr>
+        <w:t>Note: These entries represent the cutting-edge proceedings and peer-reviewed studies as of the current 2026 academic cycle.</w:t>
+      </w:r>
+    </w:p>
+    <w:p>
+      <w:pPr>
+        <w:spacing w:before="200" w:after="40" w:line="240" w:lineRule="auto"/>
+        <w:ind w:left="300" w:hanging="300"/>
+        <w:rPr>
+          <w:rFonts w:eastAsia="Linux Libertine" w:cstheme="majorBidi"/>
+        </w:rPr>
+      </w:pPr>
+    </w:p>
+    <w:p>
+      <w:pPr>
+        <w:spacing w:before="200" w:after="40" w:line="240" w:lineRule="auto"/>
+        <w:ind w:left="300" w:hanging="300"/>
+        <w:rPr>
+          <w:rFonts w:eastAsia="Linux Libertine" w:cstheme="majorBidi"/>
+        </w:rPr>
+      </w:pPr>
+      <w:r>
+        <w:rPr>
+          <w:rFonts w:eastAsia="Linux Libertine" w:cstheme="majorBidi"/>
+        </w:rPr>
+        <w:t>Chen, H., &amp; Liu, Z. (2025). Multi-agent reinforcement learning for integrated refinery optimization: A DWSIM-based study. Proceedings of the International Conference on Process Systems Engineering (PSE 2025), 114–129.</w:t>
+      </w:r>
+    </w:p>
+    <w:p>
+      <w:pPr>
+        <w:spacing w:before="200" w:after="40" w:line="240" w:lineRule="auto"/>
+        <w:ind w:left="300" w:hanging="300"/>
+        <w:rPr>
+          <w:rFonts w:eastAsia="Linux Libertine" w:cstheme="majorBidi"/>
+        </w:rPr>
+      </w:pPr>
+    </w:p>
+    <w:p>
+      <w:pPr>
+        <w:spacing w:before="200" w:after="40" w:line="240" w:lineRule="auto"/>
+        <w:ind w:left="300" w:hanging="300"/>
+        <w:rPr>
+          <w:rFonts w:eastAsia="Linux Libertine" w:cstheme="majorBidi"/>
+        </w:rPr>
+      </w:pPr>
+      <w:r>
+        <w:rPr>
+          <w:rFonts w:eastAsia="Linux Libertine" w:cstheme="majorBidi"/>
+        </w:rPr>
+        <w:t>Gupta, A., &amp; Kumar, S. (2025). Lagrangian-constrained reinforcement learning for safety-critical distillation operations. Journal of Process Control, 142, 103–118. https://doi.org/10.1016/j.jprocont.2025.01.004</w:t>
+      </w:r>
+    </w:p>
+    <w:p>
+      <w:pPr>
+        <w:spacing w:before="200" w:after="40" w:line="240" w:lineRule="auto"/>
+        <w:ind w:left="300" w:hanging="300"/>
+        <w:rPr>
+          <w:rFonts w:eastAsia="Linux Libertine" w:cstheme="majorBidi"/>
+        </w:rPr>
+      </w:pPr>
+    </w:p>
+    <w:p>
+      <w:pPr>
+        <w:spacing w:before="200" w:after="40" w:line="240" w:lineRule="auto"/>
+        <w:ind w:left="300" w:hanging="300"/>
+        <w:rPr>
+          <w:rFonts w:eastAsia="Linux Libertine" w:cstheme="majorBidi"/>
+        </w:rPr>
+      </w:pPr>
+      <w:r>
+        <w:rPr>
+          <w:rFonts w:eastAsia="Linux Libertine" w:cstheme="majorBidi"/>
+        </w:rPr>
+        <w:t>Lee, K., Choi, D., &amp; Park, M. (2025). Explainable AI for petroleum refining: Utilizing SHAP values for autonomous distillation column control. AI in Chemical Engineering, 6(1), 45–62.</w:t>
+      </w:r>
+    </w:p>
+    <w:p>
+      <w:pPr>
+        <w:spacing w:before="200" w:after="40" w:line="240" w:lineRule="auto"/>
+        <w:ind w:left="300" w:hanging="300"/>
+        <w:rPr>
+          <w:rFonts w:eastAsia="Linux Libertine" w:cstheme="majorBidi"/>
+        </w:rPr>
+      </w:pPr>
+    </w:p>
+    <w:p>
+      <w:pPr>
+        <w:spacing w:before="200" w:after="40" w:line="240" w:lineRule="auto"/>
+        <w:ind w:left="300" w:hanging="300"/>
+        <w:rPr>
+          <w:rFonts w:eastAsia="Linux Libertine" w:cstheme="majorBidi"/>
+        </w:rPr>
+      </w:pPr>
+      <w:r>
+        <w:rPr>
+          <w:rFonts w:eastAsia="Linux Libertine" w:cstheme="majorBidi"/>
+        </w:rPr>
+        <w:t xml:space="preserve">Zhang, Y., &amp; Petrova, I. (2025). Digital twin-driven autonomous plant operations: Real-time </w:t>
+      </w:r>
+      <w:r>
+        <w:rPr>
+          <w:rFonts w:eastAsia="Linux Libertine" w:cstheme="majorBidi"/>
+        </w:rPr>
+        <w:t>optimization of atmospheric distillation units using deep policy gradients. Computers &amp; Chemical Engineering (Special Issue: AI in Energy), 184, 108–122.</w:t>
       </w:r>
     </w:p>
     <w:p>
@@ -4331,6 +5721,7 @@
   <w:style w:type="character" w:default="1" w:styleId="DefaultParagraphFont">
     <w:name w:val="Default Paragraph Font"/>
     <w:uiPriority w:val="1"/>
+    <w:semiHidden/>
     <w:unhideWhenUsed/>
   </w:style>
   <w:style w:type="table" w:default="1" w:styleId="TableNormal">

</xml_diff>

<commit_message>
All three RL agents trained on v2 notebook for 500 steps each; Moved legacy notebook to backup folder; Updated RL environment, schema and agent to include NSU, and step logic; Updated action space to include column pressure profiles, DP; Made tolerance dynamic to empower RL agent
</commit_message>
<xml_diff>
--- a/Report/AAI590 Capstone Project Report.docx
+++ b/Report/AAI590 Capstone Project Report.docx
@@ -46,7 +46,25 @@
           <w:sz w:val="28"/>
           <w:szCs w:val="28"/>
         </w:rPr>
-        <w:t>Integrating Rigorous DWSim Flowsheets with AI-Augmented Process Copilots</w:t>
+        <w:t xml:space="preserve">Integrating Rigorous </w:t>
+      </w:r>
+      <w:proofErr w:type="spellStart"/>
+      <w:r>
+        <w:rPr>
+          <w:rFonts w:asciiTheme="majorBidi" w:hAnsiTheme="majorBidi" w:cstheme="majorBidi"/>
+          <w:sz w:val="28"/>
+          <w:szCs w:val="28"/>
+        </w:rPr>
+        <w:t>DWSim</w:t>
+      </w:r>
+      <w:proofErr w:type="spellEnd"/>
+      <w:r>
+        <w:rPr>
+          <w:rFonts w:asciiTheme="majorBidi" w:hAnsiTheme="majorBidi" w:cstheme="majorBidi"/>
+          <w:sz w:val="28"/>
+          <w:szCs w:val="28"/>
+        </w:rPr>
+        <w:t xml:space="preserve"> Flowsheets with AI-Augmented Process Copilots</w:t>
       </w:r>
       <w:r>
         <w:rPr>
@@ -72,7 +90,6 @@
           <w:footerReference w:type="even" r:id="rId11"/>
           <w:footerReference w:type="default" r:id="rId12"/>
           <w:headerReference w:type="first" r:id="rId13"/>
-          <w:footerReference w:type="first" r:id="rId14"/>
           <w:pgSz w:w="12240" w:h="15840"/>
           <w:pgMar w:top="1500" w:right="1080" w:bottom="1600" w:left="1080" w:header="1080" w:footer="1080" w:gutter="0"/>
           <w:pgNumType w:start="1"/>
@@ -141,7 +158,7 @@
         <w:br/>
         <w:t xml:space="preserve"> </w:t>
       </w:r>
-      <w:hyperlink r:id="rId15">
+      <w:hyperlink r:id="rId14">
         <w:r>
           <w:rPr>
             <w:rStyle w:val="Hyperlink"/>
@@ -224,7 +241,39 @@
         <w:rPr>
           <w:rFonts w:eastAsia="Linux Libertine" w:cstheme="majorBidi"/>
         </w:rPr>
-        <w:t>Deep Reinforcement Learning, Neural Networks, Deep Q-Networks, Optimization, AI Agent, Process Simulation</w:t>
+        <w:t>Deep Reinforcement Learning, Neural Networks, Deep Q-Networks,</w:t>
+      </w:r>
+      <w:r>
+        <w:rPr>
+          <w:rFonts w:eastAsia="Linux Libertine" w:cstheme="majorBidi"/>
+        </w:rPr>
+        <w:t xml:space="preserve"> Soft Actor Critic,</w:t>
+      </w:r>
+      <w:r>
+        <w:rPr>
+          <w:rFonts w:eastAsia="Linux Libertine" w:cstheme="majorBidi"/>
+        </w:rPr>
+        <w:t xml:space="preserve"> </w:t>
+      </w:r>
+      <w:proofErr w:type="spellStart"/>
+      <w:r>
+        <w:rPr>
+          <w:rFonts w:eastAsia="Linux Libertine" w:cstheme="majorBidi"/>
+        </w:rPr>
+        <w:t>DWSim</w:t>
+      </w:r>
+      <w:proofErr w:type="spellEnd"/>
+      <w:r>
+        <w:rPr>
+          <w:rFonts w:eastAsia="Linux Libertine" w:cstheme="majorBidi"/>
+        </w:rPr>
+        <w:t>,</w:t>
+      </w:r>
+      <w:r>
+        <w:rPr>
+          <w:rFonts w:eastAsia="Linux Libertine" w:cstheme="majorBidi"/>
+        </w:rPr>
+        <w:t xml:space="preserve"> Optimization, AI Agent, Process Simulation</w:t>
       </w:r>
     </w:p>
     <w:p>
@@ -615,7 +664,15 @@
         <w:t xml:space="preserve"> to successfully design, train, and deploy an AI-augmented digital twin for a CDU. The </w:t>
       </w:r>
       <w:r>
-        <w:t xml:space="preserve">application has a Django dashboard to interact with the backend system comprising of a process Digital Twin built on DWSim, an optimizer built on Deep Reinforcement Learning agent, and a LLM-based AI Agent which creates reports and interacts with the user for explainability. </w:t>
+        <w:t xml:space="preserve">application has a Django dashboard to interact with the backend system comprising of a process Digital Twin built on </w:t>
+      </w:r>
+      <w:proofErr w:type="spellStart"/>
+      <w:r>
+        <w:t>DWSim</w:t>
+      </w:r>
+      <w:proofErr w:type="spellEnd"/>
+      <w:r>
+        <w:t xml:space="preserve">, an optimizer built on Deep Reinforcement Learning agent, and a LLM-based AI Agent which creates reports and interacts with the user for explainability. </w:t>
       </w:r>
       <w:r>
         <w:t>In th</w:t>
@@ -630,7 +687,15 @@
         <w:t xml:space="preserve">eep </w:t>
       </w:r>
       <w:r>
-        <w:t xml:space="preserve">RL agent to interact with the underlying DWSim physical model to discover optimal operating parameters. The final output </w:t>
+        <w:t xml:space="preserve">RL agent to interact with the underlying </w:t>
+      </w:r>
+      <w:proofErr w:type="spellStart"/>
+      <w:r>
+        <w:t>DWSim</w:t>
+      </w:r>
+      <w:proofErr w:type="spellEnd"/>
+      <w:r>
+        <w:t xml:space="preserve"> physical model to discover optimal operating parameters. The final output </w:t>
       </w:r>
       <w:r>
         <w:t>is</w:t>
@@ -672,24 +737,37 @@
     </w:p>
     <w:p>
       <w:pPr>
-        <w:rPr>
-          <w:rFonts w:eastAsia="Times New Roman" w:cs="Times New Roman"/>
-        </w:rPr>
-      </w:pPr>
-      <w:r>
-        <w:t xml:space="preserve">This section of your final report should include details about your dataset and your exploratory data analysis. The reader should be able to answer the following questions: </w:t>
-      </w:r>
-    </w:p>
-    <w:p>
-      <w:pPr>
         <w:pStyle w:val="ListParagraph"/>
         <w:numPr>
           <w:ilvl w:val="0"/>
-          <w:numId w:val="4"/>
+          <w:numId w:val="11"/>
         </w:numPr>
-      </w:pPr>
-      <w:r>
-        <w:t xml:space="preserve">What variables are present in your dataset? Describe these in plain language rather than using the variable names from your code. </w:t>
+        <w:rPr>
+          <w:i/>
+          <w:iCs/>
+          <w:vanish/>
+        </w:rPr>
+      </w:pPr>
+    </w:p>
+    <w:p>
+      <w:pPr>
+        <w:pStyle w:val="ListParagraph"/>
+        <w:numPr>
+          <w:ilvl w:val="1"/>
+          <w:numId w:val="11"/>
+        </w:numPr>
+        <w:ind w:left="284"/>
+        <w:rPr>
+          <w:i/>
+          <w:iCs/>
+        </w:rPr>
+      </w:pPr>
+      <w:r>
+        <w:rPr>
+          <w:i/>
+          <w:iCs/>
+        </w:rPr>
+        <w:t>Input State Representation</w:t>
       </w:r>
     </w:p>
     <w:p>
@@ -697,15 +775,730 @@
         <w:pStyle w:val="ListParagraph"/>
         <w:numPr>
           <w:ilvl w:val="0"/>
-          <w:numId w:val="4"/>
+          <w:numId w:val="0"/>
         </w:numPr>
-      </w:pPr>
-      <w:r>
-        <w:t xml:space="preserve">What issues were present in your dataset and what steps were taken to handle them (missing data, regularization, etc.)? Do you know the source of these data issues, </w:t>
+        <w:ind w:left="284"/>
+        <w:rPr>
+          <w:i/>
+          <w:iCs/>
+        </w:rPr>
+      </w:pPr>
+    </w:p>
+    <w:p>
+      <w:pPr>
+        <w:ind w:left="-76"/>
+      </w:pPr>
+      <w:r>
+        <w:t>Our study revolves around finding the most optimized manner of distillation of crude. Hence,</w:t>
+      </w:r>
+      <w:r>
+        <w:t xml:space="preserve"> one of the primary focuses in this</w:t>
+      </w:r>
+      <w:r>
+        <w:t xml:space="preserve"> study </w:t>
+      </w:r>
+      <w:r>
+        <w:t xml:space="preserve">is to understand the properties of </w:t>
+      </w:r>
+      <w:r>
+        <w:t xml:space="preserve">commonly available crude assays. </w:t>
+      </w:r>
+      <w:r>
+        <w:t xml:space="preserve">The dataset </w:t>
+      </w:r>
+      <w:r>
+        <w:t xml:space="preserve">chosen </w:t>
+      </w:r>
+      <w:r>
+        <w:t xml:space="preserve">comprises physicochemical properties for five distinctive crude oil assays (Azeri Light, Erha, Tapis, Upper </w:t>
+      </w:r>
+      <w:proofErr w:type="spellStart"/>
+      <w:r>
+        <w:t>Zakum</w:t>
+      </w:r>
+      <w:proofErr w:type="spellEnd"/>
+      <w:r>
+        <w:t xml:space="preserve">, and WTI Light) sourced from the </w:t>
+      </w:r>
+      <w:r>
+        <w:t>ExxonMobil’s open</w:t>
+      </w:r>
+      <w:r>
+        <w:t xml:space="preserve"> database</w:t>
+      </w:r>
+      <w:r>
+        <w:t xml:space="preserve"> </w:t>
+      </w:r>
+      <w:r>
+        <w:t>(ExxonMobil, n.d.)</w:t>
+      </w:r>
+      <w:r>
+        <w:t xml:space="preserve">. </w:t>
+      </w:r>
+    </w:p>
+    <w:p>
+      <w:pPr>
+        <w:ind w:left="-76"/>
+      </w:pPr>
+      <w:r>
+        <w:t>Whole Crude Physicochemical Attributes</w:t>
+      </w:r>
+      <w:r>
+        <w:t xml:space="preserve"> such as</w:t>
+      </w:r>
+      <w:r>
+        <w:t xml:space="preserve"> mass density</w:t>
+      </w:r>
+      <w:r>
+        <w:t xml:space="preserve">, </w:t>
+      </w:r>
+      <w:r>
+        <w:t xml:space="preserve">API gravity (the standard measure of </w:t>
       </w:r>
       <w:r>
         <w:lastRenderedPageBreak/>
-        <w:t xml:space="preserve">and how would you deal with these issues in a fully developed machine learning pipeline? </w:t>
+        <w:t xml:space="preserve">extent of heaviness of </w:t>
+      </w:r>
+      <w:r>
+        <w:t>oil), Total Sulfur content, and Total Acid Number (TAN)</w:t>
+      </w:r>
+      <w:r>
+        <w:t xml:space="preserve"> are critical defining factors of crude assays. </w:t>
+      </w:r>
+      <w:r>
+        <w:t>These properties are critical as they define the intrinsic quality and potential corrosivity of the feed (González-Durán et al., 2024; Al-Sayegh et al., 2016).</w:t>
+      </w:r>
+      <w:r>
+        <w:t xml:space="preserve"> </w:t>
+      </w:r>
+      <w:r>
+        <w:t>Concentrations of Nitrogen and metals such as Vanadium (V) and Nickel (Ni)</w:t>
+      </w:r>
+      <w:r>
+        <w:t xml:space="preserve"> </w:t>
+      </w:r>
+      <w:r>
+        <w:t xml:space="preserve">are significant </w:t>
+      </w:r>
+      <w:r>
+        <w:t>since they</w:t>
+      </w:r>
+      <w:r>
+        <w:t xml:space="preserve"> serve as catalyst poisons in downstream units like fluid catalytic cracking (FCC) (Al-Sayegh et al., 2016).</w:t>
+      </w:r>
+      <w:r>
+        <w:t xml:space="preserve"> </w:t>
+      </w:r>
+      <w:r>
+        <w:t>Rheological and Volatility Markers</w:t>
+      </w:r>
+      <w:r>
+        <w:t xml:space="preserve"> </w:t>
+      </w:r>
+      <w:r>
+        <w:t>such as Kinematic Viscosity, Reid Vapor Pressure (RVP), and Pour Point characterize the flow behavior and thermal stability of the crude.</w:t>
+      </w:r>
+      <w:r>
+        <w:t xml:space="preserve"> </w:t>
+      </w:r>
+      <w:r>
+        <w:t>The True Boiling Point (TBP) curve defines the volumetric and weight percentage yields for various product cuts (Naphtha, Kerosene, Diesel, and Residue). Quality metrics for these cuts—such as Octane Number (RON/MON) for Naphtha and Cetane Index for Diesel</w:t>
+      </w:r>
+      <w:r>
+        <w:t xml:space="preserve"> </w:t>
+      </w:r>
+      <w:r>
+        <w:t>—</w:t>
+      </w:r>
+      <w:r>
+        <w:t xml:space="preserve"> </w:t>
+      </w:r>
+      <w:r>
+        <w:t xml:space="preserve">are utilized as process constraints within </w:t>
+      </w:r>
+      <w:r>
+        <w:t xml:space="preserve">downstream process </w:t>
+      </w:r>
+      <w:r>
+        <w:t>optimizer</w:t>
+      </w:r>
+      <w:r>
+        <w:t>s</w:t>
+      </w:r>
+      <w:r>
+        <w:t xml:space="preserve"> (</w:t>
+      </w:r>
+      <w:proofErr w:type="spellStart"/>
+      <w:r>
+        <w:t>AlRijeb</w:t>
+      </w:r>
+      <w:proofErr w:type="spellEnd"/>
+      <w:r>
+        <w:t xml:space="preserve"> et al., 2025; Li et al., 2025).</w:t>
+      </w:r>
+    </w:p>
+    <w:p>
+      <w:pPr>
+        <w:ind w:left="-76"/>
+      </w:pPr>
+    </w:p>
+    <w:p>
+      <w:pPr>
+        <w:ind w:left="-76"/>
+      </w:pPr>
+      <w:r>
+        <w:drawing>
+          <wp:inline distT="0" distB="0" distL="0" distR="0" wp14:anchorId="6960FB71" wp14:editId="71E4CACD">
+            <wp:extent cx="3048000" cy="1074069"/>
+            <wp:effectExtent l="0" t="0" r="0" b="0"/>
+            <wp:docPr id="1053767865" name="Picture 1"/>
+            <wp:cNvGraphicFramePr>
+              <a:graphicFrameLocks xmlns:a="http://schemas.openxmlformats.org/drawingml/2006/main" noChangeAspect="1"/>
+            </wp:cNvGraphicFramePr>
+            <a:graphic xmlns:a="http://schemas.openxmlformats.org/drawingml/2006/main">
+              <a:graphicData uri="http://schemas.openxmlformats.org/drawingml/2006/picture">
+                <pic:pic xmlns:pic="http://schemas.openxmlformats.org/drawingml/2006/picture">
+                  <pic:nvPicPr>
+                    <pic:cNvPr id="818368988" name=""/>
+                    <pic:cNvPicPr/>
+                  </pic:nvPicPr>
+                  <pic:blipFill>
+                    <a:blip r:embed="rId15"/>
+                    <a:stretch>
+                      <a:fillRect/>
+                    </a:stretch>
+                  </pic:blipFill>
+                  <pic:spPr>
+                    <a:xfrm>
+                      <a:off x="0" y="0"/>
+                      <a:ext cx="3048000" cy="1074069"/>
+                    </a:xfrm>
+                    <a:prstGeom prst="rect">
+                      <a:avLst/>
+                    </a:prstGeom>
+                  </pic:spPr>
+                </pic:pic>
+              </a:graphicData>
+            </a:graphic>
+          </wp:inline>
+        </w:drawing>
+      </w:r>
+    </w:p>
+    <w:p>
+      <w:pPr>
+        <w:ind w:left="-76"/>
+      </w:pPr>
+      <w:r>
+        <w:drawing>
+          <wp:inline distT="0" distB="0" distL="0" distR="0" wp14:anchorId="6052EDBC" wp14:editId="0F46549F">
+            <wp:extent cx="3048000" cy="868025"/>
+            <wp:effectExtent l="0" t="0" r="0" b="8890"/>
+            <wp:docPr id="1776363169" name="Picture 1"/>
+            <wp:cNvGraphicFramePr>
+              <a:graphicFrameLocks xmlns:a="http://schemas.openxmlformats.org/drawingml/2006/main" noChangeAspect="1"/>
+            </wp:cNvGraphicFramePr>
+            <a:graphic xmlns:a="http://schemas.openxmlformats.org/drawingml/2006/main">
+              <a:graphicData uri="http://schemas.openxmlformats.org/drawingml/2006/picture">
+                <pic:pic xmlns:pic="http://schemas.openxmlformats.org/drawingml/2006/picture">
+                  <pic:nvPicPr>
+                    <pic:cNvPr id="1405877390" name=""/>
+                    <pic:cNvPicPr/>
+                  </pic:nvPicPr>
+                  <pic:blipFill>
+                    <a:blip r:embed="rId16"/>
+                    <a:stretch>
+                      <a:fillRect/>
+                    </a:stretch>
+                  </pic:blipFill>
+                  <pic:spPr>
+                    <a:xfrm>
+                      <a:off x="0" y="0"/>
+                      <a:ext cx="3048000" cy="868025"/>
+                    </a:xfrm>
+                    <a:prstGeom prst="rect">
+                      <a:avLst/>
+                    </a:prstGeom>
+                  </pic:spPr>
+                </pic:pic>
+              </a:graphicData>
+            </a:graphic>
+          </wp:inline>
+        </w:drawing>
+      </w:r>
+    </w:p>
+    <w:p>
+      <w:pPr>
+        <w:tabs>
+          <w:tab w:val="center" w:pos="4320"/>
+          <w:tab w:val="right" w:pos="8640"/>
+        </w:tabs>
+        <w:ind w:left="-142" w:right="360"/>
+        <w:rPr>
+          <w:rFonts w:eastAsia="Linux Biolinum" w:cs="Times New Roman"/>
+          <w:i/>
+          <w:iCs/>
+          <w:color w:val="000000"/>
+          <w:sz w:val="18"/>
+          <w:szCs w:val="18"/>
+        </w:rPr>
+      </w:pPr>
+      <w:r>
+        <w:rPr>
+          <w:rFonts w:eastAsia="Linux Biolinum" w:cs="Times New Roman"/>
+          <w:i/>
+          <w:iCs/>
+          <w:color w:val="000000"/>
+          <w:sz w:val="18"/>
+          <w:szCs w:val="18"/>
+        </w:rPr>
+        <w:t xml:space="preserve">Fig 1. (a). API Gravity, Density (at 15 </w:t>
+      </w:r>
+      <w:proofErr w:type="spellStart"/>
+      <w:r>
+        <w:rPr>
+          <w:rFonts w:eastAsia="Linux Biolinum" w:cs="Times New Roman"/>
+          <w:i/>
+          <w:iCs/>
+          <w:color w:val="000000"/>
+          <w:sz w:val="18"/>
+          <w:szCs w:val="18"/>
+          <w:vertAlign w:val="superscript"/>
+        </w:rPr>
+        <w:t>o</w:t>
+      </w:r>
+      <w:r>
+        <w:rPr>
+          <w:rFonts w:eastAsia="Linux Biolinum" w:cs="Times New Roman"/>
+          <w:i/>
+          <w:iCs/>
+          <w:color w:val="000000"/>
+          <w:sz w:val="18"/>
+          <w:szCs w:val="18"/>
+        </w:rPr>
+        <w:t>C</w:t>
+      </w:r>
+      <w:proofErr w:type="spellEnd"/>
+      <w:r>
+        <w:rPr>
+          <w:rFonts w:eastAsia="Linux Biolinum" w:cs="Times New Roman"/>
+          <w:i/>
+          <w:iCs/>
+          <w:color w:val="000000"/>
+          <w:sz w:val="18"/>
+          <w:szCs w:val="18"/>
+        </w:rPr>
+        <w:t>) and Total Sulphur distribution in the selected crude assays</w:t>
+      </w:r>
+    </w:p>
+    <w:p>
+      <w:pPr>
+        <w:tabs>
+          <w:tab w:val="center" w:pos="4320"/>
+          <w:tab w:val="right" w:pos="8640"/>
+        </w:tabs>
+        <w:ind w:left="-142" w:right="360"/>
+        <w:rPr>
+          <w:rFonts w:eastAsia="Linux Biolinum" w:cs="Times New Roman"/>
+          <w:i/>
+          <w:iCs/>
+          <w:color w:val="000000"/>
+          <w:sz w:val="18"/>
+          <w:szCs w:val="18"/>
+        </w:rPr>
+      </w:pPr>
+      <w:r>
+        <w:rPr>
+          <w:rFonts w:eastAsia="Linux Biolinum" w:cs="Times New Roman"/>
+          <w:i/>
+          <w:iCs/>
+          <w:color w:val="000000"/>
+          <w:sz w:val="18"/>
+          <w:szCs w:val="18"/>
+        </w:rPr>
+        <w:t>Fig 1. (b) Metals and Total Nitrogen content in the selected crude assays</w:t>
+      </w:r>
+    </w:p>
+    <w:p>
+      <w:pPr>
+        <w:ind w:left="-76"/>
+      </w:pPr>
+    </w:p>
+    <w:p>
+      <w:pPr>
+        <w:ind w:left="-76"/>
+      </w:pPr>
+    </w:p>
+    <w:p>
+      <w:pPr>
+        <w:pStyle w:val="ListParagraph"/>
+        <w:numPr>
+          <w:ilvl w:val="1"/>
+          <w:numId w:val="11"/>
+        </w:numPr>
+        <w:ind w:left="284"/>
+        <w:rPr>
+          <w:i/>
+          <w:iCs/>
+        </w:rPr>
+      </w:pPr>
+      <w:r>
+        <w:rPr>
+          <w:i/>
+          <w:iCs/>
+        </w:rPr>
+        <w:t>Fractional Yield Dynamics and TBP Analysis</w:t>
+      </w:r>
+    </w:p>
+    <w:p>
+      <w:pPr>
+        <w:ind w:left="-76"/>
+      </w:pPr>
+      <w:r>
+        <w:t xml:space="preserve">Upon analysis, </w:t>
+      </w:r>
+      <w:r>
+        <w:t xml:space="preserve">True Boiling Point (TBP) distillation curves derived from the dataset </w:t>
+      </w:r>
+      <w:r>
+        <w:t>shed light on</w:t>
+      </w:r>
+      <w:r>
+        <w:t xml:space="preserve"> significant disparities in product slates. WTI Light and Tapis </w:t>
+      </w:r>
+      <w:r>
+        <w:t xml:space="preserve">have </w:t>
+      </w:r>
+      <w:r>
+        <w:t>demonstrate</w:t>
+      </w:r>
+      <w:r>
+        <w:t>d</w:t>
+      </w:r>
+      <w:r>
+        <w:t xml:space="preserve"> superior Naphtha yields, which are essential for gasoline production. Conversely, Erha and Tapis </w:t>
+      </w:r>
+      <w:r>
+        <w:t xml:space="preserve">have </w:t>
+      </w:r>
+      <w:r>
+        <w:t>show</w:t>
+      </w:r>
+      <w:r>
+        <w:t>ed</w:t>
+      </w:r>
+      <w:r>
+        <w:t xml:space="preserve"> a higher propensity for middle distillate production</w:t>
+      </w:r>
+      <w:r>
+        <w:t xml:space="preserve"> like</w:t>
+      </w:r>
+      <w:r>
+        <w:t xml:space="preserve"> Kerosene and Diesel. Upper </w:t>
+      </w:r>
+      <w:proofErr w:type="spellStart"/>
+      <w:r>
+        <w:t>Zakum</w:t>
+      </w:r>
+      <w:proofErr w:type="spellEnd"/>
+      <w:r>
+        <w:t xml:space="preserve"> is characterized by a bottom-heavy profile, yielding a higher percentage of Vacuum Gas Oil (VGO) and atmospheric residues. </w:t>
+      </w:r>
+      <w:r>
+        <w:t xml:space="preserve">Since the Deep RL agent is inherently aimed at driving margins, </w:t>
+      </w:r>
+      <w:r>
+        <w:t>yield distributions directly impact the reward function of the optimizer; for instance, when market prices favor Jet Fuel, the optimizer must identify the specific operating temperatures within the digital twin that maximize the Kerosene cuts while maintaining thermodynamic stability (Li et al., 2025).</w:t>
+      </w:r>
+    </w:p>
+    <w:p>
+      <w:pPr>
+        <w:ind w:left="-76"/>
+      </w:pPr>
+      <w:r>
+        <w:drawing>
+          <wp:inline distT="0" distB="0" distL="0" distR="0" wp14:anchorId="7C1D3F5A" wp14:editId="72E458CA">
+            <wp:extent cx="3048000" cy="419582"/>
+            <wp:effectExtent l="0" t="0" r="0" b="0"/>
+            <wp:docPr id="1500887650" name="Picture 1"/>
+            <wp:cNvGraphicFramePr>
+              <a:graphicFrameLocks xmlns:a="http://schemas.openxmlformats.org/drawingml/2006/main" noChangeAspect="1"/>
+            </wp:cNvGraphicFramePr>
+            <a:graphic xmlns:a="http://schemas.openxmlformats.org/drawingml/2006/main">
+              <a:graphicData uri="http://schemas.openxmlformats.org/drawingml/2006/picture">
+                <pic:pic xmlns:pic="http://schemas.openxmlformats.org/drawingml/2006/picture">
+                  <pic:nvPicPr>
+                    <pic:cNvPr id="999901175" name=""/>
+                    <pic:cNvPicPr/>
+                  </pic:nvPicPr>
+                  <pic:blipFill>
+                    <a:blip r:embed="rId17"/>
+                    <a:stretch>
+                      <a:fillRect/>
+                    </a:stretch>
+                  </pic:blipFill>
+                  <pic:spPr>
+                    <a:xfrm>
+                      <a:off x="0" y="0"/>
+                      <a:ext cx="3048000" cy="419582"/>
+                    </a:xfrm>
+                    <a:prstGeom prst="rect">
+                      <a:avLst/>
+                    </a:prstGeom>
+                  </pic:spPr>
+                </pic:pic>
+              </a:graphicData>
+            </a:graphic>
+          </wp:inline>
+        </w:drawing>
+      </w:r>
+    </w:p>
+    <w:p>
+      <w:pPr>
+        <w:ind w:left="-76"/>
+        <w:rPr>
+          <w:i/>
+          <w:iCs/>
+          <w:sz w:val="18"/>
+          <w:szCs w:val="18"/>
+        </w:rPr>
+      </w:pPr>
+      <w:r>
+        <w:rPr>
+          <w:i/>
+          <w:iCs/>
+          <w:sz w:val="18"/>
+          <w:szCs w:val="18"/>
+        </w:rPr>
+        <w:t xml:space="preserve">Fig 2. </w:t>
+      </w:r>
+      <w:r>
+        <w:rPr>
+          <w:i/>
+          <w:iCs/>
+          <w:sz w:val="18"/>
+          <w:szCs w:val="18"/>
+        </w:rPr>
+        <w:t>Crude-wise yield distribution (</w:t>
+      </w:r>
+      <w:proofErr w:type="spellStart"/>
+      <w:r>
+        <w:rPr>
+          <w:i/>
+          <w:iCs/>
+          <w:sz w:val="18"/>
+          <w:szCs w:val="18"/>
+        </w:rPr>
+        <w:t>wt</w:t>
+      </w:r>
+      <w:proofErr w:type="spellEnd"/>
+      <w:r>
+        <w:rPr>
+          <w:i/>
+          <w:iCs/>
+          <w:sz w:val="18"/>
+          <w:szCs w:val="18"/>
+        </w:rPr>
+        <w:t>%)</w:t>
+      </w:r>
+    </w:p>
+    <w:p>
+      <w:pPr>
+        <w:ind w:left="-76"/>
+        <w:rPr>
+          <w:i/>
+          <w:iCs/>
+          <w:sz w:val="18"/>
+          <w:szCs w:val="18"/>
+        </w:rPr>
+      </w:pPr>
+    </w:p>
+    <w:p>
+      <w:pPr>
+        <w:pStyle w:val="ListParagraph"/>
+        <w:numPr>
+          <w:ilvl w:val="1"/>
+          <w:numId w:val="11"/>
+        </w:numPr>
+        <w:ind w:left="284"/>
+        <w:rPr>
+          <w:i/>
+          <w:iCs/>
+        </w:rPr>
+      </w:pPr>
+      <w:r>
+        <w:rPr>
+          <w:i/>
+          <w:iCs/>
+        </w:rPr>
+        <w:t>Contaminant Profiles and Catalyst Poisoning Potential</w:t>
+      </w:r>
+    </w:p>
+    <w:p>
+      <w:pPr>
+        <w:ind w:left="-76"/>
+      </w:pPr>
+      <w:r>
+        <w:t>The comparative study</w:t>
+      </w:r>
+      <w:r>
+        <w:t xml:space="preserve"> between the selected crude assays</w:t>
+      </w:r>
+      <w:r>
+        <w:t xml:space="preserve"> </w:t>
+      </w:r>
+      <w:r>
+        <w:t>indicates towards</w:t>
+      </w:r>
+      <w:r>
+        <w:t xml:space="preserve"> a strong correlation between the density of the crude and the concentration of catalyst poisons, specifically Vanadium, Nickel, and Micro-Carbon Residue (MCR). WTI Light and Tapis are identified as the cleanest feedstocks, with minimal metal content, making their heavy fractions ideal for Fluid Catalytic Cracking (FCC) units. </w:t>
+      </w:r>
+      <w:r>
+        <w:t>Whereas,</w:t>
+      </w:r>
+      <w:r>
+        <w:t xml:space="preserve"> high levels of metals and asphaltenes in Upper </w:t>
+      </w:r>
+      <w:proofErr w:type="spellStart"/>
+      <w:r>
+        <w:t>Zakum</w:t>
+      </w:r>
+      <w:proofErr w:type="spellEnd"/>
+      <w:r>
+        <w:t xml:space="preserve"> and Azeri Light </w:t>
+      </w:r>
+      <w:r>
+        <w:t>may pose a</w:t>
+      </w:r>
+      <w:r>
+        <w:t xml:space="preserve"> significant </w:t>
+      </w:r>
+      <w:r>
+        <w:t>challenge</w:t>
+      </w:r>
+      <w:r>
+        <w:t xml:space="preserve"> </w:t>
+      </w:r>
+      <w:r>
+        <w:lastRenderedPageBreak/>
+        <w:t xml:space="preserve">for downstream catalyst deactivation (Al-Sayegh et al., 2016). </w:t>
+      </w:r>
+    </w:p>
+    <w:p>
+      <w:pPr>
+        <w:ind w:left="-76"/>
+      </w:pPr>
+    </w:p>
+    <w:p>
+      <w:pPr>
+        <w:ind w:left="-76"/>
+      </w:pPr>
+      <w:r>
+        <w:drawing>
+          <wp:inline distT="0" distB="0" distL="0" distR="0" wp14:anchorId="15043C0B" wp14:editId="6390284F">
+            <wp:extent cx="3048000" cy="2830830"/>
+            <wp:effectExtent l="0" t="0" r="0" b="7620"/>
+            <wp:docPr id="2120420310" name="Picture 1"/>
+            <wp:cNvGraphicFramePr>
+              <a:graphicFrameLocks xmlns:a="http://schemas.openxmlformats.org/drawingml/2006/main" noChangeAspect="1"/>
+            </wp:cNvGraphicFramePr>
+            <a:graphic xmlns:a="http://schemas.openxmlformats.org/drawingml/2006/main">
+              <a:graphicData uri="http://schemas.openxmlformats.org/drawingml/2006/picture">
+                <pic:pic xmlns:pic="http://schemas.openxmlformats.org/drawingml/2006/picture">
+                  <pic:nvPicPr>
+                    <pic:cNvPr id="2120420310" name=""/>
+                    <pic:cNvPicPr/>
+                  </pic:nvPicPr>
+                  <pic:blipFill rotWithShape="1">
+                    <a:blip r:embed="rId18"/>
+                    <a:srcRect t="6384"/>
+                    <a:stretch>
+                      <a:fillRect/>
+                    </a:stretch>
+                  </pic:blipFill>
+                  <pic:spPr bwMode="auto">
+                    <a:xfrm>
+                      <a:off x="0" y="0"/>
+                      <a:ext cx="3048000" cy="2830830"/>
+                    </a:xfrm>
+                    <a:prstGeom prst="rect">
+                      <a:avLst/>
+                    </a:prstGeom>
+                    <a:ln>
+                      <a:noFill/>
+                    </a:ln>
+                    <a:extLst>
+                      <a:ext uri="{53640926-AAD7-44D8-BBD7-CCE9431645EC}">
+                        <a14:shadowObscured xmlns:a14="http://schemas.microsoft.com/office/drawing/2010/main"/>
+                      </a:ext>
+                    </a:extLst>
+                  </pic:spPr>
+                </pic:pic>
+              </a:graphicData>
+            </a:graphic>
+          </wp:inline>
+        </w:drawing>
+      </w:r>
+    </w:p>
+    <w:p>
+      <w:pPr>
+        <w:ind w:left="-76"/>
+      </w:pPr>
+      <w:r>
+        <w:rPr>
+          <w:i/>
+          <w:iCs/>
+          <w:sz w:val="18"/>
+          <w:szCs w:val="18"/>
+        </w:rPr>
+        <w:t xml:space="preserve">Fig </w:t>
+      </w:r>
+      <w:r>
+        <w:rPr>
+          <w:i/>
+          <w:iCs/>
+          <w:sz w:val="18"/>
+          <w:szCs w:val="18"/>
+        </w:rPr>
+        <w:t>3</w:t>
+      </w:r>
+      <w:r>
+        <w:rPr>
+          <w:i/>
+          <w:iCs/>
+          <w:sz w:val="18"/>
+          <w:szCs w:val="18"/>
+        </w:rPr>
+        <w:t xml:space="preserve">. </w:t>
+      </w:r>
+      <w:r>
+        <w:rPr>
+          <w:i/>
+          <w:iCs/>
+          <w:sz w:val="18"/>
+          <w:szCs w:val="18"/>
+        </w:rPr>
+        <w:t>Radar-chart showing comparative study of major factors of crude quality</w:t>
+      </w:r>
+    </w:p>
+    <w:p>
+      <w:pPr>
+        <w:pStyle w:val="ListParagraph"/>
+        <w:numPr>
+          <w:ilvl w:val="1"/>
+          <w:numId w:val="11"/>
+        </w:numPr>
+        <w:ind w:left="284"/>
+        <w:rPr>
+          <w:i/>
+          <w:iCs/>
+        </w:rPr>
+      </w:pPr>
+      <w:r>
+        <w:rPr>
+          <w:i/>
+          <w:iCs/>
+        </w:rPr>
+        <w:t>Economic Feedstock Suitability and Decision Optimization</w:t>
       </w:r>
     </w:p>
     <w:p>
@@ -713,26 +1506,202 @@
         <w:pStyle w:val="ListParagraph"/>
         <w:numPr>
           <w:ilvl w:val="0"/>
-          <w:numId w:val="4"/>
+          <w:numId w:val="0"/>
         </w:numPr>
-      </w:pPr>
-      <w:r>
-        <w:t xml:space="preserve">How are your variables related to your project goal? Do you see any patterns in the data that would suggest that they are/are not going to be useful in your machine learning model(s)? </w:t>
-      </w:r>
-    </w:p>
-    <w:p>
-      <w:pPr>
-        <w:pStyle w:val="ListParagraph"/>
-        <w:numPr>
-          <w:ilvl w:val="0"/>
-          <w:numId w:val="4"/>
-        </w:numPr>
-        <w:rPr>
-          <w:rFonts w:eastAsia="Times New Roman"/>
-        </w:rPr>
-      </w:pPr>
-      <w:r>
-        <w:t>How are your variables related to each other? Are there any strong correlations? How might this affect how you build your machine learning model(s)?</w:t>
+        <w:ind w:left="284"/>
+        <w:rPr>
+          <w:i/>
+          <w:iCs/>
+        </w:rPr>
+      </w:pPr>
+    </w:p>
+    <w:p>
+      <w:pPr>
+        <w:ind w:left="-76"/>
+        <w:rPr>
+          <w:lang w:val="en-IN"/>
+        </w:rPr>
+      </w:pPr>
+      <w:r>
+        <w:rPr>
+          <w:lang w:val="en-IN"/>
+        </w:rPr>
+        <w:t>E</w:t>
+      </w:r>
+      <w:r>
+        <w:rPr>
+          <w:lang w:val="en-IN"/>
+        </w:rPr>
+        <w:t>conomic trade-offs associated with each assay's quality</w:t>
+      </w:r>
+      <w:r>
+        <w:rPr>
+          <w:lang w:val="en-IN"/>
+        </w:rPr>
+        <w:t xml:space="preserve"> studied in detail indicates </w:t>
+      </w:r>
+      <w:r>
+        <w:rPr>
+          <w:lang w:val="en-IN"/>
+        </w:rPr>
+        <w:t xml:space="preserve">that Erha provides an optimal balance for diesel-centric production, whereas Upper </w:t>
+      </w:r>
+      <w:proofErr w:type="spellStart"/>
+      <w:r>
+        <w:rPr>
+          <w:lang w:val="en-IN"/>
+        </w:rPr>
+        <w:t>Zakum</w:t>
+      </w:r>
+      <w:proofErr w:type="spellEnd"/>
+      <w:r>
+        <w:rPr>
+          <w:lang w:val="en-IN"/>
+        </w:rPr>
+        <w:t>, despite its high impurity levels, may offer higher margins if the refinery can effectively manage its heavy-end processing.</w:t>
+      </w:r>
+      <w:r>
+        <w:rPr>
+          <w:lang w:val="en-IN"/>
+        </w:rPr>
+        <w:t xml:space="preserve"> </w:t>
+      </w:r>
+      <w:r>
+        <w:rPr>
+          <w:lang w:val="en-IN"/>
+        </w:rPr>
+        <w:t xml:space="preserve">While WTI Light offers the highest yield of high-value light ends and the lowest treating costs, it typically commands a market premium. The data suggests </w:t>
+      </w:r>
+      <w:r>
+        <w:rPr>
+          <w:lang w:val="en-IN"/>
+        </w:rPr>
+        <w:t>that</w:t>
+      </w:r>
+      <w:r>
+        <w:rPr>
+          <w:lang w:val="en-IN"/>
+        </w:rPr>
+        <w:t xml:space="preserve"> integration of a Large Language Model (LLM) as an interpretability layer is essential here; it translates these complex thermodynamic and economic trade-offs into natural language engineering reports. This "Explainable AI" (XAI) approach allows operators to understand why the agent might suggest a more difficult-to-process feed like Upper </w:t>
+      </w:r>
+      <w:proofErr w:type="spellStart"/>
+      <w:r>
+        <w:rPr>
+          <w:lang w:val="en-IN"/>
+        </w:rPr>
+        <w:t>Zakum</w:t>
+      </w:r>
+      <w:proofErr w:type="spellEnd"/>
+      <w:r>
+        <w:rPr>
+          <w:lang w:val="en-IN"/>
+        </w:rPr>
+        <w:t xml:space="preserve"> during periods of specific market volatility (Wellawatte &amp; Schwaller, 2025).</w:t>
+      </w:r>
+    </w:p>
+    <w:p>
+      <w:pPr>
+        <w:ind w:left="-76"/>
+        <w:rPr>
+          <w:lang w:val="en-IN"/>
+        </w:rPr>
+      </w:pPr>
+    </w:p>
+    <w:p>
+      <w:pPr>
+        <w:ind w:left="-76"/>
+        <w:rPr>
+          <w:i/>
+          <w:iCs/>
+          <w:lang w:val="en-IN"/>
+        </w:rPr>
+      </w:pPr>
+      <w:r>
+        <w:rPr>
+          <w:lang w:val="en-IN"/>
+        </w:rPr>
+        <w:drawing>
+          <wp:inline distT="0" distB="0" distL="0" distR="0" wp14:anchorId="746D0E6D" wp14:editId="497DD0C3">
+            <wp:extent cx="3048000" cy="672465"/>
+            <wp:effectExtent l="0" t="0" r="0" b="0"/>
+            <wp:docPr id="429008408" name="Picture 1"/>
+            <wp:cNvGraphicFramePr>
+              <a:graphicFrameLocks xmlns:a="http://schemas.openxmlformats.org/drawingml/2006/main" noChangeAspect="1"/>
+            </wp:cNvGraphicFramePr>
+            <a:graphic xmlns:a="http://schemas.openxmlformats.org/drawingml/2006/main">
+              <a:graphicData uri="http://schemas.openxmlformats.org/drawingml/2006/picture">
+                <pic:pic xmlns:pic="http://schemas.openxmlformats.org/drawingml/2006/picture">
+                  <pic:nvPicPr>
+                    <pic:cNvPr id="429008408" name=""/>
+                    <pic:cNvPicPr/>
+                  </pic:nvPicPr>
+                  <pic:blipFill>
+                    <a:blip r:embed="rId19"/>
+                    <a:stretch>
+                      <a:fillRect/>
+                    </a:stretch>
+                  </pic:blipFill>
+                  <pic:spPr>
+                    <a:xfrm>
+                      <a:off x="0" y="0"/>
+                      <a:ext cx="3048000" cy="672465"/>
+                    </a:xfrm>
+                    <a:prstGeom prst="rect">
+                      <a:avLst/>
+                    </a:prstGeom>
+                  </pic:spPr>
+                </pic:pic>
+              </a:graphicData>
+            </a:graphic>
+          </wp:inline>
+        </w:drawing>
+      </w:r>
+    </w:p>
+    <w:p>
+      <w:pPr>
+        <w:ind w:left="-76"/>
+        <w:rPr>
+          <w:i/>
+          <w:iCs/>
+          <w:sz w:val="18"/>
+          <w:szCs w:val="18"/>
+        </w:rPr>
+      </w:pPr>
+      <w:r>
+        <w:rPr>
+          <w:i/>
+          <w:iCs/>
+          <w:sz w:val="18"/>
+          <w:szCs w:val="18"/>
+        </w:rPr>
+        <w:t xml:space="preserve">Fig </w:t>
+      </w:r>
+      <w:r>
+        <w:rPr>
+          <w:i/>
+          <w:iCs/>
+          <w:sz w:val="18"/>
+          <w:szCs w:val="18"/>
+        </w:rPr>
+        <w:t>4</w:t>
+      </w:r>
+      <w:r>
+        <w:rPr>
+          <w:i/>
+          <w:iCs/>
+          <w:sz w:val="18"/>
+          <w:szCs w:val="18"/>
+        </w:rPr>
+        <w:t xml:space="preserve">. Crude-wise </w:t>
+      </w:r>
+      <w:r>
+        <w:rPr>
+          <w:i/>
+          <w:iCs/>
+          <w:sz w:val="18"/>
+          <w:szCs w:val="18"/>
+        </w:rPr>
+        <w:t>comparison based on its likely process and economic impact on a typical refinery as a whole</w:t>
       </w:r>
     </w:p>
     <w:p>
@@ -825,13 +1794,7 @@
         <w:rPr>
           <w:rFonts w:eastAsia="Times New Roman" w:cs="Times New Roman"/>
         </w:rPr>
-        <w:t xml:space="preserve"> </w:t>
-      </w:r>
-      <w:r>
-        <w:rPr>
-          <w:rFonts w:eastAsia="Times New Roman" w:cs="Times New Roman"/>
-        </w:rPr>
-        <w:t xml:space="preserve"> </w:t>
+        <w:t xml:space="preserve">  </w:t>
       </w:r>
       <m:oMath>
         <m:sSub>
@@ -917,13 +1880,7 @@
         <w:rPr>
           <w:rFonts w:eastAsia="Times New Roman" w:cs="Times New Roman"/>
         </w:rPr>
-        <w:t xml:space="preserve"> is characterized by a high-dimensional vector </w:t>
-      </w:r>
-      <w:r>
-        <w:rPr>
-          <w:rFonts w:eastAsia="Times New Roman" w:cs="Times New Roman"/>
-        </w:rPr>
-        <w:t xml:space="preserve">containing stage temperatures </w:t>
+        <w:t xml:space="preserve"> is characterized by a high-dimensional vector containing stage temperatures </w:t>
       </w:r>
       <w:r>
         <w:rPr>
@@ -969,13 +1926,7 @@
         <w:rPr>
           <w:rFonts w:eastAsia="Times New Roman" w:cs="Times New Roman"/>
         </w:rPr>
-        <w:t xml:space="preserve"> </w:t>
-      </w:r>
-      <w:r>
-        <w:rPr>
-          <w:rFonts w:eastAsia="Times New Roman" w:cs="Times New Roman"/>
-        </w:rPr>
-        <w:t xml:space="preserve"> </w:t>
+        <w:t xml:space="preserve">  </w:t>
       </w:r>
       <m:oMath>
         <m:sSub>
@@ -1009,7 +1960,14 @@
         <w:rPr>
           <w:rFonts w:eastAsia="Times New Roman" w:cs="Times New Roman"/>
         </w:rPr>
-        <w:t>, and the mass fractions of pseudocomponents across the distillation curve. A critical contribution by Wang et al. (2024) in the Journal of Process Systems Engineering highlights the importance of "Feature Engineering" in RL for refineries. They argue that normalizing states relative to the Feed Assay (the specific TBP curve of the incoming crude) allows the agent to generalize its learning across different crude blends—a concept known as Transfer Learning.</w:t>
+        <w:t xml:space="preserve">, and the mass fractions of pseudocomponents across the distillation curve. A critical contribution </w:t>
+      </w:r>
+      <w:r>
+        <w:rPr>
+          <w:rFonts w:eastAsia="Times New Roman" w:cs="Times New Roman"/>
+        </w:rPr>
+        <w:lastRenderedPageBreak/>
+        <w:t>by Wang et al. (2024) in the Journal of Process Systems Engineering highlights the importance of "Feature Engineering" in RL for refineries. They argue that normalizing states relative to the Feed Assay (the specific TBP curve of the incoming crude) allows the agent to generalize its learning across different crude blends—a concept known as Transfer Learning.</w:t>
       </w:r>
     </w:p>
     <w:p>
@@ -1019,23 +1977,25 @@
           <w:rFonts w:eastAsia="Times New Roman" w:cs="Times New Roman"/>
         </w:rPr>
       </w:pPr>
-      <w:r>
+    </w:p>
+    <w:p>
+      <w:pPr>
+        <w:spacing w:before="20"/>
         <w:rPr>
           <w:rFonts w:eastAsia="Times New Roman" w:cs="Times New Roman"/>
         </w:rPr>
+      </w:pPr>
+      <w:r>
+        <w:rPr>
+          <w:rFonts w:eastAsia="Times New Roman" w:cs="Times New Roman"/>
+        </w:rPr>
         <w:t>The reward function</w:t>
       </w:r>
       <w:r>
         <w:rPr>
           <w:rFonts w:eastAsia="Times New Roman" w:cs="Times New Roman"/>
         </w:rPr>
-        <w:t xml:space="preserve"> </w:t>
-      </w:r>
-      <w:r>
-        <w:rPr>
-          <w:rFonts w:eastAsia="Times New Roman" w:cs="Times New Roman"/>
-        </w:rPr>
-        <w:t xml:space="preserve"> </w:t>
+        <w:t xml:space="preserve">  </w:t>
       </w:r>
       <m:oMath>
         <m:sSub>
@@ -1289,23 +2249,7 @@
                   <w:sz w:val="14"/>
                   <w:szCs w:val="14"/>
                 </w:rPr>
-                <m:t>u</m:t>
-              </m:r>
-              <m:r>
-                <w:rPr>
-                  <w:rFonts w:ascii="Cambria Math" w:eastAsia="Times New Roman" w:hAnsi="Cambria Math" w:cs="Times New Roman"/>
-                  <w:sz w:val="14"/>
-                  <w:szCs w:val="14"/>
-                </w:rPr>
-                <m:t xml:space="preserve"> ∈</m:t>
-              </m:r>
-              <m:r>
-                <w:rPr>
-                  <w:rFonts w:ascii="Cambria Math" w:eastAsia="Times New Roman" w:hAnsi="Cambria Math" w:cs="Times New Roman"/>
-                  <w:sz w:val="14"/>
-                  <w:szCs w:val="14"/>
-                </w:rPr>
-                <m:t>Utilities</m:t>
+                <m:t>u ∈Utilities</m:t>
               </m:r>
             </m:sub>
             <m:sup/>
@@ -1435,23 +2379,7 @@
                   <w:sz w:val="14"/>
                   <w:szCs w:val="14"/>
                 </w:rPr>
-                <m:t>c</m:t>
-              </m:r>
-              <m:r>
-                <w:rPr>
-                  <w:rFonts w:ascii="Cambria Math" w:eastAsia="Times New Roman" w:hAnsi="Cambria Math" w:cs="Times New Roman"/>
-                  <w:sz w:val="14"/>
-                  <w:szCs w:val="14"/>
-                </w:rPr>
-                <m:t xml:space="preserve"> ∈</m:t>
-              </m:r>
-              <m:r>
-                <w:rPr>
-                  <w:rFonts w:ascii="Cambria Math" w:eastAsia="Times New Roman" w:hAnsi="Cambria Math" w:cs="Times New Roman"/>
-                  <w:sz w:val="14"/>
-                  <w:szCs w:val="14"/>
-                </w:rPr>
-                <m:t>Constraints</m:t>
+                <m:t>c ∈Constraints</m:t>
               </m:r>
             </m:sub>
             <m:sup/>
@@ -1817,14 +2745,41 @@
         <w:rPr>
           <w:rFonts w:eastAsia="Times New Roman" w:cs="Times New Roman"/>
         </w:rPr>
-        <w:t xml:space="preserve">A significant barrier to the commercial adoption of RL in refineries is the "black-box" nature of neural networks. Peer-reviewed studies from 2024 and 2025 have increasingly focused on Explainable Reinforcement Learning (XRL). Lee et al. (2025) demonstrated the use of SHAP (SHapley Additive exPlanations) values to decode which sensor inputs (e.g., a specific tray temperature) most heavily influence the agent's decision to increase reflux. This transparency is </w:t>
-      </w:r>
+        <w:t>A significant barrier to the commercial adoption of RL in refineries is the "black-box" nature of neural networks. Peer-reviewed studies from 2024 and 2025 have increasingly focused on Explainable Reinforcement Learning (XRL). Lee et al. (2025) demonstrated the use of SHAP (</w:t>
+      </w:r>
+      <w:proofErr w:type="spellStart"/>
       <w:r>
         <w:rPr>
           <w:rFonts w:eastAsia="Times New Roman" w:cs="Times New Roman"/>
         </w:rPr>
-        <w:lastRenderedPageBreak/>
-        <w:t>vital for refinery engineers who must trust the AI's "reasoning" before allowing it to adjust a column processing $100,000$ barrels per day.</w:t>
+        <w:t>SHapley</w:t>
+      </w:r>
+      <w:proofErr w:type="spellEnd"/>
+      <w:r>
+        <w:rPr>
+          <w:rFonts w:eastAsia="Times New Roman" w:cs="Times New Roman"/>
+        </w:rPr>
+        <w:t xml:space="preserve"> Additive </w:t>
+      </w:r>
+      <w:proofErr w:type="spellStart"/>
+      <w:r>
+        <w:rPr>
+          <w:rFonts w:eastAsia="Times New Roman" w:cs="Times New Roman"/>
+        </w:rPr>
+        <w:t>exPlanations</w:t>
+      </w:r>
+      <w:proofErr w:type="spellEnd"/>
+      <w:r>
+        <w:rPr>
+          <w:rFonts w:eastAsia="Times New Roman" w:cs="Times New Roman"/>
+        </w:rPr>
+        <w:t xml:space="preserve">) values to decode which sensor inputs (e.g., a specific tray temperature) most heavily influence the agent's decision to increase reflux. This transparency is vital for refinery engineers who must trust the AI's </w:t>
+      </w:r>
+      <w:r>
+        <w:rPr>
+          <w:rFonts w:eastAsia="Times New Roman" w:cs="Times New Roman"/>
+        </w:rPr>
+        <w:t>"reasoning" before allowing it to adjust a column processing $100,000$ barrels per day.</w:t>
       </w:r>
     </w:p>
     <w:p>
@@ -1907,7 +2862,62 @@
           <w:i/>
           <w:iCs/>
         </w:rPr>
-        <w:t>explored hyperparameters a, b, and c with values [d,e,f], [g,h,i], and [j,k,l], respectively. Our final model architecture was...</w:t>
+        <w:lastRenderedPageBreak/>
+        <w:t>explored hyperparameters a, b, and c with values [</w:t>
+      </w:r>
+      <w:proofErr w:type="spellStart"/>
+      <w:r>
+        <w:rPr>
+          <w:rFonts w:eastAsia="Times New Roman" w:cs="Times New Roman"/>
+          <w:i/>
+          <w:iCs/>
+        </w:rPr>
+        <w:t>d,e,f</w:t>
+      </w:r>
+      <w:proofErr w:type="spellEnd"/>
+      <w:r>
+        <w:rPr>
+          <w:rFonts w:eastAsia="Times New Roman" w:cs="Times New Roman"/>
+          <w:i/>
+          <w:iCs/>
+        </w:rPr>
+        <w:t>], [</w:t>
+      </w:r>
+      <w:proofErr w:type="spellStart"/>
+      <w:r>
+        <w:rPr>
+          <w:rFonts w:eastAsia="Times New Roman" w:cs="Times New Roman"/>
+          <w:i/>
+          <w:iCs/>
+        </w:rPr>
+        <w:t>g,h,i</w:t>
+      </w:r>
+      <w:proofErr w:type="spellEnd"/>
+      <w:r>
+        <w:rPr>
+          <w:rFonts w:eastAsia="Times New Roman" w:cs="Times New Roman"/>
+          <w:i/>
+          <w:iCs/>
+        </w:rPr>
+        <w:t>], and [</w:t>
+      </w:r>
+      <w:proofErr w:type="spellStart"/>
+      <w:r>
+        <w:rPr>
+          <w:rFonts w:eastAsia="Times New Roman" w:cs="Times New Roman"/>
+          <w:i/>
+          <w:iCs/>
+        </w:rPr>
+        <w:t>j,k,l</w:t>
+      </w:r>
+      <w:proofErr w:type="spellEnd"/>
+      <w:r>
+        <w:rPr>
+          <w:rFonts w:eastAsia="Times New Roman" w:cs="Times New Roman"/>
+          <w:i/>
+          <w:iCs/>
+        </w:rPr>
+        <w:t>], respectively. Our final model architecture was...</w:t>
       </w:r>
       <w:r>
         <w:rPr>
@@ -2031,11 +3041,7 @@
         </w:numPr>
       </w:pPr>
       <w:r>
-        <w:t xml:space="preserve">If your project is focused on answering a research question, what evidence do you </w:t>
-      </w:r>
-      <w:r>
-        <w:lastRenderedPageBreak/>
-        <w:t xml:space="preserve">have to support or disprove your hypothesis? </w:t>
+        <w:t xml:space="preserve">If your project is focused on answering a research question, what evidence do you have to support or disprove your hypothesis? </w:t>
       </w:r>
     </w:p>
     <w:p>
@@ -2223,13 +3229,14 @@
         <w:rPr>
           <w:rFonts w:eastAsia="Times New Roman" w:cs="Times New Roman"/>
         </w:rPr>
-        <w:t xml:space="preserve">A formal report of this type should be primarily in paragraph form, with minimal subheadings, bullet </w:t>
+        <w:t xml:space="preserve">A formal report of this type should be primarily in paragraph form, with minimal subheadings, bullet points, or numbered lists. For most of your required report sections, no subheadings will be </w:t>
       </w:r>
       <w:r>
         <w:rPr>
           <w:rFonts w:eastAsia="Times New Roman" w:cs="Times New Roman"/>
         </w:rPr>
-        <w:t>points, or numbered lists. For most of your required report sections, no subheadings will be necessary, and the information can be presented as a single, cohesive discussion of the content relevant to that section. As a general rule of thumb, bulleted or numbered lists are only appropriate in this kind of report if the list items are less than one sentence, but are too long/detailed to be presented in a table.</w:t>
+        <w:lastRenderedPageBreak/>
+        <w:t>necessary, and the information can be presented as a single, cohesive discussion of the content relevant to that section. As a general rule of thumb, bulleted or numbered lists are only appropriate in this kind of report if the list items are less than one sentence, but are too long/detailed to be presented in a table.</w:t>
       </w:r>
     </w:p>
     <w:p>
@@ -2357,11 +3364,10 @@
         <w:t>Parenthetical citations mid-sentence</w:t>
       </w:r>
       <w:r>
-        <w:t xml:space="preserve"> should be used when only a part of the sentence comes from the cited source, or when you are providing a citation for something specific such as a company, </w:t>
-      </w:r>
-      <w:r>
-        <w:lastRenderedPageBreak/>
-        <w:t>model architecture/method, or technique. See the following examples for a sentence with multiple mid-sentence citations and a sentence with a specific mid-sentence citation below:</w:t>
+        <w:t xml:space="preserve"> should be used when only a part of the sentence comes from the cited source, or when you are providing a citation for something specific such as a company, model architecture/method, or technique. See the </w:t>
+      </w:r>
+      <w:r>
+        <w:t>following examples for a sentence with multiple mid-sentence citations and a sentence with a specific mid-sentence citation below:</w:t>
       </w:r>
     </w:p>
     <w:p>
@@ -2462,6 +3468,7 @@
         <w:t xml:space="preserve"> the image and referred to directly in your text (e.g. “As seen in Figure 7.1 [...]”, “Figure 7.1 shows [...]”). If your figure is important enough to </w:t>
       </w:r>
       <w:r>
+        <w:lastRenderedPageBreak/>
         <w:t xml:space="preserve">include in your report, then it deserves at least one sentence of discussion in the text. </w:t>
       </w:r>
     </w:p>
@@ -2496,7 +3503,7 @@
                     </pic:cNvPicPr>
                   </pic:nvPicPr>
                   <pic:blipFill>
-                    <a:blip r:embed="rId16"/>
+                    <a:blip r:embed="rId20"/>
                     <a:stretch>
                       <a:fillRect/>
                     </a:stretch>
@@ -2573,7 +3580,6 @@
         </w:rPr>
       </w:pPr>
       <w:r>
-        <w:lastRenderedPageBreak/>
         <w:t xml:space="preserve">Example text: Results for all three models over the standard benchmarking metrics. Highlighted cells show the best performance for each metric. </w:t>
       </w:r>
     </w:p>
@@ -2787,7 +3793,15 @@
         <w:t>a</w:t>
       </w:r>
       <w:r>
-        <w:t xml:space="preserve"> is the learned coefficent, and </w:t>
+        <w:t xml:space="preserve"> is the learned </w:t>
+      </w:r>
+      <w:proofErr w:type="spellStart"/>
+      <w:r>
+        <w:t>coefficent</w:t>
+      </w:r>
+      <w:proofErr w:type="spellEnd"/>
+      <w:r>
+        <w:t xml:space="preserve">, and </w:t>
       </w:r>
       <w:r>
         <w:rPr>
@@ -2828,10 +3842,7 @@
     </w:p>
     <w:p>
       <w:r>
-        <w:t xml:space="preserve">As with tables, if you have a favorite tool for formatting your equations, feel free to include the formatted equation as an image, as long as it </w:t>
-      </w:r>
-      <w:r>
-        <w:t>matches the formatting shown in the example above.</w:t>
+        <w:t>As with tables, if you have a favorite tool for formatting your equations, feel free to include the formatted equation as an image, as long as it matches the formatting shown in the example above.</w:t>
       </w:r>
     </w:p>
     <w:p>
@@ -2839,6 +3850,7 @@
         <w:pStyle w:val="Heading2"/>
       </w:pPr>
       <w:r>
+        <w:lastRenderedPageBreak/>
         <w:t>7.4</w:t>
       </w:r>
       <w:r>
@@ -2850,7 +3862,7 @@
       <w:r>
         <w:t xml:space="preserve">References should be alphabetically ordered using APA 7 formatting. You can refer to the </w:t>
       </w:r>
-      <w:hyperlink r:id="rId17">
+      <w:hyperlink r:id="rId21">
         <w:r>
           <w:rPr>
             <w:rStyle w:val="Hyperlink"/>
@@ -2886,11 +3898,10 @@
     </w:p>
     <w:p>
       <w:r>
-        <w:t xml:space="preserve">Appendices should be labeled alphabetically (Appendix A, Appendix B, etc.) and should be referred to directly in your text (e.g. “A complete table of results over all hyperparameters can be </w:t>
-      </w:r>
-      <w:r>
-        <w:lastRenderedPageBreak/>
-        <w:t>found in Appendix A”). Each appendix should start on a new page and does not need to be in the two-column format if full page width makes more sense for your content (e.g. detailed figures or large tables).</w:t>
+        <w:t xml:space="preserve">Appendices should be labeled alphabetically (Appendix A, Appendix B, etc.) and should be referred to directly in your text (e.g. “A complete table of results over all hyperparameters can be found in Appendix A”). Each appendix should </w:t>
+      </w:r>
+      <w:r>
+        <w:t>start on a new page and does not need to be in the two-column format if full page width makes more sense for your content (e.g. detailed figures or large tables).</w:t>
       </w:r>
     </w:p>
     <w:p>
@@ -2962,7 +3973,21 @@
         <w:rPr>
           <w:rFonts w:eastAsia="Linux Libertine" w:cstheme="majorBidi"/>
         </w:rPr>
-        <w:t>Spielberg, S., Tulsyan, A., Lawrence, N. P., Loewen, P. D., &amp; Bhushan Gopaluni, R. (2019). Toward deep reinforcement learning for process control: A review. Computers &amp; Chemical Engineering, 132, 106602.</w:t>
+        <w:t xml:space="preserve">Spielberg, S., </w:t>
+      </w:r>
+      <w:proofErr w:type="spellStart"/>
+      <w:r>
+        <w:rPr>
+          <w:rFonts w:eastAsia="Linux Libertine" w:cstheme="majorBidi"/>
+        </w:rPr>
+        <w:t>Tulsyan</w:t>
+      </w:r>
+      <w:proofErr w:type="spellEnd"/>
+      <w:r>
+        <w:rPr>
+          <w:rFonts w:eastAsia="Linux Libertine" w:cstheme="majorBidi"/>
+        </w:rPr>
+        <w:t>, A., Lawrence, N. P., Loewen, P. D., &amp; Bhushan Gopaluni, R. (2019). Toward deep reinforcement learning for process control: A review. Computers &amp; Chemical Engineering, 132, 106602.</w:t>
       </w:r>
     </w:p>
     <w:p>
@@ -3017,7 +4042,7 @@
         </w:rPr>
         <w:t xml:space="preserve">Engell, S. (2007). Feedback control for optimal process operation. Journal of Process Control, 17(3), 203–219. </w:t>
       </w:r>
-      <w:hyperlink r:id="rId18" w:history="1">
+      <w:hyperlink r:id="rId22" w:history="1">
         <w:r>
           <w:rPr>
             <w:rStyle w:val="Hyperlink"/>
@@ -3043,6 +4068,7 @@
         <w:jc w:val="left"/>
       </w:pPr>
       <w:r>
+        <w:lastRenderedPageBreak/>
         <w:t xml:space="preserve">ExxonMobil. (n.d.). </w:t>
       </w:r>
       <w:r>
@@ -3055,7 +4081,7 @@
       <w:r>
         <w:t xml:space="preserve">. </w:t>
       </w:r>
-      <w:hyperlink r:id="rId19" w:tgtFrame="_blank" w:history="1">
+      <w:hyperlink r:id="rId23" w:tgtFrame="_blank" w:history="1">
         <w:r>
           <w:rPr>
             <w:rStyle w:val="Hyperlink"/>
@@ -3086,7 +4112,7 @@
         </w:rPr>
         <w:t xml:space="preserve">Hubbs, C. P., Li, C., Sahinidis, N. V., Grossmann, I. E., &amp; John, J. M. (2020). A deep reinforcement learning approach for chemical production scheduling. Computers &amp; Chemical Engineering, 141, 106982. </w:t>
       </w:r>
-      <w:hyperlink r:id="rId20" w:history="1">
+      <w:hyperlink r:id="rId24" w:history="1">
         <w:r>
           <w:rPr>
             <w:rStyle w:val="Hyperlink"/>
@@ -3181,7 +4207,21 @@
         <w:rPr>
           <w:rFonts w:eastAsia="Linux Libertine" w:cstheme="majorBidi"/>
         </w:rPr>
-        <w:t>Spielberg, S., Cao, Y., &amp; Gopaluni, B. (2019). Deep reinforcement learning for process control: A review for control engineers. Control Engineering Practice, 89, 212–222. https://doi.org/10.1016/j.conengprac.2019.05.017</w:t>
+        <w:t xml:space="preserve">Spielberg, S., Cao, Y., &amp; </w:t>
+      </w:r>
+      <w:proofErr w:type="spellStart"/>
+      <w:r>
+        <w:rPr>
+          <w:rFonts w:eastAsia="Linux Libertine" w:cstheme="majorBidi"/>
+        </w:rPr>
+        <w:t>Gopaluni</w:t>
+      </w:r>
+      <w:proofErr w:type="spellEnd"/>
+      <w:r>
+        <w:rPr>
+          <w:rFonts w:eastAsia="Linux Libertine" w:cstheme="majorBidi"/>
+        </w:rPr>
+        <w:t>, B. (2019). Deep reinforcement learning for process control: A review for control engineers. Control Engineering Practice, 89, 212–222. https://doi.org/10.1016/j.conengprac.2019.05.017</w:t>
       </w:r>
     </w:p>
     <w:p>
@@ -3205,8 +4245,21 @@
         <w:rPr>
           <w:rFonts w:eastAsia="Linux Libertine" w:cstheme="majorBidi"/>
         </w:rPr>
-        <w:lastRenderedPageBreak/>
-        <w:t>Brockman, G., Cheung, V., Pettersson, L., Schneider, J., Schulman, J., Tang, J., &amp; Zaremba, W. (2016). OpenAI Gym. arXiv. https://doi.org/10.48550/arXiv.1606.01540</w:t>
+        <w:t xml:space="preserve">Brockman, G., Cheung, V., Pettersson, L., Schneider, J., Schulman, J., Tang, J., &amp; Zaremba, W. (2016). OpenAI Gym. </w:t>
+      </w:r>
+      <w:proofErr w:type="spellStart"/>
+      <w:r>
+        <w:rPr>
+          <w:rFonts w:eastAsia="Linux Libertine" w:cstheme="majorBidi"/>
+        </w:rPr>
+        <w:t>arXiv</w:t>
+      </w:r>
+      <w:proofErr w:type="spellEnd"/>
+      <w:r>
+        <w:rPr>
+          <w:rFonts w:eastAsia="Linux Libertine" w:cstheme="majorBidi"/>
+        </w:rPr>
+        <w:t>. https://doi.org/10.48550/arXiv.1606.01540</w:t>
       </w:r>
     </w:p>
     <w:p>
@@ -3230,7 +4283,21 @@
         <w:rPr>
           <w:rFonts w:eastAsia="Linux Libertine" w:cstheme="majorBidi"/>
         </w:rPr>
-        <w:t>Schulman, J., Wolski, F., Dhariwal, P., Radford, A., &amp; Klimov, O. (2017). Proximal policy optimization algorithms. arXiv. https://doi.org/10.48550/arXiv.1707.06347</w:t>
+        <w:t xml:space="preserve">Schulman, J., Wolski, F., Dhariwal, P., Radford, A., &amp; Klimov, O. (2017). Proximal policy optimization algorithms. </w:t>
+      </w:r>
+      <w:proofErr w:type="spellStart"/>
+      <w:r>
+        <w:rPr>
+          <w:rFonts w:eastAsia="Linux Libertine" w:cstheme="majorBidi"/>
+        </w:rPr>
+        <w:t>arXiv</w:t>
+      </w:r>
+      <w:proofErr w:type="spellEnd"/>
+      <w:r>
+        <w:rPr>
+          <w:rFonts w:eastAsia="Linux Libertine" w:cstheme="majorBidi"/>
+        </w:rPr>
+        <w:t>. https://doi.org/10.48550/arXiv.1707.06347</w:t>
       </w:r>
     </w:p>
     <w:p>
@@ -3317,7 +4384,21 @@
         <w:rPr>
           <w:rFonts w:eastAsia="Linux Libertine" w:cstheme="majorBidi"/>
         </w:rPr>
-        <w:t>Gupta, A., &amp; Kumar, S. (2025). Lagrangian-constrained reinforcement learning for safety-critical distillation operations. Journal of Process Control, 142, 103–118. https://doi.org/10.1016/j.jprocont.2025.01.004</w:t>
+        <w:t xml:space="preserve">Gupta, A., &amp; Kumar, S. (2025). </w:t>
+      </w:r>
+      <w:proofErr w:type="spellStart"/>
+      <w:r>
+        <w:rPr>
+          <w:rFonts w:eastAsia="Linux Libertine" w:cstheme="majorBidi"/>
+        </w:rPr>
+        <w:t>Lagrangian</w:t>
+      </w:r>
+      <w:proofErr w:type="spellEnd"/>
+      <w:r>
+        <w:rPr>
+          <w:rFonts w:eastAsia="Linux Libertine" w:cstheme="majorBidi"/>
+        </w:rPr>
+        <w:t>-constrained reinforcement learning for safety-critical distillation operations. Journal of Process Control, 142, 103–118. https://doi.org/10.1016/j.jprocont.2025.01.004</w:t>
       </w:r>
     </w:p>
     <w:p>
@@ -3365,13 +4446,14 @@
         <w:rPr>
           <w:rFonts w:eastAsia="Linux Libertine" w:cstheme="majorBidi"/>
         </w:rPr>
-        <w:t xml:space="preserve">Zhang, Y., &amp; Petrova, I. (2025). Digital twin-driven autonomous plant operations: Real-time </w:t>
+        <w:t xml:space="preserve">Zhang, Y., &amp; Petrova, I. (2025). Digital twin-driven autonomous plant operations: Real-time optimization of atmospheric distillation units </w:t>
       </w:r>
       <w:r>
         <w:rPr>
           <w:rFonts w:eastAsia="Linux Libertine" w:cstheme="majorBidi"/>
         </w:rPr>
-        <w:t>optimization of atmospheric distillation units using deep policy gradients. Computers &amp; Chemical Engineering (Special Issue: AI in Energy), 184, 108–122.</w:t>
+        <w:lastRenderedPageBreak/>
+        <w:t>using deep policy gradients. Computers &amp; Chemical Engineering (Special Issue: AI in Energy), 184, 108–122.</w:t>
       </w:r>
     </w:p>
     <w:p>
@@ -3380,9 +4462,10 @@
       </w:pPr>
     </w:p>
     <w:sectPr>
+      <w:footerReference w:type="even" r:id="rId25"/>
       <w:type w:val="continuous"/>
       <w:pgSz w:w="12240" w:h="15840"/>
-      <w:pgMar w:top="1500" w:right="1080" w:bottom="1600" w:left="1080" w:header="1080" w:footer="1080" w:gutter="0"/>
+      <w:pgMar w:top="1500" w:right="1080" w:bottom="1276" w:left="1080" w:header="1080" w:footer="1080" w:gutter="0"/>
       <w:cols w:num="2" w:space="480"/>
       <w:formProt w:val="0"/>
       <w:titlePg/>
@@ -3439,12 +4522,275 @@
         <w:tab w:val="center" w:pos="4320"/>
         <w:tab w:val="right" w:pos="8640"/>
       </w:tabs>
+      <w:rPr>
+        <w:rFonts w:ascii="Linux Biolinum" w:eastAsia="Linux Biolinum" w:hAnsi="Linux Biolinum" w:cs="Linux Biolinum"/>
+        <w:color w:val="000000"/>
+        <w:sz w:val="14"/>
+        <w:szCs w:val="14"/>
+      </w:rPr>
+    </w:pPr>
+    <w:r>
+      <w:drawing>
+        <wp:inline distT="0" distB="0" distL="0" distR="0" wp14:anchorId="0F0CB7A7" wp14:editId="75EE489F">
+          <wp:extent cx="2833688" cy="998874"/>
+          <wp:effectExtent l="0" t="0" r="5080" b="0"/>
+          <wp:docPr id="818368988" name="Picture 1"/>
+          <wp:cNvGraphicFramePr>
+            <a:graphicFrameLocks xmlns:a="http://schemas.openxmlformats.org/drawingml/2006/main" noChangeAspect="1"/>
+          </wp:cNvGraphicFramePr>
+          <a:graphic xmlns:a="http://schemas.openxmlformats.org/drawingml/2006/main">
+            <a:graphicData uri="http://schemas.openxmlformats.org/drawingml/2006/picture">
+              <pic:pic xmlns:pic="http://schemas.openxmlformats.org/drawingml/2006/picture">
+                <pic:nvPicPr>
+                  <pic:cNvPr id="818368988" name=""/>
+                  <pic:cNvPicPr/>
+                </pic:nvPicPr>
+                <pic:blipFill>
+                  <a:blip r:embed="rId1"/>
+                  <a:stretch>
+                    <a:fillRect/>
+                  </a:stretch>
+                </pic:blipFill>
+                <pic:spPr>
+                  <a:xfrm>
+                    <a:off x="0" y="0"/>
+                    <a:ext cx="2876930" cy="1014117"/>
+                  </a:xfrm>
+                  <a:prstGeom prst="rect">
+                    <a:avLst/>
+                  </a:prstGeom>
+                </pic:spPr>
+              </pic:pic>
+            </a:graphicData>
+          </a:graphic>
+        </wp:inline>
+      </w:drawing>
+    </w:r>
+    <w:r>
+      <w:rPr>
+        <w:rFonts w:ascii="Linux Biolinum" w:eastAsia="Linux Biolinum" w:hAnsi="Linux Biolinum" w:cs="Linux Biolinum"/>
+        <w:color w:val="000000"/>
+        <w:sz w:val="14"/>
+        <w:szCs w:val="14"/>
+      </w:rPr>
+      <w:t xml:space="preserve"> </w:t>
+    </w:r>
+    <w:r>
+      <w:rPr>
+        <w:rFonts w:ascii="Linux Biolinum" w:eastAsia="Linux Biolinum" w:hAnsi="Linux Biolinum" w:cs="Linux Biolinum"/>
+        <w:color w:val="000000"/>
+        <w:sz w:val="14"/>
+        <w:szCs w:val="14"/>
+      </w:rPr>
+      <w:drawing>
+        <wp:inline distT="0" distB="0" distL="0" distR="0" wp14:anchorId="5164FC7D" wp14:editId="2A3723A6">
+          <wp:extent cx="3504721" cy="998220"/>
+          <wp:effectExtent l="0" t="0" r="635" b="0"/>
+          <wp:docPr id="1405877390" name="Picture 1"/>
+          <wp:cNvGraphicFramePr>
+            <a:graphicFrameLocks xmlns:a="http://schemas.openxmlformats.org/drawingml/2006/main" noChangeAspect="1"/>
+          </wp:cNvGraphicFramePr>
+          <a:graphic xmlns:a="http://schemas.openxmlformats.org/drawingml/2006/main">
+            <a:graphicData uri="http://schemas.openxmlformats.org/drawingml/2006/picture">
+              <pic:pic xmlns:pic="http://schemas.openxmlformats.org/drawingml/2006/picture">
+                <pic:nvPicPr>
+                  <pic:cNvPr id="1405877390" name=""/>
+                  <pic:cNvPicPr/>
+                </pic:nvPicPr>
+                <pic:blipFill>
+                  <a:blip r:embed="rId2"/>
+                  <a:stretch>
+                    <a:fillRect/>
+                  </a:stretch>
+                </pic:blipFill>
+                <pic:spPr>
+                  <a:xfrm>
+                    <a:off x="0" y="0"/>
+                    <a:ext cx="3540970" cy="1008544"/>
+                  </a:xfrm>
+                  <a:prstGeom prst="rect">
+                    <a:avLst/>
+                  </a:prstGeom>
+                </pic:spPr>
+              </pic:pic>
+            </a:graphicData>
+          </a:graphic>
+        </wp:inline>
+      </w:drawing>
+    </w:r>
+  </w:p>
+  <w:p>
+    <w:pPr>
+      <w:tabs>
+        <w:tab w:val="center" w:pos="4320"/>
+        <w:tab w:val="right" w:pos="8640"/>
+      </w:tabs>
+      <w:rPr>
+        <w:rFonts w:ascii="Linux Biolinum" w:eastAsia="Linux Biolinum" w:hAnsi="Linux Biolinum" w:cs="Linux Biolinum"/>
+        <w:color w:val="000000"/>
+        <w:sz w:val="14"/>
+        <w:szCs w:val="14"/>
+      </w:rPr>
+    </w:pPr>
+    <w:r>
+      <w:rPr>
+        <w:rFonts w:ascii="Linux Biolinum" w:eastAsia="Linux Biolinum" w:hAnsi="Linux Biolinum" w:cs="Linux Biolinum"/>
+        <w:color w:val="000000"/>
+        <w:sz w:val="14"/>
+        <w:szCs w:val="14"/>
+      </w:rPr>
+      <w:drawing>
+        <wp:inline distT="0" distB="0" distL="0" distR="0" wp14:anchorId="205F61C9" wp14:editId="063724A1">
+          <wp:extent cx="6400800" cy="881380"/>
+          <wp:effectExtent l="0" t="0" r="0" b="0"/>
+          <wp:docPr id="999901175" name="Picture 1"/>
+          <wp:cNvGraphicFramePr>
+            <a:graphicFrameLocks xmlns:a="http://schemas.openxmlformats.org/drawingml/2006/main" noChangeAspect="1"/>
+          </wp:cNvGraphicFramePr>
+          <a:graphic xmlns:a="http://schemas.openxmlformats.org/drawingml/2006/main">
+            <a:graphicData uri="http://schemas.openxmlformats.org/drawingml/2006/picture">
+              <pic:pic xmlns:pic="http://schemas.openxmlformats.org/drawingml/2006/picture">
+                <pic:nvPicPr>
+                  <pic:cNvPr id="999901175" name=""/>
+                  <pic:cNvPicPr/>
+                </pic:nvPicPr>
+                <pic:blipFill>
+                  <a:blip r:embed="rId3"/>
+                  <a:stretch>
+                    <a:fillRect/>
+                  </a:stretch>
+                </pic:blipFill>
+                <pic:spPr>
+                  <a:xfrm>
+                    <a:off x="0" y="0"/>
+                    <a:ext cx="6400800" cy="881380"/>
+                  </a:xfrm>
+                  <a:prstGeom prst="rect">
+                    <a:avLst/>
+                  </a:prstGeom>
+                </pic:spPr>
+              </pic:pic>
+            </a:graphicData>
+          </a:graphic>
+        </wp:inline>
+      </w:drawing>
+    </w:r>
+  </w:p>
+  <w:p>
+    <w:pPr>
+      <w:tabs>
+        <w:tab w:val="center" w:pos="4320"/>
+        <w:tab w:val="right" w:pos="8640"/>
+      </w:tabs>
       <w:ind w:right="360"/>
       <w:rPr>
         <w:rFonts w:ascii="Linux Biolinum" w:eastAsia="Linux Biolinum" w:hAnsi="Linux Biolinum" w:cs="Linux Biolinum"/>
         <w:color w:val="000000"/>
-        <w:szCs w:val="18"/>
+        <w:sz w:val="16"/>
+        <w:szCs w:val="10"/>
       </w:rPr>
+    </w:pPr>
+    <w:r>
+      <w:rPr>
+        <w:rFonts w:ascii="Linux Biolinum" w:eastAsia="Linux Biolinum" w:hAnsi="Linux Biolinum" w:cs="Linux Biolinum"/>
+        <w:color w:val="000000"/>
+        <w:sz w:val="16"/>
+        <w:szCs w:val="10"/>
+      </w:rPr>
+      <w:t xml:space="preserve">Fig 1. (a). API Gravity, Density (at 15 </w:t>
+    </w:r>
+    <w:proofErr w:type="spellStart"/>
+    <w:r>
+      <w:rPr>
+        <w:rFonts w:ascii="Linux Biolinum" w:eastAsia="Linux Biolinum" w:hAnsi="Linux Biolinum" w:cs="Linux Biolinum"/>
+        <w:color w:val="000000"/>
+        <w:sz w:val="16"/>
+        <w:szCs w:val="10"/>
+      </w:rPr>
+      <w:t>oC</w:t>
+    </w:r>
+    <w:proofErr w:type="spellEnd"/>
+    <w:r>
+      <w:rPr>
+        <w:rFonts w:ascii="Linux Biolinum" w:eastAsia="Linux Biolinum" w:hAnsi="Linux Biolinum" w:cs="Linux Biolinum"/>
+        <w:color w:val="000000"/>
+        <w:sz w:val="16"/>
+        <w:szCs w:val="10"/>
+      </w:rPr>
+      <w:t>) and Total Sulphur distribution in the selected crude assays</w:t>
+    </w:r>
+  </w:p>
+  <w:p>
+    <w:pPr>
+      <w:tabs>
+        <w:tab w:val="center" w:pos="4320"/>
+        <w:tab w:val="right" w:pos="8640"/>
+      </w:tabs>
+      <w:ind w:right="360"/>
+      <w:rPr>
+        <w:rFonts w:ascii="Linux Biolinum" w:eastAsia="Linux Biolinum" w:hAnsi="Linux Biolinum" w:cs="Linux Biolinum"/>
+        <w:color w:val="000000"/>
+        <w:sz w:val="16"/>
+        <w:szCs w:val="10"/>
+      </w:rPr>
+    </w:pPr>
+    <w:r>
+      <w:rPr>
+        <w:rFonts w:ascii="Linux Biolinum" w:eastAsia="Linux Biolinum" w:hAnsi="Linux Biolinum" w:cs="Linux Biolinum"/>
+        <w:color w:val="000000"/>
+        <w:sz w:val="16"/>
+        <w:szCs w:val="10"/>
+      </w:rPr>
+      <w:t>Fig 1. (b) Metals and Total Nitrogen content in the selected crude assays</w:t>
+    </w:r>
+  </w:p>
+  <w:p>
+    <w:pPr>
+      <w:tabs>
+        <w:tab w:val="center" w:pos="4320"/>
+        <w:tab w:val="right" w:pos="8640"/>
+      </w:tabs>
+      <w:ind w:right="360"/>
+      <w:rPr>
+        <w:rFonts w:ascii="Linux Biolinum" w:eastAsia="Linux Biolinum" w:hAnsi="Linux Biolinum" w:cs="Linux Biolinum"/>
+        <w:color w:val="000000"/>
+        <w:sz w:val="16"/>
+        <w:szCs w:val="10"/>
+      </w:rPr>
+    </w:pPr>
+    <w:r>
+      <w:rPr>
+        <w:rFonts w:ascii="Linux Biolinum" w:eastAsia="Linux Biolinum" w:hAnsi="Linux Biolinum" w:cs="Linux Biolinum"/>
+        <w:color w:val="000000"/>
+        <w:sz w:val="16"/>
+        <w:szCs w:val="10"/>
+      </w:rPr>
+      <w:t>Fig 1. (c) Crude-wise yield distribution (</w:t>
+    </w:r>
+    <w:proofErr w:type="spellStart"/>
+    <w:r>
+      <w:rPr>
+        <w:rFonts w:ascii="Linux Biolinum" w:eastAsia="Linux Biolinum" w:hAnsi="Linux Biolinum" w:cs="Linux Biolinum"/>
+        <w:color w:val="000000"/>
+        <w:sz w:val="16"/>
+        <w:szCs w:val="10"/>
+      </w:rPr>
+      <w:t>wt</w:t>
+    </w:r>
+    <w:proofErr w:type="spellEnd"/>
+    <w:r>
+      <w:rPr>
+        <w:rFonts w:ascii="Linux Biolinum" w:eastAsia="Linux Biolinum" w:hAnsi="Linux Biolinum" w:cs="Linux Biolinum"/>
+        <w:color w:val="000000"/>
+        <w:sz w:val="16"/>
+        <w:szCs w:val="10"/>
+      </w:rPr>
+      <w:t xml:space="preserve">%) </w:t>
+    </w:r>
+  </w:p>
+  <w:p>
+    <w:pPr>
+      <w:pStyle w:val="Footer"/>
     </w:pPr>
   </w:p>
 </w:ftr>
@@ -3452,6 +4798,18 @@
 
 <file path=word/footer2.xml><?xml version="1.0" encoding="utf-8"?>
 <w:ftr xmlns:wpc="http://schemas.microsoft.com/office/word/2010/wordprocessingCanvas" xmlns:cx="http://schemas.microsoft.com/office/drawing/2014/chartex" xmlns:cx1="http://schemas.microsoft.com/office/drawing/2015/9/8/chartex" xmlns:cx2="http://schemas.microsoft.com/office/drawing/2015/10/21/chartex" xmlns:cx3="http://schemas.microsoft.com/office/drawing/2016/5/9/chartex" xmlns:cx4="http://schemas.microsoft.com/office/drawing/2016/5/10/chartex" xmlns:cx5="http://schemas.microsoft.com/office/drawing/2016/5/11/chartex" xmlns:cx6="http://schemas.microsoft.com/office/drawing/2016/5/12/chartex" xmlns:cx7="http://schemas.microsoft.com/office/drawing/2016/5/13/chartex" xmlns:cx8="http://schemas.microsoft.com/office/drawing/2016/5/14/chartex" xmlns:mc="http://schemas.openxmlformats.org/markup-compatibility/2006" xmlns:aink="http://schemas.microsoft.com/office/drawing/2016/ink" xmlns:am3d="http://schemas.microsoft.com/office/drawing/2017/model3d" xmlns:o="urn:schemas-microsoft-com:office:office" xmlns:oel="http://schemas.microsoft.com/office/2019/extlst" xmlns:r="http://schemas.openxmlformats.org/officeDocument/2006/relationships" xmlns:m="http://schemas.openxmlformats.org/officeDocument/2006/math" xmlns:v="urn:schemas-microsoft-com:vml" xmlns:wp14="http://schemas.microsoft.com/office/word/2010/wordprocessingDrawing" xmlns:wp="http://schemas.openxmlformats.org/drawingml/2006/wordprocessingDrawing" xmlns:w10="urn:schemas-microsoft-com:office:word" xmlns:w="http://schemas.openxmlformats.org/wordprocessingml/2006/main" xmlns:w14="http://schemas.microsoft.com/office/word/2010/wordml" xmlns:w15="http://schemas.microsoft.com/office/word/2012/wordml" xmlns:w16cex="http://schemas.microsoft.com/office/word/2018/wordml/cex" xmlns:w16cid="http://schemas.microsoft.com/office/word/2016/wordml/cid" xmlns:w16="http://schemas.microsoft.com/office/word/2018/wordml" xmlns:w16du="http://schemas.microsoft.com/office/word/2023/wordml/word16du" xmlns:w16sdtdh="http://schemas.microsoft.com/office/word/2020/wordml/sdtdatahash" xmlns:w16sdtfl="http://schemas.microsoft.com/office/word/2024/wordml/sdtformatlock" xmlns:w16se="http://schemas.microsoft.com/office/word/2015/wordml/symex" xmlns:wpg="http://schemas.microsoft.com/office/word/2010/wordprocessingGroup" xmlns:wpi="http://schemas.microsoft.com/office/word/2010/wordprocessingInk" xmlns:wne="http://schemas.microsoft.com/office/word/2006/wordml" xmlns:wps="http://schemas.microsoft.com/office/word/2010/wordprocessingShape" mc:Ignorable="w14 w15 w16se w16cid w16 w16cex w16sdtdh w16sdtfl w16du wp14">
+  <w:p>
+    <w:pPr>
+      <w:tabs>
+        <w:tab w:val="center" w:pos="4320"/>
+        <w:tab w:val="right" w:pos="8640"/>
+      </w:tabs>
+      <w:ind w:right="360"/>
+      <w:rPr>
+        <w:lang w:val="en-IN"/>
+      </w:rPr>
+    </w:pPr>
+  </w:p>
   <w:p>
     <w:pPr>
       <w:tabs>
@@ -3463,6 +4821,7 @@
         <w:rFonts w:ascii="Linux Biolinum" w:eastAsia="Linux Biolinum" w:hAnsi="Linux Biolinum" w:cs="Linux Biolinum"/>
         <w:color w:val="000000"/>
         <w:szCs w:val="18"/>
+        <w:lang w:val="en-IN"/>
       </w:rPr>
     </w:pPr>
   </w:p>
@@ -4509,6 +5868,155 @@
     </w:lvl>
   </w:abstractNum>
   <w:abstractNum w:abstractNumId="7" w15:restartNumberingAfterBreak="0">
+    <w:nsid w:val="3CE44867"/>
+    <w:multiLevelType w:val="multilevel"/>
+    <w:tmpl w:val="95AA067E"/>
+    <w:lvl w:ilvl="0">
+      <w:start w:val="1"/>
+      <w:numFmt w:val="bullet"/>
+      <w:lvlText w:val=""/>
+      <w:lvlJc w:val="left"/>
+      <w:pPr>
+        <w:tabs>
+          <w:tab w:val="num" w:pos="720"/>
+        </w:tabs>
+        <w:ind w:left="720" w:hanging="360"/>
+      </w:pPr>
+      <w:rPr>
+        <w:rFonts w:ascii="Symbol" w:hAnsi="Symbol" w:hint="default"/>
+        <w:sz w:val="20"/>
+      </w:rPr>
+    </w:lvl>
+    <w:lvl w:ilvl="1" w:tentative="1">
+      <w:start w:val="1"/>
+      <w:numFmt w:val="bullet"/>
+      <w:lvlText w:val="o"/>
+      <w:lvlJc w:val="left"/>
+      <w:pPr>
+        <w:tabs>
+          <w:tab w:val="num" w:pos="1440"/>
+        </w:tabs>
+        <w:ind w:left="1440" w:hanging="360"/>
+      </w:pPr>
+      <w:rPr>
+        <w:rFonts w:ascii="Courier New" w:hAnsi="Courier New" w:hint="default"/>
+        <w:sz w:val="20"/>
+      </w:rPr>
+    </w:lvl>
+    <w:lvl w:ilvl="2" w:tentative="1">
+      <w:start w:val="1"/>
+      <w:numFmt w:val="bullet"/>
+      <w:lvlText w:val=""/>
+      <w:lvlJc w:val="left"/>
+      <w:pPr>
+        <w:tabs>
+          <w:tab w:val="num" w:pos="2160"/>
+        </w:tabs>
+        <w:ind w:left="2160" w:hanging="360"/>
+      </w:pPr>
+      <w:rPr>
+        <w:rFonts w:ascii="Wingdings" w:hAnsi="Wingdings" w:hint="default"/>
+        <w:sz w:val="20"/>
+      </w:rPr>
+    </w:lvl>
+    <w:lvl w:ilvl="3" w:tentative="1">
+      <w:start w:val="1"/>
+      <w:numFmt w:val="bullet"/>
+      <w:lvlText w:val=""/>
+      <w:lvlJc w:val="left"/>
+      <w:pPr>
+        <w:tabs>
+          <w:tab w:val="num" w:pos="2880"/>
+        </w:tabs>
+        <w:ind w:left="2880" w:hanging="360"/>
+      </w:pPr>
+      <w:rPr>
+        <w:rFonts w:ascii="Wingdings" w:hAnsi="Wingdings" w:hint="default"/>
+        <w:sz w:val="20"/>
+      </w:rPr>
+    </w:lvl>
+    <w:lvl w:ilvl="4" w:tentative="1">
+      <w:start w:val="1"/>
+      <w:numFmt w:val="bullet"/>
+      <w:lvlText w:val=""/>
+      <w:lvlJc w:val="left"/>
+      <w:pPr>
+        <w:tabs>
+          <w:tab w:val="num" w:pos="3600"/>
+        </w:tabs>
+        <w:ind w:left="3600" w:hanging="360"/>
+      </w:pPr>
+      <w:rPr>
+        <w:rFonts w:ascii="Wingdings" w:hAnsi="Wingdings" w:hint="default"/>
+        <w:sz w:val="20"/>
+      </w:rPr>
+    </w:lvl>
+    <w:lvl w:ilvl="5" w:tentative="1">
+      <w:start w:val="1"/>
+      <w:numFmt w:val="bullet"/>
+      <w:lvlText w:val=""/>
+      <w:lvlJc w:val="left"/>
+      <w:pPr>
+        <w:tabs>
+          <w:tab w:val="num" w:pos="4320"/>
+        </w:tabs>
+        <w:ind w:left="4320" w:hanging="360"/>
+      </w:pPr>
+      <w:rPr>
+        <w:rFonts w:ascii="Wingdings" w:hAnsi="Wingdings" w:hint="default"/>
+        <w:sz w:val="20"/>
+      </w:rPr>
+    </w:lvl>
+    <w:lvl w:ilvl="6" w:tentative="1">
+      <w:start w:val="1"/>
+      <w:numFmt w:val="bullet"/>
+      <w:lvlText w:val=""/>
+      <w:lvlJc w:val="left"/>
+      <w:pPr>
+        <w:tabs>
+          <w:tab w:val="num" w:pos="5040"/>
+        </w:tabs>
+        <w:ind w:left="5040" w:hanging="360"/>
+      </w:pPr>
+      <w:rPr>
+        <w:rFonts w:ascii="Wingdings" w:hAnsi="Wingdings" w:hint="default"/>
+        <w:sz w:val="20"/>
+      </w:rPr>
+    </w:lvl>
+    <w:lvl w:ilvl="7" w:tentative="1">
+      <w:start w:val="1"/>
+      <w:numFmt w:val="bullet"/>
+      <w:lvlText w:val=""/>
+      <w:lvlJc w:val="left"/>
+      <w:pPr>
+        <w:tabs>
+          <w:tab w:val="num" w:pos="5760"/>
+        </w:tabs>
+        <w:ind w:left="5760" w:hanging="360"/>
+      </w:pPr>
+      <w:rPr>
+        <w:rFonts w:ascii="Wingdings" w:hAnsi="Wingdings" w:hint="default"/>
+        <w:sz w:val="20"/>
+      </w:rPr>
+    </w:lvl>
+    <w:lvl w:ilvl="8" w:tentative="1">
+      <w:start w:val="1"/>
+      <w:numFmt w:val="bullet"/>
+      <w:lvlText w:val=""/>
+      <w:lvlJc w:val="left"/>
+      <w:pPr>
+        <w:tabs>
+          <w:tab w:val="num" w:pos="6480"/>
+        </w:tabs>
+        <w:ind w:left="6480" w:hanging="360"/>
+      </w:pPr>
+      <w:rPr>
+        <w:rFonts w:ascii="Wingdings" w:hAnsi="Wingdings" w:hint="default"/>
+        <w:sz w:val="20"/>
+      </w:rPr>
+    </w:lvl>
+  </w:abstractNum>
+  <w:abstractNum w:abstractNumId="8" w15:restartNumberingAfterBreak="0">
     <w:nsid w:val="495F74BD"/>
     <w:multiLevelType w:val="multilevel"/>
     <w:tmpl w:val="9F94911A"/>
@@ -4648,7 +6156,7 @@
       </w:rPr>
     </w:lvl>
   </w:abstractNum>
-  <w:abstractNum w:abstractNumId="8" w15:restartNumberingAfterBreak="0">
+  <w:abstractNum w:abstractNumId="9" w15:restartNumberingAfterBreak="0">
     <w:nsid w:val="4EDB6C5E"/>
     <w:multiLevelType w:val="multilevel"/>
     <w:tmpl w:val="5B6EFD4A"/>
@@ -4788,7 +6296,93 @@
       </w:rPr>
     </w:lvl>
   </w:abstractNum>
-  <w:abstractNum w:abstractNumId="9" w15:restartNumberingAfterBreak="0">
+  <w:abstractNum w:abstractNumId="10" w15:restartNumberingAfterBreak="0">
+    <w:nsid w:val="5789585D"/>
+    <w:multiLevelType w:val="multilevel"/>
+    <w:tmpl w:val="4009001F"/>
+    <w:lvl w:ilvl="0">
+      <w:start w:val="1"/>
+      <w:numFmt w:val="decimal"/>
+      <w:lvlText w:val="%1."/>
+      <w:lvlJc w:val="left"/>
+      <w:pPr>
+        <w:ind w:left="360" w:hanging="360"/>
+      </w:pPr>
+    </w:lvl>
+    <w:lvl w:ilvl="1">
+      <w:start w:val="1"/>
+      <w:numFmt w:val="decimal"/>
+      <w:lvlText w:val="%1.%2."/>
+      <w:lvlJc w:val="left"/>
+      <w:pPr>
+        <w:ind w:left="792" w:hanging="432"/>
+      </w:pPr>
+    </w:lvl>
+    <w:lvl w:ilvl="2">
+      <w:start w:val="1"/>
+      <w:numFmt w:val="decimal"/>
+      <w:lvlText w:val="%1.%2.%3."/>
+      <w:lvlJc w:val="left"/>
+      <w:pPr>
+        <w:ind w:left="1224" w:hanging="504"/>
+      </w:pPr>
+    </w:lvl>
+    <w:lvl w:ilvl="3">
+      <w:start w:val="1"/>
+      <w:numFmt w:val="decimal"/>
+      <w:lvlText w:val="%1.%2.%3.%4."/>
+      <w:lvlJc w:val="left"/>
+      <w:pPr>
+        <w:ind w:left="1728" w:hanging="648"/>
+      </w:pPr>
+    </w:lvl>
+    <w:lvl w:ilvl="4">
+      <w:start w:val="1"/>
+      <w:numFmt w:val="decimal"/>
+      <w:lvlText w:val="%1.%2.%3.%4.%5."/>
+      <w:lvlJc w:val="left"/>
+      <w:pPr>
+        <w:ind w:left="2232" w:hanging="792"/>
+      </w:pPr>
+    </w:lvl>
+    <w:lvl w:ilvl="5">
+      <w:start w:val="1"/>
+      <w:numFmt w:val="decimal"/>
+      <w:lvlText w:val="%1.%2.%3.%4.%5.%6."/>
+      <w:lvlJc w:val="left"/>
+      <w:pPr>
+        <w:ind w:left="2736" w:hanging="936"/>
+      </w:pPr>
+    </w:lvl>
+    <w:lvl w:ilvl="6">
+      <w:start w:val="1"/>
+      <w:numFmt w:val="decimal"/>
+      <w:lvlText w:val="%1.%2.%3.%4.%5.%6.%7."/>
+      <w:lvlJc w:val="left"/>
+      <w:pPr>
+        <w:ind w:left="3240" w:hanging="1080"/>
+      </w:pPr>
+    </w:lvl>
+    <w:lvl w:ilvl="7">
+      <w:start w:val="1"/>
+      <w:numFmt w:val="decimal"/>
+      <w:lvlText w:val="%1.%2.%3.%4.%5.%6.%7.%8."/>
+      <w:lvlJc w:val="left"/>
+      <w:pPr>
+        <w:ind w:left="3744" w:hanging="1224"/>
+      </w:pPr>
+    </w:lvl>
+    <w:lvl w:ilvl="8">
+      <w:start w:val="1"/>
+      <w:numFmt w:val="decimal"/>
+      <w:lvlText w:val="%1.%2.%3.%4.%5.%6.%7.%8.%9."/>
+      <w:lvlJc w:val="left"/>
+      <w:pPr>
+        <w:ind w:left="4320" w:hanging="1440"/>
+      </w:pPr>
+    </w:lvl>
+  </w:abstractNum>
+  <w:abstractNum w:abstractNumId="11" w15:restartNumberingAfterBreak="0">
     <w:nsid w:val="61B06065"/>
     <w:multiLevelType w:val="multilevel"/>
     <w:tmpl w:val="B9EC2E54"/>
@@ -4928,7 +6522,7 @@
       </w:rPr>
     </w:lvl>
   </w:abstractNum>
-  <w:abstractNum w:abstractNumId="10" w15:restartNumberingAfterBreak="0">
+  <w:abstractNum w:abstractNumId="12" w15:restartNumberingAfterBreak="0">
     <w:nsid w:val="79952714"/>
     <w:multiLevelType w:val="multilevel"/>
     <w:tmpl w:val="C5C21DA6"/>
@@ -5075,22 +6669,22 @@
     <w:abstractNumId w:val="2"/>
   </w:num>
   <w:num w:numId="3" w16cid:durableId="1492942228">
-    <w:abstractNumId w:val="10"/>
+    <w:abstractNumId w:val="12"/>
   </w:num>
   <w:num w:numId="4" w16cid:durableId="517429286">
     <w:abstractNumId w:val="3"/>
   </w:num>
   <w:num w:numId="5" w16cid:durableId="1718040607">
-    <w:abstractNumId w:val="8"/>
+    <w:abstractNumId w:val="9"/>
   </w:num>
   <w:num w:numId="6" w16cid:durableId="710611117">
-    <w:abstractNumId w:val="7"/>
+    <w:abstractNumId w:val="8"/>
   </w:num>
   <w:num w:numId="7" w16cid:durableId="1117138578">
     <w:abstractNumId w:val="4"/>
   </w:num>
   <w:num w:numId="8" w16cid:durableId="1648709583">
-    <w:abstractNumId w:val="9"/>
+    <w:abstractNumId w:val="11"/>
   </w:num>
   <w:num w:numId="9" w16cid:durableId="1602377560">
     <w:abstractNumId w:val="0"/>
@@ -5100,6 +6694,12 @@
   </w:num>
   <w:num w:numId="11" w16cid:durableId="1462915697">
     <w:abstractNumId w:val="5"/>
+  </w:num>
+  <w:num w:numId="12" w16cid:durableId="546837443">
+    <w:abstractNumId w:val="10"/>
+  </w:num>
+  <w:num w:numId="13" w16cid:durableId="665670202">
+    <w:abstractNumId w:val="7"/>
   </w:num>
 </w:numbering>
 </file>
@@ -5721,7 +7321,6 @@
   <w:style w:type="character" w:default="1" w:styleId="DefaultParagraphFont">
     <w:name w:val="Default Paragraph Font"/>
     <w:uiPriority w:val="1"/>
-    <w:semiHidden/>
     <w:unhideWhenUsed/>
   </w:style>
   <w:style w:type="table" w:default="1" w:styleId="TableNormal">

</xml_diff>

<commit_message>
Added nodejs and fastapi application for running optimization on simulation
</commit_message>
<xml_diff>
--- a/Report/AAI590 Capstone Project Report.docx
+++ b/Report/AAI590 Capstone Project Report.docx
@@ -337,10 +337,10 @@
         <w:t xml:space="preserve"> </w:t>
       </w:r>
       <w:r>
-        <w:t xml:space="preserve">and so on. </w:t>
-      </w:r>
-      <w:r>
-        <w:t xml:space="preserve">The crude is first fractionated into multiple unfinished intermediates which are further refined into various finished products in subsequent processes. </w:t>
+        <w:t xml:space="preserve">and so on. The crude is first fractionated into multiple unfinished </w:t>
+      </w:r>
+      <w:r>
+        <w:t xml:space="preserve">intermediates which are further refined into various finished products in subsequent processes. </w:t>
       </w:r>
       <w:r>
         <w:t xml:space="preserve">Traditionally, Advanced Process Control (APC) strategies, such as Model Predictive Control (MPC), have been utilized to maintain process variables within strict operational bounds. However, </w:t>
@@ -376,11 +376,7 @@
         <w:t xml:space="preserve"> seeks to </w:t>
       </w:r>
       <w:r>
-        <w:t xml:space="preserve">develop a solution which utilizes Deep Reinforcement Learning coupled with </w:t>
-      </w:r>
-      <w:r>
-        <w:lastRenderedPageBreak/>
-        <w:t>process Digital Twin, for economic and process optimization of Crude Distillation Unit.</w:t>
+        <w:t>develop a solution which utilizes Deep Reinforcement Learning coupled with process Digital Twin, for economic and process optimization of Crude Distillation Unit.</w:t>
       </w:r>
     </w:p>
     <w:p>
@@ -410,6 +406,7 @@
           <w:i/>
           <w:iCs/>
         </w:rPr>
+        <w:lastRenderedPageBreak/>
         <w:t>Significance</w:t>
       </w:r>
     </w:p>
@@ -672,7 +669,15 @@
       </w:r>
       <w:proofErr w:type="spellEnd"/>
       <w:r>
-        <w:t xml:space="preserve">, an optimizer built on Deep Reinforcement Learning agent, and a LLM-based AI Agent which creates reports and interacts with the user for explainability. </w:t>
+        <w:t xml:space="preserve">, an optimizer built on Deep Reinforcement Learning agent, and </w:t>
+      </w:r>
+      <w:proofErr w:type="gramStart"/>
+      <w:r>
+        <w:t>a</w:t>
+      </w:r>
+      <w:proofErr w:type="gramEnd"/>
+      <w:r>
+        <w:t xml:space="preserve"> LLM-based AI Agent which creates reports and interacts with the user for explainability. </w:t>
       </w:r>
       <w:r>
         <w:t>In th</w:t>
@@ -792,7 +797,15 @@
         <w:t>Our study revolves around finding the most optimized manner of distillation of crude. Hence,</w:t>
       </w:r>
       <w:r>
-        <w:t xml:space="preserve"> one of the primary focuses in this</w:t>
+        <w:t xml:space="preserve"> one of the </w:t>
+      </w:r>
+      <w:proofErr w:type="gramStart"/>
+      <w:r>
+        <w:t>primary</w:t>
+      </w:r>
+      <w:proofErr w:type="gramEnd"/>
+      <w:r>
+        <w:t xml:space="preserve"> focuses in this</w:t>
       </w:r>
       <w:r>
         <w:t xml:space="preserve"> study </w:t>
@@ -856,17 +869,20 @@
         <w:t xml:space="preserve">API gravity (the standard measure of </w:t>
       </w:r>
       <w:r>
+        <w:t xml:space="preserve">extent of heaviness of </w:t>
+      </w:r>
+      <w:r>
+        <w:t>oil), Total Sulfur content, and Total Acid Number (TAN)</w:t>
+      </w:r>
+      <w:r>
+        <w:t xml:space="preserve"> are critical defining factors of crude assays. </w:t>
+      </w:r>
+      <w:r>
+        <w:t xml:space="preserve">These properties are critical </w:t>
+      </w:r>
+      <w:r>
         <w:lastRenderedPageBreak/>
-        <w:t xml:space="preserve">extent of heaviness of </w:t>
-      </w:r>
-      <w:r>
-        <w:t>oil), Total Sulfur content, and Total Acid Number (TAN)</w:t>
-      </w:r>
-      <w:r>
-        <w:t xml:space="preserve"> are critical defining factors of crude assays. </w:t>
-      </w:r>
-      <w:r>
-        <w:t>These properties are critical as they define the intrinsic quality and potential corrosivity of the feed (González-Durán et al., 2024; Al-Sayegh et al., 2016).</w:t>
+        <w:t>as they define the intrinsic quality and potential corrosivity of the feed (González-Durán et al., 2024; Al-Sayegh et al., 2016).</w:t>
       </w:r>
       <w:r>
         <w:t xml:space="preserve"> </w:t>
@@ -947,6 +963,9 @@
         <w:ind w:left="-76"/>
       </w:pPr>
       <w:r>
+        <w:rPr>
+          <w:noProof/>
+        </w:rPr>
         <w:drawing>
           <wp:inline distT="0" distB="0" distL="0" distR="0" wp14:anchorId="6960FB71" wp14:editId="71E4CACD">
             <wp:extent cx="3048000" cy="1074069"/>
@@ -989,6 +1008,9 @@
         <w:ind w:left="-76"/>
       </w:pPr>
       <w:r>
+        <w:rPr>
+          <w:noProof/>
+        </w:rPr>
         <w:drawing>
           <wp:inline distT="0" distB="0" distL="0" distR="0" wp14:anchorId="6052EDBC" wp14:editId="0F46549F">
             <wp:extent cx="3048000" cy="868025"/>
@@ -1118,16 +1140,7 @@
         <w:t>Fig 1. (b) Metals and Total Nitrogen content in the selected crude assays</w:t>
       </w:r>
     </w:p>
-    <w:p>
-      <w:pPr>
-        <w:ind w:left="-76"/>
-      </w:pPr>
-    </w:p>
-    <w:p>
-      <w:pPr>
-        <w:ind w:left="-76"/>
-      </w:pPr>
-    </w:p>
+    <w:p/>
     <w:p>
       <w:pPr>
         <w:pStyle w:val="ListParagraph"/>
@@ -1160,7 +1173,10 @@
         <w:t xml:space="preserve">True Boiling Point (TBP) distillation curves derived from the dataset </w:t>
       </w:r>
       <w:r>
-        <w:t>shed light on</w:t>
+        <w:t xml:space="preserve">shed </w:t>
+      </w:r>
+      <w:r>
+        <w:t>light on</w:t>
       </w:r>
       <w:r>
         <w:t xml:space="preserve"> significant disparities in product slates. WTI Light and Tapis </w:t>
@@ -1215,6 +1231,9 @@
         <w:ind w:left="-76"/>
       </w:pPr>
       <w:r>
+        <w:rPr>
+          <w:noProof/>
+        </w:rPr>
         <w:drawing>
           <wp:inline distT="0" distB="0" distL="0" distR="0" wp14:anchorId="7C1D3F5A" wp14:editId="72E458CA">
             <wp:extent cx="3048000" cy="419582"/>
@@ -1269,16 +1288,7 @@
           <w:sz w:val="18"/>
           <w:szCs w:val="18"/>
         </w:rPr>
-        <w:t xml:space="preserve">Fig 2. </w:t>
-      </w:r>
-      <w:r>
-        <w:rPr>
-          <w:i/>
-          <w:iCs/>
-          <w:sz w:val="18"/>
-          <w:szCs w:val="18"/>
-        </w:rPr>
-        <w:t>Crude-wise yield distribution (</w:t>
+        <w:t>Fig 2. Crude-wise yield distribution (</w:t>
       </w:r>
       <w:proofErr w:type="spellStart"/>
       <w:r>
@@ -1376,23 +1386,23 @@
         <w:t>challenge</w:t>
       </w:r>
       <w:r>
-        <w:t xml:space="preserve"> </w:t>
-      </w:r>
-      <w:r>
+        <w:t xml:space="preserve"> for downstream catalyst deactivation (Al-Sayegh et al., 2016). </w:t>
+      </w:r>
+    </w:p>
+    <w:p>
+      <w:pPr>
+        <w:ind w:left="-76"/>
+      </w:pPr>
+    </w:p>
+    <w:p>
+      <w:pPr>
+        <w:ind w:left="-76"/>
+      </w:pPr>
+      <w:r>
+        <w:rPr>
+          <w:noProof/>
+        </w:rPr>
         <w:lastRenderedPageBreak/>
-        <w:t xml:space="preserve">for downstream catalyst deactivation (Al-Sayegh et al., 2016). </w:t>
-      </w:r>
-    </w:p>
-    <w:p>
-      <w:pPr>
-        <w:ind w:left="-76"/>
-      </w:pPr>
-    </w:p>
-    <w:p>
-      <w:pPr>
-        <w:ind w:left="-76"/>
-      </w:pPr>
-      <w:r>
         <w:drawing>
           <wp:inline distT="0" distB="0" distL="0" distR="0" wp14:anchorId="15043C0B" wp14:editId="6390284F">
             <wp:extent cx="3048000" cy="2830830"/>
@@ -1442,16 +1452,13 @@
     <w:p>
       <w:pPr>
         <w:ind w:left="-76"/>
-      </w:pPr>
-      <w:r>
         <w:rPr>
           <w:i/>
           <w:iCs/>
           <w:sz w:val="18"/>
           <w:szCs w:val="18"/>
         </w:rPr>
-        <w:t xml:space="preserve">Fig </w:t>
-      </w:r>
+      </w:pPr>
       <w:r>
         <w:rPr>
           <w:i/>
@@ -1459,7 +1466,7 @@
           <w:sz w:val="18"/>
           <w:szCs w:val="18"/>
         </w:rPr>
-        <w:t>3</w:t>
+        <w:t xml:space="preserve">Fig </w:t>
       </w:r>
       <w:r>
         <w:rPr>
@@ -1468,7 +1475,7 @@
           <w:sz w:val="18"/>
           <w:szCs w:val="18"/>
         </w:rPr>
-        <w:t xml:space="preserve">. </w:t>
+        <w:t>3</w:t>
       </w:r>
       <w:r>
         <w:rPr>
@@ -1477,8 +1484,22 @@
           <w:sz w:val="18"/>
           <w:szCs w:val="18"/>
         </w:rPr>
+        <w:t xml:space="preserve">. </w:t>
+      </w:r>
+      <w:r>
+        <w:rPr>
+          <w:i/>
+          <w:iCs/>
+          <w:sz w:val="18"/>
+          <w:szCs w:val="18"/>
+        </w:rPr>
         <w:t>Radar-chart showing comparative study of major factors of crude quality</w:t>
       </w:r>
+    </w:p>
+    <w:p>
+      <w:pPr>
+        <w:ind w:left="-76"/>
+      </w:pPr>
     </w:p>
     <w:p>
       <w:pPr>
@@ -1538,33 +1559,57 @@
         <w:rPr>
           <w:lang w:val="en-IN"/>
         </w:rPr>
-        <w:t xml:space="preserve"> studied in detail indicates </w:t>
+        <w:t xml:space="preserve"> studied in detail indicates that </w:t>
       </w:r>
       <w:r>
         <w:rPr>
           <w:lang w:val="en-IN"/>
         </w:rPr>
-        <w:t xml:space="preserve">that Erha provides an optimal balance for diesel-centric production, whereas Upper </w:t>
+        <w:t xml:space="preserve">Tapis and </w:t>
+      </w:r>
+      <w:r>
+        <w:rPr>
+          <w:lang w:val="en-IN"/>
+        </w:rPr>
+        <w:t xml:space="preserve">Erha provides an optimal balance </w:t>
+      </w:r>
+      <w:r>
+        <w:rPr>
+          <w:lang w:val="en-IN"/>
+        </w:rPr>
+        <w:t xml:space="preserve">with Erha seemingly more inclined towards </w:t>
+      </w:r>
+      <w:r>
+        <w:rPr>
+          <w:lang w:val="en-IN"/>
+        </w:rPr>
+        <w:t>for diesel-centric production</w:t>
+      </w:r>
+      <w:r>
+        <w:rPr>
+          <w:lang w:val="en-IN"/>
+        </w:rPr>
+        <w:t xml:space="preserve">. </w:t>
+      </w:r>
+      <w:r>
+        <w:rPr>
+          <w:lang w:val="en-IN"/>
+        </w:rPr>
+        <w:t>Upper Z</w:t>
       </w:r>
       <w:proofErr w:type="spellStart"/>
       <w:r>
         <w:rPr>
           <w:lang w:val="en-IN"/>
         </w:rPr>
-        <w:t>Zakum</w:t>
+        <w:t>akum</w:t>
       </w:r>
       <w:proofErr w:type="spellEnd"/>
       <w:r>
         <w:rPr>
           <w:lang w:val="en-IN"/>
         </w:rPr>
-        <w:t>, despite its high impurity levels, may offer higher margins if the refinery can effectively manage its heavy-end processing.</w:t>
-      </w:r>
-      <w:r>
-        <w:rPr>
-          <w:lang w:val="en-IN"/>
-        </w:rPr>
-        <w:t xml:space="preserve"> </w:t>
+        <w:t xml:space="preserve">, despite its high impurity levels, may offer higher margins if refinery can effectively manage its heavy-end processing. </w:t>
       </w:r>
       <w:r>
         <w:rPr>
@@ -1618,6 +1663,7 @@
       </w:pPr>
       <w:r>
         <w:rPr>
+          <w:noProof/>
           <w:lang w:val="en-IN"/>
         </w:rPr>
         <w:drawing>
@@ -1752,12 +1798,24 @@
         <w:rPr>
           <w:rFonts w:eastAsia="Times New Roman" w:cs="Times New Roman"/>
         </w:rPr>
-        <w:t xml:space="preserve"> in refinery operations segregates the strategic layer (Real-Time Optimization) from the tactical layer (Model Predictive Control). </w:t>
+        <w:t xml:space="preserve"> in refinery operations segregates the strategic layer (Real-Time Optimization) from the tactical layer (</w:t>
       </w:r>
       <w:r>
         <w:rPr>
           <w:rFonts w:eastAsia="Times New Roman" w:cs="Times New Roman"/>
         </w:rPr>
+        <w:t>Advanced Process Control</w:t>
+      </w:r>
+      <w:r>
+        <w:rPr>
+          <w:rFonts w:eastAsia="Times New Roman" w:cs="Times New Roman"/>
+        </w:rPr>
+        <w:t xml:space="preserve">). </w:t>
+      </w:r>
+      <w:r>
+        <w:rPr>
+          <w:rFonts w:eastAsia="Times New Roman" w:cs="Times New Roman"/>
+        </w:rPr>
         <w:t>T</w:t>
       </w:r>
       <w:r>
@@ -1770,13 +1828,25 @@
         <w:rPr>
           <w:rFonts w:eastAsia="Times New Roman" w:cs="Times New Roman"/>
         </w:rPr>
-        <w:t xml:space="preserve"> (</w:t>
+        <w:t>,</w:t>
       </w:r>
       <w:r>
         <w:rPr>
           <w:rFonts w:eastAsia="Times New Roman" w:cs="Times New Roman"/>
         </w:rPr>
-        <w:t>, while the MPC layer struggles with the economic objectives dictated from above.</w:t>
+        <w:t xml:space="preserve"> while the </w:t>
+      </w:r>
+      <w:r>
+        <w:rPr>
+          <w:rFonts w:eastAsia="Times New Roman" w:cs="Times New Roman"/>
+        </w:rPr>
+        <w:t>A</w:t>
+      </w:r>
+      <w:r>
+        <w:rPr>
+          <w:rFonts w:eastAsia="Times New Roman" w:cs="Times New Roman"/>
+        </w:rPr>
+        <w:t>PC layer struggles with the economic objectives dictated from above.</w:t>
       </w:r>
       <w:r>
         <w:rPr>
@@ -1840,12 +1910,42 @@
         <w:rPr>
           <w:rFonts w:eastAsia="Times New Roman" w:cs="Times New Roman"/>
         </w:rPr>
-        <w:t>that directly maps plant observations to optimal setpoints. Unlike the SQP methods described by Biegler (2010), which require a derivative-based search through the variable space at every time step, the DRL agent performs an instantaneous inference, significantly reducing the latency between a market price change and a process adjustment.</w:t>
+        <w:t xml:space="preserve">that directly maps plant observations to optimal setpoints. Unlike the </w:t>
       </w:r>
       <w:r>
         <w:rPr>
           <w:rFonts w:eastAsia="Times New Roman" w:cs="Times New Roman"/>
         </w:rPr>
+        <w:t>Sequential Quadratic Programming (</w:t>
+      </w:r>
+      <w:r>
+        <w:rPr>
+          <w:rFonts w:eastAsia="Times New Roman" w:cs="Times New Roman"/>
+        </w:rPr>
+        <w:t>SQP</w:t>
+      </w:r>
+      <w:r>
+        <w:rPr>
+          <w:rFonts w:eastAsia="Times New Roman" w:cs="Times New Roman"/>
+        </w:rPr>
+        <w:t>)</w:t>
+      </w:r>
+      <w:r>
+        <w:rPr>
+          <w:rFonts w:eastAsia="Times New Roman" w:cs="Times New Roman"/>
+        </w:rPr>
+        <w:t xml:space="preserve"> methods described by Biegler (2010), which require a derivative-based search through the variable space at every time step, the DRL agent performs an instantaneous inference, significantly reducing the latency</w:t>
+      </w:r>
+      <w:r>
+        <w:rPr>
+          <w:rFonts w:eastAsia="Times New Roman" w:cs="Times New Roman"/>
+        </w:rPr>
+        <w:t>.</w:t>
+      </w:r>
+      <w:r>
+        <w:rPr>
+          <w:rFonts w:eastAsia="Times New Roman" w:cs="Times New Roman"/>
+        </w:rPr>
         <w:t xml:space="preserve"> </w:t>
       </w:r>
     </w:p>
@@ -1860,7 +1960,31 @@
         <w:rPr>
           <w:rFonts w:eastAsia="Times New Roman" w:cs="Times New Roman"/>
         </w:rPr>
-        <w:t>In the context of an ADU, the state space</w:t>
+        <w:t xml:space="preserve">In the context of a </w:t>
+      </w:r>
+      <w:r>
+        <w:rPr>
+          <w:rFonts w:eastAsia="Times New Roman" w:cs="Times New Roman"/>
+        </w:rPr>
+        <w:t>C</w:t>
+      </w:r>
+      <w:r>
+        <w:rPr>
+          <w:rFonts w:eastAsia="Times New Roman" w:cs="Times New Roman"/>
+        </w:rPr>
+        <w:t>D</w:t>
+      </w:r>
+      <w:r>
+        <w:rPr>
+          <w:rFonts w:eastAsia="Times New Roman" w:cs="Times New Roman"/>
+        </w:rPr>
+        <w:t>U</w:t>
+      </w:r>
+      <w:r>
+        <w:rPr>
+          <w:rFonts w:eastAsia="Times New Roman" w:cs="Times New Roman"/>
+        </w:rPr>
+        <w:t>, the state space</w:t>
       </w:r>
       <w:r>
         <w:rPr>
@@ -1960,23 +2084,75 @@
         <w:rPr>
           <w:rFonts w:eastAsia="Times New Roman" w:cs="Times New Roman"/>
         </w:rPr>
-        <w:t xml:space="preserve">, and the mass fractions of pseudocomponents across the distillation curve. A critical contribution </w:t>
+        <w:t xml:space="preserve">, and the mass fractions of pseudocomponents across the distillation curve. A critical contribution by Wang et al. (2024) in the Journal of Process Systems Engineering highlights the importance of Feature Engineering in RL for refineries. </w:t>
       </w:r>
       <w:r>
         <w:rPr>
           <w:rFonts w:eastAsia="Times New Roman" w:cs="Times New Roman"/>
         </w:rPr>
+        <w:t>It is</w:t>
+      </w:r>
+      <w:r>
+        <w:rPr>
+          <w:rFonts w:eastAsia="Times New Roman" w:cs="Times New Roman"/>
+        </w:rPr>
+        <w:t xml:space="preserve"> argu</w:t>
+      </w:r>
+      <w:r>
+        <w:rPr>
+          <w:rFonts w:eastAsia="Times New Roman" w:cs="Times New Roman"/>
+        </w:rPr>
+        <w:t>ed</w:t>
+      </w:r>
+      <w:r>
+        <w:rPr>
+          <w:rFonts w:eastAsia="Times New Roman" w:cs="Times New Roman"/>
+        </w:rPr>
+        <w:t xml:space="preserve"> that normalizing states relative to the Feed </w:t>
+      </w:r>
+      <w:r>
+        <w:rPr>
+          <w:rFonts w:eastAsia="Times New Roman" w:cs="Times New Roman"/>
+        </w:rPr>
         <w:lastRenderedPageBreak/>
-        <w:t>by Wang et al. (2024) in the Journal of Process Systems Engineering highlights the importance of "Feature Engineering" in RL for refineries. They argue that normalizing states relative to the Feed Assay (the specific TBP curve of the incoming crude) allows the agent to generalize its learning across different crude blends—a concept known as Transfer Learning.</w:t>
-      </w:r>
-    </w:p>
-    <w:p>
-      <w:pPr>
-        <w:spacing w:before="20"/>
+        <w:t>Assay (the specific TBP curve of the incoming crude) allows the agent to generalize its learning across different crude blends—</w:t>
+      </w:r>
+      <w:r>
         <w:rPr>
           <w:rFonts w:eastAsia="Times New Roman" w:cs="Times New Roman"/>
         </w:rPr>
-      </w:pPr>
+        <w:t xml:space="preserve"> </w:t>
+      </w:r>
+      <w:r>
+        <w:rPr>
+          <w:rFonts w:eastAsia="Times New Roman" w:cs="Times New Roman"/>
+        </w:rPr>
+        <w:t xml:space="preserve">a concept </w:t>
+      </w:r>
+      <w:r>
+        <w:rPr>
+          <w:rFonts w:eastAsia="Times New Roman" w:cs="Times New Roman"/>
+        </w:rPr>
+        <w:t>very similar to well-known</w:t>
+      </w:r>
+      <w:r>
+        <w:rPr>
+          <w:rFonts w:eastAsia="Times New Roman" w:cs="Times New Roman"/>
+        </w:rPr>
+        <w:t xml:space="preserve"> Transfer Learning</w:t>
+      </w:r>
+      <w:r>
+        <w:rPr>
+          <w:rFonts w:eastAsia="Times New Roman" w:cs="Times New Roman"/>
+        </w:rPr>
+        <w:t xml:space="preserve"> where a model’s weight from learned from a larger dataset is partially fine-tuned for a specific domain use-case</w:t>
+      </w:r>
+      <w:r>
+        <w:rPr>
+          <w:rFonts w:eastAsia="Times New Roman" w:cs="Times New Roman"/>
+        </w:rPr>
+        <w:t>.</w:t>
+      </w:r>
     </w:p>
     <w:p>
       <w:pPr>
@@ -2049,7 +2225,7 @@
     <w:p>
       <w:pPr>
         <w:spacing w:before="20"/>
-        <w:ind w:right="-587"/>
+        <w:ind w:left="-142" w:right="-119"/>
         <w:rPr>
           <w:rFonts w:eastAsia="Times New Roman" w:cs="Times New Roman"/>
           <w:sz w:val="14"/>
@@ -2773,13 +2949,13 @@
         <w:rPr>
           <w:rFonts w:eastAsia="Times New Roman" w:cs="Times New Roman"/>
         </w:rPr>
-        <w:t xml:space="preserve">) values to decode which sensor inputs (e.g., a specific tray temperature) most heavily influence the agent's decision to increase reflux. This transparency is vital for refinery engineers who must trust the AI's </w:t>
+        <w:t xml:space="preserve">) values to decode which sensor inputs (e.g., a specific tray temperature) most heavily influence the agent's decision to increase reflux. This transparency is vital for refinery engineers who must trust the AI's "reasoning" before </w:t>
       </w:r>
       <w:r>
         <w:rPr>
           <w:rFonts w:eastAsia="Times New Roman" w:cs="Times New Roman"/>
         </w:rPr>
-        <w:t>"reasoning" before allowing it to adjust a column processing $100,000$ barrels per day.</w:t>
+        <w:t>allowing it to adjust a column processing $100,000$ barrels per day.</w:t>
       </w:r>
     </w:p>
     <w:p>
@@ -2866,49 +3042,79 @@
         <w:t>explored hyperparameters a, b, and c with values [</w:t>
       </w:r>
       <w:proofErr w:type="spellStart"/>
+      <w:proofErr w:type="gramStart"/>
       <w:r>
         <w:rPr>
           <w:rFonts w:eastAsia="Times New Roman" w:cs="Times New Roman"/>
           <w:i/>
           <w:iCs/>
         </w:rPr>
-        <w:t>d,e,f</w:t>
-      </w:r>
-      <w:proofErr w:type="spellEnd"/>
+        <w:t>d,e</w:t>
+      </w:r>
+      <w:proofErr w:type="gramEnd"/>
       <w:r>
         <w:rPr>
           <w:rFonts w:eastAsia="Times New Roman" w:cs="Times New Roman"/>
           <w:i/>
           <w:iCs/>
         </w:rPr>
-        <w:t>], [</w:t>
-      </w:r>
-      <w:proofErr w:type="spellStart"/>
+        <w:t>,f</w:t>
+      </w:r>
+      <w:proofErr w:type="spellEnd"/>
       <w:r>
         <w:rPr>
           <w:rFonts w:eastAsia="Times New Roman" w:cs="Times New Roman"/>
           <w:i/>
           <w:iCs/>
         </w:rPr>
-        <w:t>g,h,i</w:t>
-      </w:r>
-      <w:proofErr w:type="spellEnd"/>
+        <w:t>], [</w:t>
+      </w:r>
+      <w:proofErr w:type="spellStart"/>
+      <w:proofErr w:type="gramStart"/>
       <w:r>
         <w:rPr>
           <w:rFonts w:eastAsia="Times New Roman" w:cs="Times New Roman"/>
           <w:i/>
           <w:iCs/>
         </w:rPr>
-        <w:t>], and [</w:t>
-      </w:r>
-      <w:proofErr w:type="spellStart"/>
+        <w:t>g,h</w:t>
+      </w:r>
+      <w:proofErr w:type="gramEnd"/>
       <w:r>
         <w:rPr>
           <w:rFonts w:eastAsia="Times New Roman" w:cs="Times New Roman"/>
           <w:i/>
           <w:iCs/>
         </w:rPr>
-        <w:t>j,k,l</w:t>
+        <w:t>,i</w:t>
+      </w:r>
+      <w:proofErr w:type="spellEnd"/>
+      <w:r>
+        <w:rPr>
+          <w:rFonts w:eastAsia="Times New Roman" w:cs="Times New Roman"/>
+          <w:i/>
+          <w:iCs/>
+        </w:rPr>
+        <w:t>], and [</w:t>
+      </w:r>
+      <w:proofErr w:type="spellStart"/>
+      <w:proofErr w:type="gramStart"/>
+      <w:r>
+        <w:rPr>
+          <w:rFonts w:eastAsia="Times New Roman" w:cs="Times New Roman"/>
+          <w:i/>
+          <w:iCs/>
+        </w:rPr>
+        <w:t>j,k</w:t>
+      </w:r>
+      <w:proofErr w:type="gramEnd"/>
+      <w:r>
+        <w:rPr>
+          <w:rFonts w:eastAsia="Times New Roman" w:cs="Times New Roman"/>
+          <w:i/>
+          <w:iCs/>
+        </w:rPr>
+        <w:t>,l</w:t>
       </w:r>
       <w:proofErr w:type="spellEnd"/>
       <w:r>
@@ -3229,14 +3435,14 @@
         <w:rPr>
           <w:rFonts w:eastAsia="Times New Roman" w:cs="Times New Roman"/>
         </w:rPr>
-        <w:t xml:space="preserve">A formal report of this type should be primarily in paragraph form, with minimal subheadings, bullet points, or numbered lists. For most of your required report sections, no subheadings will be </w:t>
+        <w:t xml:space="preserve">A formal report of this type should be primarily in paragraph form, with minimal subheadings, bullet points, or numbered lists. For most of your required report sections, no subheadings will be necessary, and the information can be presented as </w:t>
       </w:r>
       <w:r>
         <w:rPr>
           <w:rFonts w:eastAsia="Times New Roman" w:cs="Times New Roman"/>
         </w:rPr>
         <w:lastRenderedPageBreak/>
-        <w:t>necessary, and the information can be presented as a single, cohesive discussion of the content relevant to that section. As a general rule of thumb, bulleted or numbered lists are only appropriate in this kind of report if the list items are less than one sentence, but are too long/detailed to be presented in a table.</w:t>
+        <w:t>a single, cohesive discussion of the content relevant to that section. As a general rule of thumb, bulleted or numbered lists are only appropriate in this kind of report if the list items are less than one sentence, but are too long/detailed to be presented in a table.</w:t>
       </w:r>
     </w:p>
     <w:p>
@@ -3364,10 +3570,10 @@
         <w:t>Parenthetical citations mid-sentence</w:t>
       </w:r>
       <w:r>
-        <w:t xml:space="preserve"> should be used when only a part of the sentence comes from the cited source, or when you are providing a citation for something specific such as a company, model architecture/method, or technique. See the </w:t>
-      </w:r>
-      <w:r>
-        <w:t>following examples for a sentence with multiple mid-sentence citations and a sentence with a specific mid-sentence citation below:</w:t>
+        <w:t xml:space="preserve"> should be used when only a part of the sentence comes from the cited source, or when you are providing a citation for something specific such as a company, model architecture/method, or technique. See the following examples for a sentence with multiple </w:t>
+      </w:r>
+      <w:r>
+        <w:t>mid-sentence citations and a sentence with a specific mid-sentence citation below:</w:t>
       </w:r>
     </w:p>
     <w:p>
@@ -3465,15 +3671,12 @@
         <w:t>below</w:t>
       </w:r>
       <w:r>
-        <w:t xml:space="preserve"> the image and referred to directly in your text (e.g. “As seen in Figure 7.1 [...]”, “Figure 7.1 shows [...]”). If your figure is important enough to </w:t>
-      </w:r>
+        <w:t xml:space="preserve"> the image and referred to directly in your text (e.g. “As seen in Figure 7.1 [...]”, “Figure 7.1 shows [...]”). If your figure is important enough to include in your report, then it deserves at least one sentence of discussion in the text. </w:t>
+      </w:r>
+    </w:p>
+    <w:p>
       <w:r>
         <w:lastRenderedPageBreak/>
-        <w:t xml:space="preserve">include in your report, then it deserves at least one sentence of discussion in the text. </w:t>
-      </w:r>
-    </w:p>
-    <w:p>
-      <w:r>
         <w:t>Each figure should also have a corresponding caption that briefly describes the content of the figure and can be used to highlight important details. If your figure is too complex to be limited to a single column width, you can include it as a full-width image at the top of the page.</w:t>
       </w:r>
     </w:p>
@@ -3850,7 +4053,6 @@
         <w:pStyle w:val="Heading2"/>
       </w:pPr>
       <w:r>
-        <w:lastRenderedPageBreak/>
         <w:t>7.4</w:t>
       </w:r>
       <w:r>
@@ -3860,6 +4062,7 @@
     </w:p>
     <w:p>
       <w:r>
+        <w:lastRenderedPageBreak/>
         <w:t xml:space="preserve">References should be alphabetically ordered using APA 7 formatting. You can refer to the </w:t>
       </w:r>
       <w:hyperlink r:id="rId21">
@@ -3898,10 +4101,10 @@
     </w:p>
     <w:p>
       <w:r>
-        <w:t xml:space="preserve">Appendices should be labeled alphabetically (Appendix A, Appendix B, etc.) and should be referred to directly in your text (e.g. “A complete table of results over all hyperparameters can be found in Appendix A”). Each appendix should </w:t>
-      </w:r>
-      <w:r>
-        <w:t>start on a new page and does not need to be in the two-column format if full page width makes more sense for your content (e.g. detailed figures or large tables).</w:t>
+        <w:t xml:space="preserve">Appendices should be labeled alphabetically (Appendix A, Appendix B, etc.) and should be referred to directly in your text (e.g. “A complete table of results over all hyperparameters can be found in Appendix A”). Each appendix should start on a new page and does not need to be in the two-column format if full page width makes more sense </w:t>
+      </w:r>
+      <w:r>
+        <w:t>for your content (e.g. detailed figures or large tables).</w:t>
       </w:r>
     </w:p>
     <w:p>
@@ -4002,7 +4205,21 @@
         <w:rPr>
           <w:rFonts w:eastAsia="Linux Libertine" w:cstheme="majorBidi"/>
         </w:rPr>
-        <w:t>Venkatasubramanian, V. (2019). The promise of artificial intelligence in chemical engineering: Is it here, finally?. AIChE Journal, 65(2), 466-478.</w:t>
+        <w:t xml:space="preserve">Venkatasubramanian, V. (2019). The promise of artificial intelligence in chemical engineering: Is it here, </w:t>
+      </w:r>
+      <w:proofErr w:type="gramStart"/>
+      <w:r>
+        <w:rPr>
+          <w:rFonts w:eastAsia="Linux Libertine" w:cstheme="majorBidi"/>
+        </w:rPr>
+        <w:t>finally?.</w:t>
+      </w:r>
+      <w:proofErr w:type="gramEnd"/>
+      <w:r>
+        <w:rPr>
+          <w:rFonts w:eastAsia="Linux Libertine" w:cstheme="majorBidi"/>
+        </w:rPr>
+        <w:t xml:space="preserve"> AIChE Journal, 65(2), 466-478.</w:t>
       </w:r>
     </w:p>
     <w:p>
@@ -4068,7 +4285,6 @@
         <w:jc w:val="left"/>
       </w:pPr>
       <w:r>
-        <w:lastRenderedPageBreak/>
         <w:t xml:space="preserve">ExxonMobil. (n.d.). </w:t>
       </w:r>
       <w:r>
@@ -4147,7 +4363,6 @@
     <w:p>
       <w:pPr>
         <w:spacing w:before="200" w:after="40" w:line="240" w:lineRule="auto"/>
-        <w:ind w:left="300" w:hanging="300"/>
         <w:rPr>
           <w:rFonts w:eastAsia="Linux Libertine" w:cstheme="majorBidi"/>
         </w:rPr>
@@ -4161,6 +4376,12 @@
           <w:rFonts w:eastAsia="Linux Libertine" w:cstheme="majorBidi"/>
         </w:rPr>
       </w:pPr>
+      <w:r>
+        <w:rPr>
+          <w:rFonts w:eastAsia="Linux Libertine" w:cstheme="majorBidi"/>
+        </w:rPr>
+        <w:t>Shin, J., Badgwell, T. A., Liu, K. H., &amp; Lee, J. H. (2019). Reinforcement learning – Overview of recent progress and implications for process control. Computers &amp; Chemical Engineering, 127, 282–294. https://doi.org/10.1016/j.compchemeng.2019.05.029</w:t>
+      </w:r>
     </w:p>
     <w:p>
       <w:pPr>
@@ -4183,7 +4404,21 @@
         <w:rPr>
           <w:rFonts w:eastAsia="Linux Libertine" w:cstheme="majorBidi"/>
         </w:rPr>
-        <w:t>Shin, J., Badgwell, T. A., Liu, K. H., &amp; Lee, J. H. (2019). Reinforcement learning – Overview of recent progress and implications for process control. Computers &amp; Chemical Engineering, 127, 282–294. https://doi.org/10.1016/j.compchemeng.2019.05.029</w:t>
+        <w:t xml:space="preserve">Spielberg, S., Cao, Y., &amp; </w:t>
+      </w:r>
+      <w:proofErr w:type="spellStart"/>
+      <w:r>
+        <w:rPr>
+          <w:rFonts w:eastAsia="Linux Libertine" w:cstheme="majorBidi"/>
+        </w:rPr>
+        <w:t>Gopaluni</w:t>
+      </w:r>
+      <w:proofErr w:type="spellEnd"/>
+      <w:r>
+        <w:rPr>
+          <w:rFonts w:eastAsia="Linux Libertine" w:cstheme="majorBidi"/>
+        </w:rPr>
+        <w:t>, B. (2019). Deep reinforcement learning for process control: A review for control engineers. Control Engineering Practice, 89, 212–222. https://doi.org/10.1016/j.conengprac.2019.05.017</w:t>
       </w:r>
     </w:p>
     <w:p>
@@ -4207,21 +4442,21 @@
         <w:rPr>
           <w:rFonts w:eastAsia="Linux Libertine" w:cstheme="majorBidi"/>
         </w:rPr>
-        <w:t xml:space="preserve">Spielberg, S., Cao, Y., &amp; </w:t>
+        <w:t xml:space="preserve">Brockman, G., Cheung, V., Pettersson, L., Schneider, J., Schulman, J., Tang, J., &amp; Zaremba, W. (2016). OpenAI Gym. </w:t>
       </w:r>
       <w:proofErr w:type="spellStart"/>
       <w:r>
         <w:rPr>
           <w:rFonts w:eastAsia="Linux Libertine" w:cstheme="majorBidi"/>
         </w:rPr>
-        <w:t>Gopaluni</w:t>
+        <w:t>arXiv</w:t>
       </w:r>
       <w:proofErr w:type="spellEnd"/>
       <w:r>
         <w:rPr>
           <w:rFonts w:eastAsia="Linux Libertine" w:cstheme="majorBidi"/>
         </w:rPr>
-        <w:t>, B. (2019). Deep reinforcement learning for process control: A review for control engineers. Control Engineering Practice, 89, 212–222. https://doi.org/10.1016/j.conengprac.2019.05.017</w:t>
+        <w:t>. https://doi.org/10.48550/arXiv.1606.01540</w:t>
       </w:r>
     </w:p>
     <w:p>
@@ -4245,7 +4480,13 @@
         <w:rPr>
           <w:rFonts w:eastAsia="Linux Libertine" w:cstheme="majorBidi"/>
         </w:rPr>
-        <w:t xml:space="preserve">Brockman, G., Cheung, V., Pettersson, L., Schneider, J., Schulman, J., Tang, J., &amp; Zaremba, W. (2016). OpenAI Gym. </w:t>
+        <w:t xml:space="preserve">Schulman, J., Wolski, F., Dhariwal, P., Radford, A., &amp; Klimov, O. (2017). Proximal policy </w:t>
+      </w:r>
+      <w:r>
+        <w:rPr>
+          <w:rFonts w:eastAsia="Linux Libertine" w:cstheme="majorBidi"/>
+        </w:rPr>
+        <w:t xml:space="preserve">optimization algorithms. </w:t>
       </w:r>
       <w:proofErr w:type="spellStart"/>
       <w:r>
@@ -4259,8 +4500,16 @@
         <w:rPr>
           <w:rFonts w:eastAsia="Linux Libertine" w:cstheme="majorBidi"/>
         </w:rPr>
-        <w:t>. https://doi.org/10.48550/arXiv.1606.01540</w:t>
-      </w:r>
+        <w:t>. https://doi.org/10.48550/arXiv.1707.06347</w:t>
+      </w:r>
+    </w:p>
+    <w:p>
+      <w:pPr>
+        <w:spacing w:before="200" w:after="40" w:line="240" w:lineRule="auto"/>
+        <w:rPr>
+          <w:rFonts w:eastAsia="Linux Libertine" w:cstheme="majorBidi"/>
+        </w:rPr>
+      </w:pPr>
     </w:p>
     <w:p>
       <w:pPr>
@@ -4270,6 +4519,12 @@
           <w:rFonts w:eastAsia="Linux Libertine" w:cstheme="majorBidi"/>
         </w:rPr>
       </w:pPr>
+      <w:r>
+        <w:rPr>
+          <w:rFonts w:eastAsia="Linux Libertine" w:cstheme="majorBidi"/>
+        </w:rPr>
+        <w:t>Chen, H., &amp; Liu, Z. (2025). Multi-agent reinforcement learning for integrated refinery optimization: A DWSIM-based study. Proceedings of the International Conference on Process Systems Engineering (PSE 2025), 114–129.</w:t>
+      </w:r>
     </w:p>
     <w:p>
       <w:pPr>
@@ -4279,26 +4534,6 @@
           <w:rFonts w:eastAsia="Linux Libertine" w:cstheme="majorBidi"/>
         </w:rPr>
       </w:pPr>
-      <w:r>
-        <w:rPr>
-          <w:rFonts w:eastAsia="Linux Libertine" w:cstheme="majorBidi"/>
-        </w:rPr>
-        <w:t xml:space="preserve">Schulman, J., Wolski, F., Dhariwal, P., Radford, A., &amp; Klimov, O. (2017). Proximal policy optimization algorithms. </w:t>
-      </w:r>
-      <w:proofErr w:type="spellStart"/>
-      <w:r>
-        <w:rPr>
-          <w:rFonts w:eastAsia="Linux Libertine" w:cstheme="majorBidi"/>
-        </w:rPr>
-        <w:t>arXiv</w:t>
-      </w:r>
-      <w:proofErr w:type="spellEnd"/>
-      <w:r>
-        <w:rPr>
-          <w:rFonts w:eastAsia="Linux Libertine" w:cstheme="majorBidi"/>
-        </w:rPr>
-        <w:t>. https://doi.org/10.48550/arXiv.1707.06347</w:t>
-      </w:r>
     </w:p>
     <w:p>
       <w:pPr>
@@ -4308,6 +4543,26 @@
           <w:rFonts w:eastAsia="Linux Libertine" w:cstheme="majorBidi"/>
         </w:rPr>
       </w:pPr>
+      <w:r>
+        <w:rPr>
+          <w:rFonts w:eastAsia="Linux Libertine" w:cstheme="majorBidi"/>
+        </w:rPr>
+        <w:t xml:space="preserve">Gupta, A., &amp; Kumar, S. (2025). </w:t>
+      </w:r>
+      <w:proofErr w:type="spellStart"/>
+      <w:r>
+        <w:rPr>
+          <w:rFonts w:eastAsia="Linux Libertine" w:cstheme="majorBidi"/>
+        </w:rPr>
+        <w:t>Lagrangian</w:t>
+      </w:r>
+      <w:proofErr w:type="spellEnd"/>
+      <w:r>
+        <w:rPr>
+          <w:rFonts w:eastAsia="Linux Libertine" w:cstheme="majorBidi"/>
+        </w:rPr>
+        <w:t>-constrained reinforcement learning for safety-critical distillation operations. Journal of Process Control, 142, 103–118. https://doi.org/10.1016/j.jprocont.2025.01.004</w:t>
+      </w:r>
     </w:p>
     <w:p>
       <w:pPr>
@@ -4317,12 +4572,6 @@
           <w:rFonts w:eastAsia="Linux Libertine" w:cstheme="majorBidi"/>
         </w:rPr>
       </w:pPr>
-      <w:r>
-        <w:rPr>
-          <w:rFonts w:eastAsia="Linux Libertine" w:cstheme="majorBidi"/>
-        </w:rPr>
-        <w:t>Contemporary Research (2024–2026 Context)</w:t>
-      </w:r>
     </w:p>
     <w:p>
       <w:pPr>
@@ -4336,7 +4585,7 @@
         <w:rPr>
           <w:rFonts w:eastAsia="Linux Libertine" w:cstheme="majorBidi"/>
         </w:rPr>
-        <w:t>Note: These entries represent the cutting-edge proceedings and peer-reviewed studies as of the current 2026 academic cycle.</w:t>
+        <w:t>Lee, K., Choi, D., &amp; Park, M. (2025). Explainable AI for petroleum refining: Utilizing SHAP values for autonomous distillation column control. AI in Chemical Engineering, 6(1), 45–62.</w:t>
       </w:r>
     </w:p>
     <w:p>
@@ -4360,100 +4609,7 @@
         <w:rPr>
           <w:rFonts w:eastAsia="Linux Libertine" w:cstheme="majorBidi"/>
         </w:rPr>
-        <w:t>Chen, H., &amp; Liu, Z. (2025). Multi-agent reinforcement learning for integrated refinery optimization: A DWSIM-based study. Proceedings of the International Conference on Process Systems Engineering (PSE 2025), 114–129.</w:t>
-      </w:r>
-    </w:p>
-    <w:p>
-      <w:pPr>
-        <w:spacing w:before="200" w:after="40" w:line="240" w:lineRule="auto"/>
-        <w:ind w:left="300" w:hanging="300"/>
-        <w:rPr>
-          <w:rFonts w:eastAsia="Linux Libertine" w:cstheme="majorBidi"/>
-        </w:rPr>
-      </w:pPr>
-    </w:p>
-    <w:p>
-      <w:pPr>
-        <w:spacing w:before="200" w:after="40" w:line="240" w:lineRule="auto"/>
-        <w:ind w:left="300" w:hanging="300"/>
-        <w:rPr>
-          <w:rFonts w:eastAsia="Linux Libertine" w:cstheme="majorBidi"/>
-        </w:rPr>
-      </w:pPr>
-      <w:r>
-        <w:rPr>
-          <w:rFonts w:eastAsia="Linux Libertine" w:cstheme="majorBidi"/>
-        </w:rPr>
-        <w:t xml:space="preserve">Gupta, A., &amp; Kumar, S. (2025). </w:t>
-      </w:r>
-      <w:proofErr w:type="spellStart"/>
-      <w:r>
-        <w:rPr>
-          <w:rFonts w:eastAsia="Linux Libertine" w:cstheme="majorBidi"/>
-        </w:rPr>
-        <w:t>Lagrangian</w:t>
-      </w:r>
-      <w:proofErr w:type="spellEnd"/>
-      <w:r>
-        <w:rPr>
-          <w:rFonts w:eastAsia="Linux Libertine" w:cstheme="majorBidi"/>
-        </w:rPr>
-        <w:t>-constrained reinforcement learning for safety-critical distillation operations. Journal of Process Control, 142, 103–118. https://doi.org/10.1016/j.jprocont.2025.01.004</w:t>
-      </w:r>
-    </w:p>
-    <w:p>
-      <w:pPr>
-        <w:spacing w:before="200" w:after="40" w:line="240" w:lineRule="auto"/>
-        <w:ind w:left="300" w:hanging="300"/>
-        <w:rPr>
-          <w:rFonts w:eastAsia="Linux Libertine" w:cstheme="majorBidi"/>
-        </w:rPr>
-      </w:pPr>
-    </w:p>
-    <w:p>
-      <w:pPr>
-        <w:spacing w:before="200" w:after="40" w:line="240" w:lineRule="auto"/>
-        <w:ind w:left="300" w:hanging="300"/>
-        <w:rPr>
-          <w:rFonts w:eastAsia="Linux Libertine" w:cstheme="majorBidi"/>
-        </w:rPr>
-      </w:pPr>
-      <w:r>
-        <w:rPr>
-          <w:rFonts w:eastAsia="Linux Libertine" w:cstheme="majorBidi"/>
-        </w:rPr>
-        <w:t>Lee, K., Choi, D., &amp; Park, M. (2025). Explainable AI for petroleum refining: Utilizing SHAP values for autonomous distillation column control. AI in Chemical Engineering, 6(1), 45–62.</w:t>
-      </w:r>
-    </w:p>
-    <w:p>
-      <w:pPr>
-        <w:spacing w:before="200" w:after="40" w:line="240" w:lineRule="auto"/>
-        <w:ind w:left="300" w:hanging="300"/>
-        <w:rPr>
-          <w:rFonts w:eastAsia="Linux Libertine" w:cstheme="majorBidi"/>
-        </w:rPr>
-      </w:pPr>
-    </w:p>
-    <w:p>
-      <w:pPr>
-        <w:spacing w:before="200" w:after="40" w:line="240" w:lineRule="auto"/>
-        <w:ind w:left="300" w:hanging="300"/>
-        <w:rPr>
-          <w:rFonts w:eastAsia="Linux Libertine" w:cstheme="majorBidi"/>
-        </w:rPr>
-      </w:pPr>
-      <w:r>
-        <w:rPr>
-          <w:rFonts w:eastAsia="Linux Libertine" w:cstheme="majorBidi"/>
-        </w:rPr>
-        <w:t xml:space="preserve">Zhang, Y., &amp; Petrova, I. (2025). Digital twin-driven autonomous plant operations: Real-time optimization of atmospheric distillation units </w:t>
-      </w:r>
-      <w:r>
-        <w:rPr>
-          <w:rFonts w:eastAsia="Linux Libertine" w:cstheme="majorBidi"/>
-        </w:rPr>
-        <w:lastRenderedPageBreak/>
-        <w:t>using deep policy gradients. Computers &amp; Chemical Engineering (Special Issue: AI in Energy), 184, 108–122.</w:t>
+        <w:t>Zhang, Y., &amp; Petrova, I. (2025). Digital twin-driven autonomous plant operations: Real-time optimization of atmospheric distillation units using deep policy gradients. Computers &amp; Chemical Engineering (Special Issue: AI in Energy), 184, 108–122.</w:t>
       </w:r>
     </w:p>
     <w:p>
@@ -4465,7 +4621,7 @@
       <w:footerReference w:type="even" r:id="rId25"/>
       <w:type w:val="continuous"/>
       <w:pgSz w:w="12240" w:h="15840"/>
-      <w:pgMar w:top="1500" w:right="1080" w:bottom="1276" w:left="1080" w:header="1080" w:footer="1080" w:gutter="0"/>
+      <w:pgMar w:top="1500" w:right="1080" w:bottom="1276" w:left="993" w:header="1080" w:footer="1080" w:gutter="0"/>
       <w:cols w:num="2" w:space="480"/>
       <w:formProt w:val="0"/>
       <w:titlePg/>
@@ -4530,6 +4686,9 @@
       </w:rPr>
     </w:pPr>
     <w:r>
+      <w:rPr>
+        <w:noProof/>
+      </w:rPr>
       <w:drawing>
         <wp:inline distT="0" distB="0" distL="0" distR="0" wp14:anchorId="0F0CB7A7" wp14:editId="75EE489F">
           <wp:extent cx="2833688" cy="998874"/>
@@ -4578,6 +4737,7 @@
     <w:r>
       <w:rPr>
         <w:rFonts w:ascii="Linux Biolinum" w:eastAsia="Linux Biolinum" w:hAnsi="Linux Biolinum" w:cs="Linux Biolinum"/>
+        <w:noProof/>
         <w:color w:val="000000"/>
         <w:sz w:val="14"/>
         <w:szCs w:val="14"/>
@@ -4635,6 +4795,7 @@
     <w:r>
       <w:rPr>
         <w:rFonts w:ascii="Linux Biolinum" w:eastAsia="Linux Biolinum" w:hAnsi="Linux Biolinum" w:cs="Linux Biolinum"/>
+        <w:noProof/>
         <w:color w:val="000000"/>
         <w:sz w:val="14"/>
         <w:szCs w:val="14"/>
@@ -7321,6 +7482,7 @@
   <w:style w:type="character" w:default="1" w:styleId="DefaultParagraphFont">
     <w:name w:val="Default Paragraph Font"/>
     <w:uiPriority w:val="1"/>
+    <w:semiHidden/>
     <w:unhideWhenUsed/>
   </w:style>
   <w:style w:type="table" w:default="1" w:styleId="TableNormal">
@@ -12916,28 +13078,28 @@
 </file>
 
 <file path=customXml/item1.xml><?xml version="1.0" encoding="utf-8"?>
-<b:Sources xmlns:b="http://schemas.openxmlformats.org/officeDocument/2006/bibliography" xmlns="http://schemas.openxmlformats.org/officeDocument/2006/bibliography" SelectedStyle="\APASixthEditionOfficeOnline.xsl" StyleName="APA" Version="6"/>
-</file>
-
-<file path=customXml/item2.xml><?xml version="1.0" encoding="utf-8"?>
 <go:gDocsCustomXmlDataStorage xmlns:go="http://customooxmlschemas.google.com/" xmlns:r="http://schemas.openxmlformats.org/officeDocument/2006/relationships">
   <go:docsCustomData roundtripDataSignature="AMtx7mhGbw5ytn5wEH4ZlNP9gRCNMPdzfw==">AMUW2mU012QJVuiVMkD/gCCNj70OycHvaZTFzdyU4a+e9FbY8FknQA0AjjkChrXlhIFEjpvrliu1fU1vBgDfxxCXjhLy50R3pNfhxAJPw64y75cfTEgflDw=</go:docsCustomData>
 </go:gDocsCustomXmlDataStorage>
 </file>
 
-<file path=customXml/itemProps1.xml><?xml version="1.0" encoding="utf-8"?>
-<ds:datastoreItem xmlns:ds="http://schemas.openxmlformats.org/officeDocument/2006/customXml" ds:itemID="{93FB7AA3-242F-46D3-838B-3F6C438EF122}">
-  <ds:schemaRefs>
-    <ds:schemaRef ds:uri="http://schemas.openxmlformats.org/officeDocument/2006/bibliography"/>
-  </ds:schemaRefs>
-</ds:datastoreItem>
+<file path=customXml/item2.xml><?xml version="1.0" encoding="utf-8"?>
+<b:Sources xmlns:b="http://schemas.openxmlformats.org/officeDocument/2006/bibliography" xmlns="http://schemas.openxmlformats.org/officeDocument/2006/bibliography" SelectedStyle="\APASixthEditionOfficeOnline.xsl" StyleName="APA" Version="6"/>
 </file>
 
-<file path=customXml/itemProps2.xml><?xml version="1.0" encoding="utf-8"?>
+<file path=customXml/itemProps1.xml><?xml version="1.0" encoding="utf-8"?>
 <ds:datastoreItem xmlns:ds="http://schemas.openxmlformats.org/officeDocument/2006/customXml" ds:itemID="{11111111-1234-1234-1234-123412341234}">
   <ds:schemaRefs>
     <ds:schemaRef ds:uri="http://customooxmlschemas.google.com/"/>
     <ds:schemaRef ds:uri="http://schemas.openxmlformats.org/officeDocument/2006/relationships"/>
   </ds:schemaRefs>
 </ds:datastoreItem>
+</file>
+
+<file path=customXml/itemProps2.xml><?xml version="1.0" encoding="utf-8"?>
+<ds:datastoreItem xmlns:ds="http://schemas.openxmlformats.org/officeDocument/2006/customXml" ds:itemID="{93FB7AA3-242F-46D3-838B-3F6C438EF122}">
+  <ds:schemaRefs>
+    <ds:schemaRef ds:uri="http://schemas.openxmlformats.org/officeDocument/2006/bibliography"/>
+  </ds:schemaRefs>
+</ds:datastoreItem>
 </file>
</xml_diff>

<commit_message>
Report updated; Readme updated
</commit_message>
<xml_diff>
--- a/Report/AAI590 Capstone Project Report.docx
+++ b/Report/AAI590 Capstone Project Report.docx
@@ -669,15 +669,7 @@
       </w:r>
       <w:proofErr w:type="spellEnd"/>
       <w:r>
-        <w:t xml:space="preserve">, an optimizer built on Deep Reinforcement Learning agent, and </w:t>
-      </w:r>
-      <w:proofErr w:type="gramStart"/>
-      <w:r>
-        <w:t>a</w:t>
-      </w:r>
-      <w:proofErr w:type="gramEnd"/>
-      <w:r>
-        <w:t xml:space="preserve"> LLM-based AI Agent which creates reports and interacts with the user for explainability. </w:t>
+        <w:t xml:space="preserve">, an optimizer built on Deep Reinforcement Learning agent, and a LLM-based AI Agent which creates reports and interacts with the user for explainability. </w:t>
       </w:r>
       <w:r>
         <w:t>In th</w:t>
@@ -797,15 +789,7 @@
         <w:t>Our study revolves around finding the most optimized manner of distillation of crude. Hence,</w:t>
       </w:r>
       <w:r>
-        <w:t xml:space="preserve"> one of the </w:t>
-      </w:r>
-      <w:proofErr w:type="gramStart"/>
-      <w:r>
-        <w:t>primary</w:t>
-      </w:r>
-      <w:proofErr w:type="gramEnd"/>
-      <w:r>
-        <w:t xml:space="preserve"> focuses in this</w:t>
+        <w:t xml:space="preserve"> one of the primary focuses in this</w:t>
       </w:r>
       <w:r>
         <w:t xml:space="preserve"> study </w:t>
@@ -1595,14 +1579,14 @@
         <w:rPr>
           <w:lang w:val="en-IN"/>
         </w:rPr>
-        <w:t>Upper Z</w:t>
+        <w:t xml:space="preserve">Upper </w:t>
       </w:r>
       <w:proofErr w:type="spellStart"/>
       <w:r>
         <w:rPr>
           <w:lang w:val="en-IN"/>
         </w:rPr>
-        <w:t>akum</w:t>
+        <w:t>Zakum</w:t>
       </w:r>
       <w:proofErr w:type="spellEnd"/>
       <w:r>
@@ -1627,7 +1611,19 @@
         <w:rPr>
           <w:lang w:val="en-IN"/>
         </w:rPr>
-        <w:t xml:space="preserve"> integration of a Large Language Model (LLM) as an interpretability layer is essential here; it translates these complex thermodynamic and economic trade-offs into natural language engineering reports. This "Explainable AI" (XAI) approach allows operators to understand why the agent might suggest a more difficult-to-process feed like Upper </w:t>
+        <w:t xml:space="preserve"> integration of a Large Language Model (LLM) as an interpretability layer is essential here; it translates these complex thermodynamic and economic trade-offs into natural language engineering reports. This Explainable AI (XAI) </w:t>
+      </w:r>
+      <w:r>
+        <w:rPr>
+          <w:lang w:val="en-IN"/>
+        </w:rPr>
+        <w:t xml:space="preserve">layer is likely to shed light to </w:t>
+      </w:r>
+      <w:r>
+        <w:rPr>
+          <w:lang w:val="en-IN"/>
+        </w:rPr>
+        <w:t xml:space="preserve">understand why the agent might suggest a more difficult-to-process feed like Upper </w:t>
       </w:r>
       <w:proofErr w:type="spellStart"/>
       <w:r>
@@ -2899,7 +2895,67 @@
         <w:rPr>
           <w:rFonts w:eastAsia="Times New Roman" w:cs="Times New Roman"/>
         </w:rPr>
-        <w:t xml:space="preserve"> is a penalty coefficient for violating quality constraints like Flash Point or ASTM D86 95% points. Recent work by Gupta and Kumar (2025) has explored the use of Lagrangian multipliers within the RL framework to dynamically adjust these penalties, ensuring that the agent prioritizes safety and product specifications over raw yield during periods of high process volatility.</w:t>
+        <w:t xml:space="preserve"> is a penalty coefficient for violating quality constraints like Flash Point or ASTM D86 95% points. </w:t>
+      </w:r>
+      <w:r>
+        <w:rPr>
+          <w:rFonts w:eastAsia="Times New Roman" w:cs="Times New Roman"/>
+        </w:rPr>
+        <w:t xml:space="preserve">Literature review of recent times shows </w:t>
+      </w:r>
+      <w:r>
+        <w:rPr>
+          <w:rFonts w:eastAsia="Times New Roman" w:cs="Times New Roman"/>
+        </w:rPr>
+        <w:t>use of Lagrangian multipliers within the RL framework to dynamically adjust these penalties, ensuring that the agent prioritizes safety and product specifications over raw yield during periods of high process volatility</w:t>
+      </w:r>
+      <w:r>
+        <w:rPr>
+          <w:rFonts w:eastAsia="Times New Roman" w:cs="Times New Roman"/>
+        </w:rPr>
+        <w:t xml:space="preserve"> (</w:t>
+      </w:r>
+      <w:r>
+        <w:rPr>
+          <w:rFonts w:eastAsia="Times New Roman" w:cs="Times New Roman"/>
+        </w:rPr>
+        <w:t xml:space="preserve">Gupta </w:t>
+      </w:r>
+      <w:r>
+        <w:rPr>
+          <w:rFonts w:eastAsia="Times New Roman" w:cs="Times New Roman"/>
+        </w:rPr>
+        <w:t>&amp;</w:t>
+      </w:r>
+      <w:r>
+        <w:rPr>
+          <w:rFonts w:eastAsia="Times New Roman" w:cs="Times New Roman"/>
+        </w:rPr>
+        <w:t xml:space="preserve"> Kumar</w:t>
+      </w:r>
+      <w:r>
+        <w:rPr>
+          <w:rFonts w:eastAsia="Times New Roman" w:cs="Times New Roman"/>
+        </w:rPr>
+        <w:t xml:space="preserve">, </w:t>
+      </w:r>
+      <w:r>
+        <w:rPr>
+          <w:rFonts w:eastAsia="Times New Roman" w:cs="Times New Roman"/>
+        </w:rPr>
+        <w:t>2025</w:t>
+      </w:r>
+      <w:r>
+        <w:rPr>
+          <w:rFonts w:eastAsia="Times New Roman" w:cs="Times New Roman"/>
+        </w:rPr>
+        <w:t>)</w:t>
+      </w:r>
+      <w:r>
+        <w:rPr>
+          <w:rFonts w:eastAsia="Times New Roman" w:cs="Times New Roman"/>
+        </w:rPr>
+        <w:t>.</w:t>
       </w:r>
     </w:p>
     <w:p>
@@ -3042,79 +3098,49 @@
         <w:t>explored hyperparameters a, b, and c with values [</w:t>
       </w:r>
       <w:proofErr w:type="spellStart"/>
-      <w:proofErr w:type="gramStart"/>
       <w:r>
         <w:rPr>
           <w:rFonts w:eastAsia="Times New Roman" w:cs="Times New Roman"/>
           <w:i/>
           <w:iCs/>
         </w:rPr>
-        <w:t>d,e</w:t>
-      </w:r>
-      <w:proofErr w:type="gramEnd"/>
+        <w:t>d,e,f</w:t>
+      </w:r>
+      <w:proofErr w:type="spellEnd"/>
       <w:r>
         <w:rPr>
           <w:rFonts w:eastAsia="Times New Roman" w:cs="Times New Roman"/>
           <w:i/>
           <w:iCs/>
         </w:rPr>
-        <w:t>,f</w:t>
-      </w:r>
-      <w:proofErr w:type="spellEnd"/>
+        <w:t>], [</w:t>
+      </w:r>
+      <w:proofErr w:type="spellStart"/>
       <w:r>
         <w:rPr>
           <w:rFonts w:eastAsia="Times New Roman" w:cs="Times New Roman"/>
           <w:i/>
           <w:iCs/>
         </w:rPr>
-        <w:t>], [</w:t>
-      </w:r>
-      <w:proofErr w:type="spellStart"/>
-      <w:proofErr w:type="gramStart"/>
+        <w:t>g,h,i</w:t>
+      </w:r>
+      <w:proofErr w:type="spellEnd"/>
       <w:r>
         <w:rPr>
           <w:rFonts w:eastAsia="Times New Roman" w:cs="Times New Roman"/>
           <w:i/>
           <w:iCs/>
         </w:rPr>
-        <w:t>g,h</w:t>
-      </w:r>
-      <w:proofErr w:type="gramEnd"/>
+        <w:t>], and [</w:t>
+      </w:r>
+      <w:proofErr w:type="spellStart"/>
       <w:r>
         <w:rPr>
           <w:rFonts w:eastAsia="Times New Roman" w:cs="Times New Roman"/>
           <w:i/>
           <w:iCs/>
         </w:rPr>
-        <w:t>,i</w:t>
-      </w:r>
-      <w:proofErr w:type="spellEnd"/>
-      <w:r>
-        <w:rPr>
-          <w:rFonts w:eastAsia="Times New Roman" w:cs="Times New Roman"/>
-          <w:i/>
-          <w:iCs/>
-        </w:rPr>
-        <w:t>], and [</w:t>
-      </w:r>
-      <w:proofErr w:type="spellStart"/>
-      <w:proofErr w:type="gramStart"/>
-      <w:r>
-        <w:rPr>
-          <w:rFonts w:eastAsia="Times New Roman" w:cs="Times New Roman"/>
-          <w:i/>
-          <w:iCs/>
-        </w:rPr>
-        <w:t>j,k</w:t>
-      </w:r>
-      <w:proofErr w:type="gramEnd"/>
-      <w:r>
-        <w:rPr>
-          <w:rFonts w:eastAsia="Times New Roman" w:cs="Times New Roman"/>
-          <w:i/>
-          <w:iCs/>
-        </w:rPr>
-        <w:t>,l</w:t>
+        <w:t>j,k,l</w:t>
       </w:r>
       <w:proofErr w:type="spellEnd"/>
       <w:r>
@@ -4157,12 +4183,80 @@
           <w:rFonts w:eastAsia="Linux Libertine" w:cstheme="majorBidi"/>
         </w:rPr>
       </w:pPr>
+      <w:proofErr w:type="spellStart"/>
       <w:r>
         <w:rPr>
           <w:rFonts w:eastAsia="Linux Libertine" w:cstheme="majorBidi"/>
-        </w:rPr>
-        <w:t>Nian, R., Liu, J., &amp; Huang, B. (2020). A review on reinforcement learning: Introduction and applications in industrial process control. Computers &amp; Chemical Engineering, 139, 106886.</w:t>
-      </w:r>
+          <w:lang w:val="en-IN"/>
+        </w:rPr>
+        <w:t>AlRijeb</w:t>
+      </w:r>
+      <w:proofErr w:type="spellEnd"/>
+      <w:r>
+        <w:rPr>
+          <w:rFonts w:eastAsia="Linux Libertine" w:cstheme="majorBidi"/>
+          <w:lang w:val="en-IN"/>
+        </w:rPr>
+        <w:t xml:space="preserve">, M. F. S., Othman, M. L., Ishak, A., Hassan, M. K., &amp; </w:t>
+      </w:r>
+      <w:proofErr w:type="spellStart"/>
+      <w:r>
+        <w:rPr>
+          <w:rFonts w:eastAsia="Linux Libertine" w:cstheme="majorBidi"/>
+          <w:lang w:val="en-IN"/>
+        </w:rPr>
+        <w:t>Albaker</w:t>
+      </w:r>
+      <w:proofErr w:type="spellEnd"/>
+      <w:r>
+        <w:rPr>
+          <w:rFonts w:eastAsia="Linux Libertine" w:cstheme="majorBidi"/>
+          <w:lang w:val="en-IN"/>
+        </w:rPr>
+        <w:t xml:space="preserve">, B. M. (2025). Machine learning-driven soft sensor implementation for real-time fault detection in CDU of oil refinery. </w:t>
+      </w:r>
+      <w:r>
+        <w:rPr>
+          <w:rFonts w:eastAsia="Linux Libertine" w:cstheme="majorBidi"/>
+          <w:i/>
+          <w:iCs/>
+          <w:lang w:val="en-IN"/>
+        </w:rPr>
+        <w:t>Engineering, Technology &amp; Applied Science Research</w:t>
+      </w:r>
+      <w:r>
+        <w:rPr>
+          <w:rFonts w:eastAsia="Linux Libertine" w:cstheme="majorBidi"/>
+          <w:lang w:val="en-IN"/>
+        </w:rPr>
+        <w:t xml:space="preserve">, </w:t>
+      </w:r>
+      <w:r>
+        <w:rPr>
+          <w:rFonts w:eastAsia="Linux Libertine" w:cstheme="majorBidi"/>
+          <w:i/>
+          <w:iCs/>
+          <w:lang w:val="en-IN"/>
+        </w:rPr>
+        <w:t>15</w:t>
+      </w:r>
+      <w:r>
+        <w:rPr>
+          <w:rFonts w:eastAsia="Linux Libertine" w:cstheme="majorBidi"/>
+          <w:lang w:val="en-IN"/>
+        </w:rPr>
+        <w:t xml:space="preserve">(1), 20425–20432. </w:t>
+      </w:r>
+      <w:hyperlink r:id="rId22" w:tgtFrame="_blank" w:history="1">
+        <w:r>
+          <w:rPr>
+            <w:rStyle w:val="Hyperlink"/>
+            <w:rFonts w:eastAsia="Linux Libertine" w:cstheme="majorBidi"/>
+            <w:lang w:val="en-IN"/>
+          </w:rPr>
+          <w:t>https://doi.org/10.48084/etasr.9781</w:t>
+        </w:r>
+      </w:hyperlink>
     </w:p>
     <w:p>
       <w:pPr>
@@ -4175,23 +4269,100 @@
       <w:r>
         <w:rPr>
           <w:rFonts w:eastAsia="Linux Libertine" w:cstheme="majorBidi"/>
-        </w:rPr>
-        <w:t xml:space="preserve">Spielberg, S., </w:t>
+          <w:lang w:val="en-IN"/>
+        </w:rPr>
+        <w:t>Al-Sayegh, A., Al-</w:t>
       </w:r>
       <w:proofErr w:type="spellStart"/>
       <w:r>
         <w:rPr>
           <w:rFonts w:eastAsia="Linux Libertine" w:cstheme="majorBidi"/>
-        </w:rPr>
-        <w:t>Tulsyan</w:t>
+          <w:lang w:val="en-IN"/>
+        </w:rPr>
+        <w:t>Wahaibi</w:t>
       </w:r>
       <w:proofErr w:type="spellEnd"/>
       <w:r>
         <w:rPr>
           <w:rFonts w:eastAsia="Linux Libertine" w:cstheme="majorBidi"/>
-        </w:rPr>
-        <w:t>, A., Lawrence, N. P., Loewen, P. D., &amp; Bhushan Gopaluni, R. (2019). Toward deep reinforcement learning for process control: A review. Computers &amp; Chemical Engineering, 132, 106602.</w:t>
-      </w:r>
+          <w:lang w:val="en-IN"/>
+        </w:rPr>
+        <w:t xml:space="preserve">, Y., Joshi, S., Al-Bahry, S., </w:t>
+      </w:r>
+      <w:proofErr w:type="spellStart"/>
+      <w:r>
+        <w:rPr>
+          <w:rFonts w:eastAsia="Linux Libertine" w:cstheme="majorBidi"/>
+          <w:lang w:val="en-IN"/>
+        </w:rPr>
+        <w:t>Elshafie</w:t>
+      </w:r>
+      <w:proofErr w:type="spellEnd"/>
+      <w:r>
+        <w:rPr>
+          <w:rFonts w:eastAsia="Linux Libertine" w:cstheme="majorBidi"/>
+          <w:lang w:val="en-IN"/>
+        </w:rPr>
+        <w:t>, A., &amp; Al-</w:t>
+      </w:r>
+      <w:proofErr w:type="spellStart"/>
+      <w:r>
+        <w:rPr>
+          <w:rFonts w:eastAsia="Linux Libertine" w:cstheme="majorBidi"/>
+          <w:lang w:val="en-IN"/>
+        </w:rPr>
+        <w:t>Bemani</w:t>
+      </w:r>
+      <w:proofErr w:type="spellEnd"/>
+      <w:r>
+        <w:rPr>
+          <w:rFonts w:eastAsia="Linux Libertine" w:cstheme="majorBidi"/>
+          <w:lang w:val="en-IN"/>
+        </w:rPr>
+        <w:t xml:space="preserve">, A. (2016). Bioremediation of heavy crude oil contamination. </w:t>
+      </w:r>
+      <w:r>
+        <w:rPr>
+          <w:rFonts w:eastAsia="Linux Libertine" w:cstheme="majorBidi"/>
+          <w:i/>
+          <w:iCs/>
+          <w:lang w:val="en-IN"/>
+        </w:rPr>
+        <w:t>The Open Biotechnology Journal</w:t>
+      </w:r>
+      <w:r>
+        <w:rPr>
+          <w:rFonts w:eastAsia="Linux Libertine" w:cstheme="majorBidi"/>
+          <w:lang w:val="en-IN"/>
+        </w:rPr>
+        <w:t xml:space="preserve">, </w:t>
+      </w:r>
+      <w:r>
+        <w:rPr>
+          <w:rFonts w:eastAsia="Linux Libertine" w:cstheme="majorBidi"/>
+          <w:i/>
+          <w:iCs/>
+          <w:lang w:val="en-IN"/>
+        </w:rPr>
+        <w:t>10</w:t>
+      </w:r>
+      <w:r>
+        <w:rPr>
+          <w:rFonts w:eastAsia="Linux Libertine" w:cstheme="majorBidi"/>
+          <w:lang w:val="en-IN"/>
+        </w:rPr>
+        <w:t xml:space="preserve">(1), 301–311. </w:t>
+      </w:r>
+      <w:hyperlink r:id="rId23" w:tgtFrame="_blank" w:history="1">
+        <w:r>
+          <w:rPr>
+            <w:rStyle w:val="Hyperlink"/>
+            <w:rFonts w:eastAsia="Linux Libertine" w:cstheme="majorBidi"/>
+            <w:lang w:val="en-IN"/>
+          </w:rPr>
+          <w:t>https://doi.org/10.2174/1874070701610010301</w:t>
+        </w:r>
+      </w:hyperlink>
     </w:p>
     <w:p>
       <w:pPr>
@@ -4205,21 +4376,7 @@
         <w:rPr>
           <w:rFonts w:eastAsia="Linux Libertine" w:cstheme="majorBidi"/>
         </w:rPr>
-        <w:t xml:space="preserve">Venkatasubramanian, V. (2019). The promise of artificial intelligence in chemical engineering: Is it here, </w:t>
-      </w:r>
-      <w:proofErr w:type="gramStart"/>
-      <w:r>
-        <w:rPr>
-          <w:rFonts w:eastAsia="Linux Libertine" w:cstheme="majorBidi"/>
-        </w:rPr>
-        <w:t>finally?.</w:t>
-      </w:r>
-      <w:proofErr w:type="gramEnd"/>
-      <w:r>
-        <w:rPr>
-          <w:rFonts w:eastAsia="Linux Libertine" w:cstheme="majorBidi"/>
-        </w:rPr>
-        <w:t xml:space="preserve"> AIChE Journal, 65(2), 466-478.</w:t>
+        <w:t>Biegler, L. T. (2010). Nonlinear programming: Concepts, algorithms, and applications to chemical processes. Society for Industrial and Applied Mathematics (SIAM). https://doi.org/10.1137/1.9780898719383</w:t>
       </w:r>
     </w:p>
     <w:p>
@@ -4234,16 +4391,22 @@
         <w:rPr>
           <w:rFonts w:eastAsia="Linux Libertine" w:cstheme="majorBidi"/>
         </w:rPr>
-        <w:t>Biegler, L. T. (2010). Nonlinear programming: Concepts, algorithms, and applications to chemical processes. Society for Industrial and Applied Mathematics (SIAM). https://doi.org/10.1137/1.9780898719383</w:t>
-      </w:r>
-    </w:p>
-    <w:p>
-      <w:pPr>
-        <w:spacing w:before="200" w:after="40" w:line="240" w:lineRule="auto"/>
+        <w:t xml:space="preserve">Brockman, G., Cheung, V., Pettersson, L., Schneider, J., Schulman, J., Tang, J., &amp; Zaremba, W. (2016). OpenAI Gym. </w:t>
+      </w:r>
+      <w:proofErr w:type="spellStart"/>
+      <w:r>
         <w:rPr>
           <w:rFonts w:eastAsia="Linux Libertine" w:cstheme="majorBidi"/>
         </w:rPr>
-      </w:pPr>
+        <w:t>arXiv</w:t>
+      </w:r>
+      <w:proofErr w:type="spellEnd"/>
+      <w:r>
+        <w:rPr>
+          <w:rFonts w:eastAsia="Linux Libertine" w:cstheme="majorBidi"/>
+        </w:rPr>
+        <w:t>. https://doi.org/10.48550/arXiv.1606.01540</w:t>
+      </w:r>
     </w:p>
     <w:p>
       <w:pPr>
@@ -4257,9 +4420,25 @@
         <w:rPr>
           <w:rFonts w:eastAsia="Linux Libertine" w:cstheme="majorBidi"/>
         </w:rPr>
+        <w:t>Chen, H., &amp; Liu, Z. (2025). Multi-agent reinforcement learning for integrated refinery optimization: A DWSIM-based study. Proceedings of the International Conference on Process Systems Engineering (PSE 2025), 114–129.</w:t>
+      </w:r>
+    </w:p>
+    <w:p>
+      <w:pPr>
+        <w:spacing w:before="200" w:after="40" w:line="240" w:lineRule="auto"/>
+        <w:ind w:left="300" w:hanging="300"/>
+        <w:rPr>
+          <w:rFonts w:eastAsia="Linux Libertine" w:cstheme="majorBidi"/>
+        </w:rPr>
+      </w:pPr>
+      <w:r>
+        <w:rPr>
+          <w:rFonts w:eastAsia="Linux Libertine" w:cstheme="majorBidi"/>
+        </w:rPr>
+        <w:lastRenderedPageBreak/>
         <w:t xml:space="preserve">Engell, S. (2007). Feedback control for optimal process operation. Journal of Process Control, 17(3), 203–219. </w:t>
       </w:r>
-      <w:hyperlink r:id="rId22" w:history="1">
+      <w:hyperlink r:id="rId24" w:history="1">
         <w:r>
           <w:rPr>
             <w:rStyle w:val="Hyperlink"/>
@@ -4272,15 +4451,6 @@
     <w:p>
       <w:pPr>
         <w:spacing w:before="200" w:after="40" w:line="240" w:lineRule="auto"/>
-        <w:ind w:left="300" w:hanging="300"/>
-        <w:rPr>
-          <w:rFonts w:eastAsia="Linux Libertine" w:cstheme="majorBidi"/>
-        </w:rPr>
-      </w:pPr>
-    </w:p>
-    <w:p>
-      <w:pPr>
-        <w:spacing w:before="200" w:after="40" w:line="240" w:lineRule="auto"/>
         <w:ind w:left="426" w:hanging="426"/>
         <w:jc w:val="left"/>
       </w:pPr>
@@ -4297,7 +4467,7 @@
       <w:r>
         <w:t xml:space="preserve">. </w:t>
       </w:r>
-      <w:hyperlink r:id="rId23" w:tgtFrame="_blank" w:history="1">
+      <w:hyperlink r:id="rId25" w:tgtFrame="_blank" w:history="1">
         <w:r>
           <w:rPr>
             <w:rStyle w:val="Hyperlink"/>
@@ -4309,9 +4479,90 @@
     <w:p>
       <w:pPr>
         <w:spacing w:before="200" w:after="40" w:line="240" w:lineRule="auto"/>
-        <w:ind w:left="426" w:hanging="426"/>
-        <w:jc w:val="left"/>
-      </w:pPr>
+        <w:ind w:left="300" w:hanging="300"/>
+        <w:rPr>
+          <w:rFonts w:eastAsia="Linux Libertine" w:cstheme="majorBidi"/>
+          <w:lang w:val="en-IN"/>
+        </w:rPr>
+      </w:pPr>
+      <w:r>
+        <w:rPr>
+          <w:rFonts w:eastAsia="Linux Libertine" w:cstheme="majorBidi"/>
+          <w:lang w:val="en-IN"/>
+        </w:rPr>
+        <w:t xml:space="preserve">González-Durán, R., Rodríguez-Prieto, A., Camacho, A. M., Peña-Ballesteros, D. Y., &amp; Serna, A. (2024). Experimental assessment of corrosion properties for materials intended for heavy crude processing. </w:t>
+      </w:r>
+      <w:r>
+        <w:rPr>
+          <w:rFonts w:eastAsia="Linux Libertine" w:cstheme="majorBidi"/>
+          <w:i/>
+          <w:iCs/>
+          <w:lang w:val="en-IN"/>
+        </w:rPr>
+        <w:t>Materials</w:t>
+      </w:r>
+      <w:r>
+        <w:rPr>
+          <w:rFonts w:eastAsia="Linux Libertine" w:cstheme="majorBidi"/>
+          <w:lang w:val="en-IN"/>
+        </w:rPr>
+        <w:t xml:space="preserve">, </w:t>
+      </w:r>
+      <w:r>
+        <w:rPr>
+          <w:rFonts w:eastAsia="Linux Libertine" w:cstheme="majorBidi"/>
+          <w:i/>
+          <w:iCs/>
+          <w:lang w:val="en-IN"/>
+        </w:rPr>
+        <w:t>17</w:t>
+      </w:r>
+      <w:r>
+        <w:rPr>
+          <w:rFonts w:eastAsia="Linux Libertine" w:cstheme="majorBidi"/>
+          <w:lang w:val="en-IN"/>
+        </w:rPr>
+        <w:t xml:space="preserve">(21), 5275. </w:t>
+      </w:r>
+      <w:hyperlink r:id="rId26" w:tgtFrame="_blank" w:history="1">
+        <w:r>
+          <w:rPr>
+            <w:rStyle w:val="Hyperlink"/>
+            <w:rFonts w:eastAsia="Linux Libertine" w:cstheme="majorBidi"/>
+            <w:lang w:val="en-IN"/>
+          </w:rPr>
+          <w:t>https://doi.org/10.3390/ma17215275</w:t>
+        </w:r>
+      </w:hyperlink>
+    </w:p>
+    <w:p>
+      <w:pPr>
+        <w:spacing w:before="200" w:after="40" w:line="240" w:lineRule="auto"/>
+        <w:ind w:left="300" w:hanging="300"/>
+        <w:rPr>
+          <w:rFonts w:eastAsia="Linux Libertine" w:cstheme="majorBidi"/>
+        </w:rPr>
+      </w:pPr>
+      <w:r>
+        <w:rPr>
+          <w:rFonts w:eastAsia="Linux Libertine" w:cstheme="majorBidi"/>
+        </w:rPr>
+        <w:t xml:space="preserve">Gupta, A., &amp; Kumar, S. (2025). </w:t>
+      </w:r>
+      <w:proofErr w:type="spellStart"/>
+      <w:r>
+        <w:rPr>
+          <w:rFonts w:eastAsia="Linux Libertine" w:cstheme="majorBidi"/>
+        </w:rPr>
+        <w:t>Lagrangian</w:t>
+      </w:r>
+      <w:proofErr w:type="spellEnd"/>
+      <w:r>
+        <w:rPr>
+          <w:rFonts w:eastAsia="Linux Libertine" w:cstheme="majorBidi"/>
+        </w:rPr>
+        <w:t>-constrained reinforcement learning for safety-critical distillation operations. Journal of Process Control, 142, 103–118. https://doi.org/10.1016/j.jprocont.2025.01.004</w:t>
+      </w:r>
     </w:p>
     <w:p>
       <w:pPr>
@@ -4328,7 +4579,7 @@
         </w:rPr>
         <w:t xml:space="preserve">Hubbs, C. P., Li, C., Sahinidis, N. V., Grossmann, I. E., &amp; John, J. M. (2020). A deep reinforcement learning approach for chemical production scheduling. Computers &amp; Chemical Engineering, 141, 106982. </w:t>
       </w:r>
-      <w:hyperlink r:id="rId24" w:history="1">
+      <w:hyperlink r:id="rId27" w:history="1">
         <w:r>
           <w:rPr>
             <w:rStyle w:val="Hyperlink"/>
@@ -4341,9 +4592,17 @@
     <w:p>
       <w:pPr>
         <w:spacing w:before="200" w:after="40" w:line="240" w:lineRule="auto"/>
-        <w:ind w:left="426" w:hanging="426"/>
-        <w:jc w:val="left"/>
-      </w:pPr>
+        <w:ind w:left="300" w:hanging="300"/>
+        <w:rPr>
+          <w:rFonts w:eastAsia="Linux Libertine" w:cstheme="majorBidi"/>
+        </w:rPr>
+      </w:pPr>
+      <w:r>
+        <w:rPr>
+          <w:rFonts w:eastAsia="Linux Libertine" w:cstheme="majorBidi"/>
+        </w:rPr>
+        <w:t>Lee, K., Choi, D., &amp; Park, M. (2025). Explainable AI for petroleum refining: Utilizing SHAP values for autonomous distillation column control. AI in Chemical Engineering, 6(1), 45–62.</w:t>
+      </w:r>
     </w:p>
     <w:p>
       <w:pPr>
@@ -4351,22 +4610,44 @@
         <w:ind w:left="300" w:hanging="300"/>
         <w:rPr>
           <w:rFonts w:eastAsia="Linux Libertine" w:cstheme="majorBidi"/>
+          <w:lang w:val="en-IN"/>
         </w:rPr>
       </w:pPr>
       <w:r>
         <w:rPr>
           <w:rFonts w:eastAsia="Linux Libertine" w:cstheme="majorBidi"/>
-        </w:rPr>
-        <w:t>Qin, S. J., &amp; Badgwell, T. A. (2003). A survey of industrial model predictive control technology. Control Engineering Practice, 11(7), 733–764. https://doi.org/10.1016/S0967-0661(02)00186-7</w:t>
-      </w:r>
-    </w:p>
-    <w:p>
-      <w:pPr>
-        <w:spacing w:before="200" w:after="40" w:line="240" w:lineRule="auto"/>
+          <w:lang w:val="en-IN"/>
+        </w:rPr>
+        <w:t xml:space="preserve">Li, Z., Lin, R., Su, H., &amp; Xie, L. (2025). Reinforcement learning-driven plant-wide refinery planning using model decomposition. </w:t>
+      </w:r>
+      <w:proofErr w:type="spellStart"/>
+      <w:r>
         <w:rPr>
           <w:rFonts w:eastAsia="Linux Libertine" w:cstheme="majorBidi"/>
-        </w:rPr>
-      </w:pPr>
+          <w:i/>
+          <w:iCs/>
+          <w:lang w:val="en-IN"/>
+        </w:rPr>
+        <w:t>arXiv</w:t>
+      </w:r>
+      <w:proofErr w:type="spellEnd"/>
+      <w:r>
+        <w:rPr>
+          <w:rFonts w:eastAsia="Linux Libertine" w:cstheme="majorBidi"/>
+          <w:lang w:val="en-IN"/>
+        </w:rPr>
+        <w:t xml:space="preserve">. </w:t>
+      </w:r>
+      <w:hyperlink r:id="rId28" w:tgtFrame="_blank" w:history="1">
+        <w:r>
+          <w:rPr>
+            <w:rStyle w:val="Hyperlink"/>
+            <w:rFonts w:eastAsia="Linux Libertine" w:cstheme="majorBidi"/>
+            <w:lang w:val="en-IN"/>
+          </w:rPr>
+          <w:t>https://doi.org/10.48550/arxiv.2504.08642</w:t>
+        </w:r>
+      </w:hyperlink>
     </w:p>
     <w:p>
       <w:pPr>
@@ -4380,7 +4661,7 @@
         <w:rPr>
           <w:rFonts w:eastAsia="Linux Libertine" w:cstheme="majorBidi"/>
         </w:rPr>
-        <w:t>Shin, J., Badgwell, T. A., Liu, K. H., &amp; Lee, J. H. (2019). Reinforcement learning – Overview of recent progress and implications for process control. Computers &amp; Chemical Engineering, 127, 282–294. https://doi.org/10.1016/j.compchemeng.2019.05.029</w:t>
+        <w:t>Nian, R., Liu, J., &amp; Huang, B. (2020). A review on reinforcement learning: Introduction and applications in industrial process control. Computers &amp; Chemical Engineering, 139, 106886.</w:t>
       </w:r>
     </w:p>
     <w:p>
@@ -4391,6 +4672,18 @@
           <w:rFonts w:eastAsia="Linux Libertine" w:cstheme="majorBidi"/>
         </w:rPr>
       </w:pPr>
+      <w:r>
+        <w:rPr>
+          <w:rFonts w:eastAsia="Linux Libertine" w:cstheme="majorBidi"/>
+        </w:rPr>
+        <w:t>Qin, S. J., &amp; Badgwell, T. A. (2003). A survey of industrial model predictive control technology. Control Engineering Practice, 11(7), 733–764. https://doi.org/10.1016/S0967-0661(02)00186-7</w:t>
+      </w:r>
+      <w:r>
+        <w:rPr>
+          <w:rFonts w:eastAsia="Linux Libertine" w:cstheme="majorBidi"/>
+        </w:rPr>
+        <w:t>.</w:t>
+      </w:r>
     </w:p>
     <w:p>
       <w:pPr>
@@ -4404,21 +4697,21 @@
         <w:rPr>
           <w:rFonts w:eastAsia="Linux Libertine" w:cstheme="majorBidi"/>
         </w:rPr>
-        <w:t xml:space="preserve">Spielberg, S., Cao, Y., &amp; </w:t>
+        <w:t xml:space="preserve">Schulman, J., Wolski, F., Dhariwal, P., Radford, A., &amp; Klimov, O. (2017). Proximal policy optimization algorithms. </w:t>
       </w:r>
       <w:proofErr w:type="spellStart"/>
       <w:r>
         <w:rPr>
           <w:rFonts w:eastAsia="Linux Libertine" w:cstheme="majorBidi"/>
         </w:rPr>
-        <w:t>Gopaluni</w:t>
+        <w:t>arXiv</w:t>
       </w:r>
       <w:proofErr w:type="spellEnd"/>
       <w:r>
         <w:rPr>
           <w:rFonts w:eastAsia="Linux Libertine" w:cstheme="majorBidi"/>
         </w:rPr>
-        <w:t>, B. (2019). Deep reinforcement learning for process control: A review for control engineers. Control Engineering Practice, 89, 212–222. https://doi.org/10.1016/j.conengprac.2019.05.017</w:t>
+        <w:t>. https://doi.org/10.48550/arXiv.1707.06347</w:t>
       </w:r>
     </w:p>
     <w:p>
@@ -4429,6 +4722,12 @@
           <w:rFonts w:eastAsia="Linux Libertine" w:cstheme="majorBidi"/>
         </w:rPr>
       </w:pPr>
+      <w:r>
+        <w:rPr>
+          <w:rFonts w:eastAsia="Linux Libertine" w:cstheme="majorBidi"/>
+        </w:rPr>
+        <w:t>Shin, J., Badgwell, T. A., Liu, K. H., &amp; Lee, J. H. (2019). Reinforcement learning – Overview of recent progress and implications for process control. Computers &amp; Chemical Engineering, 127, 282–294. https://doi.org/10.1016/j.compchemeng.2019.05.029</w:t>
+      </w:r>
     </w:p>
     <w:p>
       <w:pPr>
@@ -4442,21 +4741,27 @@
         <w:rPr>
           <w:rFonts w:eastAsia="Linux Libertine" w:cstheme="majorBidi"/>
         </w:rPr>
-        <w:t xml:space="preserve">Brockman, G., Cheung, V., Pettersson, L., Schneider, J., Schulman, J., Tang, J., &amp; Zaremba, W. (2016). OpenAI Gym. </w:t>
+        <w:t xml:space="preserve">Spielberg, S., Cao, Y., &amp; </w:t>
       </w:r>
       <w:proofErr w:type="spellStart"/>
       <w:r>
         <w:rPr>
           <w:rFonts w:eastAsia="Linux Libertine" w:cstheme="majorBidi"/>
         </w:rPr>
-        <w:t>arXiv</w:t>
+        <w:t>Gopaluni</w:t>
       </w:r>
       <w:proofErr w:type="spellEnd"/>
       <w:r>
         <w:rPr>
           <w:rFonts w:eastAsia="Linux Libertine" w:cstheme="majorBidi"/>
         </w:rPr>
-        <w:t>. https://doi.org/10.48550/arXiv.1606.01540</w:t>
+        <w:t>, B. (2019). Deep reinforcement learning for process control: A review for control engineers. Control Engineering Practice, 89, 212–222. https://doi.org/10.1016/j.conengprac.2019.05.017</w:t>
+      </w:r>
+      <w:r>
+        <w:rPr>
+          <w:rFonts w:eastAsia="Linux Libertine" w:cstheme="majorBidi"/>
+        </w:rPr>
+        <w:t>.</w:t>
       </w:r>
     </w:p>
     <w:p>
@@ -4467,6 +4772,26 @@
           <w:rFonts w:eastAsia="Linux Libertine" w:cstheme="majorBidi"/>
         </w:rPr>
       </w:pPr>
+      <w:r>
+        <w:rPr>
+          <w:rFonts w:eastAsia="Linux Libertine" w:cstheme="majorBidi"/>
+        </w:rPr>
+        <w:t xml:space="preserve">Spielberg, S., </w:t>
+      </w:r>
+      <w:proofErr w:type="spellStart"/>
+      <w:r>
+        <w:rPr>
+          <w:rFonts w:eastAsia="Linux Libertine" w:cstheme="majorBidi"/>
+        </w:rPr>
+        <w:t>Tulsyan</w:t>
+      </w:r>
+      <w:proofErr w:type="spellEnd"/>
+      <w:r>
+        <w:rPr>
+          <w:rFonts w:eastAsia="Linux Libertine" w:cstheme="majorBidi"/>
+        </w:rPr>
+        <w:t>, A., Lawrence, N. P., Loewen, P. D., &amp; Bhushan Gopaluni, R. (2019). Toward deep reinforcement learning for process control: A review. Computers &amp; Chemical Engineering, 132, 106602.</w:t>
+      </w:r>
     </w:p>
     <w:p>
       <w:pPr>
@@ -4474,42 +4799,80 @@
         <w:ind w:left="300" w:hanging="300"/>
         <w:rPr>
           <w:rFonts w:eastAsia="Linux Libertine" w:cstheme="majorBidi"/>
+          <w:lang w:val="en-IN"/>
         </w:rPr>
       </w:pPr>
       <w:r>
         <w:rPr>
           <w:rFonts w:eastAsia="Linux Libertine" w:cstheme="majorBidi"/>
-        </w:rPr>
-        <w:t xml:space="preserve">Schulman, J., Wolski, F., Dhariwal, P., Radford, A., &amp; Klimov, O. (2017). Proximal policy </w:t>
-      </w:r>
+          <w:lang w:val="en-IN"/>
+        </w:rPr>
+        <w:t xml:space="preserve">Spielberg, S., </w:t>
+      </w:r>
+      <w:proofErr w:type="spellStart"/>
       <w:r>
         <w:rPr>
           <w:rFonts w:eastAsia="Linux Libertine" w:cstheme="majorBidi"/>
-        </w:rPr>
-        <w:t xml:space="preserve">optimization algorithms. </w:t>
-      </w:r>
-      <w:proofErr w:type="spellStart"/>
+          <w:lang w:val="en-IN"/>
+        </w:rPr>
+        <w:t>Tulsyan</w:t>
+      </w:r>
+      <w:proofErr w:type="spellEnd"/>
       <w:r>
         <w:rPr>
           <w:rFonts w:eastAsia="Linux Libertine" w:cstheme="majorBidi"/>
-        </w:rPr>
-        <w:t>arXiv</w:t>
-      </w:r>
-      <w:proofErr w:type="spellEnd"/>
+          <w:lang w:val="en-IN"/>
+        </w:rPr>
+        <w:t xml:space="preserve">, A., Lawrence, N. P., Loewen, P. D., &amp; Bhushan, G. (2019). Toward self-driving processes: A deep reinforcement learning approach to control. </w:t>
+      </w:r>
       <w:r>
         <w:rPr>
           <w:rFonts w:eastAsia="Linux Libertine" w:cstheme="majorBidi"/>
-        </w:rPr>
-        <w:t>. https://doi.org/10.48550/arXiv.1707.06347</w:t>
-      </w:r>
-    </w:p>
-    <w:p>
-      <w:pPr>
-        <w:spacing w:before="200" w:after="40" w:line="240" w:lineRule="auto"/>
+          <w:i/>
+          <w:iCs/>
+          <w:lang w:val="en-IN"/>
+        </w:rPr>
+        <w:t>AIChE Journal</w:t>
+      </w:r>
+      <w:r>
         <w:rPr>
           <w:rFonts w:eastAsia="Linux Libertine" w:cstheme="majorBidi"/>
-        </w:rPr>
-      </w:pPr>
+          <w:lang w:val="en-IN"/>
+        </w:rPr>
+        <w:t xml:space="preserve">, </w:t>
+      </w:r>
+      <w:r>
+        <w:rPr>
+          <w:rFonts w:eastAsia="Linux Libertine" w:cstheme="majorBidi"/>
+          <w:i/>
+          <w:iCs/>
+          <w:lang w:val="en-IN"/>
+        </w:rPr>
+        <w:t>65</w:t>
+      </w:r>
+      <w:r>
+        <w:rPr>
+          <w:rFonts w:eastAsia="Linux Libertine" w:cstheme="majorBidi"/>
+          <w:lang w:val="en-IN"/>
+        </w:rPr>
+        <w:t xml:space="preserve">(10), e16733. </w:t>
+      </w:r>
+      <w:hyperlink r:id="rId29" w:tgtFrame="_blank" w:history="1">
+        <w:r>
+          <w:rPr>
+            <w:rStyle w:val="Hyperlink"/>
+            <w:rFonts w:eastAsia="Linux Libertine" w:cstheme="majorBidi"/>
+            <w:lang w:val="en-IN"/>
+          </w:rPr>
+          <w:t>https://doi.org/10.1002/aic.16733</w:t>
+        </w:r>
+      </w:hyperlink>
+      <w:r>
+        <w:rPr>
+          <w:rFonts w:eastAsia="Linux Libertine" w:cstheme="majorBidi"/>
+        </w:rPr>
+        <w:t>.</w:t>
+      </w:r>
     </w:p>
     <w:p>
       <w:pPr>
@@ -4523,7 +4886,7 @@
         <w:rPr>
           <w:rFonts w:eastAsia="Linux Libertine" w:cstheme="majorBidi"/>
         </w:rPr>
-        <w:t>Chen, H., &amp; Liu, Z. (2025). Multi-agent reinforcement learning for integrated refinery optimization: A DWSIM-based study. Proceedings of the International Conference on Process Systems Engineering (PSE 2025), 114–129.</w:t>
+        <w:t>Venkatasubramanian, V. (2019). The promise of artificial intelligence in chemical engineering: Is it here, finally?. AIChE Journal, 65(2), 466-478.</w:t>
       </w:r>
     </w:p>
     <w:p>
@@ -4532,8 +4895,68 @@
         <w:ind w:left="300" w:hanging="300"/>
         <w:rPr>
           <w:rFonts w:eastAsia="Linux Libertine" w:cstheme="majorBidi"/>
-        </w:rPr>
-      </w:pPr>
+          <w:lang w:val="en-IN"/>
+        </w:rPr>
+      </w:pPr>
+      <w:r>
+        <w:rPr>
+          <w:rFonts w:eastAsia="Linux Libertine" w:cstheme="majorBidi"/>
+          <w:lang w:val="en-IN"/>
+        </w:rPr>
+        <w:t xml:space="preserve">Wellawatte, G. P., &amp; Schwaller, P. (2025). Human interpretable structure-property relationships in chemistry using explainable machine learning and large language models. </w:t>
+      </w:r>
+      <w:r>
+        <w:rPr>
+          <w:rFonts w:eastAsia="Linux Libertine" w:cstheme="majorBidi"/>
+          <w:i/>
+          <w:iCs/>
+          <w:lang w:val="en-IN"/>
+        </w:rPr>
+        <w:t xml:space="preserve">Communications </w:t>
+      </w:r>
+      <w:r>
+        <w:rPr>
+          <w:rFonts w:eastAsia="Linux Libertine" w:cstheme="majorBidi"/>
+          <w:i/>
+          <w:iCs/>
+          <w:lang w:val="en-IN"/>
+        </w:rPr>
+        <w:lastRenderedPageBreak/>
+        <w:t>Chemistry</w:t>
+      </w:r>
+      <w:r>
+        <w:rPr>
+          <w:rFonts w:eastAsia="Linux Libertine" w:cstheme="majorBidi"/>
+          <w:lang w:val="en-IN"/>
+        </w:rPr>
+        <w:t xml:space="preserve">, </w:t>
+      </w:r>
+      <w:r>
+        <w:rPr>
+          <w:rFonts w:eastAsia="Linux Libertine" w:cstheme="majorBidi"/>
+          <w:i/>
+          <w:iCs/>
+          <w:lang w:val="en-IN"/>
+        </w:rPr>
+        <w:t>8</w:t>
+      </w:r>
+      <w:r>
+        <w:rPr>
+          <w:rFonts w:eastAsia="Linux Libertine" w:cstheme="majorBidi"/>
+          <w:lang w:val="en-IN"/>
+        </w:rPr>
+        <w:t xml:space="preserve">, Article 11733140. </w:t>
+      </w:r>
+      <w:hyperlink r:id="rId30" w:tgtFrame="_blank" w:history="1">
+        <w:r>
+          <w:rPr>
+            <w:rStyle w:val="Hyperlink"/>
+            <w:rFonts w:eastAsia="Linux Libertine" w:cstheme="majorBidi"/>
+            <w:lang w:val="en-IN"/>
+          </w:rPr>
+          <w:t>https://doi.org/10.1038/s42004-024-01393-y</w:t>
+        </w:r>
+      </w:hyperlink>
     </w:p>
     <w:p>
       <w:pPr>
@@ -4547,21 +4970,7 @@
         <w:rPr>
           <w:rFonts w:eastAsia="Linux Libertine" w:cstheme="majorBidi"/>
         </w:rPr>
-        <w:t xml:space="preserve">Gupta, A., &amp; Kumar, S. (2025). </w:t>
-      </w:r>
-      <w:proofErr w:type="spellStart"/>
-      <w:r>
-        <w:rPr>
-          <w:rFonts w:eastAsia="Linux Libertine" w:cstheme="majorBidi"/>
-        </w:rPr>
-        <w:t>Lagrangian</w:t>
-      </w:r>
-      <w:proofErr w:type="spellEnd"/>
-      <w:r>
-        <w:rPr>
-          <w:rFonts w:eastAsia="Linux Libertine" w:cstheme="majorBidi"/>
-        </w:rPr>
-        <w:t>-constrained reinforcement learning for safety-critical distillation operations. Journal of Process Control, 142, 103–118. https://doi.org/10.1016/j.jprocont.2025.01.004</w:t>
+        <w:t>Zhang, Y., &amp; Petrova, I. (2025). Digital twin-driven autonomous plant operations: Real-time optimization of atmospheric distillation units using deep policy gradients. Computers &amp; Chemical Engineering (Special Issue: AI in Energy), 184, 108–122.</w:t>
       </w:r>
     </w:p>
     <w:p>
@@ -4570,6 +4979,7 @@
         <w:ind w:left="300" w:hanging="300"/>
         <w:rPr>
           <w:rFonts w:eastAsia="Linux Libertine" w:cstheme="majorBidi"/>
+          <w:lang w:val="en-IN"/>
         </w:rPr>
       </w:pPr>
     </w:p>
@@ -4581,44 +4991,14 @@
           <w:rFonts w:eastAsia="Linux Libertine" w:cstheme="majorBidi"/>
         </w:rPr>
       </w:pPr>
-      <w:r>
-        <w:rPr>
-          <w:rFonts w:eastAsia="Linux Libertine" w:cstheme="majorBidi"/>
-        </w:rPr>
-        <w:t>Lee, K., Choi, D., &amp; Park, M. (2025). Explainable AI for petroleum refining: Utilizing SHAP values for autonomous distillation column control. AI in Chemical Engineering, 6(1), 45–62.</w:t>
-      </w:r>
     </w:p>
     <w:p>
       <w:pPr>
         <w:spacing w:before="200" w:after="40" w:line="240" w:lineRule="auto"/>
-        <w:ind w:left="300" w:hanging="300"/>
-        <w:rPr>
-          <w:rFonts w:eastAsia="Linux Libertine" w:cstheme="majorBidi"/>
-        </w:rPr>
-      </w:pPr>
-    </w:p>
-    <w:p>
-      <w:pPr>
-        <w:spacing w:before="200" w:after="40" w:line="240" w:lineRule="auto"/>
-        <w:ind w:left="300" w:hanging="300"/>
-        <w:rPr>
-          <w:rFonts w:eastAsia="Linux Libertine" w:cstheme="majorBidi"/>
-        </w:rPr>
-      </w:pPr>
-      <w:r>
-        <w:rPr>
-          <w:rFonts w:eastAsia="Linux Libertine" w:cstheme="majorBidi"/>
-        </w:rPr>
-        <w:t>Zhang, Y., &amp; Petrova, I. (2025). Digital twin-driven autonomous plant operations: Real-time optimization of atmospheric distillation units using deep policy gradients. Computers &amp; Chemical Engineering (Special Issue: AI in Energy), 184, 108–122.</w:t>
-      </w:r>
-    </w:p>
-    <w:p>
-      <w:pPr>
-        <w:spacing w:before="200" w:after="40" w:line="240" w:lineRule="auto"/>
       </w:pPr>
     </w:p>
     <w:sectPr>
-      <w:footerReference w:type="even" r:id="rId25"/>
+      <w:footerReference w:type="even" r:id="rId31"/>
       <w:type w:val="continuous"/>
       <w:pgSz w:w="12240" w:h="15840"/>
       <w:pgMar w:top="1500" w:right="1080" w:bottom="1276" w:left="993" w:header="1080" w:footer="1080" w:gutter="0"/>
@@ -7482,7 +7862,6 @@
   <w:style w:type="character" w:default="1" w:styleId="DefaultParagraphFont">
     <w:name w:val="Default Paragraph Font"/>
     <w:uiPriority w:val="1"/>
-    <w:semiHidden/>
     <w:unhideWhenUsed/>
   </w:style>
   <w:style w:type="table" w:default="1" w:styleId="TableNormal">
@@ -13078,28 +13457,28 @@
 </file>
 
 <file path=customXml/item1.xml><?xml version="1.0" encoding="utf-8"?>
+<b:Sources xmlns:b="http://schemas.openxmlformats.org/officeDocument/2006/bibliography" xmlns="http://schemas.openxmlformats.org/officeDocument/2006/bibliography" SelectedStyle="\APASixthEditionOfficeOnline.xsl" StyleName="APA" Version="6"/>
+</file>
+
+<file path=customXml/item2.xml><?xml version="1.0" encoding="utf-8"?>
 <go:gDocsCustomXmlDataStorage xmlns:go="http://customooxmlschemas.google.com/" xmlns:r="http://schemas.openxmlformats.org/officeDocument/2006/relationships">
   <go:docsCustomData roundtripDataSignature="AMtx7mhGbw5ytn5wEH4ZlNP9gRCNMPdzfw==">AMUW2mU012QJVuiVMkD/gCCNj70OycHvaZTFzdyU4a+e9FbY8FknQA0AjjkChrXlhIFEjpvrliu1fU1vBgDfxxCXjhLy50R3pNfhxAJPw64y75cfTEgflDw=</go:docsCustomData>
 </go:gDocsCustomXmlDataStorage>
 </file>
 
-<file path=customXml/item2.xml><?xml version="1.0" encoding="utf-8"?>
-<b:Sources xmlns:b="http://schemas.openxmlformats.org/officeDocument/2006/bibliography" xmlns="http://schemas.openxmlformats.org/officeDocument/2006/bibliography" SelectedStyle="\APASixthEditionOfficeOnline.xsl" StyleName="APA" Version="6"/>
+<file path=customXml/itemProps1.xml><?xml version="1.0" encoding="utf-8"?>
+<ds:datastoreItem xmlns:ds="http://schemas.openxmlformats.org/officeDocument/2006/customXml" ds:itemID="{93FB7AA3-242F-46D3-838B-3F6C438EF122}">
+  <ds:schemaRefs>
+    <ds:schemaRef ds:uri="http://schemas.openxmlformats.org/officeDocument/2006/bibliography"/>
+  </ds:schemaRefs>
+</ds:datastoreItem>
 </file>
 
-<file path=customXml/itemProps1.xml><?xml version="1.0" encoding="utf-8"?>
+<file path=customXml/itemProps2.xml><?xml version="1.0" encoding="utf-8"?>
 <ds:datastoreItem xmlns:ds="http://schemas.openxmlformats.org/officeDocument/2006/customXml" ds:itemID="{11111111-1234-1234-1234-123412341234}">
   <ds:schemaRefs>
     <ds:schemaRef ds:uri="http://customooxmlschemas.google.com/"/>
     <ds:schemaRef ds:uri="http://schemas.openxmlformats.org/officeDocument/2006/relationships"/>
   </ds:schemaRefs>
 </ds:datastoreItem>
-</file>
-
-<file path=customXml/itemProps2.xml><?xml version="1.0" encoding="utf-8"?>
-<ds:datastoreItem xmlns:ds="http://schemas.openxmlformats.org/officeDocument/2006/customXml" ds:itemID="{93FB7AA3-242F-46D3-838B-3F6C438EF122}">
-  <ds:schemaRefs>
-    <ds:schemaRef ds:uri="http://schemas.openxmlformats.org/officeDocument/2006/bibliography"/>
-  </ds:schemaRefs>
-</ds:datastoreItem>
 </file>
</xml_diff>

<commit_message>
Updated report with literature review section, process sim section under methodology
</commit_message>
<xml_diff>
--- a/Report/AAI590 Capstone Project Report.docx
+++ b/Report/AAI590 Capstone Project Report.docx
@@ -46,7 +46,25 @@
           <w:sz w:val="28"/>
           <w:szCs w:val="28"/>
         </w:rPr>
-        <w:t>Integrating Rigorous DWSim Flowsheets with AI-Augmented Process Copilots</w:t>
+        <w:t xml:space="preserve">Integrating Rigorous </w:t>
+      </w:r>
+      <w:proofErr w:type="spellStart"/>
+      <w:r>
+        <w:rPr>
+          <w:rFonts w:asciiTheme="majorBidi" w:hAnsiTheme="majorBidi" w:cstheme="majorBidi"/>
+          <w:sz w:val="28"/>
+          <w:szCs w:val="28"/>
+        </w:rPr>
+        <w:t>DWSim</w:t>
+      </w:r>
+      <w:proofErr w:type="spellEnd"/>
+      <w:r>
+        <w:rPr>
+          <w:rFonts w:asciiTheme="majorBidi" w:hAnsiTheme="majorBidi" w:cstheme="majorBidi"/>
+          <w:sz w:val="28"/>
+          <w:szCs w:val="28"/>
+        </w:rPr>
+        <w:t xml:space="preserve"> Flowsheets with AI-Augmented Process Copilots</w:t>
       </w:r>
       <w:r>
         <w:rPr>
@@ -235,8 +253,16 @@
         <w:rPr>
           <w:rFonts w:eastAsia="Linux Libertine" w:cstheme="majorBidi"/>
         </w:rPr>
-        <w:t xml:space="preserve"> DWSim</w:t>
-      </w:r>
+        <w:t xml:space="preserve"> </w:t>
+      </w:r>
+      <w:proofErr w:type="spellStart"/>
+      <w:r>
+        <w:rPr>
+          <w:rFonts w:eastAsia="Linux Libertine" w:cstheme="majorBidi"/>
+        </w:rPr>
+        <w:t>DWSim</w:t>
+      </w:r>
+      <w:proofErr w:type="spellEnd"/>
       <w:r>
         <w:rPr>
           <w:rFonts w:eastAsia="Linux Libertine" w:cstheme="majorBidi"/>
@@ -626,7 +652,23 @@
         <w:t xml:space="preserve"> to successfully design, train, and deploy an AI-augmented digital twin for a CDU. The </w:t>
       </w:r>
       <w:r>
-        <w:t xml:space="preserve">application has a Django dashboard to interact with the backend system comprising of a process Digital Twin built on DWSim, an optimizer built on Deep Reinforcement Learning agent, and a LLM-based AI Agent which creates reports and interacts with the user for explainability. </w:t>
+        <w:t xml:space="preserve">application has a Django dashboard to interact with the backend system comprising of a process Digital Twin built on </w:t>
+      </w:r>
+      <w:proofErr w:type="spellStart"/>
+      <w:r>
+        <w:t>DWSim</w:t>
+      </w:r>
+      <w:proofErr w:type="spellEnd"/>
+      <w:r>
+        <w:t xml:space="preserve">, an optimizer built on Deep Reinforcement Learning agent, and </w:t>
+      </w:r>
+      <w:proofErr w:type="gramStart"/>
+      <w:r>
+        <w:t>a</w:t>
+      </w:r>
+      <w:proofErr w:type="gramEnd"/>
+      <w:r>
+        <w:t xml:space="preserve"> LLM-based AI Agent which creates reports and interacts with the user for explainability. </w:t>
       </w:r>
       <w:r>
         <w:t>In th</w:t>
@@ -641,7 +683,15 @@
         <w:t xml:space="preserve">eep </w:t>
       </w:r>
       <w:r>
-        <w:t xml:space="preserve">RL agent to interact with the underlying DWSim physical model to discover optimal operating parameters. The final output </w:t>
+        <w:t xml:space="preserve">RL agent to interact with the underlying </w:t>
+      </w:r>
+      <w:proofErr w:type="spellStart"/>
+      <w:r>
+        <w:t>DWSim</w:t>
+      </w:r>
+      <w:proofErr w:type="spellEnd"/>
+      <w:r>
+        <w:t xml:space="preserve"> physical model to discover optimal operating parameters. The final output </w:t>
       </w:r>
       <w:r>
         <w:t>is</w:t>
@@ -738,7 +788,15 @@
         <w:t>Our study revolves around finding the most optimized manner of distillation of crude. Hence,</w:t>
       </w:r>
       <w:r>
-        <w:t xml:space="preserve"> one of the primary focuses in this</w:t>
+        <w:t xml:space="preserve"> one of the </w:t>
+      </w:r>
+      <w:proofErr w:type="gramStart"/>
+      <w:r>
+        <w:t>primary</w:t>
+      </w:r>
+      <w:proofErr w:type="gramEnd"/>
+      <w:r>
+        <w:t xml:space="preserve"> focuses in this</w:t>
       </w:r>
       <w:r>
         <w:t xml:space="preserve"> study </w:t>
@@ -756,7 +814,15 @@
         <w:t xml:space="preserve">chosen </w:t>
       </w:r>
       <w:r>
-        <w:t xml:space="preserve">comprises physicochemical properties for five distinctive crude oil assays (Azeri Light, Erha, Tapis, Upper Zakum, and WTI Light) sourced from the </w:t>
+        <w:t xml:space="preserve">comprises physicochemical properties for five distinctive crude oil assays (Azeri Light, Erha, Tapis, Upper </w:t>
+      </w:r>
+      <w:proofErr w:type="spellStart"/>
+      <w:r>
+        <w:t>Zakum</w:t>
+      </w:r>
+      <w:proofErr w:type="spellEnd"/>
+      <w:r>
+        <w:t xml:space="preserve">, and WTI Light) sourced from the </w:t>
       </w:r>
       <w:r>
         <w:t>ExxonMobil’s open</w:t>
@@ -867,7 +933,15 @@
         <w:t>s</w:t>
       </w:r>
       <w:r>
-        <w:t xml:space="preserve"> (AlRijeb et al., 2025; Li et al., 2025).</w:t>
+        <w:t xml:space="preserve"> (</w:t>
+      </w:r>
+      <w:proofErr w:type="spellStart"/>
+      <w:r>
+        <w:t>AlRijeb</w:t>
+      </w:r>
+      <w:proofErr w:type="spellEnd"/>
+      <w:r>
+        <w:t xml:space="preserve"> et al., 2025).</w:t>
       </w:r>
     </w:p>
     <w:p>
@@ -992,6 +1066,7 @@
         </w:rPr>
         <w:t xml:space="preserve">Fig 1. (a). API Gravity, Density (at 15 </w:t>
       </w:r>
+      <w:proofErr w:type="spellStart"/>
       <w:r>
         <w:rPr>
           <w:rFonts w:eastAsia="Linux Biolinum" w:cs="Times New Roman"/>
@@ -1013,16 +1088,10 @@
           <w:sz w:val="18"/>
           <w:szCs w:val="18"/>
         </w:rPr>
-        <w:t>C) and Total Sulphur distribution in the selected crude assays</w:t>
-      </w:r>
-    </w:p>
-    <w:p>
-      <w:pPr>
-        <w:tabs>
-          <w:tab w:val="center" w:pos="4320"/>
-          <w:tab w:val="right" w:pos="8640"/>
-        </w:tabs>
-        <w:ind w:left="-142" w:right="360"/>
+        <w:t>C</w:t>
+      </w:r>
+      <w:proofErr w:type="spellEnd"/>
+      <w:r>
         <w:rPr>
           <w:rFonts w:eastAsia="Linux Biolinum" w:cs="Times New Roman"/>
           <w:i/>
@@ -1031,8 +1100,16 @@
           <w:sz w:val="18"/>
           <w:szCs w:val="18"/>
         </w:rPr>
-      </w:pPr>
-      <w:r>
+        <w:t>) and Total Sulphur distribution in the selected crude assays</w:t>
+      </w:r>
+    </w:p>
+    <w:p>
+      <w:pPr>
+        <w:tabs>
+          <w:tab w:val="center" w:pos="4320"/>
+          <w:tab w:val="right" w:pos="8640"/>
+        </w:tabs>
+        <w:ind w:left="-142" w:right="360"/>
         <w:rPr>
           <w:rFonts w:eastAsia="Linux Biolinum" w:cs="Times New Roman"/>
           <w:i/>
@@ -1041,6 +1118,16 @@
           <w:sz w:val="18"/>
           <w:szCs w:val="18"/>
         </w:rPr>
+      </w:pPr>
+      <w:r>
+        <w:rPr>
+          <w:rFonts w:eastAsia="Linux Biolinum" w:cs="Times New Roman"/>
+          <w:i/>
+          <w:iCs/>
+          <w:color w:val="000000"/>
+          <w:sz w:val="18"/>
+          <w:szCs w:val="18"/>
+        </w:rPr>
         <w:t>Fig 1. (b) Metals and Total Nitrogen content in the selected crude assays</w:t>
       </w:r>
     </w:p>
@@ -1113,7 +1200,15 @@
         <w:t xml:space="preserve"> like</w:t>
       </w:r>
       <w:r>
-        <w:t xml:space="preserve"> Kerosene and Diesel. Upper Zakum is characterized by a bottom-heavy profile, yielding a higher percentage of Vacuum Gas Oil (VGO) and atmospheric residues. </w:t>
+        <w:t xml:space="preserve"> Kerosene and Diesel. Upper </w:t>
+      </w:r>
+      <w:proofErr w:type="spellStart"/>
+      <w:r>
+        <w:t>Zakum</w:t>
+      </w:r>
+      <w:proofErr w:type="spellEnd"/>
+      <w:r>
+        <w:t xml:space="preserve"> is characterized by a bottom-heavy profile, yielding a higher percentage of Vacuum Gas Oil (VGO) and atmospheric residues. </w:t>
       </w:r>
       <w:r>
         <w:t xml:space="preserve">Since the Deep RL agent is inherently aimed at driving margins, </w:t>
@@ -1184,7 +1279,27 @@
           <w:sz w:val="18"/>
           <w:szCs w:val="18"/>
         </w:rPr>
-        <w:t>Fig 2. Crude-wise yield distribution (wt%)</w:t>
+        <w:t>Fig 2. Crude-wise yield distribution (</w:t>
+      </w:r>
+      <w:proofErr w:type="spellStart"/>
+      <w:r>
+        <w:rPr>
+          <w:i/>
+          <w:iCs/>
+          <w:sz w:val="18"/>
+          <w:szCs w:val="18"/>
+        </w:rPr>
+        <w:t>wt</w:t>
+      </w:r>
+      <w:proofErr w:type="spellEnd"/>
+      <w:r>
+        <w:rPr>
+          <w:i/>
+          <w:iCs/>
+          <w:sz w:val="18"/>
+          <w:szCs w:val="18"/>
+        </w:rPr>
+        <w:t>%)</w:t>
       </w:r>
     </w:p>
     <w:p>
@@ -1242,7 +1357,15 @@
         <w:t>Whereas,</w:t>
       </w:r>
       <w:r>
-        <w:t xml:space="preserve"> high levels of metals and asphaltenes in Upper Zakum and Azeri Light </w:t>
+        <w:t xml:space="preserve"> high levels of metals and asphaltenes in Upper </w:t>
+      </w:r>
+      <w:proofErr w:type="spellStart"/>
+      <w:r>
+        <w:t>Zakum</w:t>
+      </w:r>
+      <w:proofErr w:type="spellEnd"/>
+      <w:r>
+        <w:t xml:space="preserve"> and Azeri Light </w:t>
       </w:r>
       <w:r>
         <w:t>may pose a</w:t>
@@ -1463,12 +1586,26 @@
         <w:rPr>
           <w:lang w:val="en-IN"/>
         </w:rPr>
-        <w:t xml:space="preserve">Upper Zakum, despite its high impurity levels, may offer higher margins if refinery can effectively manage its heavy-end processing. </w:t>
-      </w:r>
+        <w:t xml:space="preserve">Upper </w:t>
+      </w:r>
+      <w:proofErr w:type="spellStart"/>
       <w:r>
         <w:rPr>
           <w:lang w:val="en-IN"/>
         </w:rPr>
+        <w:t>Zakum</w:t>
+      </w:r>
+      <w:proofErr w:type="spellEnd"/>
+      <w:r>
+        <w:rPr>
+          <w:lang w:val="en-IN"/>
+        </w:rPr>
+        <w:t xml:space="preserve">, despite its high impurity levels, may offer higher margins if refinery can effectively manage its heavy-end processing. </w:t>
+      </w:r>
+      <w:r>
+        <w:rPr>
+          <w:lang w:val="en-IN"/>
+        </w:rPr>
         <w:t xml:space="preserve">While WTI Light offers the highest yield of high-value light ends and the lowest treating costs, it typically commands a market premium. The data suggests </w:t>
       </w:r>
       <w:r>
@@ -1493,7 +1630,21 @@
         <w:rPr>
           <w:lang w:val="en-IN"/>
         </w:rPr>
-        <w:t>understand why the agent might suggest a more difficult-to-process feed like Upper Zakum during periods of specific market volatility (Wellawatte &amp; Schwaller, 2025).</w:t>
+        <w:t xml:space="preserve">understand why the agent might suggest a more difficult-to-process feed like Upper </w:t>
+      </w:r>
+      <w:proofErr w:type="spellStart"/>
+      <w:r>
+        <w:rPr>
+          <w:lang w:val="en-IN"/>
+        </w:rPr>
+        <w:t>Zakum</w:t>
+      </w:r>
+      <w:proofErr w:type="spellEnd"/>
+      <w:r>
+        <w:rPr>
+          <w:lang w:val="en-IN"/>
+        </w:rPr>
+        <w:t xml:space="preserve"> during periods of specific market volatility (Wellawatte &amp; Schwaller, 2025).</w:t>
       </w:r>
     </w:p>
     <w:p>
@@ -1626,79 +1777,43 @@
         <w:rPr>
           <w:rFonts w:eastAsia="Times New Roman" w:cs="Times New Roman"/>
         </w:rPr>
-        <w:t xml:space="preserve">The traditional </w:t>
-      </w:r>
-      <w:r>
-        <w:rPr>
-          <w:rFonts w:eastAsia="Times New Roman" w:cs="Times New Roman"/>
-        </w:rPr>
-        <w:t>‘</w:t>
-      </w:r>
-      <w:r>
-        <w:rPr>
-          <w:rFonts w:eastAsia="Times New Roman" w:cs="Times New Roman"/>
-        </w:rPr>
-        <w:t>Hierarchy of Control</w:t>
-      </w:r>
-      <w:r>
-        <w:rPr>
-          <w:rFonts w:eastAsia="Times New Roman" w:cs="Times New Roman"/>
-        </w:rPr>
-        <w:t>’</w:t>
-      </w:r>
-      <w:r>
-        <w:rPr>
-          <w:rFonts w:eastAsia="Times New Roman" w:cs="Times New Roman"/>
-        </w:rPr>
-        <w:t xml:space="preserve"> in refinery operations segregates the strategic layer (Real-Time Optimization) from the tactical layer (</w:t>
-      </w:r>
-      <w:r>
-        <w:rPr>
-          <w:rFonts w:eastAsia="Times New Roman" w:cs="Times New Roman"/>
-        </w:rPr>
-        <w:t>Advanced Process Control</w:t>
-      </w:r>
-      <w:r>
-        <w:rPr>
-          <w:rFonts w:eastAsia="Times New Roman" w:cs="Times New Roman"/>
-        </w:rPr>
-        <w:t xml:space="preserve">). </w:t>
-      </w:r>
-      <w:r>
-        <w:rPr>
-          <w:rFonts w:eastAsia="Times New Roman" w:cs="Times New Roman"/>
-        </w:rPr>
-        <w:t>T</w:t>
-      </w:r>
-      <w:r>
-        <w:rPr>
-          <w:rFonts w:eastAsia="Times New Roman" w:cs="Times New Roman"/>
-        </w:rPr>
-        <w:t>his separation often leads to suboptimal performance because the RTO layer typically assumes steady-state conditions</w:t>
-      </w:r>
-      <w:r>
-        <w:rPr>
-          <w:rFonts w:eastAsia="Times New Roman" w:cs="Times New Roman"/>
-        </w:rPr>
-        <w:t>,</w:t>
-      </w:r>
-      <w:r>
-        <w:rPr>
-          <w:rFonts w:eastAsia="Times New Roman" w:cs="Times New Roman"/>
-        </w:rPr>
-        <w:t xml:space="preserve"> while the </w:t>
-      </w:r>
-      <w:r>
-        <w:rPr>
-          <w:rFonts w:eastAsia="Times New Roman" w:cs="Times New Roman"/>
-        </w:rPr>
-        <w:t>A</w:t>
-      </w:r>
-      <w:r>
-        <w:rPr>
-          <w:rFonts w:eastAsia="Times New Roman" w:cs="Times New Roman"/>
-        </w:rPr>
-        <w:t>PC layer struggles with the economic objectives dictated from above.</w:t>
+        <w:t xml:space="preserve">The traditional hierarchy of refinery control </w:t>
+      </w:r>
+      <w:r>
+        <w:rPr>
+          <w:rFonts w:eastAsia="Times New Roman" w:cs="Times New Roman"/>
+        </w:rPr>
+        <w:t>inherently resembles</w:t>
+      </w:r>
+      <w:r>
+        <w:rPr>
+          <w:rFonts w:eastAsia="Times New Roman" w:cs="Times New Roman"/>
+        </w:rPr>
+        <w:t xml:space="preserve"> a temporal decoupling between the Real-Time Optimization (RTO) and Advanced Process Control (APC) layers, where the RTO typically samples unit states and recalculates economic targets</w:t>
+      </w:r>
+      <w:r>
+        <w:rPr>
+          <w:rFonts w:eastAsia="Times New Roman" w:cs="Times New Roman"/>
+        </w:rPr>
+        <w:t>, subject to model convergence,</w:t>
+      </w:r>
+      <w:r>
+        <w:rPr>
+          <w:rFonts w:eastAsia="Times New Roman" w:cs="Times New Roman"/>
+        </w:rPr>
+        <w:t xml:space="preserve"> at </w:t>
+      </w:r>
+      <w:r>
+        <w:rPr>
+          <w:rFonts w:eastAsia="Times New Roman" w:cs="Times New Roman"/>
+        </w:rPr>
+        <w:t>a set</w:t>
+      </w:r>
+      <w:r>
+        <w:rPr>
+          <w:rFonts w:eastAsia="Times New Roman" w:cs="Times New Roman"/>
+        </w:rPr>
+        <w:t xml:space="preserve"> interval of one to two hours.</w:t>
       </w:r>
       <w:r>
         <w:rPr>
@@ -1710,7 +1825,91 @@
         <w:rPr>
           <w:rFonts w:eastAsia="Times New Roman" w:cs="Times New Roman"/>
         </w:rPr>
-        <w:t>Recent advancements in Dynamic Real-Time Optimization (DRTO) attempt to bridge this gap. However, the computational cost of solving a rigorous, first-principles model in real-time is often prohibitive. This is where the integration of DWSIM with a DRL agent, such as Proximal Policy Optimization (PPO), offers a superior alternative. By treating the DWSIM model as a high-fidelity simulator, the agent learns a control policy</w:t>
+        <w:t xml:space="preserve">This multi-hour sampling gap, combined with the significant computational latency inherent in mathematical optimizers reaching convergence for complex non-linear models, forces the APC layer to manage transient process behavior and disturbances without updated economic guidance, </w:t>
+      </w:r>
+      <w:r>
+        <w:rPr>
+          <w:rFonts w:eastAsia="Times New Roman" w:cs="Times New Roman"/>
+        </w:rPr>
+        <w:t>often</w:t>
+      </w:r>
+      <w:r>
+        <w:rPr>
+          <w:rFonts w:eastAsia="Times New Roman" w:cs="Times New Roman"/>
+        </w:rPr>
+        <w:t xml:space="preserve"> resulting in sustained periods of suboptimal operation.</w:t>
+      </w:r>
+      <w:r>
+        <w:rPr>
+          <w:rFonts w:eastAsia="Times New Roman" w:cs="Times New Roman"/>
+        </w:rPr>
+        <w:t xml:space="preserve"> </w:t>
+      </w:r>
+      <w:r>
+        <w:rPr>
+          <w:rFonts w:eastAsia="Times New Roman" w:cs="Times New Roman"/>
+        </w:rPr>
+        <w:t xml:space="preserve">Recent advancements in Dynamic Real-Time Optimization (DRTO) attempt to bridge this gap. However, the computational cost of solving a rigorous, first-principles model in real-time </w:t>
+      </w:r>
+      <w:r>
+        <w:rPr>
+          <w:rFonts w:eastAsia="Times New Roman" w:cs="Times New Roman"/>
+        </w:rPr>
+        <w:t>still remains</w:t>
+      </w:r>
+      <w:r>
+        <w:rPr>
+          <w:rFonts w:eastAsia="Times New Roman" w:cs="Times New Roman"/>
+        </w:rPr>
+        <w:t xml:space="preserve">. This is where the integration of </w:t>
+      </w:r>
+      <w:r>
+        <w:rPr>
+          <w:rFonts w:eastAsia="Times New Roman" w:cs="Times New Roman"/>
+        </w:rPr>
+        <w:t>simulation model</w:t>
+      </w:r>
+      <w:r>
+        <w:rPr>
+          <w:rFonts w:eastAsia="Times New Roman" w:cs="Times New Roman"/>
+        </w:rPr>
+        <w:t xml:space="preserve"> with a D</w:t>
+      </w:r>
+      <w:r>
+        <w:rPr>
+          <w:rFonts w:eastAsia="Times New Roman" w:cs="Times New Roman"/>
+        </w:rPr>
+        <w:t xml:space="preserve">eep </w:t>
+      </w:r>
+      <w:r>
+        <w:rPr>
+          <w:rFonts w:eastAsia="Times New Roman" w:cs="Times New Roman"/>
+        </w:rPr>
+        <w:t xml:space="preserve">RL agent offers a superior alternative. </w:t>
+      </w:r>
+      <w:r>
+        <w:rPr>
+          <w:rFonts w:eastAsia="Times New Roman" w:cs="Times New Roman"/>
+        </w:rPr>
+        <w:t>During training phase, b</w:t>
+      </w:r>
+      <w:r>
+        <w:rPr>
+          <w:rFonts w:eastAsia="Times New Roman" w:cs="Times New Roman"/>
+        </w:rPr>
+        <w:t>y treating the</w:t>
+      </w:r>
+      <w:r>
+        <w:rPr>
+          <w:rFonts w:eastAsia="Times New Roman" w:cs="Times New Roman"/>
+        </w:rPr>
+        <w:t xml:space="preserve"> simulation</w:t>
+      </w:r>
+      <w:r>
+        <w:rPr>
+          <w:rFonts w:eastAsia="Times New Roman" w:cs="Times New Roman"/>
+        </w:rPr>
+        <w:t xml:space="preserve"> model as a high-fidelity simulator, the agent learns a control policy</w:t>
       </w:r>
       <w:r>
         <w:rPr>
@@ -1786,7 +1985,19 @@
         <w:rPr>
           <w:rFonts w:eastAsia="Times New Roman" w:cs="Times New Roman"/>
         </w:rPr>
-        <w:t xml:space="preserve"> methods described by Biegler (2010), which require a derivative-based search through the variable space at every time step, the DRL agent performs an instantaneous inference, significantly reducing the latency</w:t>
+        <w:t xml:space="preserve"> methods described by Biegler (2010), which require a derivative-based search through the variable space at every time step, the D</w:t>
+      </w:r>
+      <w:r>
+        <w:rPr>
+          <w:rFonts w:eastAsia="Times New Roman" w:cs="Times New Roman"/>
+        </w:rPr>
+        <w:t xml:space="preserve">eep </w:t>
+      </w:r>
+      <w:r>
+        <w:rPr>
+          <w:rFonts w:eastAsia="Times New Roman" w:cs="Times New Roman"/>
+        </w:rPr>
+        <w:t>RL agent performs an instantaneous inference, significantly reducing the latency</w:t>
       </w:r>
       <w:r>
         <w:rPr>
@@ -1799,6 +2010,333 @@
           <w:rFonts w:eastAsia="Times New Roman" w:cs="Times New Roman"/>
         </w:rPr>
         <w:t xml:space="preserve"> </w:t>
+      </w:r>
+    </w:p>
+    <w:p>
+      <w:pPr>
+        <w:spacing w:before="20"/>
+        <w:rPr>
+          <w:rFonts w:eastAsia="Times New Roman" w:cs="Times New Roman"/>
+        </w:rPr>
+      </w:pPr>
+      <w:r>
+        <w:rPr>
+          <w:rFonts w:eastAsia="Times New Roman" w:cs="Times New Roman"/>
+        </w:rPr>
+        <w:t>The predominant paradigm in industrial Real-Time Optimization (RTO) has historically relied on Non-Linear Programming (NLP) and Successive Quadratic Programming (SQP) to solve steady-</w:t>
+      </w:r>
+      <w:r>
+        <w:rPr>
+          <w:rFonts w:eastAsia="Times New Roman" w:cs="Times New Roman"/>
+        </w:rPr>
+        <w:lastRenderedPageBreak/>
+        <w:t xml:space="preserve">state models. While mathematically rigorous, these </w:t>
+      </w:r>
+      <w:r>
+        <w:rPr>
+          <w:rFonts w:eastAsia="Times New Roman" w:cs="Times New Roman"/>
+        </w:rPr>
+        <w:t>‘</w:t>
+      </w:r>
+      <w:r>
+        <w:rPr>
+          <w:rFonts w:eastAsia="Times New Roman" w:cs="Times New Roman"/>
+        </w:rPr>
+        <w:t>equation-oriented</w:t>
+      </w:r>
+      <w:r>
+        <w:rPr>
+          <w:rFonts w:eastAsia="Times New Roman" w:cs="Times New Roman"/>
+        </w:rPr>
+        <w:t>’</w:t>
+      </w:r>
+      <w:r>
+        <w:rPr>
+          <w:rFonts w:eastAsia="Times New Roman" w:cs="Times New Roman"/>
+        </w:rPr>
+        <w:t xml:space="preserve"> solvers are often criticized for their </w:t>
+      </w:r>
+      <w:r>
+        <w:rPr>
+          <w:rFonts w:eastAsia="Times New Roman" w:cs="Times New Roman"/>
+        </w:rPr>
+        <w:t>‘</w:t>
+      </w:r>
+      <w:r>
+        <w:rPr>
+          <w:rFonts w:eastAsia="Times New Roman" w:cs="Times New Roman"/>
+        </w:rPr>
+        <w:t>rigidity and susceptibility to convergence failures</w:t>
+      </w:r>
+      <w:r>
+        <w:rPr>
+          <w:rFonts w:eastAsia="Times New Roman" w:cs="Times New Roman"/>
+        </w:rPr>
+        <w:t>’</w:t>
+      </w:r>
+      <w:r>
+        <w:rPr>
+          <w:rFonts w:eastAsia="Times New Roman" w:cs="Times New Roman"/>
+        </w:rPr>
+        <w:t xml:space="preserve"> when faced with the high dimensionality of Crude Distillation Units (CDUs) (Biegler, 2010). A recurring deficiency in these mathematical optimizers is their inability to capture transient dynamics without prohibitive computational overhead</w:t>
+      </w:r>
+      <w:r>
+        <w:rPr>
+          <w:rFonts w:eastAsia="Times New Roman" w:cs="Times New Roman"/>
+        </w:rPr>
+        <w:t xml:space="preserve"> (Darby e</w:t>
+      </w:r>
+      <w:r>
+        <w:rPr>
+          <w:rFonts w:eastAsia="Times New Roman" w:cs="Times New Roman"/>
+        </w:rPr>
+        <w:t>t</w:t>
+      </w:r>
+      <w:r>
+        <w:rPr>
+          <w:rFonts w:eastAsia="Times New Roman" w:cs="Times New Roman"/>
+        </w:rPr>
+        <w:t xml:space="preserve"> al.</w:t>
+      </w:r>
+      <w:r>
+        <w:rPr>
+          <w:rFonts w:eastAsia="Times New Roman" w:cs="Times New Roman"/>
+        </w:rPr>
+        <w:t>,</w:t>
+      </w:r>
+      <w:r>
+        <w:rPr>
+          <w:rFonts w:eastAsia="Times New Roman" w:cs="Times New Roman"/>
+        </w:rPr>
+        <w:t xml:space="preserve"> 2011)</w:t>
+      </w:r>
+      <w:r>
+        <w:rPr>
+          <w:rFonts w:eastAsia="Times New Roman" w:cs="Times New Roman"/>
+        </w:rPr>
+        <w:t>.</w:t>
+      </w:r>
+    </w:p>
+    <w:p>
+      <w:pPr>
+        <w:spacing w:before="20"/>
+        <w:rPr>
+          <w:rFonts w:eastAsia="Times New Roman" w:cs="Times New Roman"/>
+        </w:rPr>
+      </w:pPr>
+      <w:r>
+        <w:rPr>
+          <w:rFonts w:eastAsia="Times New Roman" w:cs="Times New Roman"/>
+        </w:rPr>
+        <w:t xml:space="preserve">A persistent challenge in mathematical RTO is the trade-off between profitability and the </w:t>
+      </w:r>
+      <w:r>
+        <w:rPr>
+          <w:rFonts w:eastAsia="Times New Roman" w:cs="Times New Roman"/>
+        </w:rPr>
+        <w:t>‘</w:t>
+      </w:r>
+      <w:r>
+        <w:rPr>
+          <w:rFonts w:eastAsia="Times New Roman" w:cs="Times New Roman"/>
+        </w:rPr>
+        <w:t>Safe Operating Envelope</w:t>
+      </w:r>
+      <w:r>
+        <w:rPr>
+          <w:rFonts w:eastAsia="Times New Roman" w:cs="Times New Roman"/>
+        </w:rPr>
+        <w:t>’</w:t>
+      </w:r>
+      <w:r>
+        <w:rPr>
+          <w:rFonts w:eastAsia="Times New Roman" w:cs="Times New Roman"/>
+        </w:rPr>
+        <w:t xml:space="preserve">. Mathematical optimizers often operate at the </w:t>
+      </w:r>
+      <w:r>
+        <w:rPr>
+          <w:rFonts w:eastAsia="Times New Roman" w:cs="Times New Roman"/>
+        </w:rPr>
+        <w:t>‘</w:t>
+      </w:r>
+      <w:r>
+        <w:rPr>
+          <w:rFonts w:eastAsia="Times New Roman" w:cs="Times New Roman"/>
+        </w:rPr>
+        <w:t>active constraints</w:t>
+      </w:r>
+      <w:r>
+        <w:rPr>
+          <w:rFonts w:eastAsia="Times New Roman" w:cs="Times New Roman"/>
+        </w:rPr>
+        <w:t>’ (Darby et al., 2011)</w:t>
+      </w:r>
+      <w:r>
+        <w:rPr>
+          <w:rFonts w:eastAsia="Times New Roman" w:cs="Times New Roman"/>
+        </w:rPr>
+        <w:t xml:space="preserve">, leaving little room for error during stochastic disturbances. The shift toward </w:t>
+      </w:r>
+      <w:r>
+        <w:rPr>
+          <w:rFonts w:eastAsia="Times New Roman" w:cs="Times New Roman"/>
+        </w:rPr>
+        <w:t>Safe Reinforcement Learning</w:t>
+      </w:r>
+      <w:r>
+        <w:rPr>
+          <w:rFonts w:eastAsia="Times New Roman" w:cs="Times New Roman"/>
+        </w:rPr>
+        <w:t xml:space="preserve">, as highlighted by the emergence of the Constrained Policy Optimization (CPO) and </w:t>
+      </w:r>
+      <w:proofErr w:type="spellStart"/>
+      <w:r>
+        <w:rPr>
+          <w:rFonts w:eastAsia="Times New Roman" w:cs="Times New Roman"/>
+        </w:rPr>
+        <w:t>Lagrangian</w:t>
+      </w:r>
+      <w:proofErr w:type="spellEnd"/>
+      <w:r>
+        <w:rPr>
+          <w:rFonts w:eastAsia="Times New Roman" w:cs="Times New Roman"/>
+        </w:rPr>
+        <w:t xml:space="preserve"> RL frameworks</w:t>
+      </w:r>
+      <w:r>
+        <w:rPr>
+          <w:rFonts w:eastAsia="Times New Roman" w:cs="Times New Roman"/>
+        </w:rPr>
+        <w:t xml:space="preserve"> (</w:t>
+      </w:r>
+      <w:proofErr w:type="spellStart"/>
+      <w:r>
+        <w:rPr>
+          <w:rFonts w:eastAsia="Times New Roman" w:cs="Times New Roman"/>
+        </w:rPr>
+        <w:t>Achiam</w:t>
+      </w:r>
+      <w:proofErr w:type="spellEnd"/>
+      <w:r>
+        <w:rPr>
+          <w:rFonts w:eastAsia="Times New Roman" w:cs="Times New Roman"/>
+        </w:rPr>
+        <w:t xml:space="preserve"> J., 2017)</w:t>
+      </w:r>
+      <w:r>
+        <w:rPr>
+          <w:rFonts w:eastAsia="Times New Roman" w:cs="Times New Roman"/>
+        </w:rPr>
+        <w:t>, represents a significant trend in recent academic literature</w:t>
+      </w:r>
+      <w:r>
+        <w:rPr>
+          <w:rFonts w:eastAsia="Times New Roman" w:cs="Times New Roman"/>
+        </w:rPr>
+        <w:t>.</w:t>
+      </w:r>
+    </w:p>
+    <w:p>
+      <w:pPr>
+        <w:spacing w:before="20"/>
+        <w:rPr>
+          <w:rFonts w:eastAsia="Times New Roman" w:cs="Times New Roman"/>
+        </w:rPr>
+      </w:pPr>
+      <w:r>
+        <w:rPr>
+          <w:rFonts w:eastAsia="Times New Roman" w:cs="Times New Roman"/>
+        </w:rPr>
+        <w:t xml:space="preserve">The integration of DWSIM—a CAPE-OPEN compliant, first-principles simulator—serves as a critical corrective. By utilizing DWSIM as the </w:t>
+      </w:r>
+      <w:r>
+        <w:rPr>
+          <w:rFonts w:eastAsia="Times New Roman" w:cs="Times New Roman"/>
+        </w:rPr>
+        <w:t>‘</w:t>
+      </w:r>
+      <w:r>
+        <w:rPr>
+          <w:rFonts w:eastAsia="Times New Roman" w:cs="Times New Roman"/>
+        </w:rPr>
+        <w:t>ground truth</w:t>
+      </w:r>
+      <w:r>
+        <w:rPr>
+          <w:rFonts w:eastAsia="Times New Roman" w:cs="Times New Roman"/>
+        </w:rPr>
+        <w:t>’</w:t>
+      </w:r>
+      <w:r>
+        <w:rPr>
+          <w:rFonts w:eastAsia="Times New Roman" w:cs="Times New Roman"/>
+        </w:rPr>
+        <w:t xml:space="preserve"> environment, the DRL agent is not merely performing statistical curve fitting; it is interacting with a thermodynamically consistent system governed by Equations of State. This </w:t>
+      </w:r>
+      <w:r>
+        <w:rPr>
+          <w:rFonts w:eastAsia="Times New Roman" w:cs="Times New Roman"/>
+        </w:rPr>
+        <w:t>‘</w:t>
+      </w:r>
+      <w:r>
+        <w:rPr>
+          <w:rFonts w:eastAsia="Times New Roman" w:cs="Times New Roman"/>
+        </w:rPr>
+        <w:t>First-</w:t>
+      </w:r>
+      <w:proofErr w:type="gramStart"/>
+      <w:r>
+        <w:rPr>
+          <w:rFonts w:eastAsia="Times New Roman" w:cs="Times New Roman"/>
+        </w:rPr>
+        <w:t>Principle</w:t>
+      </w:r>
+      <w:proofErr w:type="gramEnd"/>
+      <w:r>
+        <w:rPr>
+          <w:rFonts w:eastAsia="Times New Roman" w:cs="Times New Roman"/>
+        </w:rPr>
+        <w:t xml:space="preserve"> Compliance</w:t>
+      </w:r>
+      <w:r>
+        <w:rPr>
+          <w:rFonts w:eastAsia="Times New Roman" w:cs="Times New Roman"/>
+        </w:rPr>
+        <w:t>’</w:t>
+      </w:r>
+      <w:r>
+        <w:rPr>
+          <w:rFonts w:eastAsia="Times New Roman" w:cs="Times New Roman"/>
+        </w:rPr>
+        <w:t xml:space="preserve"> ensures that the learned control policy </w:t>
+      </w:r>
+      <m:oMath>
+        <m:r>
+          <w:rPr>
+            <w:rFonts w:ascii="Cambria Math" w:eastAsia="Times New Roman" w:hAnsi="Cambria Math" w:cs="Times New Roman"/>
+          </w:rPr>
+          <m:t>π</m:t>
+        </m:r>
+        <m:r>
+          <w:rPr>
+            <w:rFonts w:ascii="Cambria Math" w:eastAsia="Times New Roman" w:hAnsi="Cambria Math" w:cs="Times New Roman"/>
+          </w:rPr>
+          <m:t>(a|s)</m:t>
+        </m:r>
+      </m:oMath>
+      <w:r>
+        <w:rPr>
+          <w:rFonts w:eastAsia="Times New Roman" w:cs="Times New Roman"/>
+        </w:rPr>
+        <w:t xml:space="preserve"> </w:t>
+      </w:r>
+      <w:r>
+        <w:rPr>
+          <w:rFonts w:eastAsia="Times New Roman" w:cs="Times New Roman"/>
+        </w:rPr>
+        <w:t>remains bounded by physical reality, effectively bridging the gap between pure data-driven machine learning and rigorous chemical engineering (Spielberg et al., 2019).</w:t>
       </w:r>
     </w:p>
     <w:p>
@@ -1936,7 +2474,33 @@
         <w:rPr>
           <w:rFonts w:eastAsia="Times New Roman" w:cs="Times New Roman"/>
         </w:rPr>
-        <w:t xml:space="preserve">, and the mass fractions of pseudocomponents across the distillation curve. A critical contribution by Wang et al. (2024) in the Journal of Process Systems Engineering highlights the importance of Feature Engineering in RL for refineries. </w:t>
+        <w:t>, mass fractions of pseudocomponents across the distillation curve</w:t>
+      </w:r>
+      <w:r>
+        <w:rPr>
+          <w:rFonts w:eastAsia="Times New Roman" w:cs="Times New Roman"/>
+        </w:rPr>
+        <w:t>, and product yields</w:t>
+      </w:r>
+      <w:r>
+        <w:rPr>
+          <w:rFonts w:eastAsia="Times New Roman" w:cs="Times New Roman"/>
+        </w:rPr>
+        <w:t>.</w:t>
+      </w:r>
+    </w:p>
+    <w:p>
+      <w:pPr>
+        <w:spacing w:before="20"/>
+        <w:rPr>
+          <w:rFonts w:eastAsia="Times New Roman" w:cs="Times New Roman"/>
+        </w:rPr>
+      </w:pPr>
+      <w:r>
+        <w:rPr>
+          <w:rFonts w:eastAsia="Times New Roman" w:cs="Times New Roman"/>
+        </w:rPr>
+        <w:t xml:space="preserve">A critical contribution by Wang et al. (2024) in the Journal of Process Systems Engineering highlights the importance of Feature Engineering in RL for refineries. </w:t>
       </w:r>
       <w:r>
         <w:rPr>
@@ -1960,14 +2524,7 @@
         <w:rPr>
           <w:rFonts w:eastAsia="Times New Roman" w:cs="Times New Roman"/>
         </w:rPr>
-        <w:t xml:space="preserve"> that normalizing states relative to the Feed </w:t>
-      </w:r>
-      <w:r>
-        <w:rPr>
-          <w:rFonts w:eastAsia="Times New Roman" w:cs="Times New Roman"/>
-        </w:rPr>
-        <w:lastRenderedPageBreak/>
-        <w:t>Assay (the specific TBP curve of the incoming crude) allows the agent to generalize its learning across different crude blends—</w:t>
+        <w:t xml:space="preserve"> that normalizing states relative to the Feed Assay (the specific TBP curve of the incoming crude) allows the agent to generalize its learning across different crude blends—</w:t>
       </w:r>
       <w:r>
         <w:rPr>
@@ -2063,7 +2620,25 @@
         <w:rPr>
           <w:rFonts w:eastAsia="Times New Roman" w:cs="Times New Roman"/>
         </w:rPr>
-        <w:t>is the most critical design element for academic validity. It must be formulated as a multi-objective scalar:</w:t>
+        <w:t>is the most critical design element for</w:t>
+      </w:r>
+      <w:r>
+        <w:rPr>
+          <w:rFonts w:eastAsia="Times New Roman" w:cs="Times New Roman"/>
+        </w:rPr>
+        <w:t xml:space="preserve"> any optimizer</w:t>
+      </w:r>
+      <w:r>
+        <w:rPr>
+          <w:rFonts w:eastAsia="Times New Roman" w:cs="Times New Roman"/>
+        </w:rPr>
+        <w:t>, which may be formulated as</w:t>
+      </w:r>
+      <w:r>
+        <w:rPr>
+          <w:rFonts w:eastAsia="Times New Roman" w:cs="Times New Roman"/>
+        </w:rPr>
+        <w:t>:</w:t>
       </w:r>
     </w:p>
     <w:p>
@@ -2763,7 +3338,21 @@
         <w:rPr>
           <w:rFonts w:eastAsia="Times New Roman" w:cs="Times New Roman"/>
         </w:rPr>
-        <w:t>use of Lagrangian multipliers within the RL framework to dynamically adjust these penalties, ensuring that the agent prioritizes safety and product specifications over raw yield during periods of high process volatility</w:t>
+        <w:t xml:space="preserve">use of </w:t>
+      </w:r>
+      <w:proofErr w:type="spellStart"/>
+      <w:r>
+        <w:rPr>
+          <w:rFonts w:eastAsia="Times New Roman" w:cs="Times New Roman"/>
+        </w:rPr>
+        <w:t>Lagrangian</w:t>
+      </w:r>
+      <w:proofErr w:type="spellEnd"/>
+      <w:r>
+        <w:rPr>
+          <w:rFonts w:eastAsia="Times New Roman" w:cs="Times New Roman"/>
+        </w:rPr>
+        <w:t xml:space="preserve"> multipliers within the RL framework to dynamically adjust these penalties, ensuring that the agent prioritizes safety and product specifications over raw yield during periods of high process volatility</w:t>
       </w:r>
       <w:r>
         <w:rPr>
@@ -2771,35 +3360,19 @@
         </w:rPr>
         <w:t xml:space="preserve"> (</w:t>
       </w:r>
-      <w:r>
-        <w:rPr>
-          <w:rFonts w:eastAsia="Times New Roman" w:cs="Times New Roman"/>
-        </w:rPr>
-        <w:t xml:space="preserve">Gupta </w:t>
-      </w:r>
-      <w:r>
-        <w:rPr>
-          <w:rFonts w:eastAsia="Times New Roman" w:cs="Times New Roman"/>
-        </w:rPr>
-        <w:t>&amp;</w:t>
-      </w:r>
-      <w:r>
-        <w:rPr>
-          <w:rFonts w:eastAsia="Times New Roman" w:cs="Times New Roman"/>
-        </w:rPr>
-        <w:t xml:space="preserve"> Kumar</w:t>
-      </w:r>
-      <w:r>
-        <w:rPr>
-          <w:rFonts w:eastAsia="Times New Roman" w:cs="Times New Roman"/>
-        </w:rPr>
-        <w:t xml:space="preserve">, </w:t>
-      </w:r>
-      <w:r>
-        <w:rPr>
-          <w:rFonts w:eastAsia="Times New Roman" w:cs="Times New Roman"/>
-        </w:rPr>
-        <w:t>2025</w:t>
+      <w:proofErr w:type="spellStart"/>
+      <w:r>
+        <w:rPr>
+          <w:rFonts w:eastAsia="Times New Roman" w:cs="Times New Roman"/>
+        </w:rPr>
+        <w:t>Stooke</w:t>
+      </w:r>
+      <w:proofErr w:type="spellEnd"/>
+      <w:r>
+        <w:rPr>
+          <w:rFonts w:eastAsia="Times New Roman" w:cs="Times New Roman"/>
+        </w:rPr>
+        <w:t xml:space="preserve"> A., et al., 2020</w:t>
       </w:r>
       <w:r>
         <w:rPr>
@@ -2821,72 +3394,167 @@
           <w:rFonts w:eastAsia="Times New Roman" w:cs="Times New Roman"/>
         </w:rPr>
       </w:pPr>
+      <w:r>
+        <w:rPr>
+          <w:rFonts w:eastAsia="Times New Roman" w:cs="Times New Roman"/>
+        </w:rPr>
+        <w:t>Academic research</w:t>
+      </w:r>
+      <w:r>
+        <w:rPr>
+          <w:rFonts w:eastAsia="Times New Roman" w:cs="Times New Roman"/>
+        </w:rPr>
+        <w:t xml:space="preserve"> on</w:t>
+      </w:r>
+      <w:r>
+        <w:rPr>
+          <w:rFonts w:eastAsia="Times New Roman" w:cs="Times New Roman"/>
+        </w:rPr>
+        <w:t xml:space="preserve"> </w:t>
+      </w:r>
+      <w:r>
+        <w:rPr>
+          <w:rFonts w:eastAsia="Times New Roman" w:cs="Times New Roman"/>
+        </w:rPr>
+        <w:t xml:space="preserve">Constrained Policy Optimization (CPO) algorithm </w:t>
+      </w:r>
+      <w:r>
+        <w:rPr>
+          <w:rFonts w:eastAsia="Times New Roman" w:cs="Times New Roman"/>
+        </w:rPr>
+        <w:t xml:space="preserve">shows that it is </w:t>
+      </w:r>
+      <w:r>
+        <w:rPr>
+          <w:rFonts w:eastAsia="Times New Roman" w:cs="Times New Roman"/>
+        </w:rPr>
+        <w:t xml:space="preserve">used </w:t>
+      </w:r>
+      <w:r>
+        <w:rPr>
+          <w:rFonts w:eastAsia="Times New Roman" w:cs="Times New Roman"/>
+        </w:rPr>
+        <w:t xml:space="preserve">to ensure that the agent remains within the Safe Operating Envelope of a VDU-ADU sequence. Their findings suggest that while CPO may converge slightly slower than standard PPO, it effectively eliminates the risk of dry trays or </w:t>
+      </w:r>
+      <w:r>
+        <w:rPr>
+          <w:rFonts w:eastAsia="Times New Roman" w:cs="Times New Roman"/>
+        </w:rPr>
+        <w:lastRenderedPageBreak/>
+        <w:t>column flooding during the learning process</w:t>
+      </w:r>
+      <w:r>
+        <w:rPr>
+          <w:rFonts w:eastAsia="Times New Roman" w:cs="Times New Roman"/>
+        </w:rPr>
+        <w:t xml:space="preserve"> (</w:t>
+      </w:r>
+      <w:proofErr w:type="spellStart"/>
+      <w:r>
+        <w:rPr>
+          <w:rFonts w:eastAsia="Times New Roman" w:cs="Times New Roman"/>
+        </w:rPr>
+        <w:t>Achiam</w:t>
+      </w:r>
+      <w:proofErr w:type="spellEnd"/>
+      <w:r>
+        <w:rPr>
+          <w:rFonts w:eastAsia="Times New Roman" w:cs="Times New Roman"/>
+        </w:rPr>
+        <w:t xml:space="preserve"> L., et al., 2017)</w:t>
+      </w:r>
+      <w:r>
+        <w:rPr>
+          <w:rFonts w:eastAsia="Times New Roman" w:cs="Times New Roman"/>
+        </w:rPr>
+        <w:t>.</w:t>
+      </w:r>
     </w:p>
     <w:p>
       <w:pPr>
         <w:spacing w:before="20"/>
         <w:rPr>
           <w:rFonts w:eastAsia="Times New Roman" w:cs="Times New Roman"/>
-        </w:rPr>
-      </w:pPr>
-      <w:r>
-        <w:rPr>
-          <w:rFonts w:eastAsia="Times New Roman" w:cs="Times New Roman"/>
-        </w:rPr>
-        <w:t xml:space="preserve">A significant barrier to the commercial adoption of RL in refineries is the "black-box" nature of neural networks. Peer-reviewed studies from 2024 and 2025 have increasingly focused on Explainable Reinforcement Learning (XRL). Lee et al. (2025) demonstrated the use of SHAP (SHapley Additive exPlanations) values to decode which sensor inputs (e.g., a specific tray temperature) most heavily influence the agent's decision to increase reflux. This transparency is vital for refinery engineers who must trust the AI's "reasoning" before </w:t>
-      </w:r>
-      <w:r>
-        <w:rPr>
-          <w:rFonts w:eastAsia="Times New Roman" w:cs="Times New Roman"/>
-        </w:rPr>
-        <w:t>allowing it to adjust a column processing $100,000$ barrels per day.</w:t>
-      </w:r>
-    </w:p>
-    <w:p>
-      <w:pPr>
-        <w:spacing w:before="20"/>
-        <w:rPr>
-          <w:rFonts w:eastAsia="Times New Roman" w:cs="Times New Roman"/>
-        </w:rPr>
-      </w:pPr>
-    </w:p>
-    <w:p>
-      <w:pPr>
-        <w:spacing w:before="20"/>
-        <w:rPr>
-          <w:rFonts w:eastAsia="Times New Roman" w:cs="Times New Roman"/>
-        </w:rPr>
-      </w:pPr>
-      <w:r>
-        <w:rPr>
-          <w:rFonts w:eastAsia="Times New Roman" w:cs="Times New Roman"/>
-        </w:rPr>
-        <w:t>The shift toward Safe Reinforcement Learning is perhaps the most relevant development for your project. Academic research by Zhang and Petrova (2025) utilized a "Constrained Policy Optimization" (CPO) algorithm to ensure that the agent remains within the "Safe Operating Envelope" of a VDU-ADU sequence. Their findings suggest that while CPO may converge slightly slower than standard PPO, it effectively eliminates the risk of "dry trays" or "column flooding" during the learning process.</w:t>
-      </w:r>
-    </w:p>
-    <w:p>
-      <w:pPr>
-        <w:spacing w:before="20"/>
-        <w:rPr>
-          <w:rFonts w:eastAsia="Times New Roman" w:cs="Times New Roman"/>
-        </w:rPr>
-      </w:pPr>
-      <w:r>
-        <w:rPr>
-          <w:rFonts w:eastAsia="Times New Roman" w:cs="Times New Roman"/>
-        </w:rPr>
-        <w:t>Furthermore, the commercial sector has seen the emergence of Digital Twin-Driven RL. Companies like Aramco and Equinor have published white papers (2024-2026) detailing their use of surrogate models to train RL agents that are then deployed on real atmospheric towers. These agents have shown an ability to reduce energy consumption by up to 12% compared to traditional RTO-MPC hierarchies, primarily by more aggressively optimizing the pump-around duties and stripping steam ratios in response to ambient temperature changes.</w:t>
-      </w:r>
-    </w:p>
-    <w:p>
-      <w:pPr>
-        <w:spacing w:before="240" w:after="240"/>
-        <w:ind w:left="720" w:hanging="720"/>
-        <w:rPr>
-          <w:rFonts w:eastAsia="Times New Roman"/>
-          <w:color w:val="000000"/>
-        </w:rPr>
-      </w:pPr>
+          <w:lang w:val="en-IN"/>
+        </w:rPr>
+      </w:pPr>
+      <w:r>
+        <w:rPr>
+          <w:rFonts w:eastAsia="Times New Roman" w:cs="Times New Roman"/>
+          <w:lang w:val="en-IN"/>
+        </w:rPr>
+        <w:t xml:space="preserve">While the RL agent maximizes the profit-based reward function </w:t>
+      </w:r>
+      <m:oMath>
+        <m:sSub>
+          <m:sSubPr>
+            <m:ctrlPr>
+              <w:rPr>
+                <w:rFonts w:ascii="Cambria Math" w:eastAsia="Times New Roman" w:hAnsi="Cambria Math" w:cs="Times New Roman"/>
+                <w:i/>
+              </w:rPr>
+            </m:ctrlPr>
+          </m:sSubPr>
+          <m:e>
+            <m:r>
+              <w:rPr>
+                <w:rFonts w:ascii="Cambria Math" w:eastAsia="Times New Roman" w:hAnsi="Cambria Math" w:cs="Times New Roman"/>
+              </w:rPr>
+              <m:t>R</m:t>
+            </m:r>
+          </m:e>
+          <m:sub>
+            <m:r>
+              <w:rPr>
+                <w:rFonts w:ascii="Cambria Math" w:eastAsia="Times New Roman" w:hAnsi="Cambria Math" w:cs="Times New Roman"/>
+              </w:rPr>
+              <m:t>t</m:t>
+            </m:r>
+          </m:sub>
+        </m:sSub>
+      </m:oMath>
+      <w:r>
+        <w:rPr>
+          <w:rFonts w:eastAsia="Times New Roman" w:cs="Times New Roman"/>
+          <w:lang w:val="en-IN"/>
+        </w:rPr>
+        <w:t xml:space="preserve">, it often lacks the semantic awareness to identify nuanced process risks, such as dew point corrosion. Traditional RTOs focus on economic optima and may push the column toward temperatures that inadvertently lead to the condensation of acidic water in the overhead system. Recent studies in 2025 have proposed the use of Large Language Models (LLMs) as </w:t>
+      </w:r>
+      <w:r>
+        <w:rPr>
+          <w:rFonts w:eastAsia="Times New Roman" w:cs="Times New Roman"/>
+          <w:lang w:val="en-IN"/>
+        </w:rPr>
+        <w:t>‘</w:t>
+      </w:r>
+      <w:r>
+        <w:rPr>
+          <w:rFonts w:eastAsia="Times New Roman" w:cs="Times New Roman"/>
+          <w:lang w:val="en-IN"/>
+        </w:rPr>
+        <w:t>Cognitive AI Agents</w:t>
+      </w:r>
+      <w:r>
+        <w:rPr>
+          <w:rFonts w:eastAsia="Times New Roman" w:cs="Times New Roman"/>
+          <w:lang w:val="en-IN"/>
+        </w:rPr>
+        <w:t>’</w:t>
+      </w:r>
+      <w:r>
+        <w:rPr>
+          <w:rFonts w:eastAsia="Times New Roman" w:cs="Times New Roman"/>
+          <w:lang w:val="en-IN"/>
+        </w:rPr>
+        <w:t xml:space="preserve"> that sit atop the optimization layer (</w:t>
+      </w:r>
+      <w:r>
+        <w:rPr>
+          <w:rFonts w:eastAsia="Times New Roman" w:cs="Times New Roman"/>
+          <w:lang w:val="en-IN"/>
+        </w:rPr>
+        <w:t>Bran A. M., et al., 2024).</w:t>
+      </w:r>
     </w:p>
     <w:p>
       <w:pPr>
@@ -2898,32 +3566,589 @@
     </w:p>
     <w:p>
       <w:pPr>
-        <w:rPr>
-          <w:rFonts w:eastAsia="Times New Roman" w:cs="Times New Roman"/>
-        </w:rPr>
-      </w:pPr>
-      <w:r>
-        <w:rPr>
-          <w:rFonts w:eastAsia="Times New Roman" w:cs="Times New Roman"/>
-        </w:rPr>
-        <w:t>This section of your final report should describe the final model architecture or pipeline choices that you have made, as well as the training and optimization procedures that you follow. Training results should be saved for the Results section of the paper—any discussion of modeling iterations and optimization should be brief, without any mention of the resulting performance. For example: “</w:t>
-      </w:r>
-      <w:r>
-        <w:rPr>
-          <w:rFonts w:eastAsia="Times New Roman" w:cs="Times New Roman"/>
+        <w:pStyle w:val="ListParagraph"/>
+        <w:numPr>
+          <w:ilvl w:val="1"/>
+          <w:numId w:val="15"/>
+        </w:numPr>
+        <w:ind w:left="426"/>
+        <w:rPr>
           <w:i/>
           <w:iCs/>
         </w:rPr>
-        <w:t xml:space="preserve">During model optimization, we </w:t>
-      </w:r>
-      <w:r>
-        <w:rPr>
-          <w:rFonts w:eastAsia="Times New Roman" w:cs="Times New Roman"/>
+      </w:pPr>
+      <w:r>
+        <w:rPr>
           <w:i/>
           <w:iCs/>
         </w:rPr>
+        <w:t>Process Simulation</w:t>
+      </w:r>
+    </w:p>
+    <w:p>
+      <w:pPr>
+        <w:ind w:left="-6"/>
+      </w:pPr>
+      <w:r>
+        <w:t>The process simulation is developed using DWSIM, a CAPE-OPEN compliant flowsheet simulator, utilizing a comprehensive model that encompasses an Atmospheric Distillation Unit (ADU), a Naphtha Stabilizer Unit (NSU), and a Vacuum Distillation Unit (VDU). This multi-unit sequence is configured to generate 13 distinct product streams, ranging from light gases to heavy residues. The ADU section produces five streams including un-condensed gas,</w:t>
+      </w:r>
+      <w:r>
+        <w:t xml:space="preserve"> </w:t>
+      </w:r>
+      <w:proofErr w:type="spellStart"/>
+      <w:r>
+        <w:t>Unstabilized</w:t>
+      </w:r>
+      <w:proofErr w:type="spellEnd"/>
+      <w:r>
+        <w:t xml:space="preserve"> Naphtha, H</w:t>
+      </w:r>
+      <w:r>
+        <w:t xml:space="preserve">eavy </w:t>
+      </w:r>
+      <w:r>
+        <w:t>N</w:t>
+      </w:r>
+      <w:r>
+        <w:t>aphtha</w:t>
+      </w:r>
+      <w:r>
+        <w:t xml:space="preserve"> (HN)</w:t>
+      </w:r>
+      <w:r>
+        <w:t xml:space="preserve">, </w:t>
+      </w:r>
+      <w:r>
+        <w:t>Straight-Run</w:t>
+      </w:r>
+      <w:r>
+        <w:t xml:space="preserve"> </w:t>
+      </w:r>
+      <w:r>
+        <w:t>K</w:t>
+      </w:r>
+      <w:r>
+        <w:t xml:space="preserve">erosene </w:t>
+      </w:r>
+      <w:r>
+        <w:t xml:space="preserve">Oil </w:t>
+      </w:r>
+      <w:r>
+        <w:t xml:space="preserve">(SKO), </w:t>
+      </w:r>
+      <w:r>
+        <w:t>L</w:t>
+      </w:r>
+      <w:r>
+        <w:t xml:space="preserve">ight </w:t>
+      </w:r>
+      <w:r>
+        <w:t>G</w:t>
+      </w:r>
+      <w:r>
+        <w:t xml:space="preserve">as </w:t>
+      </w:r>
+      <w:r>
+        <w:t>o</w:t>
+      </w:r>
+      <w:r>
+        <w:t xml:space="preserve">il (LGO), and </w:t>
+      </w:r>
+      <w:r>
+        <w:t>H</w:t>
+      </w:r>
+      <w:r>
+        <w:t xml:space="preserve">eavy </w:t>
+      </w:r>
+      <w:r>
+        <w:t>G</w:t>
+      </w:r>
+      <w:r>
+        <w:t>as oil (HGO). The NSU further refines light components</w:t>
+      </w:r>
+      <w:r>
+        <w:t xml:space="preserve"> of </w:t>
+      </w:r>
+      <w:proofErr w:type="spellStart"/>
+      <w:r>
+        <w:t>Unstabilized</w:t>
+      </w:r>
+      <w:proofErr w:type="spellEnd"/>
+      <w:r>
+        <w:t xml:space="preserve"> Naphtha</w:t>
+      </w:r>
+      <w:r>
+        <w:t xml:space="preserve"> into stabilizer off-gas, LPG, and stabilized run naphtha (SRN), while the VDU yields vacuum off-gas, vacuum diesel, </w:t>
+      </w:r>
+      <w:r>
+        <w:t>V</w:t>
+      </w:r>
+      <w:r>
+        <w:t xml:space="preserve">acuum gas oil (VGO), </w:t>
+      </w:r>
+      <w:proofErr w:type="spellStart"/>
+      <w:r>
+        <w:t>H</w:t>
+      </w:r>
+      <w:r>
+        <w:t>otwell</w:t>
+      </w:r>
+      <w:proofErr w:type="spellEnd"/>
+      <w:r>
+        <w:t xml:space="preserve"> oil, and vacuum residue</w:t>
+      </w:r>
+      <w:r>
+        <w:t>, while feeding from bottoms of ADU which is referred to as Reduced Crude Oil (RCO)</w:t>
+      </w:r>
+      <w:r>
+        <w:t xml:space="preserve">. </w:t>
+      </w:r>
+      <w:r>
+        <w:t xml:space="preserve">For academic purpose, the flowsheet was converged on Erha Crude assay. </w:t>
+      </w:r>
+    </w:p>
+    <w:p>
+      <w:pPr>
+        <w:ind w:left="-6"/>
+      </w:pPr>
+      <w:r>
+        <w:t xml:space="preserve">The crude feed is defined at ambient temperature and atmospheric pressure which is then pressurized through booster pumps, and heated in two phases </w:t>
+      </w:r>
+      <w:proofErr w:type="spellStart"/>
+      <w:r>
+        <w:t>upto</w:t>
+      </w:r>
+      <w:proofErr w:type="spellEnd"/>
+      <w:r>
+        <w:t xml:space="preserve"> 360 </w:t>
+      </w:r>
+      <w:proofErr w:type="spellStart"/>
+      <w:r>
+        <w:rPr>
+          <w:vertAlign w:val="superscript"/>
+        </w:rPr>
+        <w:t>o</w:t>
+      </w:r>
+      <w:r>
+        <w:t>C</w:t>
+      </w:r>
+      <w:proofErr w:type="spellEnd"/>
+      <w:r>
+        <w:t xml:space="preserve"> where 56% of the crude turns in </w:t>
+      </w:r>
+      <w:proofErr w:type="spellStart"/>
+      <w:r>
+        <w:t>vapour</w:t>
+      </w:r>
+      <w:proofErr w:type="spellEnd"/>
+      <w:r>
+        <w:t xml:space="preserve"> phase.</w:t>
+      </w:r>
+    </w:p>
+    <w:p>
+      <w:pPr>
+        <w:ind w:left="-6"/>
+      </w:pPr>
+      <w:r>
+        <w:t xml:space="preserve">The Atmospheric Distillation </w:t>
+      </w:r>
+      <w:r>
+        <w:t>Unit (ADU)</w:t>
+      </w:r>
+      <w:r>
+        <w:t xml:space="preserve"> is configured with 30 stages, at 1.7 bar Top pressure with 0.4 bar pressure drop. Four side drawn products are defined. A partial condenser with initial reflux ratio of 5 used. </w:t>
+      </w:r>
+      <w:r>
+        <w:t>Bottom temperature is set at 365</w:t>
+      </w:r>
+      <w:r>
+        <w:t xml:space="preserve"> </w:t>
+      </w:r>
+      <w:proofErr w:type="spellStart"/>
+      <w:r>
+        <w:rPr>
+          <w:vertAlign w:val="superscript"/>
+        </w:rPr>
+        <w:t>o</w:t>
+      </w:r>
+      <w:r>
+        <w:t>C.</w:t>
+      </w:r>
+      <w:proofErr w:type="spellEnd"/>
+      <w:r>
+        <w:t xml:space="preserve"> The overhead liquid stream, </w:t>
+      </w:r>
+      <w:proofErr w:type="spellStart"/>
+      <w:r>
+        <w:t>Unstabilized</w:t>
+      </w:r>
+      <w:proofErr w:type="spellEnd"/>
+      <w:r>
+        <w:t xml:space="preserve"> Naphtha is drawn and fed to Naphtha Stabilizer to separate LPG from Straight-run Naphtha.</w:t>
+      </w:r>
+      <w:r>
+        <w:t xml:space="preserve"> The bottom, Reduced Crude Oil (RCO), </w:t>
+      </w:r>
+      <w:r>
+        <w:t>is fed to Vacuum Distillation Unit for further refinement.</w:t>
+      </w:r>
+    </w:p>
+    <w:p>
+      <w:pPr>
+        <w:ind w:left="-6"/>
+      </w:pPr>
+      <w:r>
+        <w:t xml:space="preserve">Naphtha Stabilizer (NSU) </w:t>
+      </w:r>
+      <w:r>
+        <w:t xml:space="preserve">is configured with 30 stages, at 9.5 bar with 0.4 bar pressure drop, a partial condenser with 0.05 bar pressure drop, reflux ratio of 5 and bottom temperature at 155 </w:t>
+      </w:r>
+      <w:proofErr w:type="spellStart"/>
+      <w:r>
+        <w:rPr>
+          <w:vertAlign w:val="superscript"/>
+        </w:rPr>
+        <w:t>o</w:t>
+      </w:r>
+      <w:r>
+        <w:t>C.</w:t>
+      </w:r>
+      <w:proofErr w:type="spellEnd"/>
+      <w:r>
+        <w:t xml:space="preserve"> </w:t>
+      </w:r>
+    </w:p>
+    <w:p>
+      <w:pPr>
+        <w:ind w:left="-6"/>
+      </w:pPr>
+    </w:p>
+    <w:p>
+      <w:pPr>
+        <w:ind w:left="-6"/>
+      </w:pPr>
+    </w:p>
+    <w:p>
+      <w:pPr>
+        <w:ind w:left="-6"/>
+      </w:pPr>
+      <w:r>
+        <w:drawing>
+          <wp:inline distT="0" distB="0" distL="0" distR="0" wp14:anchorId="3F2170B9" wp14:editId="3B0B5B30">
+            <wp:extent cx="3075305" cy="1305560"/>
+            <wp:effectExtent l="0" t="0" r="0" b="8890"/>
+            <wp:docPr id="211983199" name="Picture 1"/>
+            <wp:cNvGraphicFramePr>
+              <a:graphicFrameLocks xmlns:a="http://schemas.openxmlformats.org/drawingml/2006/main" noChangeAspect="1"/>
+            </wp:cNvGraphicFramePr>
+            <a:graphic xmlns:a="http://schemas.openxmlformats.org/drawingml/2006/main">
+              <a:graphicData uri="http://schemas.openxmlformats.org/drawingml/2006/picture">
+                <pic:pic xmlns:pic="http://schemas.openxmlformats.org/drawingml/2006/picture">
+                  <pic:nvPicPr>
+                    <pic:cNvPr id="211983199" name=""/>
+                    <pic:cNvPicPr/>
+                  </pic:nvPicPr>
+                  <pic:blipFill>
+                    <a:blip r:embed="rId20"/>
+                    <a:stretch>
+                      <a:fillRect/>
+                    </a:stretch>
+                  </pic:blipFill>
+                  <pic:spPr>
+                    <a:xfrm>
+                      <a:off x="0" y="0"/>
+                      <a:ext cx="3075305" cy="1305560"/>
+                    </a:xfrm>
+                    <a:prstGeom prst="rect">
+                      <a:avLst/>
+                    </a:prstGeom>
+                  </pic:spPr>
+                </pic:pic>
+              </a:graphicData>
+            </a:graphic>
+          </wp:inline>
+        </w:drawing>
+      </w:r>
+    </w:p>
+    <w:p>
+      <w:pPr>
+        <w:ind w:left="-6"/>
+      </w:pPr>
+      <w:r>
+        <w:drawing>
+          <wp:inline distT="0" distB="0" distL="0" distR="0" wp14:anchorId="65537D0E" wp14:editId="5ABF1467">
+            <wp:extent cx="3075305" cy="1385570"/>
+            <wp:effectExtent l="0" t="0" r="0" b="5080"/>
+            <wp:docPr id="158474818" name="Picture 1"/>
+            <wp:cNvGraphicFramePr>
+              <a:graphicFrameLocks xmlns:a="http://schemas.openxmlformats.org/drawingml/2006/main" noChangeAspect="1"/>
+            </wp:cNvGraphicFramePr>
+            <a:graphic xmlns:a="http://schemas.openxmlformats.org/drawingml/2006/main">
+              <a:graphicData uri="http://schemas.openxmlformats.org/drawingml/2006/picture">
+                <pic:pic xmlns:pic="http://schemas.openxmlformats.org/drawingml/2006/picture">
+                  <pic:nvPicPr>
+                    <pic:cNvPr id="158474818" name=""/>
+                    <pic:cNvPicPr/>
+                  </pic:nvPicPr>
+                  <pic:blipFill>
+                    <a:blip r:embed="rId21"/>
+                    <a:stretch>
+                      <a:fillRect/>
+                    </a:stretch>
+                  </pic:blipFill>
+                  <pic:spPr>
+                    <a:xfrm>
+                      <a:off x="0" y="0"/>
+                      <a:ext cx="3075305" cy="1385570"/>
+                    </a:xfrm>
+                    <a:prstGeom prst="rect">
+                      <a:avLst/>
+                    </a:prstGeom>
+                  </pic:spPr>
+                </pic:pic>
+              </a:graphicData>
+            </a:graphic>
+          </wp:inline>
+        </w:drawing>
+      </w:r>
+    </w:p>
+    <w:p>
+      <w:pPr>
+        <w:ind w:left="-6"/>
+      </w:pPr>
+      <w:r>
         <w:lastRenderedPageBreak/>
-        <w:t>explored hyperparameters a, b, and c with values [d,e,f], [g,h,i], and [j,k,l], respectively. Our final model architecture was...</w:t>
+        <w:drawing>
+          <wp:inline distT="0" distB="0" distL="0" distR="0" wp14:anchorId="226ED0A2" wp14:editId="22B7D93A">
+            <wp:extent cx="3075305" cy="1429385"/>
+            <wp:effectExtent l="0" t="0" r="0" b="0"/>
+            <wp:docPr id="89766192" name="Picture 1"/>
+            <wp:cNvGraphicFramePr>
+              <a:graphicFrameLocks xmlns:a="http://schemas.openxmlformats.org/drawingml/2006/main" noChangeAspect="1"/>
+            </wp:cNvGraphicFramePr>
+            <a:graphic xmlns:a="http://schemas.openxmlformats.org/drawingml/2006/main">
+              <a:graphicData uri="http://schemas.openxmlformats.org/drawingml/2006/picture">
+                <pic:pic xmlns:pic="http://schemas.openxmlformats.org/drawingml/2006/picture">
+                  <pic:nvPicPr>
+                    <pic:cNvPr id="89766192" name=""/>
+                    <pic:cNvPicPr/>
+                  </pic:nvPicPr>
+                  <pic:blipFill>
+                    <a:blip r:embed="rId22"/>
+                    <a:stretch>
+                      <a:fillRect/>
+                    </a:stretch>
+                  </pic:blipFill>
+                  <pic:spPr>
+                    <a:xfrm>
+                      <a:off x="0" y="0"/>
+                      <a:ext cx="3075305" cy="1429385"/>
+                    </a:xfrm>
+                    <a:prstGeom prst="rect">
+                      <a:avLst/>
+                    </a:prstGeom>
+                  </pic:spPr>
+                </pic:pic>
+              </a:graphicData>
+            </a:graphic>
+          </wp:inline>
+        </w:drawing>
+      </w:r>
+    </w:p>
+    <w:p>
+      <w:pPr>
+        <w:ind w:left="-6"/>
+        <w:rPr>
+          <w:i/>
+          <w:iCs/>
+          <w:sz w:val="18"/>
+          <w:szCs w:val="18"/>
+        </w:rPr>
+      </w:pPr>
+      <w:r>
+        <w:rPr>
+          <w:i/>
+          <w:iCs/>
+          <w:sz w:val="18"/>
+          <w:szCs w:val="18"/>
+        </w:rPr>
+        <w:t xml:space="preserve">Fig 4. </w:t>
+      </w:r>
+      <w:r>
+        <w:rPr>
+          <w:i/>
+          <w:iCs/>
+          <w:sz w:val="18"/>
+          <w:szCs w:val="18"/>
+        </w:rPr>
+        <w:t>Flowsheets created depicting a typical Crude Distillation Unit</w:t>
+      </w:r>
+    </w:p>
+    <w:p>
+      <w:pPr>
+        <w:pStyle w:val="ListParagraph"/>
+        <w:numPr>
+          <w:ilvl w:val="1"/>
+          <w:numId w:val="15"/>
+        </w:numPr>
+        <w:ind w:left="426"/>
+      </w:pPr>
+      <w:r>
+        <w:t>Reinforcement Learning Architectures</w:t>
+      </w:r>
+    </w:p>
+    <w:p>
+      <w:pPr>
+        <w:ind w:left="720" w:hanging="720"/>
+      </w:pPr>
+    </w:p>
+    <w:p/>
+    <w:p>
+      <w:r>
+        <w:t xml:space="preserve">4.2 </w:t>
+      </w:r>
+    </w:p>
+    <w:p>
+      <w:r>
+        <w:t xml:space="preserve">4.3 </w:t>
+      </w:r>
+      <w:proofErr w:type="spellStart"/>
+      <w:r>
+        <w:t>DWSim</w:t>
+      </w:r>
+      <w:proofErr w:type="spellEnd"/>
+      <w:r>
+        <w:t>-RL Bridge</w:t>
+      </w:r>
+    </w:p>
+    <w:p>
+      <w:r>
+        <w:t>4.4 Agent Training</w:t>
+      </w:r>
+    </w:p>
+    <w:p>
+      <w:r>
+        <w:t>4.5 Model Optimization</w:t>
+      </w:r>
+    </w:p>
+    <w:p>
+      <w:r>
+        <w:t>4.6 AI Agent Creation</w:t>
+      </w:r>
+    </w:p>
+    <w:p>
+      <w:r>
+        <w:t>4.7 Application development</w:t>
+      </w:r>
+    </w:p>
+    <w:p>
+      <w:r>
+        <w:t xml:space="preserve">  </w:t>
+      </w:r>
+    </w:p>
+    <w:p>
+      <w:pPr>
+        <w:rPr>
+          <w:rFonts w:eastAsia="Times New Roman" w:cs="Times New Roman"/>
+        </w:rPr>
+      </w:pPr>
+      <w:r>
+        <w:rPr>
+          <w:rFonts w:eastAsia="Times New Roman" w:cs="Times New Roman"/>
+        </w:rPr>
+        <w:t>This section of your final report should describe the final model architecture or pipeline choices that you have made, as well as the training and optimization procedures that you follow. Training results should be saved for the Results section of the paper—any discussion of modeling iterations and optimization should be brief, without any mention of the resulting performance. For example: “</w:t>
+      </w:r>
+      <w:r>
+        <w:rPr>
+          <w:rFonts w:eastAsia="Times New Roman" w:cs="Times New Roman"/>
+          <w:i/>
+          <w:iCs/>
+        </w:rPr>
+        <w:t>During model optimization, we explored hyperparameters a, b, and c with values [</w:t>
+      </w:r>
+      <w:proofErr w:type="spellStart"/>
+      <w:proofErr w:type="gramStart"/>
+      <w:r>
+        <w:rPr>
+          <w:rFonts w:eastAsia="Times New Roman" w:cs="Times New Roman"/>
+          <w:i/>
+          <w:iCs/>
+        </w:rPr>
+        <w:t>d,e</w:t>
+      </w:r>
+      <w:proofErr w:type="gramEnd"/>
+      <w:r>
+        <w:rPr>
+          <w:rFonts w:eastAsia="Times New Roman" w:cs="Times New Roman"/>
+          <w:i/>
+          <w:iCs/>
+        </w:rPr>
+        <w:t>,f</w:t>
+      </w:r>
+      <w:proofErr w:type="spellEnd"/>
+      <w:r>
+        <w:rPr>
+          <w:rFonts w:eastAsia="Times New Roman" w:cs="Times New Roman"/>
+          <w:i/>
+          <w:iCs/>
+        </w:rPr>
+        <w:t>], [</w:t>
+      </w:r>
+      <w:proofErr w:type="spellStart"/>
+      <w:proofErr w:type="gramStart"/>
+      <w:r>
+        <w:rPr>
+          <w:rFonts w:eastAsia="Times New Roman" w:cs="Times New Roman"/>
+          <w:i/>
+          <w:iCs/>
+        </w:rPr>
+        <w:t>g,h</w:t>
+      </w:r>
+      <w:proofErr w:type="gramEnd"/>
+      <w:r>
+        <w:rPr>
+          <w:rFonts w:eastAsia="Times New Roman" w:cs="Times New Roman"/>
+          <w:i/>
+          <w:iCs/>
+        </w:rPr>
+        <w:t>,i</w:t>
+      </w:r>
+      <w:proofErr w:type="spellEnd"/>
+      <w:r>
+        <w:rPr>
+          <w:rFonts w:eastAsia="Times New Roman" w:cs="Times New Roman"/>
+          <w:i/>
+          <w:iCs/>
+        </w:rPr>
+        <w:t>], and [</w:t>
+      </w:r>
+      <w:proofErr w:type="spellStart"/>
+      <w:proofErr w:type="gramStart"/>
+      <w:r>
+        <w:rPr>
+          <w:rFonts w:eastAsia="Times New Roman" w:cs="Times New Roman"/>
+          <w:i/>
+          <w:iCs/>
+        </w:rPr>
+        <w:t>j,k</w:t>
+      </w:r>
+      <w:proofErr w:type="gramEnd"/>
+      <w:r>
+        <w:rPr>
+          <w:rFonts w:eastAsia="Times New Roman" w:cs="Times New Roman"/>
+          <w:i/>
+          <w:iCs/>
+        </w:rPr>
+        <w:t>,l</w:t>
+      </w:r>
+      <w:proofErr w:type="spellEnd"/>
+      <w:r>
+        <w:rPr>
+          <w:rFonts w:eastAsia="Times New Roman" w:cs="Times New Roman"/>
+          <w:i/>
+          <w:iCs/>
+        </w:rPr>
+        <w:t>], respectively. Our final model architecture was...</w:t>
       </w:r>
       <w:r>
         <w:rPr>
@@ -3074,6 +4299,7 @@
         </w:rPr>
       </w:pPr>
       <w:r>
+        <w:lastRenderedPageBreak/>
         <w:t>If your project is focused on implementing a complete machine learning system, what is the user experience? Are there any delays or remaining bugs that affect your model output either in common or edge use cases?</w:t>
       </w:r>
     </w:p>
@@ -3235,14 +4461,13 @@
         <w:rPr>
           <w:rFonts w:eastAsia="Times New Roman" w:cs="Times New Roman"/>
         </w:rPr>
-        <w:t xml:space="preserve">A formal report of this type should be primarily in paragraph form, with minimal subheadings, bullet points, or numbered lists. For most of your required report sections, no subheadings will be necessary, and the information can be presented as </w:t>
-      </w:r>
-      <w:r>
-        <w:rPr>
-          <w:rFonts w:eastAsia="Times New Roman" w:cs="Times New Roman"/>
-        </w:rPr>
-        <w:lastRenderedPageBreak/>
-        <w:t>a single, cohesive discussion of the content relevant to that section. As a general rule of thumb, bulleted or numbered lists are only appropriate in this kind of report if the list items are less than one sentence, but are too long/detailed to be presented in a table.</w:t>
+        <w:t xml:space="preserve">A formal report of this type should be primarily in paragraph form, with minimal subheadings, bullet points, or numbered lists. For most of your required report sections, no subheadings will be necessary, and the information can be presented as a single, cohesive discussion of the content relevant to that section. As a general rule of thumb, bulleted or numbered lists are only appropriate in this kind of report if the list items are less than one </w:t>
+      </w:r>
+      <w:r>
+        <w:rPr>
+          <w:rFonts w:eastAsia="Times New Roman" w:cs="Times New Roman"/>
+        </w:rPr>
+        <w:t>sentence, but are too long/detailed to be presented in a table.</w:t>
       </w:r>
     </w:p>
     <w:p>
@@ -3370,10 +4595,7 @@
         <w:t>Parenthetical citations mid-sentence</w:t>
       </w:r>
       <w:r>
-        <w:t xml:space="preserve"> should be used when only a part of the sentence comes from the cited source, or when you are providing a citation for something specific such as a company, model architecture/method, or technique. See the following examples for a sentence with multiple </w:t>
-      </w:r>
-      <w:r>
-        <w:t>mid-sentence citations and a sentence with a specific mid-sentence citation below:</w:t>
+        <w:t xml:space="preserve"> should be used when only a part of the sentence comes from the cited source, or when you are providing a citation for something specific such as a company, model architecture/method, or technique. See the following examples for a sentence with multiple mid-sentence citations and a sentence with a specific mid-sentence citation below:</w:t>
       </w:r>
     </w:p>
     <w:p>
@@ -3385,7 +4607,11 @@
         </w:numPr>
       </w:pPr>
       <w:r>
-        <w:t>The transformer model was introduced in 2017 for the application of machine translation (Vaswani et al., 2017) and quickly became the most common backbone for today’s large language models (Devlin et al., 2019; Radford et al., 2019).</w:t>
+        <w:t xml:space="preserve">The transformer model was introduced in 2017 for the application of machine </w:t>
+      </w:r>
+      <w:r>
+        <w:lastRenderedPageBreak/>
+        <w:t>translation (Vaswani et al., 2017) and quickly became the most common backbone for today’s large language models (Devlin et al., 2019; Radford et al., 2019).</w:t>
       </w:r>
     </w:p>
     <w:p>
@@ -3476,8 +4702,10 @@
     </w:p>
     <w:p>
       <w:r>
-        <w:lastRenderedPageBreak/>
-        <w:t>Each figure should also have a corresponding caption that briefly describes the content of the figure and can be used to highlight important details. If your figure is too complex to be limited to a single column width, you can include it as a full-width image at the top of the page.</w:t>
+        <w:t xml:space="preserve">Each figure should also have a corresponding caption that briefly describes the content of the figure and can be used to highlight important details. If your figure is too complex to be limited </w:t>
+      </w:r>
+      <w:r>
+        <w:t>to a single column width, you can include it as a full-width image at the top of the page.</w:t>
       </w:r>
     </w:p>
     <w:p>
@@ -3506,7 +4734,7 @@
                     </pic:cNvPicPr>
                   </pic:nvPicPr>
                   <pic:blipFill>
-                    <a:blip r:embed="rId20"/>
+                    <a:blip r:embed="rId23"/>
                     <a:stretch>
                       <a:fillRect/>
                     </a:stretch>
@@ -3796,7 +5024,15 @@
         <w:t>a</w:t>
       </w:r>
       <w:r>
-        <w:t xml:space="preserve"> is the learned coefficent, and </w:t>
+        <w:t xml:space="preserve"> is the learned </w:t>
+      </w:r>
+      <w:proofErr w:type="spellStart"/>
+      <w:r>
+        <w:t>coefficent</w:t>
+      </w:r>
+      <w:proofErr w:type="spellEnd"/>
+      <w:r>
+        <w:t xml:space="preserve">, and </w:t>
       </w:r>
       <w:r>
         <w:rPr>
@@ -3854,10 +5090,9 @@
     </w:p>
     <w:p>
       <w:r>
-        <w:lastRenderedPageBreak/>
         <w:t xml:space="preserve">References should be alphabetically ordered using APA 7 formatting. You can refer to the </w:t>
       </w:r>
-      <w:hyperlink r:id="rId21">
+      <w:hyperlink r:id="rId24">
         <w:r>
           <w:rPr>
             <w:rStyle w:val="Hyperlink"/>
@@ -3866,7 +5101,10 @@
         </w:r>
       </w:hyperlink>
       <w:r>
-        <w:t xml:space="preserve"> on how to format citations from different types of sources. There are also online tools that can be used to create citations for you, though these will occasionally produce errors, so be sure to double check these. If you are citing an academic paper, the Google Scholar listing for the paper will also have a properly formatted APA citation that you can copy into your report. Several example citations are shown in the works cited included in this template.</w:t>
+        <w:t xml:space="preserve"> on how to format citations from different types of sources. There are also online </w:t>
+      </w:r>
+      <w:r>
+        <w:t>tools that can be used to create citations for you, though these will occasionally produce errors, so be sure to double check these. If you are citing an academic paper, the Google Scholar listing for the paper will also have a properly formatted APA citation that you can copy into your report. Several example citations are shown in the works cited included in this template.</w:t>
       </w:r>
     </w:p>
     <w:p>
@@ -3893,10 +5131,7 @@
     </w:p>
     <w:p>
       <w:r>
-        <w:t xml:space="preserve">Appendices should be labeled alphabetically (Appendix A, Appendix B, etc.) and should be referred to directly in your text (e.g. “A complete table of results over all hyperparameters can be found in Appendix A”). Each appendix should start on a new page and does not need to be in the two-column format if full page width makes more sense </w:t>
-      </w:r>
-      <w:r>
-        <w:t>for your content (e.g. detailed figures or large tables).</w:t>
+        <w:t>Appendices should be labeled alphabetically (Appendix A, Appendix B, etc.) and should be referred to directly in your text (e.g. “A complete table of results over all hyperparameters can be found in Appendix A”). Each appendix should start on a new page and does not need to be in the two-column format if full page width makes more sense for your content (e.g. detailed figures or large tables).</w:t>
       </w:r>
     </w:p>
     <w:p>
@@ -3909,6 +5144,7 @@
         </w:rPr>
       </w:pPr>
       <w:r>
+        <w:lastRenderedPageBreak/>
         <w:t>ACKNOWLEDGMENTS</w:t>
       </w:r>
     </w:p>
@@ -3952,9 +5188,91 @@
       <w:r>
         <w:rPr>
           <w:rFonts w:eastAsia="Linux Libertine" w:cstheme="majorBidi"/>
+        </w:rPr>
+        <w:t xml:space="preserve">Achiam, J., Held, D., Tamar, A., &amp; </w:t>
+      </w:r>
+      <w:proofErr w:type="spellStart"/>
+      <w:r>
+        <w:rPr>
+          <w:rFonts w:eastAsia="Linux Libertine" w:cstheme="majorBidi"/>
+        </w:rPr>
+        <w:t>Abbeel</w:t>
+      </w:r>
+      <w:proofErr w:type="spellEnd"/>
+      <w:r>
+        <w:rPr>
+          <w:rFonts w:eastAsia="Linux Libertine" w:cstheme="majorBidi"/>
+        </w:rPr>
+        <w:t xml:space="preserve">, P. (2017). Constrained Policy Optimization. </w:t>
+      </w:r>
+      <w:r>
+        <w:rPr>
+          <w:rFonts w:eastAsia="Linux Libertine" w:cstheme="majorBidi"/>
+          <w:i/>
+          <w:iCs/>
+        </w:rPr>
+        <w:t>Proceedings of the 34th International Conference on Machine Learning (ICML)</w:t>
+      </w:r>
+      <w:r>
+        <w:rPr>
+          <w:rFonts w:eastAsia="Linux Libertine" w:cstheme="majorBidi"/>
+        </w:rPr>
+        <w:t xml:space="preserve">, </w:t>
+      </w:r>
+      <w:r>
+        <w:rPr>
+          <w:rFonts w:eastAsia="Linux Libertine" w:cstheme="majorBidi"/>
+          <w:i/>
+          <w:iCs/>
+        </w:rPr>
+        <w:t>70</w:t>
+      </w:r>
+      <w:r>
+        <w:rPr>
+          <w:rFonts w:eastAsia="Linux Libertine" w:cstheme="majorBidi"/>
+        </w:rPr>
+        <w:t>, 22–31.</w:t>
+      </w:r>
+    </w:p>
+    <w:p>
+      <w:pPr>
+        <w:spacing w:before="200" w:after="40" w:line="240" w:lineRule="auto"/>
+        <w:ind w:left="300" w:hanging="300"/>
+        <w:rPr>
+          <w:rFonts w:eastAsia="Linux Libertine" w:cstheme="majorBidi"/>
+        </w:rPr>
+      </w:pPr>
+      <w:proofErr w:type="spellStart"/>
+      <w:r>
+        <w:rPr>
+          <w:rFonts w:eastAsia="Linux Libertine" w:cstheme="majorBidi"/>
           <w:lang w:val="en-IN"/>
         </w:rPr>
-        <w:t xml:space="preserve">AlRijeb, M. F. S., Othman, M. L., Ishak, A., Hassan, M. K., &amp; Albaker, B. M. (2025). Machine learning-driven soft sensor implementation for real-time fault detection in CDU of oil refinery. </w:t>
+        <w:t>AlRijeb</w:t>
+      </w:r>
+      <w:proofErr w:type="spellEnd"/>
+      <w:r>
+        <w:rPr>
+          <w:rFonts w:eastAsia="Linux Libertine" w:cstheme="majorBidi"/>
+          <w:lang w:val="en-IN"/>
+        </w:rPr>
+        <w:t xml:space="preserve">, M. F. S., Othman, M. L., Ishak, A., Hassan, M. K., &amp; </w:t>
+      </w:r>
+      <w:proofErr w:type="spellStart"/>
+      <w:r>
+        <w:rPr>
+          <w:rFonts w:eastAsia="Linux Libertine" w:cstheme="majorBidi"/>
+          <w:lang w:val="en-IN"/>
+        </w:rPr>
+        <w:t>Albaker</w:t>
+      </w:r>
+      <w:proofErr w:type="spellEnd"/>
+      <w:r>
+        <w:rPr>
+          <w:rFonts w:eastAsia="Linux Libertine" w:cstheme="majorBidi"/>
+          <w:lang w:val="en-IN"/>
+        </w:rPr>
+        <w:t xml:space="preserve">, B. M. (2025). Machine learning-driven soft sensor implementation for real-time fault detection in CDU of oil refinery. </w:t>
       </w:r>
       <w:r>
         <w:rPr>
@@ -3988,7 +5306,7 @@
         </w:rPr>
         <w:t xml:space="preserve">(1), 20425–20432. </w:t>
       </w:r>
-      <w:hyperlink r:id="rId22" w:tgtFrame="_blank" w:history="1">
+      <w:hyperlink r:id="rId25" w:tgtFrame="_blank" w:history="1">
         <w:r>
           <w:rPr>
             <w:rStyle w:val="Hyperlink"/>
@@ -4012,7 +5330,55 @@
           <w:rFonts w:eastAsia="Linux Libertine" w:cstheme="majorBidi"/>
           <w:lang w:val="en-IN"/>
         </w:rPr>
-        <w:t xml:space="preserve">Al-Sayegh, A., Al-Wahaibi, Y., Joshi, S., Al-Bahry, S., Elshafie, A., &amp; Al-Bemani, A. (2016). Bioremediation of heavy crude oil contamination. </w:t>
+        <w:t>Al-Sayegh, A., Al-</w:t>
+      </w:r>
+      <w:proofErr w:type="spellStart"/>
+      <w:r>
+        <w:rPr>
+          <w:rFonts w:eastAsia="Linux Libertine" w:cstheme="majorBidi"/>
+          <w:lang w:val="en-IN"/>
+        </w:rPr>
+        <w:t>Wahaibi</w:t>
+      </w:r>
+      <w:proofErr w:type="spellEnd"/>
+      <w:r>
+        <w:rPr>
+          <w:rFonts w:eastAsia="Linux Libertine" w:cstheme="majorBidi"/>
+          <w:lang w:val="en-IN"/>
+        </w:rPr>
+        <w:t xml:space="preserve">, Y., Joshi, S., Al-Bahry, S., </w:t>
+      </w:r>
+      <w:proofErr w:type="spellStart"/>
+      <w:r>
+        <w:rPr>
+          <w:rFonts w:eastAsia="Linux Libertine" w:cstheme="majorBidi"/>
+          <w:lang w:val="en-IN"/>
+        </w:rPr>
+        <w:t>Elshafie</w:t>
+      </w:r>
+      <w:proofErr w:type="spellEnd"/>
+      <w:r>
+        <w:rPr>
+          <w:rFonts w:eastAsia="Linux Libertine" w:cstheme="majorBidi"/>
+          <w:lang w:val="en-IN"/>
+        </w:rPr>
+        <w:t>, A., &amp; Al-</w:t>
+      </w:r>
+      <w:proofErr w:type="spellStart"/>
+      <w:r>
+        <w:rPr>
+          <w:rFonts w:eastAsia="Linux Libertine" w:cstheme="majorBidi"/>
+          <w:lang w:val="en-IN"/>
+        </w:rPr>
+        <w:t>Bemani</w:t>
+      </w:r>
+      <w:proofErr w:type="spellEnd"/>
+      <w:r>
+        <w:rPr>
+          <w:rFonts w:eastAsia="Linux Libertine" w:cstheme="majorBidi"/>
+          <w:lang w:val="en-IN"/>
+        </w:rPr>
+        <w:t xml:space="preserve">, A. (2016). Bioremediation of heavy crude oil contamination. </w:t>
       </w:r>
       <w:r>
         <w:rPr>
@@ -4046,7 +5412,7 @@
         </w:rPr>
         <w:t xml:space="preserve">(1), 301–311. </w:t>
       </w:r>
-      <w:hyperlink r:id="rId23" w:tgtFrame="_blank" w:history="1">
+      <w:hyperlink r:id="rId26" w:tgtFrame="_blank" w:history="1">
         <w:r>
           <w:rPr>
             <w:rStyle w:val="Hyperlink"/>
@@ -4084,8 +5450,45 @@
         <w:rPr>
           <w:rFonts w:eastAsia="Linux Libertine" w:cstheme="majorBidi"/>
         </w:rPr>
-        <w:t>Brockman, G., Cheung, V., Pettersson, L., Schneider, J., Schulman, J., Tang, J., &amp; Zaremba, W. (2016). OpenAI Gym. arXiv. https://doi.org/10.48550/arXiv.1606.01540</w:t>
-      </w:r>
+        <w:t xml:space="preserve">Bran, A. M., Cox, S., Edwards, O., </w:t>
+      </w:r>
+      <w:proofErr w:type="spellStart"/>
+      <w:r>
+        <w:rPr>
+          <w:rFonts w:eastAsia="Linux Libertine" w:cstheme="majorBidi"/>
+        </w:rPr>
+        <w:t>Diggans</w:t>
+      </w:r>
+      <w:proofErr w:type="spellEnd"/>
+      <w:r>
+        <w:rPr>
+          <w:rFonts w:eastAsia="Linux Libertine" w:cstheme="majorBidi"/>
+        </w:rPr>
+        <w:t xml:space="preserve">, C., Schwaller, P., &amp; White, A. D. (2024). </w:t>
+      </w:r>
+      <w:proofErr w:type="spellStart"/>
+      <w:r>
+        <w:rPr>
+          <w:rFonts w:eastAsia="Linux Libertine" w:cstheme="majorBidi"/>
+        </w:rPr>
+        <w:t>ChemCrow</w:t>
+      </w:r>
+      <w:proofErr w:type="spellEnd"/>
+      <w:r>
+        <w:rPr>
+          <w:rFonts w:eastAsia="Linux Libertine" w:cstheme="majorBidi"/>
+        </w:rPr>
+        <w:t xml:space="preserve">: Augmenting large-language models with chemistry tools. Nature Machine Intelligence, 6(6), 525–535. </w:t>
+      </w:r>
+      <w:hyperlink r:id="rId27" w:history="1">
+        <w:r>
+          <w:rPr>
+            <w:rStyle w:val="Hyperlink"/>
+            <w:rFonts w:eastAsia="Linux Libertine" w:cstheme="majorBidi"/>
+          </w:rPr>
+          <w:t>https://doi.org/10.1038/s42256-024-00832-w</w:t>
+        </w:r>
+      </w:hyperlink>
     </w:p>
     <w:p>
       <w:pPr>
@@ -4099,7 +5502,27 @@
         <w:rPr>
           <w:rFonts w:eastAsia="Linux Libertine" w:cstheme="majorBidi"/>
         </w:rPr>
-        <w:t>Chen, H., &amp; Liu, Z. (2025). Multi-agent reinforcement learning for integrated refinery optimization: A DWSIM-based study. Proceedings of the International Conference on Process Systems Engineering (PSE 2025), 114–129.</w:t>
+        <w:t xml:space="preserve">Brockman, G., Cheung, V., Pettersson, L., Schneider, J., Schulman, J., Tang, J., &amp; </w:t>
+      </w:r>
+      <w:r>
+        <w:rPr>
+          <w:rFonts w:eastAsia="Linux Libertine" w:cstheme="majorBidi"/>
+        </w:rPr>
+        <w:t xml:space="preserve">Zaremba, W. (2016). OpenAI Gym. </w:t>
+      </w:r>
+      <w:proofErr w:type="spellStart"/>
+      <w:r>
+        <w:rPr>
+          <w:rFonts w:eastAsia="Linux Libertine" w:cstheme="majorBidi"/>
+        </w:rPr>
+        <w:t>arXiv</w:t>
+      </w:r>
+      <w:proofErr w:type="spellEnd"/>
+      <w:r>
+        <w:rPr>
+          <w:rFonts w:eastAsia="Linux Libertine" w:cstheme="majorBidi"/>
+        </w:rPr>
+        <w:t>. https://doi.org/10.48550/arXiv.1606.01540</w:t>
       </w:r>
     </w:p>
     <w:p>
@@ -4114,10 +5537,24 @@
         <w:rPr>
           <w:rFonts w:eastAsia="Linux Libertine" w:cstheme="majorBidi"/>
         </w:rPr>
-        <w:lastRenderedPageBreak/>
+        <w:t>Darby, M. L., Nikolaou, M., Jones, J., &amp; Nicholson, D. (2011). RTO—An overview and assessment of current practice. Journal of Process Control, 21(6), 874-884.</w:t>
+      </w:r>
+    </w:p>
+    <w:p>
+      <w:pPr>
+        <w:spacing w:before="200" w:after="40" w:line="240" w:lineRule="auto"/>
+        <w:ind w:left="300" w:hanging="300"/>
+        <w:rPr>
+          <w:rFonts w:eastAsia="Linux Libertine" w:cstheme="majorBidi"/>
+        </w:rPr>
+      </w:pPr>
+      <w:r>
+        <w:rPr>
+          <w:rFonts w:eastAsia="Linux Libertine" w:cstheme="majorBidi"/>
+        </w:rPr>
         <w:t xml:space="preserve">Engell, S. (2007). Feedback control for optimal process operation. Journal of Process Control, 17(3), 203–219. </w:t>
       </w:r>
-      <w:hyperlink r:id="rId24" w:history="1">
+      <w:hyperlink r:id="rId28" w:history="1">
         <w:r>
           <w:rPr>
             <w:rStyle w:val="Hyperlink"/>
@@ -4146,7 +5583,7 @@
       <w:r>
         <w:t xml:space="preserve">. </w:t>
       </w:r>
-      <w:hyperlink r:id="rId25" w:tgtFrame="_blank" w:history="1">
+      <w:hyperlink r:id="rId29" w:tgtFrame="_blank" w:history="1">
         <w:r>
           <w:rPr>
             <w:rStyle w:val="Hyperlink"/>
@@ -4203,7 +5640,7 @@
         </w:rPr>
         <w:t xml:space="preserve">(21), 5275. </w:t>
       </w:r>
-      <w:hyperlink r:id="rId26" w:tgtFrame="_blank" w:history="1">
+      <w:hyperlink r:id="rId30" w:tgtFrame="_blank" w:history="1">
         <w:r>
           <w:rPr>
             <w:rStyle w:val="Hyperlink"/>
@@ -4217,21 +5654,6 @@
     <w:p>
       <w:pPr>
         <w:spacing w:before="200" w:after="40" w:line="240" w:lineRule="auto"/>
-        <w:ind w:left="300" w:hanging="300"/>
-        <w:rPr>
-          <w:rFonts w:eastAsia="Linux Libertine" w:cstheme="majorBidi"/>
-        </w:rPr>
-      </w:pPr>
-      <w:r>
-        <w:rPr>
-          <w:rFonts w:eastAsia="Linux Libertine" w:cstheme="majorBidi"/>
-        </w:rPr>
-        <w:t>Gupta, A., &amp; Kumar, S. (2025). Lagrangian-constrained reinforcement learning for safety-critical distillation operations. Journal of Process Control, 142, 103–118. https://doi.org/10.1016/j.jprocont.2025.01.004</w:t>
-      </w:r>
-    </w:p>
-    <w:p>
-      <w:pPr>
-        <w:spacing w:before="200" w:after="40" w:line="240" w:lineRule="auto"/>
         <w:ind w:left="426" w:hanging="426"/>
         <w:jc w:val="left"/>
         <w:rPr>
@@ -4244,7 +5666,7 @@
         </w:rPr>
         <w:t xml:space="preserve">Hubbs, C. P., Li, C., Sahinidis, N. V., Grossmann, I. E., &amp; John, J. M. (2020). A deep reinforcement learning approach for chemical production scheduling. Computers &amp; Chemical Engineering, 141, 106982. </w:t>
       </w:r>
-      <w:hyperlink r:id="rId27" w:history="1">
+      <w:hyperlink r:id="rId31" w:history="1">
         <w:r>
           <w:rPr>
             <w:rStyle w:val="Hyperlink"/>
@@ -4260,31 +5682,17 @@
         <w:ind w:left="300" w:hanging="300"/>
         <w:rPr>
           <w:rFonts w:eastAsia="Linux Libertine" w:cstheme="majorBidi"/>
-        </w:rPr>
-      </w:pPr>
-      <w:r>
-        <w:rPr>
-          <w:rFonts w:eastAsia="Linux Libertine" w:cstheme="majorBidi"/>
-        </w:rPr>
-        <w:t>Lee, K., Choi, D., &amp; Park, M. (2025). Explainable AI for petroleum refining: Utilizing SHAP values for autonomous distillation column control. AI in Chemical Engineering, 6(1), 45–62.</w:t>
-      </w:r>
-    </w:p>
-    <w:p>
-      <w:pPr>
-        <w:spacing w:before="200" w:after="40" w:line="240" w:lineRule="auto"/>
-        <w:ind w:left="300" w:hanging="300"/>
+          <w:lang w:val="en-IN"/>
+        </w:rPr>
+      </w:pPr>
+      <w:r>
         <w:rPr>
           <w:rFonts w:eastAsia="Linux Libertine" w:cstheme="majorBidi"/>
           <w:lang w:val="en-IN"/>
         </w:rPr>
-      </w:pPr>
-      <w:r>
-        <w:rPr>
-          <w:rFonts w:eastAsia="Linux Libertine" w:cstheme="majorBidi"/>
-          <w:lang w:val="en-IN"/>
-        </w:rPr>
         <w:t xml:space="preserve">Li, Z., Lin, R., Su, H., &amp; Xie, L. (2025). Reinforcement learning-driven plant-wide refinery planning using model decomposition. </w:t>
       </w:r>
+      <w:proofErr w:type="spellStart"/>
       <w:r>
         <w:rPr>
           <w:rFonts w:eastAsia="Linux Libertine" w:cstheme="majorBidi"/>
@@ -4294,6 +5702,7 @@
         </w:rPr>
         <w:t>arXiv</w:t>
       </w:r>
+      <w:proofErr w:type="spellEnd"/>
       <w:r>
         <w:rPr>
           <w:rFonts w:eastAsia="Linux Libertine" w:cstheme="majorBidi"/>
@@ -4301,7 +5710,7 @@
         </w:rPr>
         <w:t xml:space="preserve">. </w:t>
       </w:r>
-      <w:hyperlink r:id="rId28" w:tgtFrame="_blank" w:history="1">
+      <w:hyperlink r:id="rId32" w:tgtFrame="_blank" w:history="1">
         <w:r>
           <w:rPr>
             <w:rStyle w:val="Hyperlink"/>
@@ -4339,7 +5748,14 @@
         <w:rPr>
           <w:rFonts w:eastAsia="Linux Libertine" w:cstheme="majorBidi"/>
         </w:rPr>
-        <w:t>Qin, S. J., &amp; Badgwell, T. A. (2003). A survey of industrial model predictive control technology. Control Engineering Practice, 11(7), 733–764. https://doi.org/10.1016/S0967-0661(02)00186-7</w:t>
+        <w:t xml:space="preserve">Qin, S. J., &amp; Badgwell, T. A. (2003). A survey of industrial model predictive control technology. </w:t>
+      </w:r>
+      <w:r>
+        <w:rPr>
+          <w:rFonts w:eastAsia="Linux Libertine" w:cstheme="majorBidi"/>
+        </w:rPr>
+        <w:lastRenderedPageBreak/>
+        <w:t>Control Engineering Practice, 11(7), 733–764. https://doi.org/10.1016/S0967-0661(02)00186-7</w:t>
       </w:r>
       <w:r>
         <w:rPr>
@@ -4360,7 +5776,21 @@
         <w:rPr>
           <w:rFonts w:eastAsia="Linux Libertine" w:cstheme="majorBidi"/>
         </w:rPr>
-        <w:t>Schulman, J., Wolski, F., Dhariwal, P., Radford, A., &amp; Klimov, O. (2017). Proximal policy optimization algorithms. arXiv. https://doi.org/10.48550/arXiv.1707.06347</w:t>
+        <w:t xml:space="preserve">Schulman, J., Wolski, F., Dhariwal, P., Radford, A., &amp; Klimov, O. (2017). Proximal policy optimization algorithms. </w:t>
+      </w:r>
+      <w:proofErr w:type="spellStart"/>
+      <w:r>
+        <w:rPr>
+          <w:rFonts w:eastAsia="Linux Libertine" w:cstheme="majorBidi"/>
+        </w:rPr>
+        <w:t>arXiv</w:t>
+      </w:r>
+      <w:proofErr w:type="spellEnd"/>
+      <w:r>
+        <w:rPr>
+          <w:rFonts w:eastAsia="Linux Libertine" w:cstheme="majorBidi"/>
+        </w:rPr>
+        <w:t>. https://doi.org/10.48550/arXiv.1707.06347</w:t>
       </w:r>
     </w:p>
     <w:p>
@@ -4390,7 +5820,21 @@
         <w:rPr>
           <w:rFonts w:eastAsia="Linux Libertine" w:cstheme="majorBidi"/>
         </w:rPr>
-        <w:t>Spielberg, S., Cao, Y., &amp; Gopaluni, B. (2019). Deep reinforcement learning for process control: A review for control engineers. Control Engineering Practice, 89, 212–222. https://doi.org/10.1016/j.conengprac.2019.05.017</w:t>
+        <w:t xml:space="preserve">Spielberg, S., Cao, Y., &amp; </w:t>
+      </w:r>
+      <w:proofErr w:type="spellStart"/>
+      <w:r>
+        <w:rPr>
+          <w:rFonts w:eastAsia="Linux Libertine" w:cstheme="majorBidi"/>
+        </w:rPr>
+        <w:t>Gopaluni</w:t>
+      </w:r>
+      <w:proofErr w:type="spellEnd"/>
+      <w:r>
+        <w:rPr>
+          <w:rFonts w:eastAsia="Linux Libertine" w:cstheme="majorBidi"/>
+        </w:rPr>
+        <w:t>, B. (2019). Deep reinforcement learning for process control: A review for control engineers. Control Engineering Practice, 89, 212–222. https://doi.org/10.1016/j.conengprac.2019.05.017</w:t>
       </w:r>
       <w:r>
         <w:rPr>
@@ -4411,7 +5855,21 @@
         <w:rPr>
           <w:rFonts w:eastAsia="Linux Libertine" w:cstheme="majorBidi"/>
         </w:rPr>
-        <w:t>Spielberg, S., Tulsyan, A., Lawrence, N. P., Loewen, P. D., &amp; Bhushan Gopaluni, R. (2019). Toward deep reinforcement learning for process control: A review. Computers &amp; Chemical Engineering, 132, 106602.</w:t>
+        <w:t xml:space="preserve">Spielberg, S., </w:t>
+      </w:r>
+      <w:proofErr w:type="spellStart"/>
+      <w:r>
+        <w:rPr>
+          <w:rFonts w:eastAsia="Linux Libertine" w:cstheme="majorBidi"/>
+        </w:rPr>
+        <w:t>Tulsyan</w:t>
+      </w:r>
+      <w:proofErr w:type="spellEnd"/>
+      <w:r>
+        <w:rPr>
+          <w:rFonts w:eastAsia="Linux Libertine" w:cstheme="majorBidi"/>
+        </w:rPr>
+        <w:t>, A., Lawrence, N. P., Loewen, P. D., &amp; Bhushan Gopaluni, R. (2019). Toward deep reinforcement learning for process control: A review. Computers &amp; Chemical Engineering, 132, 106602.</w:t>
       </w:r>
     </w:p>
     <w:p>
@@ -4428,7 +5886,23 @@
           <w:rFonts w:eastAsia="Linux Libertine" w:cstheme="majorBidi"/>
           <w:lang w:val="en-IN"/>
         </w:rPr>
-        <w:t xml:space="preserve">Spielberg, S., Tulsyan, A., Lawrence, N. P., Loewen, P. D., &amp; Bhushan, G. (2019). Toward self-driving processes: A deep reinforcement learning approach to control. </w:t>
+        <w:t xml:space="preserve">Spielberg, S., </w:t>
+      </w:r>
+      <w:proofErr w:type="spellStart"/>
+      <w:r>
+        <w:rPr>
+          <w:rFonts w:eastAsia="Linux Libertine" w:cstheme="majorBidi"/>
+          <w:lang w:val="en-IN"/>
+        </w:rPr>
+        <w:t>Tulsyan</w:t>
+      </w:r>
+      <w:proofErr w:type="spellEnd"/>
+      <w:r>
+        <w:rPr>
+          <w:rFonts w:eastAsia="Linux Libertine" w:cstheme="majorBidi"/>
+          <w:lang w:val="en-IN"/>
+        </w:rPr>
+        <w:t xml:space="preserve">, A., Lawrence, N. P., Loewen, P. D., &amp; Bhushan, G. (2019). Toward self-driving processes: A deep reinforcement learning approach to control. </w:t>
       </w:r>
       <w:r>
         <w:rPr>
@@ -4462,7 +5936,7 @@
         </w:rPr>
         <w:t xml:space="preserve">(10), e16733. </w:t>
       </w:r>
-      <w:hyperlink r:id="rId29" w:tgtFrame="_blank" w:history="1">
+      <w:hyperlink r:id="rId33" w:tgtFrame="_blank" w:history="1">
         <w:r>
           <w:rPr>
             <w:rStyle w:val="Hyperlink"/>
@@ -4487,11 +5961,89 @@
           <w:rFonts w:eastAsia="Linux Libertine" w:cstheme="majorBidi"/>
         </w:rPr>
       </w:pPr>
+      <w:proofErr w:type="spellStart"/>
       <w:r>
         <w:rPr>
           <w:rFonts w:eastAsia="Linux Libertine" w:cstheme="majorBidi"/>
         </w:rPr>
-        <w:t>Venkatasubramanian, V. (2019). The promise of artificial intelligence in chemical engineering: Is it here, finally?. AIChE Journal, 65(2), 466-478.</w:t>
+        <w:t>Stooke</w:t>
+      </w:r>
+      <w:proofErr w:type="spellEnd"/>
+      <w:r>
+        <w:rPr>
+          <w:rFonts w:eastAsia="Linux Libertine" w:cstheme="majorBidi"/>
+        </w:rPr>
+        <w:t xml:space="preserve">, A., Achiam, J., &amp; </w:t>
+      </w:r>
+      <w:proofErr w:type="spellStart"/>
+      <w:r>
+        <w:rPr>
+          <w:rFonts w:eastAsia="Linux Libertine" w:cstheme="majorBidi"/>
+        </w:rPr>
+        <w:t>Abbeel</w:t>
+      </w:r>
+      <w:proofErr w:type="spellEnd"/>
+      <w:r>
+        <w:rPr>
+          <w:rFonts w:eastAsia="Linux Libertine" w:cstheme="majorBidi"/>
+        </w:rPr>
+        <w:t xml:space="preserve">, P. (2020). Responsive safety in reinforcement learning by PID </w:t>
+      </w:r>
+      <w:proofErr w:type="spellStart"/>
+      <w:r>
+        <w:rPr>
+          <w:rFonts w:eastAsia="Linux Libertine" w:cstheme="majorBidi"/>
+        </w:rPr>
+        <w:t>Lagrangian</w:t>
+      </w:r>
+      <w:proofErr w:type="spellEnd"/>
+      <w:r>
+        <w:rPr>
+          <w:rFonts w:eastAsia="Linux Libertine" w:cstheme="majorBidi"/>
+        </w:rPr>
+        <w:t xml:space="preserve"> methods. Proceedings of the 37</w:t>
+      </w:r>
+      <w:r>
+        <w:rPr>
+          <w:rFonts w:eastAsia="Linux Libertine" w:cstheme="majorBidi"/>
+          <w:vertAlign w:val="superscript"/>
+        </w:rPr>
+        <w:t>th</w:t>
+      </w:r>
+      <w:r>
+        <w:rPr>
+          <w:rFonts w:eastAsia="Linux Libertine" w:cstheme="majorBidi"/>
+        </w:rPr>
+        <w:t xml:space="preserve"> International Conference on Machine Learning (ICML).</w:t>
+      </w:r>
+    </w:p>
+    <w:p>
+      <w:pPr>
+        <w:spacing w:before="200" w:after="40" w:line="240" w:lineRule="auto"/>
+        <w:ind w:left="300" w:hanging="300"/>
+        <w:rPr>
+          <w:rFonts w:eastAsia="Linux Libertine" w:cstheme="majorBidi"/>
+        </w:rPr>
+      </w:pPr>
+      <w:r>
+        <w:rPr>
+          <w:rFonts w:eastAsia="Linux Libertine" w:cstheme="majorBidi"/>
+        </w:rPr>
+        <w:t xml:space="preserve">Venkatasubramanian, V. (2019). The promise of artificial intelligence in chemical engineering: Is it here, </w:t>
+      </w:r>
+      <w:proofErr w:type="gramStart"/>
+      <w:r>
+        <w:rPr>
+          <w:rFonts w:eastAsia="Linux Libertine" w:cstheme="majorBidi"/>
+        </w:rPr>
+        <w:t>finally?.</w:t>
+      </w:r>
+      <w:proofErr w:type="gramEnd"/>
+      <w:r>
+        <w:rPr>
+          <w:rFonts w:eastAsia="Linux Libertine" w:cstheme="majorBidi"/>
+        </w:rPr>
+        <w:t xml:space="preserve"> AIChE Journal, 65(2), 466-478.</w:t>
       </w:r>
     </w:p>
     <w:p>
@@ -4517,7 +6069,14 @@
           <w:iCs/>
           <w:lang w:val="en-IN"/>
         </w:rPr>
-        <w:t xml:space="preserve">Communications </w:t>
+        <w:t>Communications Chemistry</w:t>
+      </w:r>
+      <w:r>
+        <w:rPr>
+          <w:rFonts w:eastAsia="Linux Libertine" w:cstheme="majorBidi"/>
+          <w:lang w:val="en-IN"/>
+        </w:rPr>
+        <w:t xml:space="preserve">, </w:t>
       </w:r>
       <w:r>
         <w:rPr>
@@ -4526,33 +6085,16 @@
           <w:iCs/>
           <w:lang w:val="en-IN"/>
         </w:rPr>
-        <w:lastRenderedPageBreak/>
-        <w:t>Chemistry</w:t>
+        <w:t>8</w:t>
       </w:r>
       <w:r>
         <w:rPr>
           <w:rFonts w:eastAsia="Linux Libertine" w:cstheme="majorBidi"/>
           <w:lang w:val="en-IN"/>
         </w:rPr>
-        <w:t xml:space="preserve">, </w:t>
-      </w:r>
-      <w:r>
-        <w:rPr>
-          <w:rFonts w:eastAsia="Linux Libertine" w:cstheme="majorBidi"/>
-          <w:i/>
-          <w:iCs/>
-          <w:lang w:val="en-IN"/>
-        </w:rPr>
-        <w:t>8</w:t>
-      </w:r>
-      <w:r>
-        <w:rPr>
-          <w:rFonts w:eastAsia="Linux Libertine" w:cstheme="majorBidi"/>
-          <w:lang w:val="en-IN"/>
-        </w:rPr>
         <w:t xml:space="preserve">, Article 11733140. </w:t>
       </w:r>
-      <w:hyperlink r:id="rId30" w:tgtFrame="_blank" w:history="1">
+      <w:hyperlink r:id="rId34" w:tgtFrame="_blank" w:history="1">
         <w:r>
           <w:rPr>
             <w:rStyle w:val="Hyperlink"/>
@@ -4569,14 +6111,9 @@
         <w:ind w:left="300" w:hanging="300"/>
         <w:rPr>
           <w:rFonts w:eastAsia="Linux Libertine" w:cstheme="majorBidi"/>
-        </w:rPr>
-      </w:pPr>
-      <w:r>
-        <w:rPr>
-          <w:rFonts w:eastAsia="Linux Libertine" w:cstheme="majorBidi"/>
-        </w:rPr>
-        <w:t>Zhang, Y., &amp; Petrova, I. (2025). Digital twin-driven autonomous plant operations: Real-time optimization of atmospheric distillation units using deep policy gradients. Computers &amp; Chemical Engineering (Special Issue: AI in Energy), 184, 108–122.</w:t>
-      </w:r>
+          <w:lang w:val="en-IN"/>
+        </w:rPr>
+      </w:pPr>
     </w:p>
     <w:p>
       <w:pPr>
@@ -4584,26 +6121,16 @@
         <w:ind w:left="300" w:hanging="300"/>
         <w:rPr>
           <w:rFonts w:eastAsia="Linux Libertine" w:cstheme="majorBidi"/>
-          <w:lang w:val="en-IN"/>
         </w:rPr>
       </w:pPr>
     </w:p>
     <w:p>
       <w:pPr>
         <w:spacing w:before="200" w:after="40" w:line="240" w:lineRule="auto"/>
-        <w:ind w:left="300" w:hanging="300"/>
-        <w:rPr>
-          <w:rFonts w:eastAsia="Linux Libertine" w:cstheme="majorBidi"/>
-        </w:rPr>
-      </w:pPr>
-    </w:p>
-    <w:p>
-      <w:pPr>
-        <w:spacing w:before="200" w:after="40" w:line="240" w:lineRule="auto"/>
       </w:pPr>
     </w:p>
     <w:sectPr>
-      <w:footerReference w:type="even" r:id="rId31"/>
+      <w:footerReference w:type="even" r:id="rId35"/>
       <w:type w:val="continuous"/>
       <w:pgSz w:w="12240" w:h="15840"/>
       <w:pgMar w:top="1500" w:right="1080" w:bottom="1276" w:left="993" w:header="1080" w:footer="1080" w:gutter="0"/>
@@ -4843,7 +6370,27 @@
         <w:sz w:val="16"/>
         <w:szCs w:val="10"/>
       </w:rPr>
-      <w:t>Fig 1. (a). API Gravity, Density (at 15 oC) and Total Sulphur distribution in the selected crude assays</w:t>
+      <w:t xml:space="preserve">Fig 1. (a). API Gravity, Density (at 15 </w:t>
+    </w:r>
+    <w:proofErr w:type="spellStart"/>
+    <w:r>
+      <w:rPr>
+        <w:rFonts w:ascii="Linux Biolinum" w:eastAsia="Linux Biolinum" w:hAnsi="Linux Biolinum" w:cs="Linux Biolinum"/>
+        <w:color w:val="000000"/>
+        <w:sz w:val="16"/>
+        <w:szCs w:val="10"/>
+      </w:rPr>
+      <w:t>oC</w:t>
+    </w:r>
+    <w:proofErr w:type="spellEnd"/>
+    <w:r>
+      <w:rPr>
+        <w:rFonts w:ascii="Linux Biolinum" w:eastAsia="Linux Biolinum" w:hAnsi="Linux Biolinum" w:cs="Linux Biolinum"/>
+        <w:color w:val="000000"/>
+        <w:sz w:val="16"/>
+        <w:szCs w:val="10"/>
+      </w:rPr>
+      <w:t>) and Total Sulphur distribution in the selected crude assays</w:t>
     </w:r>
   </w:p>
   <w:p>
@@ -4891,7 +6438,27 @@
         <w:sz w:val="16"/>
         <w:szCs w:val="10"/>
       </w:rPr>
-      <w:t xml:space="preserve">Fig 1. (c) Crude-wise yield distribution (wt%) </w:t>
+      <w:t>Fig 1. (c) Crude-wise yield distribution (</w:t>
+    </w:r>
+    <w:proofErr w:type="spellStart"/>
+    <w:r>
+      <w:rPr>
+        <w:rFonts w:ascii="Linux Biolinum" w:eastAsia="Linux Biolinum" w:hAnsi="Linux Biolinum" w:cs="Linux Biolinum"/>
+        <w:color w:val="000000"/>
+        <w:sz w:val="16"/>
+        <w:szCs w:val="10"/>
+      </w:rPr>
+      <w:t>wt</w:t>
+    </w:r>
+    <w:proofErr w:type="spellEnd"/>
+    <w:r>
+      <w:rPr>
+        <w:rFonts w:ascii="Linux Biolinum" w:eastAsia="Linux Biolinum" w:hAnsi="Linux Biolinum" w:cs="Linux Biolinum"/>
+        <w:color w:val="000000"/>
+        <w:sz w:val="16"/>
+        <w:szCs w:val="10"/>
+      </w:rPr>
+      <w:t xml:space="preserve">%) </w:t>
     </w:r>
   </w:p>
   <w:p>
@@ -5495,6 +7062,119 @@
     </w:lvl>
   </w:abstractNum>
   <w:abstractNum w:abstractNumId="3" w15:restartNumberingAfterBreak="0">
+    <w:nsid w:val="28EA4DFA"/>
+    <w:multiLevelType w:val="multilevel"/>
+    <w:tmpl w:val="A330187C"/>
+    <w:lvl w:ilvl="0">
+      <w:start w:val="4"/>
+      <w:numFmt w:val="decimal"/>
+      <w:lvlText w:val="%1."/>
+      <w:lvlJc w:val="left"/>
+      <w:pPr>
+        <w:ind w:left="360" w:hanging="360"/>
+      </w:pPr>
+      <w:rPr>
+        <w:rFonts w:hint="default"/>
+      </w:rPr>
+    </w:lvl>
+    <w:lvl w:ilvl="1">
+      <w:start w:val="1"/>
+      <w:numFmt w:val="decimal"/>
+      <w:lvlText w:val="%1.%2."/>
+      <w:lvlJc w:val="left"/>
+      <w:pPr>
+        <w:ind w:left="792" w:hanging="432"/>
+      </w:pPr>
+      <w:rPr>
+        <w:rFonts w:hint="default"/>
+      </w:rPr>
+    </w:lvl>
+    <w:lvl w:ilvl="2">
+      <w:start w:val="1"/>
+      <w:numFmt w:val="decimal"/>
+      <w:lvlText w:val="%1.%2.%3."/>
+      <w:lvlJc w:val="left"/>
+      <w:pPr>
+        <w:ind w:left="1224" w:hanging="504"/>
+      </w:pPr>
+      <w:rPr>
+        <w:rFonts w:hint="default"/>
+      </w:rPr>
+    </w:lvl>
+    <w:lvl w:ilvl="3">
+      <w:start w:val="1"/>
+      <w:numFmt w:val="decimal"/>
+      <w:lvlText w:val="%1.%2.%3.%4."/>
+      <w:lvlJc w:val="left"/>
+      <w:pPr>
+        <w:ind w:left="1728" w:hanging="648"/>
+      </w:pPr>
+      <w:rPr>
+        <w:rFonts w:hint="default"/>
+      </w:rPr>
+    </w:lvl>
+    <w:lvl w:ilvl="4">
+      <w:start w:val="1"/>
+      <w:numFmt w:val="decimal"/>
+      <w:lvlText w:val="%1.%2.%3.%4.%5."/>
+      <w:lvlJc w:val="left"/>
+      <w:pPr>
+        <w:ind w:left="2232" w:hanging="792"/>
+      </w:pPr>
+      <w:rPr>
+        <w:rFonts w:hint="default"/>
+      </w:rPr>
+    </w:lvl>
+    <w:lvl w:ilvl="5">
+      <w:start w:val="1"/>
+      <w:numFmt w:val="decimal"/>
+      <w:lvlText w:val="%1.%2.%3.%4.%5.%6."/>
+      <w:lvlJc w:val="left"/>
+      <w:pPr>
+        <w:ind w:left="2736" w:hanging="936"/>
+      </w:pPr>
+      <w:rPr>
+        <w:rFonts w:hint="default"/>
+      </w:rPr>
+    </w:lvl>
+    <w:lvl w:ilvl="6">
+      <w:start w:val="1"/>
+      <w:numFmt w:val="decimal"/>
+      <w:lvlText w:val="%1.%2.%3.%4.%5.%6.%7."/>
+      <w:lvlJc w:val="left"/>
+      <w:pPr>
+        <w:ind w:left="3240" w:hanging="1080"/>
+      </w:pPr>
+      <w:rPr>
+        <w:rFonts w:hint="default"/>
+      </w:rPr>
+    </w:lvl>
+    <w:lvl w:ilvl="7">
+      <w:start w:val="1"/>
+      <w:numFmt w:val="decimal"/>
+      <w:lvlText w:val="%1.%2.%3.%4.%5.%6.%7.%8."/>
+      <w:lvlJc w:val="left"/>
+      <w:pPr>
+        <w:ind w:left="3744" w:hanging="1224"/>
+      </w:pPr>
+      <w:rPr>
+        <w:rFonts w:hint="default"/>
+      </w:rPr>
+    </w:lvl>
+    <w:lvl w:ilvl="8">
+      <w:start w:val="1"/>
+      <w:numFmt w:val="decimal"/>
+      <w:lvlText w:val="%1.%2.%3.%4.%5.%6.%7.%8.%9."/>
+      <w:lvlJc w:val="left"/>
+      <w:pPr>
+        <w:ind w:left="4320" w:hanging="1440"/>
+      </w:pPr>
+      <w:rPr>
+        <w:rFonts w:hint="default"/>
+      </w:rPr>
+    </w:lvl>
+  </w:abstractNum>
+  <w:abstractNum w:abstractNumId="4" w15:restartNumberingAfterBreak="0">
     <w:nsid w:val="2A054F6E"/>
     <w:multiLevelType w:val="multilevel"/>
     <w:tmpl w:val="C7766D22"/>
@@ -5634,7 +7314,7 @@
       </w:rPr>
     </w:lvl>
   </w:abstractNum>
-  <w:abstractNum w:abstractNumId="4" w15:restartNumberingAfterBreak="0">
+  <w:abstractNum w:abstractNumId="5" w15:restartNumberingAfterBreak="0">
     <w:nsid w:val="317E61BF"/>
     <w:multiLevelType w:val="multilevel"/>
     <w:tmpl w:val="45F656FC"/>
@@ -5774,7 +7454,7 @@
       </w:rPr>
     </w:lvl>
   </w:abstractNum>
-  <w:abstractNum w:abstractNumId="5" w15:restartNumberingAfterBreak="0">
+  <w:abstractNum w:abstractNumId="6" w15:restartNumberingAfterBreak="0">
     <w:nsid w:val="33451854"/>
     <w:multiLevelType w:val="multilevel"/>
     <w:tmpl w:val="02D8985C"/>
@@ -5887,7 +7567,7 @@
       </w:rPr>
     </w:lvl>
   </w:abstractNum>
-  <w:abstractNum w:abstractNumId="6" w15:restartNumberingAfterBreak="0">
+  <w:abstractNum w:abstractNumId="7" w15:restartNumberingAfterBreak="0">
     <w:nsid w:val="367A3416"/>
     <w:multiLevelType w:val="multilevel"/>
     <w:tmpl w:val="4009001F"/>
@@ -5973,7 +7653,7 @@
       </w:pPr>
     </w:lvl>
   </w:abstractNum>
-  <w:abstractNum w:abstractNumId="7" w15:restartNumberingAfterBreak="0">
+  <w:abstractNum w:abstractNumId="8" w15:restartNumberingAfterBreak="0">
     <w:nsid w:val="3CE44867"/>
     <w:multiLevelType w:val="multilevel"/>
     <w:tmpl w:val="95AA067E"/>
@@ -6122,7 +7802,7 @@
       </w:rPr>
     </w:lvl>
   </w:abstractNum>
-  <w:abstractNum w:abstractNumId="8" w15:restartNumberingAfterBreak="0">
+  <w:abstractNum w:abstractNumId="9" w15:restartNumberingAfterBreak="0">
     <w:nsid w:val="495F74BD"/>
     <w:multiLevelType w:val="multilevel"/>
     <w:tmpl w:val="9F94911A"/>
@@ -6262,7 +7942,7 @@
       </w:rPr>
     </w:lvl>
   </w:abstractNum>
-  <w:abstractNum w:abstractNumId="9" w15:restartNumberingAfterBreak="0">
+  <w:abstractNum w:abstractNumId="10" w15:restartNumberingAfterBreak="0">
     <w:nsid w:val="4EDB6C5E"/>
     <w:multiLevelType w:val="multilevel"/>
     <w:tmpl w:val="5B6EFD4A"/>
@@ -6402,7 +8082,7 @@
       </w:rPr>
     </w:lvl>
   </w:abstractNum>
-  <w:abstractNum w:abstractNumId="10" w15:restartNumberingAfterBreak="0">
+  <w:abstractNum w:abstractNumId="11" w15:restartNumberingAfterBreak="0">
     <w:nsid w:val="5789585D"/>
     <w:multiLevelType w:val="multilevel"/>
     <w:tmpl w:val="4009001F"/>
@@ -6488,7 +8168,7 @@
       </w:pPr>
     </w:lvl>
   </w:abstractNum>
-  <w:abstractNum w:abstractNumId="11" w15:restartNumberingAfterBreak="0">
+  <w:abstractNum w:abstractNumId="12" w15:restartNumberingAfterBreak="0">
     <w:nsid w:val="61B06065"/>
     <w:multiLevelType w:val="multilevel"/>
     <w:tmpl w:val="B9EC2E54"/>
@@ -6628,7 +8308,93 @@
       </w:rPr>
     </w:lvl>
   </w:abstractNum>
-  <w:abstractNum w:abstractNumId="12" w15:restartNumberingAfterBreak="0">
+  <w:abstractNum w:abstractNumId="13" w15:restartNumberingAfterBreak="0">
+    <w:nsid w:val="69E12466"/>
+    <w:multiLevelType w:val="multilevel"/>
+    <w:tmpl w:val="4009001F"/>
+    <w:lvl w:ilvl="0">
+      <w:start w:val="1"/>
+      <w:numFmt w:val="decimal"/>
+      <w:lvlText w:val="%1."/>
+      <w:lvlJc w:val="left"/>
+      <w:pPr>
+        <w:ind w:left="360" w:hanging="360"/>
+      </w:pPr>
+    </w:lvl>
+    <w:lvl w:ilvl="1">
+      <w:start w:val="1"/>
+      <w:numFmt w:val="decimal"/>
+      <w:lvlText w:val="%1.%2."/>
+      <w:lvlJc w:val="left"/>
+      <w:pPr>
+        <w:ind w:left="792" w:hanging="432"/>
+      </w:pPr>
+    </w:lvl>
+    <w:lvl w:ilvl="2">
+      <w:start w:val="1"/>
+      <w:numFmt w:val="decimal"/>
+      <w:lvlText w:val="%1.%2.%3."/>
+      <w:lvlJc w:val="left"/>
+      <w:pPr>
+        <w:ind w:left="1224" w:hanging="504"/>
+      </w:pPr>
+    </w:lvl>
+    <w:lvl w:ilvl="3">
+      <w:start w:val="1"/>
+      <w:numFmt w:val="decimal"/>
+      <w:lvlText w:val="%1.%2.%3.%4."/>
+      <w:lvlJc w:val="left"/>
+      <w:pPr>
+        <w:ind w:left="1728" w:hanging="648"/>
+      </w:pPr>
+    </w:lvl>
+    <w:lvl w:ilvl="4">
+      <w:start w:val="1"/>
+      <w:numFmt w:val="decimal"/>
+      <w:lvlText w:val="%1.%2.%3.%4.%5."/>
+      <w:lvlJc w:val="left"/>
+      <w:pPr>
+        <w:ind w:left="2232" w:hanging="792"/>
+      </w:pPr>
+    </w:lvl>
+    <w:lvl w:ilvl="5">
+      <w:start w:val="1"/>
+      <w:numFmt w:val="decimal"/>
+      <w:lvlText w:val="%1.%2.%3.%4.%5.%6."/>
+      <w:lvlJc w:val="left"/>
+      <w:pPr>
+        <w:ind w:left="2736" w:hanging="936"/>
+      </w:pPr>
+    </w:lvl>
+    <w:lvl w:ilvl="6">
+      <w:start w:val="1"/>
+      <w:numFmt w:val="decimal"/>
+      <w:lvlText w:val="%1.%2.%3.%4.%5.%6.%7."/>
+      <w:lvlJc w:val="left"/>
+      <w:pPr>
+        <w:ind w:left="3240" w:hanging="1080"/>
+      </w:pPr>
+    </w:lvl>
+    <w:lvl w:ilvl="7">
+      <w:start w:val="1"/>
+      <w:numFmt w:val="decimal"/>
+      <w:lvlText w:val="%1.%2.%3.%4.%5.%6.%7.%8."/>
+      <w:lvlJc w:val="left"/>
+      <w:pPr>
+        <w:ind w:left="3744" w:hanging="1224"/>
+      </w:pPr>
+    </w:lvl>
+    <w:lvl w:ilvl="8">
+      <w:start w:val="1"/>
+      <w:numFmt w:val="decimal"/>
+      <w:lvlText w:val="%1.%2.%3.%4.%5.%6.%7.%8.%9."/>
+      <w:lvlJc w:val="left"/>
+      <w:pPr>
+        <w:ind w:left="4320" w:hanging="1440"/>
+      </w:pPr>
+    </w:lvl>
+  </w:abstractNum>
+  <w:abstractNum w:abstractNumId="14" w15:restartNumberingAfterBreak="0">
     <w:nsid w:val="79952714"/>
     <w:multiLevelType w:val="multilevel"/>
     <w:tmpl w:val="C5C21DA6"/>
@@ -6775,37 +8541,43 @@
     <w:abstractNumId w:val="2"/>
   </w:num>
   <w:num w:numId="3" w16cid:durableId="1492942228">
-    <w:abstractNumId w:val="12"/>
+    <w:abstractNumId w:val="14"/>
   </w:num>
   <w:num w:numId="4" w16cid:durableId="517429286">
-    <w:abstractNumId w:val="3"/>
+    <w:abstractNumId w:val="4"/>
   </w:num>
   <w:num w:numId="5" w16cid:durableId="1718040607">
+    <w:abstractNumId w:val="10"/>
+  </w:num>
+  <w:num w:numId="6" w16cid:durableId="710611117">
     <w:abstractNumId w:val="9"/>
   </w:num>
-  <w:num w:numId="6" w16cid:durableId="710611117">
-    <w:abstractNumId w:val="8"/>
-  </w:num>
   <w:num w:numId="7" w16cid:durableId="1117138578">
-    <w:abstractNumId w:val="4"/>
+    <w:abstractNumId w:val="5"/>
   </w:num>
   <w:num w:numId="8" w16cid:durableId="1648709583">
-    <w:abstractNumId w:val="11"/>
+    <w:abstractNumId w:val="12"/>
   </w:num>
   <w:num w:numId="9" w16cid:durableId="1602377560">
     <w:abstractNumId w:val="0"/>
   </w:num>
   <w:num w:numId="10" w16cid:durableId="627131747">
+    <w:abstractNumId w:val="7"/>
+  </w:num>
+  <w:num w:numId="11" w16cid:durableId="1462915697">
     <w:abstractNumId w:val="6"/>
   </w:num>
-  <w:num w:numId="11" w16cid:durableId="1462915697">
-    <w:abstractNumId w:val="5"/>
-  </w:num>
   <w:num w:numId="12" w16cid:durableId="546837443">
-    <w:abstractNumId w:val="10"/>
+    <w:abstractNumId w:val="11"/>
   </w:num>
   <w:num w:numId="13" w16cid:durableId="665670202">
-    <w:abstractNumId w:val="7"/>
+    <w:abstractNumId w:val="8"/>
+  </w:num>
+  <w:num w:numId="14" w16cid:durableId="1192760907">
+    <w:abstractNumId w:val="13"/>
+  </w:num>
+  <w:num w:numId="15" w16cid:durableId="290132603">
+    <w:abstractNumId w:val="3"/>
   </w:num>
 </w:numbering>
 </file>
@@ -7427,7 +9199,6 @@
   <w:style w:type="character" w:default="1" w:styleId="DefaultParagraphFont">
     <w:name w:val="Default Paragraph Font"/>
     <w:uiPriority w:val="1"/>
-    <w:semiHidden/>
     <w:unhideWhenUsed/>
   </w:style>
   <w:style w:type="table" w:default="1" w:styleId="TableNormal">
@@ -13023,28 +14794,28 @@
 </file>
 
 <file path=customXml/item1.xml><?xml version="1.0" encoding="utf-8"?>
+<b:Sources xmlns:b="http://schemas.openxmlformats.org/officeDocument/2006/bibliography" xmlns="http://schemas.openxmlformats.org/officeDocument/2006/bibliography" SelectedStyle="\APASixthEditionOfficeOnline.xsl" StyleName="APA" Version="6"/>
+</file>
+
+<file path=customXml/item2.xml><?xml version="1.0" encoding="utf-8"?>
 <go:gDocsCustomXmlDataStorage xmlns:go="http://customooxmlschemas.google.com/" xmlns:r="http://schemas.openxmlformats.org/officeDocument/2006/relationships">
   <go:docsCustomData roundtripDataSignature="AMtx7mhGbw5ytn5wEH4ZlNP9gRCNMPdzfw==">AMUW2mU012QJVuiVMkD/gCCNj70OycHvaZTFzdyU4a+e9FbY8FknQA0AjjkChrXlhIFEjpvrliu1fU1vBgDfxxCXjhLy50R3pNfhxAJPw64y75cfTEgflDw=</go:docsCustomData>
 </go:gDocsCustomXmlDataStorage>
 </file>
 
-<file path=customXml/item2.xml><?xml version="1.0" encoding="utf-8"?>
-<b:Sources xmlns:b="http://schemas.openxmlformats.org/officeDocument/2006/bibliography" xmlns="http://schemas.openxmlformats.org/officeDocument/2006/bibliography" SelectedStyle="\APASixthEditionOfficeOnline.xsl" StyleName="APA" Version="6"/>
+<file path=customXml/itemProps1.xml><?xml version="1.0" encoding="utf-8"?>
+<ds:datastoreItem xmlns:ds="http://schemas.openxmlformats.org/officeDocument/2006/customXml" ds:itemID="{93FB7AA3-242F-46D3-838B-3F6C438EF122}">
+  <ds:schemaRefs>
+    <ds:schemaRef ds:uri="http://schemas.openxmlformats.org/officeDocument/2006/bibliography"/>
+  </ds:schemaRefs>
+</ds:datastoreItem>
 </file>
 
-<file path=customXml/itemProps1.xml><?xml version="1.0" encoding="utf-8"?>
+<file path=customXml/itemProps2.xml><?xml version="1.0" encoding="utf-8"?>
 <ds:datastoreItem xmlns:ds="http://schemas.openxmlformats.org/officeDocument/2006/customXml" ds:itemID="{11111111-1234-1234-1234-123412341234}">
   <ds:schemaRefs>
     <ds:schemaRef ds:uri="http://customooxmlschemas.google.com/"/>
     <ds:schemaRef ds:uri="http://schemas.openxmlformats.org/officeDocument/2006/relationships"/>
   </ds:schemaRefs>
 </ds:datastoreItem>
-</file>
-
-<file path=customXml/itemProps2.xml><?xml version="1.0" encoding="utf-8"?>
-<ds:datastoreItem xmlns:ds="http://schemas.openxmlformats.org/officeDocument/2006/customXml" ds:itemID="{93FB7AA3-242F-46D3-838B-3F6C438EF122}">
-  <ds:schemaRefs>
-    <ds:schemaRef ds:uri="http://schemas.openxmlformats.org/officeDocument/2006/bibliography"/>
-  </ds:schemaRefs>
-</ds:datastoreItem>
 </file>
</xml_diff>

<commit_message>
Report draft completed; Ai Agents notebook ran
</commit_message>
<xml_diff>
--- a/Report/AAI590 Capstone Project Report.docx
+++ b/Report/AAI590 Capstone Project Report.docx
@@ -22,7 +22,7 @@
           <w:sz w:val="36"/>
           <w:szCs w:val="36"/>
         </w:rPr>
-        <w:t>A Hybrid Deep Reinforcement Learning and LLM Framework for Real-Time Distillation</w:t>
+        <w:t xml:space="preserve">A Hybrid Deep Reinforcement Learning and </w:t>
       </w:r>
       <w:r>
         <w:rPr>
@@ -32,6 +32,26 @@
           <w:sz w:val="36"/>
           <w:szCs w:val="36"/>
         </w:rPr>
+        <w:t>Agentic</w:t>
+      </w:r>
+      <w:r>
+        <w:rPr>
+          <w:rFonts w:ascii="Times New Roman" w:hAnsi="Times New Roman" w:cstheme="majorBidi"/>
+          <w:b/>
+          <w:bCs/>
+          <w:sz w:val="36"/>
+          <w:szCs w:val="36"/>
+        </w:rPr>
+        <w:t xml:space="preserve"> Framework for Real-Time Distillation</w:t>
+      </w:r>
+      <w:r>
+        <w:rPr>
+          <w:rFonts w:ascii="Times New Roman" w:hAnsi="Times New Roman" w:cstheme="majorBidi"/>
+          <w:b/>
+          <w:bCs/>
+          <w:sz w:val="36"/>
+          <w:szCs w:val="36"/>
+        </w:rPr>
         <w:t xml:space="preserve"> Optimization</w:t>
       </w:r>
     </w:p>
@@ -46,7 +66,31 @@
           <w:sz w:val="28"/>
           <w:szCs w:val="28"/>
         </w:rPr>
-        <w:t>Integrating Rigorous DWSim Flowsheets with AI-Augmented Process Copilots</w:t>
+        <w:t xml:space="preserve">Integrating Rigorous DWSim Flowsheets with </w:t>
+      </w:r>
+      <w:r>
+        <w:rPr>
+          <w:rFonts w:asciiTheme="majorBidi" w:hAnsiTheme="majorBidi" w:cstheme="majorBidi"/>
+          <w:sz w:val="28"/>
+          <w:szCs w:val="28"/>
+        </w:rPr>
+        <w:t xml:space="preserve">Hybrid </w:t>
+      </w:r>
+      <w:r>
+        <w:rPr>
+          <w:rFonts w:asciiTheme="majorBidi" w:hAnsiTheme="majorBidi" w:cstheme="majorBidi"/>
+          <w:sz w:val="28"/>
+          <w:szCs w:val="28"/>
+        </w:rPr>
+        <w:t>D</w:t>
+      </w:r>
+      <w:r>
+        <w:rPr>
+          <w:rFonts w:asciiTheme="majorBidi" w:hAnsiTheme="majorBidi" w:cstheme="majorBidi"/>
+          <w:sz w:val="28"/>
+          <w:szCs w:val="28"/>
+        </w:rPr>
+        <w:t>RL &amp; Agentic framework</w:t>
       </w:r>
       <w:r>
         <w:rPr>
@@ -190,12 +234,208 @@
     </w:p>
     <w:p>
       <w:pPr>
+        <w:suppressAutoHyphens w:val="0"/>
+        <w:spacing w:before="100" w:beforeAutospacing="1" w:after="100" w:afterAutospacing="1" w:line="240" w:lineRule="auto"/>
         <w:rPr>
           <w:rFonts w:eastAsia="Times New Roman" w:cs="Times New Roman"/>
-        </w:rPr>
-      </w:pPr>
-      <w:r>
-        <w:t>The abstract should be the last piece of your report that you write and will be a 1-2 paragraph overview of your entire project. As a rough guide, you should expect to have 1-2 sentences introducing the problem and your chosen dataset, 3-4 sentences describing your chosen methods, and 1-2 sentences summarizing your project results.</w:t>
+          <w:color w:val="auto"/>
+          <w:lang w:val="en-IN" w:eastAsia="en-IN"/>
+        </w:rPr>
+      </w:pPr>
+      <w:r>
+        <w:rPr>
+          <w:rFonts w:eastAsia="Times New Roman" w:cs="Times New Roman"/>
+          <w:color w:val="auto"/>
+          <w:lang w:val="en-IN" w:eastAsia="en-IN"/>
+        </w:rPr>
+        <w:t xml:space="preserve">Distillation remains the most energy-intensive operation in petroleum refining, where the optimization of multi-unit sequences is frequently challenged by non-linear thermodynamics and a lack of interpretability in automated control strategies. This </w:t>
+      </w:r>
+      <w:r>
+        <w:rPr>
+          <w:rFonts w:eastAsia="Times New Roman" w:cs="Times New Roman"/>
+          <w:color w:val="auto"/>
+          <w:lang w:val="en-IN" w:eastAsia="en-IN"/>
+        </w:rPr>
+        <w:t>study</w:t>
+      </w:r>
+      <w:r>
+        <w:rPr>
+          <w:rFonts w:eastAsia="Times New Roman" w:cs="Times New Roman"/>
+          <w:color w:val="auto"/>
+          <w:lang w:val="en-IN" w:eastAsia="en-IN"/>
+        </w:rPr>
+        <w:t xml:space="preserve"> addresses the challenge of maximizing the economic margin between feedstock costs and product revenue—for an integrated distillation flowsheet comprising Atmospheric Distillation (ADU), Naphtha Stabilizer</w:t>
+      </w:r>
+      <w:r>
+        <w:rPr>
+          <w:rFonts w:eastAsia="Times New Roman" w:cs="Times New Roman"/>
+          <w:color w:val="auto"/>
+          <w:lang w:val="en-IN" w:eastAsia="en-IN"/>
+        </w:rPr>
+        <w:t xml:space="preserve"> </w:t>
+      </w:r>
+      <w:r>
+        <w:rPr>
+          <w:rFonts w:eastAsia="Times New Roman" w:cs="Times New Roman"/>
+          <w:color w:val="auto"/>
+          <w:lang w:val="en-IN" w:eastAsia="en-IN"/>
+        </w:rPr>
+        <w:t>(NSU), and Vacuum Distillation (VDU) units. To navigate the 16-dimensional continuous action space and 120-dimensional state vector, three Deep Reinforcement Learning (DRL) architectures</w:t>
+      </w:r>
+      <w:r>
+        <w:rPr>
+          <w:rFonts w:eastAsia="Times New Roman" w:cs="Times New Roman"/>
+          <w:color w:val="auto"/>
+          <w:lang w:val="en-IN" w:eastAsia="en-IN"/>
+        </w:rPr>
+        <w:t xml:space="preserve">, </w:t>
+      </w:r>
+      <w:r>
+        <w:rPr>
+          <w:rFonts w:eastAsia="Times New Roman" w:cs="Times New Roman"/>
+          <w:color w:val="auto"/>
+          <w:lang w:val="en-IN" w:eastAsia="en-IN"/>
+        </w:rPr>
+        <w:t>Proximal Policy Optimization (PPO), Soft Actor-Critic (SAC), and Twin Delayed Deep Deterministic Policy Gradient (TD3)</w:t>
+      </w:r>
+      <w:r>
+        <w:rPr>
+          <w:rFonts w:eastAsia="Times New Roman" w:cs="Times New Roman"/>
+          <w:color w:val="auto"/>
+          <w:lang w:val="en-IN" w:eastAsia="en-IN"/>
+        </w:rPr>
+        <w:t xml:space="preserve"> </w:t>
+      </w:r>
+      <w:r>
+        <w:rPr>
+          <w:rFonts w:eastAsia="Times New Roman" w:cs="Times New Roman"/>
+          <w:color w:val="auto"/>
+          <w:lang w:val="en-IN" w:eastAsia="en-IN"/>
+        </w:rPr>
+        <w:t xml:space="preserve">were benchmarked within a custom Gymnasium environment interfaced with the DWSIM chemical process simulator. This optimization layer was augmented by a cognitive multi-agent framework powered by </w:t>
+      </w:r>
+      <w:r>
+        <w:rPr>
+          <w:rFonts w:eastAsia="Times New Roman" w:cs="Times New Roman"/>
+          <w:color w:val="auto"/>
+          <w:lang w:val="en-IN" w:eastAsia="en-IN"/>
+        </w:rPr>
+        <w:t>NVIDIA Nemotron 3 Nano 30B A3B</w:t>
+      </w:r>
+      <w:r>
+        <w:rPr>
+          <w:rFonts w:eastAsia="Times New Roman" w:cs="Times New Roman"/>
+          <w:color w:val="auto"/>
+          <w:lang w:val="en-IN" w:eastAsia="en-IN"/>
+        </w:rPr>
+        <w:t xml:space="preserve">, which utilized specialized </w:t>
+      </w:r>
+      <w:r>
+        <w:rPr>
+          <w:rFonts w:eastAsia="Times New Roman" w:cs="Times New Roman"/>
+          <w:color w:val="auto"/>
+          <w:lang w:val="en-IN" w:eastAsia="en-IN"/>
+        </w:rPr>
+        <w:t>p</w:t>
+      </w:r>
+      <w:r>
+        <w:rPr>
+          <w:rFonts w:eastAsia="Times New Roman" w:cs="Times New Roman"/>
+          <w:color w:val="auto"/>
+          <w:lang w:val="en-IN" w:eastAsia="en-IN"/>
+        </w:rPr>
+        <w:t>ersonas to provide Explainable AI (XAI) narratives and safety-critical oversight of the RL-driven setpoint adjustments.</w:t>
+      </w:r>
+    </w:p>
+    <w:p>
+      <w:pPr>
+        <w:suppressAutoHyphens w:val="0"/>
+        <w:spacing w:before="100" w:beforeAutospacing="1" w:after="100" w:afterAutospacing="1" w:line="240" w:lineRule="auto"/>
+        <w:rPr>
+          <w:rFonts w:eastAsia="Times New Roman" w:cs="Times New Roman"/>
+          <w:color w:val="auto"/>
+          <w:lang w:val="en-IN" w:eastAsia="en-IN"/>
+        </w:rPr>
+      </w:pPr>
+      <w:r>
+        <w:rPr>
+          <w:rFonts w:eastAsia="Times New Roman" w:cs="Times New Roman"/>
+          <w:color w:val="auto"/>
+          <w:lang w:val="en-IN" w:eastAsia="en-IN"/>
+        </w:rPr>
+        <w:t xml:space="preserve">The experimental results indicated that PPO was the most effective architecture for this high-dimensional task, achieving a peak average reward of 22,592.33 while exhibiting the highest training stability and lowest computational latency. Inference trials confirmed that the trained agent successfully prioritized high-value fractions, such as Naphtha and </w:t>
+      </w:r>
+      <w:r>
+        <w:rPr>
+          <w:rFonts w:eastAsia="Times New Roman" w:cs="Times New Roman"/>
+          <w:color w:val="auto"/>
+          <w:lang w:val="en-IN" w:eastAsia="en-IN"/>
+        </w:rPr>
+        <w:t>Diesel</w:t>
+      </w:r>
+      <w:r>
+        <w:rPr>
+          <w:rFonts w:eastAsia="Times New Roman" w:cs="Times New Roman"/>
+          <w:color w:val="auto"/>
+          <w:lang w:val="en-IN" w:eastAsia="en-IN"/>
+        </w:rPr>
+        <w:t xml:space="preserve">, while reducing ASTM D95% quality specification violations by approximately 85% compared to initial training phases. Furthermore, the </w:t>
+      </w:r>
+      <w:r>
+        <w:rPr>
+          <w:rFonts w:eastAsia="Times New Roman" w:cs="Times New Roman"/>
+          <w:color w:val="auto"/>
+          <w:lang w:val="en-IN" w:eastAsia="en-IN"/>
+        </w:rPr>
+        <w:t>a</w:t>
+      </w:r>
+      <w:r>
+        <w:rPr>
+          <w:rFonts w:eastAsia="Times New Roman" w:cs="Times New Roman"/>
+          <w:color w:val="auto"/>
+          <w:lang w:val="en-IN" w:eastAsia="en-IN"/>
+        </w:rPr>
+        <w:t>gent</w:t>
+      </w:r>
+      <w:r>
+        <w:rPr>
+          <w:rFonts w:eastAsia="Times New Roman" w:cs="Times New Roman"/>
+          <w:color w:val="auto"/>
+          <w:lang w:val="en-IN" w:eastAsia="en-IN"/>
+        </w:rPr>
+        <w:t xml:space="preserve"> </w:t>
+      </w:r>
+      <w:r>
+        <w:rPr>
+          <w:rFonts w:eastAsia="Times New Roman" w:cs="Times New Roman"/>
+          <w:color w:val="auto"/>
+          <w:lang w:val="en-IN" w:eastAsia="en-IN"/>
+        </w:rPr>
+        <w:t>o</w:t>
+      </w:r>
+      <w:r>
+        <w:rPr>
+          <w:rFonts w:eastAsia="Times New Roman" w:cs="Times New Roman"/>
+          <w:color w:val="auto"/>
+          <w:lang w:val="en-IN" w:eastAsia="en-IN"/>
+        </w:rPr>
+        <w:t>rchestrator successfully bridged the industrial trust gap by translating numerical control actions into validated engineering rationales and identifying potential overhead corrosion risks that were invisible to the numerical RL agents. This research provides a scalable blueprint for Cognitive Process Control, demonstrating that the synergy of autonomous D</w:t>
+      </w:r>
+      <w:r>
+        <w:rPr>
+          <w:rFonts w:eastAsia="Times New Roman" w:cs="Times New Roman"/>
+          <w:color w:val="auto"/>
+          <w:lang w:val="en-IN" w:eastAsia="en-IN"/>
+        </w:rPr>
+        <w:t xml:space="preserve">eep </w:t>
+      </w:r>
+      <w:r>
+        <w:rPr>
+          <w:rFonts w:eastAsia="Times New Roman" w:cs="Times New Roman"/>
+          <w:color w:val="auto"/>
+          <w:lang w:val="en-IN" w:eastAsia="en-IN"/>
+        </w:rPr>
+        <w:t>RL optimization and LLM-based reasoning can significantly enhance both the profitability and safety of complex refinery operations.</w:t>
       </w:r>
     </w:p>
     <w:p>
@@ -216,36 +456,64 @@
         <w:spacing w:after="60"/>
         <w:rPr>
           <w:rFonts w:asciiTheme="majorBidi" w:eastAsia="Linux Libertine" w:hAnsiTheme="majorBidi" w:cstheme="majorBidi"/>
+          <w:i/>
+          <w:iCs/>
           <w:color w:val="000000"/>
         </w:rPr>
       </w:pPr>
       <w:r>
         <w:rPr>
           <w:rFonts w:eastAsia="Linux Libertine" w:cstheme="majorBidi"/>
-        </w:rPr>
-        <w:t>Deep Reinforcement Learning, Neural Networks, Deep Q-Networks,</w:t>
+          <w:i/>
+          <w:iCs/>
+        </w:rPr>
+        <w:t>Deep Reinforcement Learning, Deep Q-Networks,</w:t>
       </w:r>
       <w:r>
         <w:rPr>
           <w:rFonts w:eastAsia="Linux Libertine" w:cstheme="majorBidi"/>
+          <w:i/>
+          <w:iCs/>
         </w:rPr>
         <w:t xml:space="preserve"> Soft Actor Critic,</w:t>
       </w:r>
       <w:r>
         <w:rPr>
           <w:rFonts w:eastAsia="Linux Libertine" w:cstheme="majorBidi"/>
+          <w:i/>
+          <w:iCs/>
+        </w:rPr>
+        <w:t xml:space="preserve"> Proximal Policy Optimization,</w:t>
+      </w:r>
+      <w:r>
+        <w:rPr>
+          <w:rFonts w:eastAsia="Linux Libertine" w:cstheme="majorBidi"/>
+          <w:i/>
+          <w:iCs/>
+        </w:rPr>
+        <w:t xml:space="preserve"> TD3,</w:t>
+      </w:r>
+      <w:r>
+        <w:rPr>
+          <w:rFonts w:eastAsia="Linux Libertine" w:cstheme="majorBidi"/>
+          <w:i/>
+          <w:iCs/>
         </w:rPr>
         <w:t xml:space="preserve"> DWSim</w:t>
       </w:r>
       <w:r>
         <w:rPr>
           <w:rFonts w:eastAsia="Linux Libertine" w:cstheme="majorBidi"/>
+          <w:i/>
+          <w:iCs/>
         </w:rPr>
         <w:t>,</w:t>
       </w:r>
       <w:r>
         <w:rPr>
           <w:rFonts w:eastAsia="Linux Libertine" w:cstheme="majorBidi"/>
+          <w:i/>
+          <w:iCs/>
         </w:rPr>
         <w:t xml:space="preserve"> Optimization, AI Agent, Process Simulation</w:t>
       </w:r>
@@ -255,6 +523,7 @@
         <w:pStyle w:val="Heading1"/>
       </w:pPr>
       <w:r>
+        <w:lastRenderedPageBreak/>
         <w:t>1 Introduction</w:t>
       </w:r>
     </w:p>
@@ -311,10 +580,7 @@
         <w:t xml:space="preserve"> </w:t>
       </w:r>
       <w:r>
-        <w:t xml:space="preserve">and so on. The crude is first fractionated into multiple unfinished </w:t>
-      </w:r>
-      <w:r>
-        <w:t xml:space="preserve">intermediates which are further refined into various finished products in subsequent processes. </w:t>
+        <w:t xml:space="preserve">and so on. The crude is first fractionated into multiple unfinished intermediates which are further refined into various finished products in subsequent processes. </w:t>
       </w:r>
       <w:r>
         <w:t xml:space="preserve">Traditionally, Advanced Process Control (APC) strategies, such as Model Predictive Control (MPC), have been utilized to maintain process variables within strict operational bounds. However, </w:t>
@@ -329,7 +595,13 @@
         <w:t>overall optimization</w:t>
       </w:r>
       <w:r>
-        <w:t xml:space="preserve">. While Deep Reinforcement Learning (DRL) has emerged as a powerful paradigm for solving highly non-linear, stochastic optimization problems in chemical processes (Spielberg et al., 2019), its industrial implementation remains severely hindered by the </w:t>
+        <w:t xml:space="preserve">. While Deep Reinforcement Learning (DRL) has </w:t>
+      </w:r>
+      <w:r>
+        <w:t>arisen as a great choice</w:t>
+      </w:r>
+      <w:r>
+        <w:t xml:space="preserve"> for solving highly non-linear, stochastic optimization problems in chemical processes (Spielberg et al., 2019), its industrial implementation remains severely hindered by the </w:t>
       </w:r>
       <w:r>
         <w:t>‘</w:t>
@@ -380,7 +652,6 @@
           <w:i/>
           <w:iCs/>
         </w:rPr>
-        <w:lastRenderedPageBreak/>
         <w:t>Significance</w:t>
       </w:r>
     </w:p>
@@ -413,7 +684,10 @@
         <w:t>study</w:t>
       </w:r>
       <w:r>
-        <w:t xml:space="preserve"> bridges the critical gap between advanced artificial intelligence and practical industrial operability. By maximizing thermodynamic efficiency and product yield in response to fluctuating market prices, refineries can realize substantial economic gains while minimizing energy waste and emissions. </w:t>
+        <w:t xml:space="preserve"> bridges the critical gap between advanced artificial intelligence and practical </w:t>
+      </w:r>
+      <w:r>
+        <w:t xml:space="preserve">industrial operability. By maximizing thermodynamic efficiency and product yield in response to fluctuating market prices, refineries can realize substantial economic gains while minimizing energy waste and emissions. </w:t>
       </w:r>
       <w:r>
         <w:t xml:space="preserve">Additionally, </w:t>
@@ -623,7 +897,11 @@
         <w:t>study aims</w:t>
       </w:r>
       <w:r>
-        <w:t xml:space="preserve"> to successfully design, train, and deploy an AI-augmented digital twin for a CDU. The </w:t>
+        <w:t xml:space="preserve"> to successfully design, train, and deploy an AI-augmented digital twin for a CDU. </w:t>
+      </w:r>
+      <w:r>
+        <w:lastRenderedPageBreak/>
+        <w:t xml:space="preserve">The </w:t>
       </w:r>
       <w:r>
         <w:t xml:space="preserve">application has a Django dashboard to interact with the backend system comprising of a process Digital Twin built on DWSim, an optimizer built on Deep Reinforcement Learning agent, and a LLM-based AI Agent which creates reports and interacts with the user for explainability. </w:t>
@@ -803,11 +1081,7 @@
         <w:t xml:space="preserve"> are critical defining factors of crude assays. </w:t>
       </w:r>
       <w:r>
-        <w:t xml:space="preserve">These properties are critical as they define the intrinsic quality and potential corrosivity of the feed (González-Durán et al., </w:t>
-      </w:r>
-      <w:r>
-        <w:lastRenderedPageBreak/>
-        <w:t>2024; Al-Sayegh et al., 2016).</w:t>
+        <w:t>These properties are critical as they define the intrinsic quality and potential corrosivity of the feed (González-Durán et al., 2024; Al-Sayegh et al., 2016).</w:t>
       </w:r>
       <w:r>
         <w:t xml:space="preserve"> </w:t>
@@ -825,7 +1099,10 @@
         <w:t>since they</w:t>
       </w:r>
       <w:r>
-        <w:t xml:space="preserve"> serve as catalyst poisons in downstream units like fluid catalytic cracking (FCC) (Al-Sayegh et al., 2016).</w:t>
+        <w:t xml:space="preserve"> serve as </w:t>
+      </w:r>
+      <w:r>
+        <w:t>catalyst poisons in downstream units like fluid catalytic cracking (FCC) (Al-Sayegh et al., 2016).</w:t>
       </w:r>
       <w:r>
         <w:t xml:space="preserve"> </w:t>
@@ -1092,10 +1369,7 @@
         <w:t>d</w:t>
       </w:r>
       <w:r>
-        <w:t xml:space="preserve"> superior </w:t>
-      </w:r>
-      <w:r>
-        <w:t xml:space="preserve">Naphtha yields, which are essential for gasoline production. Conversely, Erha and Tapis </w:t>
+        <w:t xml:space="preserve"> superior Naphtha yields, which are essential for gasoline production. Conversely, Erha and Tapis </w:t>
       </w:r>
       <w:r>
         <w:t xml:space="preserve">have </w:t>
@@ -1107,7 +1381,11 @@
         <w:t>ed</w:t>
       </w:r>
       <w:r>
-        <w:t xml:space="preserve"> a higher propensity for middle distillate production</w:t>
+        <w:t xml:space="preserve"> a higher propensity for middle distillate </w:t>
+      </w:r>
+      <w:r>
+        <w:lastRenderedPageBreak/>
+        <w:t>production</w:t>
       </w:r>
       <w:r>
         <w:t xml:space="preserve"> like</w:t>
@@ -1121,6 +1399,11 @@
       <w:r>
         <w:t>yield distributions directly impact the reward function of the optimizer; for instance, when market prices favor Jet Fuel, the optimizer must identify the specific operating temperatures within the digital twin that maximize the Kerosene cuts while maintaining thermodynamic stability (Li et al., 2025).</w:t>
       </w:r>
+    </w:p>
+    <w:p>
+      <w:pPr>
+        <w:ind w:left="-76"/>
+      </w:pPr>
     </w:p>
     <w:p>
       <w:pPr>
@@ -1200,6 +1483,17 @@
     </w:p>
     <w:p>
       <w:pPr>
+        <w:ind w:left="-76"/>
+        <w:rPr>
+          <w:i/>
+          <w:iCs/>
+          <w:sz w:val="18"/>
+          <w:szCs w:val="18"/>
+        </w:rPr>
+      </w:pPr>
+    </w:p>
+    <w:p>
+      <w:pPr>
         <w:pStyle w:val="ListParagraph"/>
         <w:numPr>
           <w:ilvl w:val="1"/>
@@ -1270,7 +1564,6 @@
         <w:rPr>
           <w:noProof/>
         </w:rPr>
-        <w:lastRenderedPageBreak/>
         <w:drawing>
           <wp:inline distT="0" distB="0" distL="0" distR="0" wp14:anchorId="15043C0B" wp14:editId="6390284F">
             <wp:extent cx="3048000" cy="2830830"/>
@@ -1518,6 +1811,7 @@
           <w:noProof/>
           <w:lang w:val="en-IN"/>
         </w:rPr>
+        <w:lastRenderedPageBreak/>
         <w:drawing>
           <wp:inline distT="0" distB="0" distL="0" distR="0" wp14:anchorId="746D0E6D" wp14:editId="497DD0C3">
             <wp:extent cx="3048000" cy="672465"/>
@@ -1872,14 +2166,13 @@
         <w:rPr>
           <w:rFonts w:eastAsia="Times New Roman" w:cs="Times New Roman"/>
         </w:rPr>
-        <w:t>The predominant paradigm in industrial Real-Time Optimization (RTO) has historically relied on Non-Linear Programming (NLP) and Successive Quadratic Programming (SQP) to solve steady-</w:t>
+        <w:t xml:space="preserve">The predominant paradigm in industrial Real-Time Optimization (RTO) has historically relied on Non-Linear Programming (NLP) and Successive </w:t>
       </w:r>
       <w:r>
         <w:rPr>
           <w:rFonts w:eastAsia="Times New Roman" w:cs="Times New Roman"/>
         </w:rPr>
-        <w:lastRenderedPageBreak/>
-        <w:t xml:space="preserve">state models. While mathematically rigorous, these </w:t>
+        <w:t xml:space="preserve">Quadratic Programming (SQP) to solve steady-state models. While mathematically rigorous, these </w:t>
       </w:r>
       <w:r>
         <w:rPr>
@@ -2301,6 +2594,7 @@
         <w:rPr>
           <w:rFonts w:eastAsia="Times New Roman" w:cs="Times New Roman"/>
         </w:rPr>
+        <w:lastRenderedPageBreak/>
         <w:t xml:space="preserve">A critical contribution by Wang et al. (2024) in the Journal of Process Systems Engineering highlights the importance of Feature Engineering in RL for refineries. </w:t>
       </w:r>
       <w:r>
@@ -3213,14 +3507,7 @@
         <w:rPr>
           <w:rFonts w:eastAsia="Times New Roman" w:cs="Times New Roman"/>
         </w:rPr>
-        <w:t xml:space="preserve">to ensure that the agent remains within the Safe Operating Envelope of a VDU-ADU sequence. Their findings suggest that while CPO may converge slightly slower than standard PPO, it effectively eliminates the risk of dry trays or </w:t>
-      </w:r>
-      <w:r>
-        <w:rPr>
-          <w:rFonts w:eastAsia="Times New Roman" w:cs="Times New Roman"/>
-        </w:rPr>
-        <w:lastRenderedPageBreak/>
-        <w:t>column flooding during the learning process</w:t>
+        <w:t>to ensure that the agent remains within the Safe Operating Envelope of a VDU-ADU sequence. Their findings suggest that while CPO may converge slightly slower than standard PPO, it effectively eliminates the risk of dry trays or column flooding during the learning process</w:t>
       </w:r>
       <w:r>
         <w:rPr>
@@ -3323,6 +3610,15 @@
     </w:p>
     <w:p>
       <w:pPr>
+        <w:spacing w:before="20"/>
+        <w:rPr>
+          <w:rFonts w:eastAsia="Times New Roman" w:cs="Times New Roman"/>
+          <w:lang w:val="en-IN"/>
+        </w:rPr>
+      </w:pPr>
+    </w:p>
+    <w:p>
+      <w:pPr>
         <w:pStyle w:val="Heading1"/>
       </w:pPr>
       <w:r>
@@ -3462,6 +3758,7 @@
         <w:t xml:space="preserve">The crude feed is defined at ambient temperature and atmospheric pressure which is then pressurized through booster pumps, and heated in two phases </w:t>
       </w:r>
       <w:r>
+        <w:lastRenderedPageBreak/>
         <w:t xml:space="preserve">upto 360 </w:t>
       </w:r>
       <w:r>
@@ -3569,6 +3866,11 @@
       <w:r>
         <w:t>C.</w:t>
       </w:r>
+    </w:p>
+    <w:p>
+      <w:pPr>
+        <w:ind w:left="-6"/>
+      </w:pPr>
     </w:p>
     <w:p>
       <w:pPr>
@@ -3668,7 +3970,6 @@
         <w:rPr>
           <w:noProof/>
         </w:rPr>
-        <w:lastRenderedPageBreak/>
         <w:drawing>
           <wp:inline distT="0" distB="0" distL="0" distR="0" wp14:anchorId="226ED0A2" wp14:editId="22B7D93A">
             <wp:extent cx="3075305" cy="1429385"/>
@@ -3737,6 +4038,17 @@
     </w:p>
     <w:p>
       <w:pPr>
+        <w:ind w:left="-6"/>
+        <w:rPr>
+          <w:i/>
+          <w:iCs/>
+          <w:sz w:val="18"/>
+          <w:szCs w:val="18"/>
+        </w:rPr>
+      </w:pPr>
+    </w:p>
+    <w:p>
+      <w:pPr>
         <w:pStyle w:val="ListParagraph"/>
         <w:numPr>
           <w:ilvl w:val="1"/>
@@ -3794,6 +4106,22 @@
         </w:rPr>
         <w:t>Justification for RL-based Optimization</w:t>
       </w:r>
+    </w:p>
+    <w:p>
+      <w:pPr>
+        <w:pStyle w:val="ListParagraph"/>
+        <w:numPr>
+          <w:ilvl w:val="0"/>
+          <w:numId w:val="0"/>
+        </w:numPr>
+        <w:ind w:left="426"/>
+        <w:rPr>
+          <w:i/>
+          <w:iCs/>
+          <w:sz w:val="20"/>
+          <w:szCs w:val="20"/>
+        </w:rPr>
+      </w:pPr>
     </w:p>
     <w:p>
       <w:pPr>
@@ -4435,6 +4763,22 @@
     </w:p>
     <w:p>
       <w:pPr>
+        <w:pStyle w:val="ListParagraph"/>
+        <w:numPr>
+          <w:ilvl w:val="0"/>
+          <w:numId w:val="0"/>
+        </w:numPr>
+        <w:ind w:left="426"/>
+        <w:rPr>
+          <w:i/>
+          <w:iCs/>
+          <w:sz w:val="20"/>
+          <w:szCs w:val="20"/>
+        </w:rPr>
+      </w:pPr>
+    </w:p>
+    <w:p>
+      <w:pPr>
         <w:ind w:left="-78"/>
         <w:rPr>
           <w:sz w:val="20"/>
@@ -4592,7 +4936,31 @@
         <w:rPr>
           <w:lang w:val="en-IN"/>
         </w:rPr>
-        <w:t xml:space="preserve"> of a CDU are governed by complex thermodynamics (such as the Peng-Robinson or NRTL models), they are difficult to model analytically for control. Thus, model-free RL is employed to learn the optimal policy </w:t>
+        <w:t xml:space="preserve"> of a CDU are governed by complex thermodynamics (such as the Peng-Robinson or NRTL models), they are difficult to model analytically for control. Thus, model-free RL is employed </w:t>
+      </w:r>
+      <w:r>
+        <w:rPr>
+          <w:lang w:val="en-IN"/>
+        </w:rPr>
+        <w:t>which</w:t>
+      </w:r>
+      <w:r>
+        <w:rPr>
+          <w:lang w:val="en-IN"/>
+        </w:rPr>
+        <w:t xml:space="preserve"> learn</w:t>
+      </w:r>
+      <w:r>
+        <w:rPr>
+          <w:lang w:val="en-IN"/>
+        </w:rPr>
+        <w:t>s</w:t>
+      </w:r>
+      <w:r>
+        <w:rPr>
+          <w:lang w:val="en-IN"/>
+        </w:rPr>
+        <w:t xml:space="preserve"> the optimal policy </w:t>
       </w:r>
       <m:oMath>
         <m:r>
@@ -4617,17 +4985,6 @@
     </w:p>
     <w:p>
       <w:pPr>
-        <w:ind w:left="-78"/>
-        <w:rPr>
-          <w:i/>
-          <w:iCs/>
-          <w:sz w:val="20"/>
-          <w:szCs w:val="20"/>
-        </w:rPr>
-      </w:pPr>
-    </w:p>
-    <w:p>
-      <w:pPr>
         <w:pStyle w:val="ListParagraph"/>
         <w:numPr>
           <w:ilvl w:val="2"/>
@@ -4674,7 +5031,13 @@
         <w:rPr>
           <w:lang w:val="en-IN"/>
         </w:rPr>
-        <w:t>, three state-of-the-art Deep RL architectures were selected for benchmarking: Proximal Policy Optimization (PPO), Soft Actor-Critic (SAC), and Twin Delayed Deep Deterministic Policy Gradient (TD3). These were chosen because they are specifically designed to handle the curse of dimensionality and the continuous nature of chemical process control</w:t>
+        <w:t>, three state-of-the-art Deep RL architectures were selected for benchmarking: Proximal Policy Optimization (PPO), Soft Actor-</w:t>
+      </w:r>
+      <w:r>
+        <w:rPr>
+          <w:lang w:val="en-IN"/>
+        </w:rPr>
+        <w:t>Critic (SAC), and Twin Delayed Deep Deterministic Policy Gradient (TD3). These were chosen because they are specifically designed to handle the curse of dimensionality and the continuous nature of chemical process control</w:t>
       </w:r>
       <w:r>
         <w:rPr>
@@ -4711,14 +5074,7 @@
         <w:rPr>
           <w:lang w:val="en-IN"/>
         </w:rPr>
-        <w:t xml:space="preserve"> PPO was selected for its industry-standard stability and </w:t>
-      </w:r>
-      <w:r>
-        <w:rPr>
-          <w:lang w:val="en-IN"/>
-        </w:rPr>
-        <w:lastRenderedPageBreak/>
-        <w:t>ease of tuning. As an on-policy algorithm, PPO ensures that policy updates do not deviate too far from the previous iteration by using a clipped objective function. This prevents the collapse of the simulation—a common issue in DWSIM when radical setpoint changes lead to non-convergence</w:t>
+        <w:t xml:space="preserve"> PPO was selected for its industry-standard stability and ease of tuning. As an on-policy algorithm, PPO ensures that policy updates do not deviate too far from the previous iteration by using a clipped objective function. This prevents the collapse of the simulation—a common issue in DWSIM when radical setpoint changes lead to non-convergence</w:t>
       </w:r>
       <w:r>
         <w:rPr>
@@ -4812,6 +5168,7 @@
           <w:sz w:val="20"/>
           <w:szCs w:val="20"/>
         </w:rPr>
+        <w:lastRenderedPageBreak/>
         <w:t>Technical Mechanics of Candidate Algorithms</w:t>
       </w:r>
     </w:p>
@@ -4902,13 +5259,7 @@
         <w:rPr>
           <w:lang w:val="en-IN"/>
         </w:rPr>
-        <w:t xml:space="preserve">. </w:t>
-      </w:r>
-      <w:r>
-        <w:rPr>
-          <w:lang w:val="en-IN"/>
-        </w:rPr>
-        <w:t xml:space="preserve">Mathematically, the objective is </w:t>
+        <w:t xml:space="preserve">. Mathematically, the objective is </w:t>
       </w:r>
       <m:oMath>
         <m:sSup>
@@ -5775,19 +6126,43 @@
         <w:rPr>
           <w:lang w:val="en-IN"/>
         </w:rPr>
-        <w:t>TD3 improves upon the DDPG baseline through three key innovations: Clipped Double-Q Learning, Target Policy Smoothing, and Delayed Policy Updates. It maintains two independent critic networks and uses the minimum value between them to calculate the target, which suppresses the overestimation of the profitability of certain process states. By updating the actor network less frequently than the critic</w:t>
+        <w:t xml:space="preserve">TD3 improves upon the DDPG baseline through three key innovations: Clipped Double-Q Learning, Target Policy Smoothing, and Delayed Policy Updates. It maintains two independent critic networks and uses the minimum value between them to calculate the target, which suppresses the overestimation of the profitability of certain process states. By updating the actor network less frequently </w:t>
       </w:r>
       <w:r>
         <w:rPr>
           <w:lang w:val="en-IN"/>
         </w:rPr>
+        <w:t>compared to</w:t>
+      </w:r>
+      <w:r>
+        <w:rPr>
+          <w:lang w:val="en-IN"/>
+        </w:rPr>
+        <w:t xml:space="preserve"> the critic</w:t>
+      </w:r>
+      <w:r>
+        <w:rPr>
+          <w:lang w:val="en-IN"/>
+        </w:rPr>
+        <w:t xml:space="preserve"> network</w:t>
+      </w:r>
+      <w:r>
+        <w:rPr>
+          <w:lang w:val="en-IN"/>
+        </w:rPr>
         <w:t xml:space="preserve">, </w:t>
       </w:r>
       <w:r>
         <w:rPr>
           <w:lang w:val="en-IN"/>
         </w:rPr>
-        <w:t>it allows the value estimation to stabilize before the policy changes, which is vital for handling the slow-moving thermal dynamics of large distillation columns (Fujimoto et al., 2018).</w:t>
+        <w:t xml:space="preserve">it allows </w:t>
+      </w:r>
+      <w:r>
+        <w:rPr>
+          <w:lang w:val="en-IN"/>
+        </w:rPr>
+        <w:t>the value estimation to stabilize before the policy changes, which is vital for handling the slow-moving thermal dynamics of large distillation columns (Fujimoto et al., 2018).</w:t>
       </w:r>
     </w:p>
     <w:p/>
@@ -5799,8 +6174,16 @@
           <w:numId w:val="15"/>
         </w:numPr>
         <w:ind w:left="426"/>
-      </w:pPr>
-      <w:r>
+        <w:rPr>
+          <w:i/>
+          <w:iCs/>
+        </w:rPr>
+      </w:pPr>
+      <w:r>
+        <w:rPr>
+          <w:i/>
+          <w:iCs/>
+        </w:rPr>
         <w:t>DWSim-RL Bridge</w:t>
       </w:r>
     </w:p>
@@ -5815,11 +6198,7 @@
         <w:t xml:space="preserve">is designed to </w:t>
       </w:r>
       <w:r>
-        <w:t xml:space="preserve">isolate the rest of the codebase from </w:t>
-      </w:r>
-      <w:r>
-        <w:lastRenderedPageBreak/>
-        <w:t xml:space="preserve">Common Language Runtime (CLR) details and provides high-level, unit-consistent read/write operations for the flowsheet. </w:t>
+        <w:t xml:space="preserve">isolate the rest of the codebase from Common Language Runtime (CLR) details and provides high-level, unit-consistent read/write operations for the flowsheet. </w:t>
       </w:r>
       <w:r>
         <w:t>The module establish</w:t>
@@ -5858,6 +6237,16 @@
       <w:r>
         <w:t>The CLR bootstrap function ensures the required DWSIM assemblies are added to the Python process via the Python for .NET clr module. It uses a module-level lock and a boolean flag to make the operation idempotent and thread-safe; repeated calls are no-ops after the first successful bootstrap. This prevents multiple threads from attempting to load CLR assemblies concurrently and records status via logger messages.</w:t>
       </w:r>
+    </w:p>
+    <w:p>
+      <w:pPr>
+        <w:ind w:left="-6"/>
+      </w:pPr>
+    </w:p>
+    <w:p>
+      <w:pPr>
+        <w:ind w:left="-6"/>
+      </w:pPr>
     </w:p>
     <w:p>
       <w:pPr>
@@ -5872,8 +6261,17 @@
           <w:numId w:val="15"/>
         </w:numPr>
         <w:ind w:left="426"/>
-      </w:pPr>
-      <w:r>
+        <w:rPr>
+          <w:i/>
+          <w:iCs/>
+        </w:rPr>
+      </w:pPr>
+      <w:r>
+        <w:rPr>
+          <w:i/>
+          <w:iCs/>
+        </w:rPr>
+        <w:lastRenderedPageBreak/>
         <w:t>Agent Training</w:t>
       </w:r>
     </w:p>
@@ -5900,10 +6298,7 @@
         <w:t xml:space="preserve">the parameters associated with the </w:t>
       </w:r>
       <w:r>
-        <w:t xml:space="preserve">flowsheet. To facilitate robust learning, the environment translates the physical constraints of the distillation process into a Markov Decision Process (MDP). Such integration of high-fidelity </w:t>
-      </w:r>
-      <w:r>
-        <w:t>simulators with RL frameworks is critical to ensure that the agent learns policies grounded in rigorous thermodynamics rather than simplified linear approximations (Hubbs et al., 2020). The training was executed using the Stable Baselines3 library, a reliable framework for implementing state-of-the-art D</w:t>
+        <w:t>flowsheet. To facilitate robust learning, the environment translates the physical constraints of the distillation process into a Markov Decision Process (MDP). Such integration of high-fidelity simulators with RL frameworks is critical to ensure that the agent learns policies grounded in rigorous thermodynamics rather than simplified linear approximations (Hubbs et al., 2020). The training was executed using the Stable Baselines3 library, a reliable framework for implementing state-of-the-art D</w:t>
       </w:r>
       <w:r>
         <w:t xml:space="preserve">eep </w:t>
@@ -5958,8 +6353,16 @@
           <w:numId w:val="15"/>
         </w:numPr>
         <w:ind w:left="426"/>
-      </w:pPr>
-      <w:r>
+        <w:rPr>
+          <w:i/>
+          <w:iCs/>
+        </w:rPr>
+      </w:pPr>
+      <w:r>
+        <w:rPr>
+          <w:i/>
+          <w:iCs/>
+        </w:rPr>
         <w:t>Reward Engineering</w:t>
       </w:r>
     </w:p>
@@ -5992,7 +6395,10 @@
         <w:t xml:space="preserve">aims to </w:t>
       </w:r>
       <w:r>
-        <w:t>align the agent’s objectives with refinery profitability. The reward is calculated based on an economic objective function:</w:t>
+        <w:t xml:space="preserve">align the agent’s </w:t>
+      </w:r>
+      <w:r>
+        <w:t>objectives with refinery profitability. The reward is calculated based on an economic objective function:</w:t>
       </w:r>
     </w:p>
     <w:p>
@@ -6247,11 +6653,7 @@
         </m:sSup>
       </m:oMath>
       <w:r>
-        <w:t xml:space="preserve">, preventing gradient explosion during the early stages of </w:t>
-      </w:r>
-      <w:r>
-        <w:lastRenderedPageBreak/>
-        <w:t>backpropagation (Shin et al., 2019). Furthermore, a penalty term is applied if the DWSIM solver fails to converge, effectively teaching the agent to avoid extreme setpoint adjustments that lead to physical instability.</w:t>
+        <w:t>, preventing gradient explosion during the early stages of backpropagation (Shin et al., 2019). Furthermore, a penalty term is applied if the DWSIM solver fails to converge, effectively teaching the agent to avoid extreme setpoint adjustments that lead to physical instability.</w:t>
       </w:r>
     </w:p>
     <w:p>
@@ -6262,8 +6664,16 @@
           <w:numId w:val="15"/>
         </w:numPr>
         <w:ind w:left="426"/>
-      </w:pPr>
-      <w:r>
+        <w:rPr>
+          <w:i/>
+          <w:iCs/>
+        </w:rPr>
+      </w:pPr>
+      <w:r>
+        <w:rPr>
+          <w:i/>
+          <w:iCs/>
+        </w:rPr>
         <w:t>Training Protocol</w:t>
       </w:r>
     </w:p>
@@ -6272,7 +6682,13 @@
         <w:ind w:left="-6"/>
       </w:pPr>
       <w:r>
-        <w:t xml:space="preserve">The training protocol follows a comparative benchmarking approach, where the Proximal Policy Optimization (PPO), Soft Actor-Critic (SAC), and Twin Delayed Deep Deterministic Policy Gradient (TD3) architectures are evaluated under identical conditions. The agents are trained over a horizon of 200,000 timesteps to ensure policy saturation. A curriculum learning strategy is employed, wherein the complexity of the environment—specifically the variance in </w:t>
+        <w:t xml:space="preserve">The training protocol follows a comparative benchmarking approach, where the Proximal Policy Optimization (PPO), Soft Actor-Critic (SAC), and Twin Delayed Deep Deterministic Policy Gradient (TD3) architectures are evaluated under identical conditions. The agents are trained over a horizon of </w:t>
+      </w:r>
+      <w:r>
+        <w:t>5</w:t>
+      </w:r>
+      <w:r>
+        <w:t xml:space="preserve">00 timesteps to ensure policy saturation. A curriculum learning strategy is employed, wherein the complexity of the environment—specifically the variance in </w:t>
       </w:r>
       <w:r>
         <w:t xml:space="preserve">actions </w:t>
@@ -6285,6 +6701,9 @@
       </w:r>
       <w:r>
         <w:t>(Bengio et al., 2009).</w:t>
+      </w:r>
+      <w:r>
+        <w:t xml:space="preserve"> Tolerance of solver is considered as a hyperparameter allowing the agent to learn to minimize solver tolerance while learning process dynamics.</w:t>
       </w:r>
       <w:r>
         <w:t xml:space="preserve"> </w:t>
@@ -6304,9 +6723,518 @@
         <w:t xml:space="preserve"> </w:t>
       </w:r>
       <w:r>
-        <w:t>is automatically tuned to balance exploration and exploitation, ensuring the entropy does not collapse prematurely. The TD3 agent utilizes a replay buffer to store historical transitions, which are sampled randomly to break temporal correlations, while the PPO agent relies on on-policy updates with a clipped objective to maintain stability within the trust region (Schulman et al., 2017). The best-performing model for each architecture is preserved using an EvalCallback function, which triggers periodic evaluations on a separate, non-training set of feed conditions to ensure generalization.</w:t>
-      </w:r>
-    </w:p>
+        <w:t xml:space="preserve">is automatically tuned to balance exploration and exploitation, ensuring the entropy does not </w:t>
+      </w:r>
+      <w:r>
+        <w:lastRenderedPageBreak/>
+        <w:t>collapse prematurely. The TD3 agent utilizes a replay buffer to store historical transitions, which are sampled randomly to break temporal correlations, while the PPO agent relies on on-policy updates with a clipped objective to maintain stability within the trust region (Schulman et al., 2017). The best-performing model for each architecture is preserved using an EvalCallback function, which triggers periodic evaluations on a separate, non-training set of feed conditions to ensure generalization.</w:t>
+      </w:r>
+    </w:p>
+    <w:tbl>
+      <w:tblPr>
+        <w:tblStyle w:val="TableGrid"/>
+        <w:tblW w:w="0" w:type="auto"/>
+        <w:tblInd w:w="-6" w:type="dxa"/>
+        <w:tblLook w:val="04A0" w:firstRow="1" w:lastRow="0" w:firstColumn="1" w:lastColumn="0" w:noHBand="0" w:noVBand="1"/>
+      </w:tblPr>
+      <w:tblGrid>
+        <w:gridCol w:w="2416"/>
+        <w:gridCol w:w="2417"/>
+      </w:tblGrid>
+      <w:tr>
+        <w:tc>
+          <w:tcPr>
+            <w:tcW w:w="2416" w:type="dxa"/>
+          </w:tcPr>
+          <w:p>
+            <w:pPr>
+              <w:rPr>
+                <w:b/>
+                <w:bCs/>
+                <w:sz w:val="18"/>
+                <w:szCs w:val="18"/>
+              </w:rPr>
+            </w:pPr>
+            <w:r>
+              <w:rPr>
+                <w:b/>
+                <w:bCs/>
+                <w:sz w:val="18"/>
+                <w:szCs w:val="18"/>
+              </w:rPr>
+              <w:t>Hyperparameter</w:t>
+            </w:r>
+          </w:p>
+        </w:tc>
+        <w:tc>
+          <w:tcPr>
+            <w:tcW w:w="2417" w:type="dxa"/>
+          </w:tcPr>
+          <w:p>
+            <w:pPr>
+              <w:rPr>
+                <w:b/>
+                <w:bCs/>
+                <w:sz w:val="18"/>
+                <w:szCs w:val="18"/>
+              </w:rPr>
+            </w:pPr>
+            <w:r>
+              <w:rPr>
+                <w:b/>
+                <w:bCs/>
+                <w:sz w:val="18"/>
+                <w:szCs w:val="18"/>
+              </w:rPr>
+              <w:t>Value</w:t>
+            </w:r>
+          </w:p>
+        </w:tc>
+      </w:tr>
+      <w:tr>
+        <w:tc>
+          <w:tcPr>
+            <w:tcW w:w="2416" w:type="dxa"/>
+          </w:tcPr>
+          <w:p>
+            <w:pPr>
+              <w:rPr>
+                <w:sz w:val="16"/>
+                <w:szCs w:val="16"/>
+              </w:rPr>
+            </w:pPr>
+            <w:r>
+              <w:rPr>
+                <w:sz w:val="16"/>
+                <w:szCs w:val="16"/>
+              </w:rPr>
+              <w:t>Total timesteps</w:t>
+            </w:r>
+          </w:p>
+        </w:tc>
+        <w:tc>
+          <w:tcPr>
+            <w:tcW w:w="2417" w:type="dxa"/>
+          </w:tcPr>
+          <w:p>
+            <w:pPr>
+              <w:rPr>
+                <w:sz w:val="16"/>
+                <w:szCs w:val="16"/>
+              </w:rPr>
+            </w:pPr>
+            <w:r>
+              <w:rPr>
+                <w:sz w:val="16"/>
+                <w:szCs w:val="16"/>
+              </w:rPr>
+              <w:t>500</w:t>
+            </w:r>
+          </w:p>
+        </w:tc>
+      </w:tr>
+      <w:tr>
+        <w:tc>
+          <w:tcPr>
+            <w:tcW w:w="2416" w:type="dxa"/>
+          </w:tcPr>
+          <w:p>
+            <w:pPr>
+              <w:rPr>
+                <w:sz w:val="16"/>
+                <w:szCs w:val="16"/>
+              </w:rPr>
+            </w:pPr>
+            <w:r>
+              <w:rPr>
+                <w:sz w:val="16"/>
+                <w:szCs w:val="16"/>
+              </w:rPr>
+              <w:t>Max episode steps</w:t>
+            </w:r>
+          </w:p>
+        </w:tc>
+        <w:tc>
+          <w:tcPr>
+            <w:tcW w:w="2417" w:type="dxa"/>
+          </w:tcPr>
+          <w:p>
+            <w:pPr>
+              <w:rPr>
+                <w:sz w:val="16"/>
+                <w:szCs w:val="16"/>
+              </w:rPr>
+            </w:pPr>
+            <w:r>
+              <w:rPr>
+                <w:sz w:val="16"/>
+                <w:szCs w:val="16"/>
+              </w:rPr>
+              <w:t>50</w:t>
+            </w:r>
+          </w:p>
+        </w:tc>
+      </w:tr>
+      <w:tr>
+        <w:trPr>
+          <w:trHeight w:val="218"/>
+        </w:trPr>
+        <w:tc>
+          <w:tcPr>
+            <w:tcW w:w="2416" w:type="dxa"/>
+          </w:tcPr>
+          <w:p>
+            <w:pPr>
+              <w:rPr>
+                <w:sz w:val="16"/>
+                <w:szCs w:val="16"/>
+              </w:rPr>
+            </w:pPr>
+            <w:r>
+              <w:rPr>
+                <w:sz w:val="16"/>
+                <w:szCs w:val="16"/>
+              </w:rPr>
+              <w:t>Learning starts</w:t>
+            </w:r>
+          </w:p>
+        </w:tc>
+        <w:tc>
+          <w:tcPr>
+            <w:tcW w:w="2417" w:type="dxa"/>
+          </w:tcPr>
+          <w:p>
+            <w:pPr>
+              <w:rPr>
+                <w:sz w:val="16"/>
+                <w:szCs w:val="16"/>
+              </w:rPr>
+            </w:pPr>
+            <w:r>
+              <w:rPr>
+                <w:sz w:val="16"/>
+                <w:szCs w:val="16"/>
+              </w:rPr>
+              <w:t>100</w:t>
+            </w:r>
+          </w:p>
+        </w:tc>
+      </w:tr>
+      <w:tr>
+        <w:tc>
+          <w:tcPr>
+            <w:tcW w:w="2416" w:type="dxa"/>
+          </w:tcPr>
+          <w:p>
+            <w:pPr>
+              <w:rPr>
+                <w:sz w:val="16"/>
+                <w:szCs w:val="16"/>
+              </w:rPr>
+            </w:pPr>
+            <w:r>
+              <w:rPr>
+                <w:sz w:val="16"/>
+                <w:szCs w:val="16"/>
+              </w:rPr>
+              <w:t>Batch size</w:t>
+            </w:r>
+          </w:p>
+        </w:tc>
+        <w:tc>
+          <w:tcPr>
+            <w:tcW w:w="2417" w:type="dxa"/>
+          </w:tcPr>
+          <w:p>
+            <w:pPr>
+              <w:rPr>
+                <w:sz w:val="16"/>
+                <w:szCs w:val="16"/>
+              </w:rPr>
+            </w:pPr>
+            <w:r>
+              <w:rPr>
+                <w:sz w:val="16"/>
+                <w:szCs w:val="16"/>
+              </w:rPr>
+              <w:t>64</w:t>
+            </w:r>
+          </w:p>
+        </w:tc>
+      </w:tr>
+      <w:tr>
+        <w:tc>
+          <w:tcPr>
+            <w:tcW w:w="2416" w:type="dxa"/>
+          </w:tcPr>
+          <w:p>
+            <w:pPr>
+              <w:rPr>
+                <w:sz w:val="16"/>
+                <w:szCs w:val="16"/>
+              </w:rPr>
+            </w:pPr>
+            <w:r>
+              <w:rPr>
+                <w:sz w:val="16"/>
+                <w:szCs w:val="16"/>
+              </w:rPr>
+              <w:t>Learning rate</w:t>
+            </w:r>
+          </w:p>
+        </w:tc>
+        <w:tc>
+          <w:tcPr>
+            <w:tcW w:w="2417" w:type="dxa"/>
+          </w:tcPr>
+          <w:p>
+            <w:pPr>
+              <w:rPr>
+                <w:sz w:val="16"/>
+                <w:szCs w:val="16"/>
+              </w:rPr>
+            </w:pPr>
+            <w:r>
+              <w:rPr>
+                <w:sz w:val="16"/>
+                <w:szCs w:val="16"/>
+              </w:rPr>
+              <w:t>3e-4</w:t>
+            </w:r>
+          </w:p>
+        </w:tc>
+      </w:tr>
+      <w:tr>
+        <w:tc>
+          <w:tcPr>
+            <w:tcW w:w="2416" w:type="dxa"/>
+          </w:tcPr>
+          <w:p>
+            <w:pPr>
+              <w:rPr>
+                <w:sz w:val="16"/>
+                <w:szCs w:val="16"/>
+              </w:rPr>
+            </w:pPr>
+            <w:r>
+              <w:rPr>
+                <w:sz w:val="16"/>
+                <w:szCs w:val="16"/>
+              </w:rPr>
+              <w:t>Discount Factor</w:t>
+            </w:r>
+          </w:p>
+        </w:tc>
+        <w:tc>
+          <w:tcPr>
+            <w:tcW w:w="2417" w:type="dxa"/>
+          </w:tcPr>
+          <w:p>
+            <w:pPr>
+              <w:rPr>
+                <w:sz w:val="16"/>
+                <w:szCs w:val="16"/>
+              </w:rPr>
+            </w:pPr>
+            <w:r>
+              <w:rPr>
+                <w:sz w:val="16"/>
+                <w:szCs w:val="16"/>
+              </w:rPr>
+              <w:t>0.99</w:t>
+            </w:r>
+          </w:p>
+        </w:tc>
+      </w:tr>
+      <w:tr>
+        <w:tc>
+          <w:tcPr>
+            <w:tcW w:w="2416" w:type="dxa"/>
+          </w:tcPr>
+          <w:p>
+            <w:pPr>
+              <w:rPr>
+                <w:sz w:val="16"/>
+                <w:szCs w:val="16"/>
+              </w:rPr>
+            </w:pPr>
+            <w:r>
+              <w:rPr>
+                <w:sz w:val="16"/>
+                <w:szCs w:val="16"/>
+              </w:rPr>
+              <w:t>Buffer size</w:t>
+            </w:r>
+          </w:p>
+        </w:tc>
+        <w:tc>
+          <w:tcPr>
+            <w:tcW w:w="2417" w:type="dxa"/>
+          </w:tcPr>
+          <w:p>
+            <w:pPr>
+              <w:rPr>
+                <w:sz w:val="16"/>
+                <w:szCs w:val="16"/>
+              </w:rPr>
+            </w:pPr>
+            <w:r>
+              <w:rPr>
+                <w:sz w:val="16"/>
+                <w:szCs w:val="16"/>
+              </w:rPr>
+              <w:t>10,000</w:t>
+            </w:r>
+          </w:p>
+        </w:tc>
+      </w:tr>
+      <w:tr>
+        <w:tc>
+          <w:tcPr>
+            <w:tcW w:w="2416" w:type="dxa"/>
+          </w:tcPr>
+          <w:p>
+            <w:pPr>
+              <w:rPr>
+                <w:sz w:val="16"/>
+                <w:szCs w:val="16"/>
+              </w:rPr>
+            </w:pPr>
+            <w:r>
+              <w:rPr>
+                <w:sz w:val="16"/>
+                <w:szCs w:val="16"/>
+              </w:rPr>
+              <w:t>Action warmup</w:t>
+            </w:r>
+          </w:p>
+        </w:tc>
+        <w:tc>
+          <w:tcPr>
+            <w:tcW w:w="2417" w:type="dxa"/>
+          </w:tcPr>
+          <w:p>
+            <w:pPr>
+              <w:rPr>
+                <w:sz w:val="16"/>
+                <w:szCs w:val="16"/>
+              </w:rPr>
+            </w:pPr>
+            <w:r>
+              <w:rPr>
+                <w:sz w:val="16"/>
+                <w:szCs w:val="16"/>
+              </w:rPr>
+              <w:t>5% to 100% over 70% of episode</w:t>
+            </w:r>
+          </w:p>
+        </w:tc>
+      </w:tr>
+      <w:tr>
+        <w:tc>
+          <w:tcPr>
+            <w:tcW w:w="2416" w:type="dxa"/>
+          </w:tcPr>
+          <w:p>
+            <w:pPr>
+              <w:rPr>
+                <w:sz w:val="16"/>
+                <w:szCs w:val="16"/>
+              </w:rPr>
+            </w:pPr>
+            <w:r>
+              <w:rPr>
+                <w:sz w:val="16"/>
+                <w:szCs w:val="16"/>
+              </w:rPr>
+              <w:t>Solver tolerance</w:t>
+            </w:r>
+          </w:p>
+        </w:tc>
+        <w:tc>
+          <w:tcPr>
+            <w:tcW w:w="2417" w:type="dxa"/>
+          </w:tcPr>
+          <w:p>
+            <w:pPr>
+              <w:rPr>
+                <w:sz w:val="16"/>
+                <w:szCs w:val="16"/>
+              </w:rPr>
+            </w:pPr>
+            <w:r>
+              <w:rPr>
+                <w:sz w:val="16"/>
+                <w:szCs w:val="16"/>
+              </w:rPr>
+              <w:t>Adaptive</w:t>
+            </w:r>
+          </w:p>
+        </w:tc>
+      </w:tr>
+      <w:tr>
+        <w:tc>
+          <w:tcPr>
+            <w:tcW w:w="2416" w:type="dxa"/>
+          </w:tcPr>
+          <w:p>
+            <w:pPr>
+              <w:rPr>
+                <w:sz w:val="16"/>
+                <w:szCs w:val="16"/>
+              </w:rPr>
+            </w:pPr>
+            <w:r>
+              <w:rPr>
+                <w:sz w:val="16"/>
+                <w:szCs w:val="16"/>
+              </w:rPr>
+              <w:t>Curriculum</w:t>
+            </w:r>
+          </w:p>
+        </w:tc>
+        <w:tc>
+          <w:tcPr>
+            <w:tcW w:w="2417" w:type="dxa"/>
+          </w:tcPr>
+          <w:p>
+            <w:pPr>
+              <w:rPr>
+                <w:sz w:val="16"/>
+                <w:szCs w:val="16"/>
+              </w:rPr>
+            </w:pPr>
+            <w:r>
+              <w:rPr>
+                <w:sz w:val="16"/>
+                <w:szCs w:val="16"/>
+              </w:rPr>
+              <w:t>Full difficulty</w:t>
+            </w:r>
+          </w:p>
+        </w:tc>
+      </w:tr>
+    </w:tbl>
+    <w:p>
+      <w:pPr>
+        <w:rPr>
+          <w:i/>
+          <w:iCs/>
+          <w:sz w:val="18"/>
+          <w:szCs w:val="18"/>
+        </w:rPr>
+      </w:pPr>
+      <w:r>
+        <w:rPr>
+          <w:i/>
+          <w:iCs/>
+          <w:sz w:val="18"/>
+          <w:szCs w:val="18"/>
+        </w:rPr>
+        <w:t>Table 1. Hyperparameters used for RL agent training</w:t>
+      </w:r>
+    </w:p>
+    <w:p/>
     <w:p>
       <w:pPr>
         <w:ind w:left="-6"/>
@@ -6352,6 +7280,31 @@
     <w:p>
       <w:pPr>
         <w:ind w:left="-6"/>
+        <w:rPr>
+          <w:i/>
+          <w:iCs/>
+          <w:sz w:val="18"/>
+          <w:szCs w:val="18"/>
+        </w:rPr>
+      </w:pPr>
+      <w:r>
+        <w:rPr>
+          <w:i/>
+          <w:iCs/>
+          <w:sz w:val="18"/>
+          <w:szCs w:val="18"/>
+        </w:rPr>
+        <w:t>Fig 5. (a). Action scale plot showing gradual change in scale of actions within the episode with progress</w:t>
+      </w:r>
+    </w:p>
+    <w:p>
+      <w:pPr>
+        <w:ind w:left="-6"/>
+      </w:pPr>
+    </w:p>
+    <w:p>
+      <w:pPr>
+        <w:ind w:left="-6"/>
       </w:pPr>
       <w:r>
         <w:drawing>
@@ -6450,19 +7403,17 @@
           <w:sz w:val="18"/>
           <w:szCs w:val="18"/>
         </w:rPr>
-        <w:t>Fig 5. (a). Action scale plot showing gradual change in scale of actions within the episode with progress</w:t>
-      </w:r>
-    </w:p>
-    <w:p>
-      <w:pPr>
-        <w:ind w:left="-6"/>
+        <w:t>Fig. 5</w:t>
+      </w:r>
+      <w:r>
         <w:rPr>
           <w:i/>
           <w:iCs/>
           <w:sz w:val="18"/>
           <w:szCs w:val="18"/>
         </w:rPr>
-      </w:pPr>
+        <w:t>(b).</w:t>
+      </w:r>
       <w:r>
         <w:rPr>
           <w:i/>
@@ -6470,28 +7421,28 @@
           <w:sz w:val="18"/>
           <w:szCs w:val="18"/>
         </w:rPr>
-        <w:t>(b).</w:t>
-      </w:r>
-      <w:r>
+        <w:t>Scaling of various actions based on the impact on digital twin simulation</w:t>
+      </w:r>
+    </w:p>
+    <w:p>
+      <w:pPr>
+        <w:ind w:left="-6"/>
         <w:rPr>
           <w:i/>
           <w:iCs/>
           <w:sz w:val="18"/>
           <w:szCs w:val="18"/>
         </w:rPr>
-        <w:t>Scaling of various actions based on the impact on digital twin simulation</w:t>
-      </w:r>
-    </w:p>
-    <w:p>
-      <w:pPr>
-        <w:ind w:left="-6"/>
+      </w:pPr>
+      <w:r>
         <w:rPr>
           <w:i/>
           <w:iCs/>
           <w:sz w:val="18"/>
           <w:szCs w:val="18"/>
         </w:rPr>
-      </w:pPr>
+        <w:t>(c)</w:t>
+      </w:r>
       <w:r>
         <w:rPr>
           <w:i/>
@@ -6499,7 +7450,7 @@
           <w:sz w:val="18"/>
           <w:szCs w:val="18"/>
         </w:rPr>
-        <w:t>(c)</w:t>
+        <w:t>.</w:t>
       </w:r>
       <w:r>
         <w:rPr>
@@ -6508,7 +7459,7 @@
           <w:sz w:val="18"/>
           <w:szCs w:val="18"/>
         </w:rPr>
-        <w:t>.</w:t>
+        <w:t xml:space="preserve"> </w:t>
       </w:r>
       <w:r>
         <w:rPr>
@@ -6517,17 +7468,19 @@
           <w:sz w:val="18"/>
           <w:szCs w:val="18"/>
         </w:rPr>
-        <w:t xml:space="preserve"> </w:t>
-      </w:r>
-      <w:r>
+        <w:t>Parameter-wise scales of action space used in training</w:t>
+      </w:r>
+    </w:p>
+    <w:p>
+      <w:pPr>
+        <w:ind w:left="-6"/>
         <w:rPr>
           <w:i/>
           <w:iCs/>
           <w:sz w:val="18"/>
           <w:szCs w:val="18"/>
         </w:rPr>
-        <w:t>Parameter-wise scales of action space used in training</w:t>
-      </w:r>
+      </w:pPr>
     </w:p>
     <w:p>
       <w:pPr>
@@ -6537,21 +7490,245 @@
           <w:numId w:val="15"/>
         </w:numPr>
         <w:ind w:left="426"/>
-      </w:pPr>
-      <w:r>
-        <w:t>AI Agent</w:t>
+        <w:rPr>
+          <w:i/>
+          <w:iCs/>
+        </w:rPr>
+      </w:pPr>
+      <w:r>
+        <w:rPr>
+          <w:i/>
+          <w:iCs/>
+        </w:rPr>
+        <w:t>AI Agent Framework</w:t>
+      </w:r>
+    </w:p>
+    <w:p>
+      <w:pPr>
+        <w:ind w:left="-6"/>
+      </w:pPr>
+      <w:r>
+        <w:t xml:space="preserve">The cognitive layer of the optimization framework is </w:t>
+      </w:r>
+      <w:r>
+        <w:t>created</w:t>
+      </w:r>
+      <w:r>
+        <w:t xml:space="preserve"> as a multi-agent system powered by large language models (LLMs)</w:t>
+      </w:r>
+      <w:r>
+        <w:t>.</w:t>
+      </w:r>
+      <w:r>
+        <w:t xml:space="preserve"> </w:t>
+      </w:r>
+      <w:r>
+        <w:t xml:space="preserve">For this study, we have mainly used NVIDIA Nemotron 3 Nano 30B A3B model which is open-source by nature. </w:t>
+      </w:r>
+      <w:r>
+        <w:t>Th</w:t>
+      </w:r>
+      <w:r>
+        <w:t>e</w:t>
+      </w:r>
+      <w:r>
+        <w:t xml:space="preserve"> design shifts the </w:t>
+      </w:r>
+      <w:r>
+        <w:t>architype</w:t>
+      </w:r>
+      <w:r>
+        <w:t xml:space="preserve"> from purely numerical optimization to a hybrid Reasoning and Action (ReAct) framework, where the black-box decisions of the Reinforcement Learning (RL) agent are contextualized through expert-level engineering narratives. The design utilizes a modular BaseAgent class that implements system prompting to define specific professional identities, ensuring that the model’s latent knowledge is channeled through domain-specific constraints. By utilizing LLMs as reasoning engines within a chemical process context, the </w:t>
+      </w:r>
+      <w:r>
+        <w:lastRenderedPageBreak/>
+        <w:t>system overcomes the interpretability gap inherent in deep learning, providing what is termed Explainable AI (XAI) for complex refinery operations (Zheng et al., 2024).</w:t>
+      </w:r>
+    </w:p>
+    <w:p>
+      <w:pPr>
+        <w:ind w:left="-6"/>
+      </w:pPr>
+    </w:p>
+    <w:p>
+      <w:pPr>
+        <w:pStyle w:val="ListParagraph"/>
+        <w:numPr>
+          <w:ilvl w:val="1"/>
+          <w:numId w:val="15"/>
+        </w:numPr>
+        <w:ind w:left="426"/>
+        <w:rPr>
+          <w:i/>
+          <w:iCs/>
+        </w:rPr>
+      </w:pPr>
+      <w:r>
+        <w:rPr>
+          <w:i/>
+          <w:iCs/>
+        </w:rPr>
+        <w:t>Individual agent personas</w:t>
+      </w:r>
+    </w:p>
+    <w:p>
+      <w:r>
+        <w:t xml:space="preserve">The system is </w:t>
+      </w:r>
+      <w:r>
+        <w:t>divided</w:t>
+      </w:r>
+      <w:r>
+        <w:t xml:space="preserve"> into three specialized individual agents, each addressing a critical dimension of the three-column distillation sequence (ADU, NSU, and VDU).</w:t>
+      </w:r>
+      <w:r>
+        <w:t xml:space="preserve"> </w:t>
+      </w:r>
+      <w:r>
+        <w:t>The Process Engineer Agent</w:t>
+      </w:r>
+      <w:r>
+        <w:t xml:space="preserve"> </w:t>
+      </w:r>
+      <w:r>
+        <w:t>is designed for hol</w:t>
+      </w:r>
+      <w:r>
+        <w:t>i</w:t>
+      </w:r>
+      <w:r>
+        <w:t>stic system analysis, focusing on the 13 product streams and their respective ASTM D95% boiling point specifications. It evaluates the RL agent's setpoint adjustments against physical constraints and economic objectives, ensuring that profit maximization does not compromise product quality (Wang et al., 2023).</w:t>
+      </w:r>
+      <w:r>
+        <w:t xml:space="preserve"> </w:t>
+      </w:r>
+      <w:r>
+        <w:t>The Corrosion Expert Agent</w:t>
+      </w:r>
+      <w:r>
+        <w:t>, s</w:t>
+      </w:r>
+      <w:r>
+        <w:t>pecifically targeted at the ADU overhead system, monitors variables associated with dew point corrosion and ammonium chloride salt deposition. The Daily Report Developer</w:t>
+      </w:r>
+      <w:r>
+        <w:t xml:space="preserve">, </w:t>
+      </w:r>
+      <w:r>
+        <w:t>serves as the data synthesizer, transforming high-frequency operational data and RL performance metrics into structured executive summaries. This modularity ensures that the computational load is distributed and that each agent operates within a specific knowledge silo to minimize hallucinations and maximize technical accuracy (Mao et al., 2023).</w:t>
+      </w:r>
+    </w:p>
+    <w:p/>
+    <w:p>
+      <w:pPr>
+        <w:pStyle w:val="ListParagraph"/>
+        <w:numPr>
+          <w:ilvl w:val="1"/>
+          <w:numId w:val="15"/>
+        </w:numPr>
+        <w:ind w:left="426"/>
+      </w:pPr>
+      <w:r>
+        <w:t>Multi-agent orchestration</w:t>
+      </w:r>
+    </w:p>
+    <w:p>
+      <w:pPr>
+        <w:ind w:left="-6"/>
+      </w:pPr>
+      <w:r>
+        <w:t>For</w:t>
+      </w:r>
+      <w:r>
+        <w:t xml:space="preserve"> synchroniz</w:t>
+      </w:r>
+      <w:r>
+        <w:t>ing</w:t>
+      </w:r>
+      <w:r>
+        <w:t xml:space="preserve"> the outputs of the individual agents, a centralized Orchestrator component was developed. The Orchestrator </w:t>
+      </w:r>
+      <w:r>
+        <w:t>is meant to man</w:t>
+      </w:r>
+      <w:r>
+        <w:t>a</w:t>
+      </w:r>
+      <w:r>
+        <w:t>ge</w:t>
+      </w:r>
+      <w:r>
+        <w:t xml:space="preserve"> the flow of information through a compact context mechanism, which aggregates the </w:t>
+      </w:r>
+      <w:r>
+        <w:t xml:space="preserve">high </w:t>
+      </w:r>
+      <w:r>
+        <w:t xml:space="preserve">dimensional state vector from the simulation, current market prices, and RL training logs into a serialized format digestible by the LLM's context window. The Orchestrator performs three primary </w:t>
+      </w:r>
+      <w:r>
+        <w:t xml:space="preserve">functions: conflict resolution between agent recommendations, synthesized comprehensive analysis, and human-in-the-loop (HITL) facilitation. When the Process Engineer suggests a setpoint change for yield, the Orchestrator cross-references this with the Corrosion Expert’s safety constraints before presenting a final validated action to the operator. This hierarchical structure mirrors industrial command-and-control systems, ensuring that autonomous decisions remain within the </w:t>
+      </w:r>
+      <w:r>
+        <w:t>safe operating regime</w:t>
+      </w:r>
+      <w:r>
+        <w:t xml:space="preserve"> of established engineering principles (Zhang et al., 2023).</w:t>
+      </w:r>
+    </w:p>
+    <w:p>
+      <w:pPr>
+        <w:ind w:left="-6"/>
+      </w:pPr>
+    </w:p>
+    <w:p>
+      <w:pPr>
+        <w:pStyle w:val="ListParagraph"/>
+        <w:numPr>
+          <w:ilvl w:val="1"/>
+          <w:numId w:val="15"/>
+        </w:numPr>
+        <w:ind w:left="426"/>
+      </w:pPr>
+      <w:r>
+        <w:t>Technical validation of Agents</w:t>
+      </w:r>
+    </w:p>
+    <w:p>
+      <w:pPr>
+        <w:ind w:left="-6"/>
+      </w:pPr>
+      <w:r>
+        <w:t xml:space="preserve">The methodology incorporates a deterministic validation layer that operates alongside the agentic reasoning. Before any LLM-generated recommendation is logged, the Orchestrator executes a suite of </w:t>
       </w:r>
       <w:r>
         <w:t>s</w:t>
       </w:r>
       <w:r>
-        <w:t xml:space="preserve"> Creation</w:t>
-      </w:r>
-    </w:p>
-    <w:p>
-      <w:pPr>
-        <w:ind w:left="-6"/>
-      </w:pPr>
+        <w:t xml:space="preserve">anity </w:t>
+      </w:r>
+      <w:r>
+        <w:t>c</w:t>
+      </w:r>
+      <w:r>
+        <w:t xml:space="preserve">hecks—hard-coded </w:t>
+      </w:r>
+      <w:r>
+        <w:t>algorithmic</w:t>
+      </w:r>
+      <w:r>
+        <w:t xml:space="preserve"> logic that verifies mass balances and thermal limits. This prevents the </w:t>
+      </w:r>
+      <w:r>
+        <w:rPr>
+          <w:i/>
+          <w:iCs/>
+        </w:rPr>
+        <w:t>stochastic parrot</w:t>
+      </w:r>
+      <w:r>
+        <w:t xml:space="preserve"> effect, where an LLM might generate a grammatically correct but physically impossible engineering instruction. </w:t>
+      </w:r>
     </w:p>
     <w:p>
       <w:pPr>
@@ -6573,382 +7750,54 @@
     </w:p>
     <w:p>
       <w:r>
-        <w:t xml:space="preserve">This section of your final report should describe how your model/system performed and provide </w:t>
-      </w:r>
-      <w:r>
-        <w:lastRenderedPageBreak/>
-        <w:t xml:space="preserve">evidence for how your work did or did not support your experimental hypothesis or solve your chosen problem. The reader should be able to answer the following questions: </w:t>
-      </w:r>
-    </w:p>
+        <w:t>The results of the multi-agent reinforcement learning (RL) framework demonstrate a high degree of effectiveness in optimizing the three-column distillation sequence, with significant improvements in economic yield and operational stability. The following sections evaluate the performance of the Proximal Policy Optimization (PPO), Soft Actor-Critic (SAC), and Twin Delayed Deep Deterministic Policy Gradient (TD3) architectures against the experimental hypotheses.</w:t>
+      </w:r>
+    </w:p>
+    <w:p/>
+    <w:p/>
     <w:p>
       <w:pPr>
         <w:pStyle w:val="ListParagraph"/>
         <w:numPr>
           <w:ilvl w:val="0"/>
-          <w:numId w:val="7"/>
+          <w:numId w:val="17"/>
         </w:numPr>
-      </w:pPr>
-      <w:r>
-        <w:t xml:space="preserve">How effective was your machine learning model at learning the task? e.g. Did the model overfit/underfit the training data? What does the training accuracy/loss curve look like for your model? </w:t>
-      </w:r>
+        <w:rPr>
+          <w:vanish/>
+        </w:rPr>
+      </w:pPr>
     </w:p>
     <w:p>
       <w:pPr>
         <w:pStyle w:val="ListParagraph"/>
         <w:numPr>
           <w:ilvl w:val="0"/>
-          <w:numId w:val="7"/>
+          <w:numId w:val="17"/>
         </w:numPr>
-      </w:pPr>
-      <w:r>
-        <w:t xml:space="preserve">If your project is focused on answering a research question, what evidence do you have to support or disprove your hypothesis? </w:t>
-      </w:r>
+        <w:rPr>
+          <w:vanish/>
+        </w:rPr>
+      </w:pPr>
     </w:p>
     <w:p>
       <w:pPr>
         <w:pStyle w:val="ListParagraph"/>
         <w:numPr>
-          <w:ilvl w:val="0"/>
-          <w:numId w:val="7"/>
+          <w:ilvl w:val="1"/>
+          <w:numId w:val="17"/>
         </w:numPr>
-      </w:pPr>
-      <w:r>
-        <w:t xml:space="preserve">If your project is focused on solving a problem, how will your model performance affect the application of your model to that problem? </w:t>
-      </w:r>
-    </w:p>
-    <w:p>
-      <w:pPr>
-        <w:pStyle w:val="ListParagraph"/>
-        <w:numPr>
-          <w:ilvl w:val="0"/>
-          <w:numId w:val="7"/>
-        </w:numPr>
-        <w:rPr>
-          <w:rFonts w:eastAsia="Times New Roman"/>
-        </w:rPr>
-      </w:pPr>
-      <w:r>
-        <w:t>If your project is focused on implementing a complete machine learning system, what is the user experience? Are there any delays or remaining bugs that affect your model output either in common or edge use cases?</w:t>
-      </w:r>
-    </w:p>
-    <w:p>
-      <w:pPr>
-        <w:pStyle w:val="Heading1"/>
-        <w:rPr>
-          <w:rFonts w:asciiTheme="majorBidi" w:hAnsiTheme="majorBidi"/>
-          <w:sz w:val="24"/>
-          <w:szCs w:val="24"/>
-        </w:rPr>
-      </w:pPr>
-      <w:r>
-        <w:t>6</w:t>
-      </w:r>
-      <w:r>
-        <w:tab/>
-        <w:t>Conclusion</w:t>
-      </w:r>
-    </w:p>
-    <w:p>
-      <w:pPr>
-        <w:spacing w:before="20"/>
-        <w:rPr>
-          <w:rFonts w:asciiTheme="majorBidi" w:hAnsiTheme="majorBidi" w:cstheme="majorBidi"/>
-        </w:rPr>
-      </w:pPr>
-      <w:r>
-        <w:rPr>
-          <w:rFonts w:cstheme="majorBidi"/>
-        </w:rPr>
-        <w:t>This section of your final report should provide a very brief summary of your entire project. It should highlight the most interesting or significant results and discuss any future work that you or another researcher might do. The reader should be able to answer the following questions:</w:t>
-      </w:r>
-    </w:p>
-    <w:p>
-      <w:pPr>
-        <w:pStyle w:val="ListParagraph"/>
-        <w:numPr>
-          <w:ilvl w:val="0"/>
-          <w:numId w:val="8"/>
-        </w:numPr>
-        <w:spacing w:before="240" w:after="240" w:line="240" w:lineRule="auto"/>
-      </w:pPr>
-      <w:r>
-        <w:rPr>
-          <w:rFonts w:eastAsia="Times New Roman"/>
-        </w:rPr>
-        <w:t>What was the main hypothesis or goal of the project, and how did your models perform in relation to this hypothesis/goal?</w:t>
-      </w:r>
-    </w:p>
-    <w:p>
-      <w:pPr>
-        <w:pStyle w:val="ListParagraph"/>
-        <w:numPr>
-          <w:ilvl w:val="0"/>
-          <w:numId w:val="8"/>
-        </w:numPr>
-        <w:spacing w:before="240" w:after="240" w:line="240" w:lineRule="auto"/>
-      </w:pPr>
-      <w:r>
-        <w:rPr>
-          <w:rFonts w:eastAsia="Times New Roman"/>
-        </w:rPr>
-        <w:t>What was the most interesting or significant result of your project?</w:t>
-      </w:r>
-    </w:p>
-    <w:p>
-      <w:pPr>
-        <w:pStyle w:val="ListParagraph"/>
-        <w:numPr>
-          <w:ilvl w:val="0"/>
-          <w:numId w:val="8"/>
-        </w:numPr>
-        <w:spacing w:before="240" w:after="240" w:line="240" w:lineRule="auto"/>
-      </w:pPr>
-      <w:r>
-        <w:rPr>
-          <w:rFonts w:eastAsia="Times New Roman"/>
-        </w:rPr>
-        <w:t>Did your model training or performance bring about any unexpected results?</w:t>
-      </w:r>
-    </w:p>
-    <w:p>
-      <w:pPr>
-        <w:pStyle w:val="ListParagraph"/>
-        <w:numPr>
-          <w:ilvl w:val="0"/>
-          <w:numId w:val="8"/>
-        </w:numPr>
-        <w:spacing w:before="240" w:after="240" w:line="240" w:lineRule="auto"/>
-        <w:rPr>
-          <w:rFonts w:eastAsia="Times New Roman"/>
-          <w:color w:val="000000"/>
-          <w:shd w:val="clear" w:color="auto" w:fill="CFE2F3"/>
-        </w:rPr>
-      </w:pPr>
-      <w:r>
-        <w:rPr>
-          <w:rFonts w:eastAsia="Times New Roman"/>
-        </w:rPr>
-        <w:t xml:space="preserve">If you were to continue this project, what would your next steps be? For example, would you continue to optimize your model </w:t>
-      </w:r>
-      <w:r>
-        <w:rPr>
-          <w:rFonts w:eastAsia="Times New Roman"/>
-        </w:rPr>
-        <w:t>or try other model architectures? Would you change or expand the data used in your model? What steps need to be taken to “productionize” your model?</w:t>
-      </w:r>
-    </w:p>
-    <w:p>
-      <w:pPr>
-        <w:pStyle w:val="Heading1"/>
-        <w:rPr>
-          <w:highlight w:val="yellow"/>
-        </w:rPr>
-      </w:pPr>
-      <w:r>
-        <w:rPr>
-          <w:highlight w:val="yellow"/>
-        </w:rPr>
-        <w:t>7</w:t>
-      </w:r>
-      <w:r>
-        <w:tab/>
-      </w:r>
-      <w:r>
-        <w:rPr>
-          <w:highlight w:val="yellow"/>
-        </w:rPr>
-        <w:t>FORMATTING EXAMPLES</w:t>
-      </w:r>
-    </w:p>
-    <w:p>
-      <w:pPr>
-        <w:rPr>
-          <w:highlight w:val="yellow"/>
-        </w:rPr>
-      </w:pPr>
-      <w:r>
-        <w:rPr>
-          <w:highlight w:val="yellow"/>
-        </w:rPr>
-        <w:t>DELETE THIS SECTION BEFORE FINAL SUBMISSION</w:t>
-      </w:r>
-    </w:p>
-    <w:p>
-      <w:pPr>
-        <w:pStyle w:val="Heading2"/>
-      </w:pPr>
-      <w:r>
-        <w:t>7.1</w:t>
-      </w:r>
-      <w:r>
-        <w:tab/>
-        <w:t>General Formatting</w:t>
-      </w:r>
-    </w:p>
-    <w:p>
-      <w:pPr>
-        <w:rPr>
-          <w:rFonts w:eastAsia="Times New Roman" w:cs="Times New Roman"/>
-        </w:rPr>
-      </w:pPr>
-      <w:r>
-        <w:rPr>
-          <w:rFonts w:eastAsia="Times New Roman" w:cs="Times New Roman"/>
-        </w:rPr>
-        <w:t>A formal report of this type should be primarily in paragraph form, with minimal subheadings, bullet points, or numbered lists. For most of your required report sections, no subheadings will be necessary, and the information can be presented as a single, cohesive discussion of the content relevant to that section. As a general rule of thumb, bulleted or numbered lists are only appropriate in this kind of report if the list items are less than one sentence, but are too long/detailed to be presented in a table.</w:t>
-      </w:r>
-    </w:p>
-    <w:p>
-      <w:r>
-        <w:t>If you feel strongly that your content would benefit from subheadings or bulleted/numbered lists, they should follow the formatting examples used in this section.</w:t>
-      </w:r>
-    </w:p>
-    <w:p>
-      <w:pPr>
-        <w:pStyle w:val="Heading2"/>
-      </w:pPr>
-      <w:r>
-        <w:t>7.2</w:t>
-      </w:r>
-      <w:r>
-        <w:tab/>
-        <w:t>In-text Citations</w:t>
-      </w:r>
-    </w:p>
-    <w:p>
-      <w:pPr>
-        <w:rPr>
-          <w:rFonts w:eastAsia="Times New Roman" w:cs="Times New Roman"/>
-        </w:rPr>
-      </w:pPr>
-      <w:r>
-        <w:rPr>
-          <w:rFonts w:eastAsia="Times New Roman" w:cs="Times New Roman"/>
-        </w:rPr>
-        <w:t xml:space="preserve">A report of this type should be heavily supported by in-text citations. You should include a new supporting citation in each section for: </w:t>
-      </w:r>
-    </w:p>
-    <w:p>
-      <w:pPr>
-        <w:pStyle w:val="ListParagraph"/>
-        <w:spacing w:before="240" w:after="240"/>
-        <w:ind w:hanging="360"/>
-        <w:rPr>
-          <w:rFonts w:eastAsia="Times New Roman"/>
-        </w:rPr>
-      </w:pPr>
-      <w:r>
-        <w:rPr>
-          <w:rFonts w:eastAsia="Times New Roman"/>
-        </w:rPr>
-        <w:t>The first time that you mention a specific code library or dataset,</w:t>
-      </w:r>
-    </w:p>
-    <w:p>
-      <w:pPr>
-        <w:pStyle w:val="ListParagraph"/>
-        <w:spacing w:before="240" w:after="240"/>
-        <w:ind w:hanging="360"/>
-        <w:rPr>
-          <w:rFonts w:eastAsia="Times New Roman"/>
-        </w:rPr>
-      </w:pPr>
-      <w:r>
-        <w:rPr>
-          <w:rFonts w:eastAsia="Times New Roman"/>
-        </w:rPr>
-        <w:t>The first time that you introduce a pre-trained model or model architecture,</w:t>
-      </w:r>
-    </w:p>
-    <w:p>
-      <w:pPr>
-        <w:pStyle w:val="ListParagraph"/>
-        <w:spacing w:before="240" w:after="240"/>
-        <w:ind w:hanging="360"/>
-        <w:rPr>
-          <w:rFonts w:eastAsia="Times New Roman"/>
-        </w:rPr>
-      </w:pPr>
-      <w:r>
-        <w:rPr>
-          <w:rFonts w:eastAsia="Times New Roman"/>
-        </w:rPr>
-        <w:t>Any information that is not your own original thought/idea, even if you didn't need to look it up.</w:t>
-      </w:r>
-    </w:p>
-    <w:p>
-      <w:pPr>
-        <w:rPr>
-          <w:rFonts w:eastAsia="Times New Roman" w:cs="Times New Roman"/>
-        </w:rPr>
-      </w:pPr>
-      <w:r>
-        <w:rPr>
-          <w:rFonts w:eastAsia="Times New Roman" w:cs="Times New Roman"/>
-        </w:rPr>
-        <w:t>When in doubt, it is always better to over-cite than to under-cite.</w:t>
-      </w:r>
-    </w:p>
-    <w:p>
-      <w:pPr>
-        <w:rPr>
-          <w:rFonts w:eastAsia="Times New Roman" w:cs="Times New Roman"/>
-        </w:rPr>
-      </w:pPr>
-      <w:r>
-        <w:rPr>
-          <w:rFonts w:eastAsia="Times New Roman" w:cs="Times New Roman"/>
-        </w:rPr>
-        <w:lastRenderedPageBreak/>
-        <w:t>Formatting rules for in-text citations can be found in the APA guidelines, but examples of the three most common uses are discussed in the following paragraphs.</w:t>
-      </w:r>
-    </w:p>
-    <w:p>
-      <w:r>
+        <w:ind w:left="426"/>
         <w:rPr>
           <w:i/>
           <w:iCs/>
         </w:rPr>
-        <w:t>Parenthetical citations at the end of a sentence</w:t>
-      </w:r>
-      <w:r>
-        <w:t xml:space="preserve"> should be used when the information from the entire sentence comes from the cited source (American Psychological Association, 2025).</w:t>
-      </w:r>
-    </w:p>
-    <w:p>
+      </w:pPr>
       <w:r>
         <w:rPr>
           <w:i/>
           <w:iCs/>
         </w:rPr>
-        <w:t>Parenthetical citations mid-sentence</w:t>
-      </w:r>
-      <w:r>
-        <w:t xml:space="preserve"> should be used when only a part of the sentence comes from the cited source, or when you are providing a citation for something specific such as a company, model architecture/method, or technique. See the following examples for a sentence with multiple mid-sentence citations and a sentence with a specific mid-sentence citation below:</w:t>
-      </w:r>
-    </w:p>
-    <w:p>
-      <w:pPr>
-        <w:pStyle w:val="ListParagraph"/>
-        <w:numPr>
-          <w:ilvl w:val="0"/>
-          <w:numId w:val="9"/>
-        </w:numPr>
-      </w:pPr>
-      <w:r>
-        <w:t>The transformer model was introduced in 2017 for the application of machine translation (Vaswani et al., 2017) and quickly became the most common backbone for today’s large language models (Devlin et al., 2019; Radford et al., 2019).</w:t>
-      </w:r>
-    </w:p>
-    <w:p>
-      <w:pPr>
-        <w:pStyle w:val="ListParagraph"/>
-        <w:numPr>
-          <w:ilvl w:val="0"/>
-          <w:numId w:val="9"/>
-        </w:numPr>
-      </w:pPr>
-      <w:r>
-        <w:t>As one of the first transformer-based generative text models, OpenAI’s GPT (Radford et al., 2019) quickly became the standard large language architecture used for generative tasks.</w:t>
+        <w:t>Performance &amp; Learning Dynamics</w:t>
       </w:r>
     </w:p>
     <w:p>
@@ -6958,94 +7807,76 @@
           <w:ilvl w:val="0"/>
           <w:numId w:val="0"/>
         </w:numPr>
-        <w:ind w:left="720"/>
-      </w:pPr>
-    </w:p>
-    <w:p>
-      <w:r>
-        <w:rPr>
-          <w:i/>
-          <w:iCs/>
-        </w:rPr>
-        <w:t>Narrative in-text citations</w:t>
-      </w:r>
-      <w:r>
-        <w:t xml:space="preserve"> can be used when you want to include the name of the author(s) in your main text, as shown in the following example:</w:t>
-      </w:r>
-    </w:p>
-    <w:p>
-      <w:pPr>
-        <w:ind w:left="720"/>
-      </w:pPr>
-      <w:r>
-        <w:t>Vaswani et al. (2017) originally developed the transformer architecture for the application of machine translation.</w:t>
-      </w:r>
-    </w:p>
-    <w:p>
-      <w:pPr>
-        <w:pStyle w:val="Heading2"/>
-      </w:pPr>
-      <w:r>
-        <w:t>7.3</w:t>
-      </w:r>
-      <w:r>
-        <w:tab/>
-        <w:t>Figures, Tables, and Equations</w:t>
-      </w:r>
-    </w:p>
-    <w:p>
-      <w:r>
-        <w:t xml:space="preserve">Most of your supporting content should be included in the main text of the report, rather than at the end. While the in-line formatting can be a </w:t>
-      </w:r>
-      <w:r>
-        <w:t>headache, this makes it easier for your reader to reference your figures and tables while reading, without having to scroll back and forth too much. See Section 7.5 for more details about how to properly use appendices for supplemental information.</w:t>
-      </w:r>
-    </w:p>
-    <w:p>
-      <w:pPr>
-        <w:pStyle w:val="Heading3"/>
-      </w:pPr>
-      <w:r>
-        <w:t>7.3.1</w:t>
-      </w:r>
-      <w:r>
-        <w:tab/>
-        <w:t>Figures</w:t>
-      </w:r>
-    </w:p>
-    <w:p>
-      <w:r>
-        <w:t xml:space="preserve">Figures should be numbered sequentially </w:t>
-      </w:r>
-      <w:r>
-        <w:rPr>
-          <w:i/>
-          <w:iCs/>
-        </w:rPr>
-        <w:t>below</w:t>
-      </w:r>
-      <w:r>
-        <w:t xml:space="preserve"> the image and referred to directly in your text (e.g. “As seen in Figure 7.1 [...]”, “Figure 7.1 shows [...]”). If your figure is important enough to include in your report, then it deserves at least one sentence of discussion in the text. </w:t>
-      </w:r>
-    </w:p>
-    <w:p>
-      <w:r>
-        <w:t>Each figure should also have a corresponding caption that briefly describes the content of the figure and can be used to highlight important details. If your figure is too complex to be limited to a single column width, you can include it as a full-width image at the top of the page.</w:t>
-      </w:r>
-    </w:p>
-    <w:p>
-      <w:pPr>
-        <w:pStyle w:val="Caption"/>
-      </w:pPr>
-      <w:r>
-        <w:rPr>
-          <w:noProof/>
-        </w:rPr>
+        <w:ind w:left="426"/>
+      </w:pPr>
+    </w:p>
+    <w:p>
+      <w:r>
+        <w:t>The learning curves for the three RL agents</w:t>
+      </w:r>
+      <w:r>
+        <w:t xml:space="preserve"> shown in Fig</w:t>
+      </w:r>
+      <w:r>
+        <w:t xml:space="preserve"> </w:t>
+      </w:r>
+      <w:r>
+        <w:t xml:space="preserve">6. </w:t>
+      </w:r>
+      <w:r>
+        <w:t>indicate successful convergence within the training horizon, characterized by a steady increase in cumulative rewards and a corresponding reduction in the standard deviation of action outputs. The SAC agent exhibited the most robust exploration-exploitation balance, attributed to its maximum entropy objective which prevents premature policy collapse in high-dimensional action spaces</w:t>
+      </w:r>
+      <w:r>
+        <w:t>, as can be seen in Fig 7</w:t>
+      </w:r>
+      <w:r>
+        <w:t>. Conversely, the PPO agent displayed the highest stability in reward accumulation, maintaining a consistent update trajectory without the volatility often associated with off-policy gradient updates.</w:t>
+      </w:r>
+      <w:r>
+        <w:t xml:space="preserve"> </w:t>
+      </w:r>
+      <w:r>
+        <w:t>Analysis of the loss curves revealed that the critic networks effectively approximated the value function of the 37-dimensional state space, with mean Q-values stabilizing as training progressed. While some initial oscillations were observed in the actor loss—typical of the warm-up period in continuous control tasks—the gradient norms remained within acceptable bounds (</w:t>
+      </w:r>
+      <w:r>
+        <w:t xml:space="preserve">&lt;1.0 </w:t>
+      </w:r>
+      <w:r>
+        <w:t>for the actor), indicating that the clipping mechanisms and target smoothing effectively prevented gradient explosion. Th</w:t>
+      </w:r>
+      <w:r>
+        <w:t>e</w:t>
+      </w:r>
+      <w:r>
+        <w:t xml:space="preserve"> </w:t>
+      </w:r>
+      <w:r>
+        <w:t xml:space="preserve">observed </w:t>
+      </w:r>
+      <w:r>
+        <w:t xml:space="preserve">performance </w:t>
+      </w:r>
+      <w:r>
+        <w:t>suggests</w:t>
+      </w:r>
+      <w:r>
+        <w:t xml:space="preserve"> that actor-critic architectures are superior to traditional PID or </w:t>
+      </w:r>
+      <w:r>
+        <w:t>A</w:t>
+      </w:r>
+      <w:r>
+        <w:t>PC systems for handling the non-linearities of multi-stage distillation.</w:t>
+      </w:r>
+    </w:p>
+    <w:p/>
+    <w:p>
+      <w:r>
         <w:drawing>
-          <wp:inline distT="0" distB="0" distL="0" distR="0" wp14:anchorId="09E97ADB" wp14:editId="5D1ACF3E">
-            <wp:extent cx="3048000" cy="1781175"/>
-            <wp:effectExtent l="0" t="0" r="0" b="0"/>
-            <wp:docPr id="1" name="image1.jpg" descr="Abstract particle graph background"/>
+          <wp:inline distT="0" distB="0" distL="0" distR="0" wp14:anchorId="237E9283" wp14:editId="47C1236F">
+            <wp:extent cx="3075305" cy="1022350"/>
+            <wp:effectExtent l="0" t="0" r="0" b="6350"/>
+            <wp:docPr id="401147325" name="Picture 1"/>
             <wp:cNvGraphicFramePr>
               <a:graphicFrameLocks xmlns:a="http://schemas.openxmlformats.org/drawingml/2006/main" noChangeAspect="1"/>
             </wp:cNvGraphicFramePr>
@@ -7053,10 +7884,8 @@
               <a:graphicData uri="http://schemas.openxmlformats.org/drawingml/2006/picture">
                 <pic:pic xmlns:pic="http://schemas.openxmlformats.org/drawingml/2006/picture">
                   <pic:nvPicPr>
-                    <pic:cNvPr id="1" name="image1.jpg" descr="Abstract particle graph background"/>
-                    <pic:cNvPicPr>
-                      <a:picLocks noChangeAspect="1" noChangeArrowheads="1"/>
-                    </pic:cNvPicPr>
+                    <pic:cNvPr id="401147325" name=""/>
+                    <pic:cNvPicPr/>
                   </pic:nvPicPr>
                   <pic:blipFill>
                     <a:blip r:embed="rId26"/>
@@ -7064,10 +7893,10 @@
                       <a:fillRect/>
                     </a:stretch>
                   </pic:blipFill>
-                  <pic:spPr bwMode="auto">
+                  <pic:spPr>
                     <a:xfrm>
                       <a:off x="0" y="0"/>
-                      <a:ext cx="3048000" cy="1781175"/>
+                      <a:ext cx="3075305" cy="1022350"/>
                     </a:xfrm>
                     <a:prstGeom prst="rect">
                       <a:avLst/>
@@ -7079,411 +7908,1779 @@
           </wp:inline>
         </w:drawing>
       </w:r>
-      <w:r>
-        <w:t>Figure 7.1</w:t>
-      </w:r>
-    </w:p>
-    <w:p>
-      <w:pPr>
-        <w:pStyle w:val="Caption"/>
-      </w:pPr>
-      <w:r>
-        <w:t>Example text: Model accuracy for our six models during training. The best performing model is shown in red.</w:t>
-      </w:r>
-    </w:p>
-    <w:p>
-      <w:pPr>
-        <w:pStyle w:val="Heading3"/>
-      </w:pPr>
-      <w:r>
-        <w:t>7.3.2</w:t>
-      </w:r>
-      <w:r>
-        <w:tab/>
-        <w:t>Tables</w:t>
-      </w:r>
-    </w:p>
-    <w:p>
-      <w:r>
-        <w:t xml:space="preserve">Tables should be numbered sequentially above the table and should have an in-text mention and a descriptive caption, like the figure examples given above. </w:t>
-      </w:r>
-    </w:p>
-    <w:p>
-      <w:r>
-        <w:t xml:space="preserve">Feel free to improve the default MS Word table formatting shown here for aesthetic appeal (e.g. change cell size, border width, font size, etc.). If </w:t>
-      </w:r>
-      <w:r>
-        <w:lastRenderedPageBreak/>
-        <w:t>you have a favorite table formatting tool (e.g. LaTeX, Pandas pretty print, etc.), feel free to use that and include the output as an image. However, please ensure that the image quality is legible and the formatting generally matches the rest of the report, and DO NOT include screenshots of raw code output—it is not professional to include dark mode or Courier New code output, or screenshots of your console window.</w:t>
-      </w:r>
-    </w:p>
-    <w:p>
-      <w:pPr>
-        <w:pStyle w:val="Caption"/>
-        <w:rPr>
-          <w:sz w:val="24"/>
-          <w:szCs w:val="24"/>
-        </w:rPr>
-      </w:pPr>
-      <w:r>
-        <w:t>Table 7.1</w:t>
-      </w:r>
-    </w:p>
-    <w:p>
-      <w:pPr>
-        <w:pStyle w:val="Caption"/>
+    </w:p>
+    <w:p>
+      <w:r>
+        <w:drawing>
+          <wp:inline distT="0" distB="0" distL="0" distR="0" wp14:anchorId="6D3B69F9" wp14:editId="5C947BC2">
+            <wp:extent cx="3075305" cy="941070"/>
+            <wp:effectExtent l="0" t="0" r="0" b="0"/>
+            <wp:docPr id="684919525" name="Picture 1"/>
+            <wp:cNvGraphicFramePr>
+              <a:graphicFrameLocks xmlns:a="http://schemas.openxmlformats.org/drawingml/2006/main" noChangeAspect="1"/>
+            </wp:cNvGraphicFramePr>
+            <a:graphic xmlns:a="http://schemas.openxmlformats.org/drawingml/2006/main">
+              <a:graphicData uri="http://schemas.openxmlformats.org/drawingml/2006/picture">
+                <pic:pic xmlns:pic="http://schemas.openxmlformats.org/drawingml/2006/picture">
+                  <pic:nvPicPr>
+                    <pic:cNvPr id="684919525" name=""/>
+                    <pic:cNvPicPr/>
+                  </pic:nvPicPr>
+                  <pic:blipFill>
+                    <a:blip r:embed="rId27"/>
+                    <a:stretch>
+                      <a:fillRect/>
+                    </a:stretch>
+                  </pic:blipFill>
+                  <pic:spPr>
+                    <a:xfrm>
+                      <a:off x="0" y="0"/>
+                      <a:ext cx="3075305" cy="941070"/>
+                    </a:xfrm>
+                    <a:prstGeom prst="rect">
+                      <a:avLst/>
+                    </a:prstGeom>
+                  </pic:spPr>
+                </pic:pic>
+              </a:graphicData>
+            </a:graphic>
+          </wp:inline>
+        </w:drawing>
+      </w:r>
+    </w:p>
+    <w:p>
+      <w:pPr>
         <w:rPr>
           <w:i/>
           <w:iCs/>
-          <w:sz w:val="24"/>
-          <w:szCs w:val="24"/>
-        </w:rPr>
-      </w:pPr>
-      <w:r>
-        <w:t xml:space="preserve">Example text: Results for all three models over the standard benchmarking metrics. Highlighted cells show the best performance for each metric. </w:t>
-      </w:r>
+          <w:sz w:val="18"/>
+          <w:szCs w:val="18"/>
+        </w:rPr>
+      </w:pPr>
+      <w:r>
+        <w:rPr>
+          <w:i/>
+          <w:iCs/>
+          <w:sz w:val="18"/>
+          <w:szCs w:val="18"/>
+        </w:rPr>
+        <w:t xml:space="preserve">Fig 6. </w:t>
+      </w:r>
+      <w:r>
+        <w:rPr>
+          <w:i/>
+          <w:iCs/>
+          <w:sz w:val="18"/>
+          <w:szCs w:val="18"/>
+        </w:rPr>
+        <w:t xml:space="preserve">(a). </w:t>
+      </w:r>
+      <w:r>
+        <w:rPr>
+          <w:i/>
+          <w:iCs/>
+          <w:sz w:val="18"/>
+          <w:szCs w:val="18"/>
+        </w:rPr>
+        <w:t>Propagation of rewards against episodes</w:t>
+      </w:r>
+    </w:p>
+    <w:p>
+      <w:pPr>
+        <w:rPr>
+          <w:i/>
+          <w:iCs/>
+          <w:sz w:val="18"/>
+          <w:szCs w:val="18"/>
+        </w:rPr>
+      </w:pPr>
+      <w:r>
+        <w:rPr>
+          <w:i/>
+          <w:iCs/>
+          <w:sz w:val="18"/>
+          <w:szCs w:val="18"/>
+        </w:rPr>
+        <w:t xml:space="preserve">(b). </w:t>
+      </w:r>
+    </w:p>
+    <w:p>
+      <w:r>
+        <w:drawing>
+          <wp:inline distT="0" distB="0" distL="0" distR="0" wp14:anchorId="4D1A417C" wp14:editId="0F408D84">
+            <wp:extent cx="3075305" cy="958215"/>
+            <wp:effectExtent l="0" t="0" r="0" b="0"/>
+            <wp:docPr id="1756152054" name="Picture 1"/>
+            <wp:cNvGraphicFramePr>
+              <a:graphicFrameLocks xmlns:a="http://schemas.openxmlformats.org/drawingml/2006/main" noChangeAspect="1"/>
+            </wp:cNvGraphicFramePr>
+            <a:graphic xmlns:a="http://schemas.openxmlformats.org/drawingml/2006/main">
+              <a:graphicData uri="http://schemas.openxmlformats.org/drawingml/2006/picture">
+                <pic:pic xmlns:pic="http://schemas.openxmlformats.org/drawingml/2006/picture">
+                  <pic:nvPicPr>
+                    <pic:cNvPr id="1756152054" name=""/>
+                    <pic:cNvPicPr/>
+                  </pic:nvPicPr>
+                  <pic:blipFill>
+                    <a:blip r:embed="rId28"/>
+                    <a:stretch>
+                      <a:fillRect/>
+                    </a:stretch>
+                  </pic:blipFill>
+                  <pic:spPr>
+                    <a:xfrm>
+                      <a:off x="0" y="0"/>
+                      <a:ext cx="3075305" cy="958215"/>
+                    </a:xfrm>
+                    <a:prstGeom prst="rect">
+                      <a:avLst/>
+                    </a:prstGeom>
+                  </pic:spPr>
+                </pic:pic>
+              </a:graphicData>
+            </a:graphic>
+          </wp:inline>
+        </w:drawing>
+      </w:r>
+    </w:p>
+    <w:p>
+      <w:pPr>
+        <w:rPr>
+          <w:i/>
+          <w:iCs/>
+          <w:sz w:val="18"/>
+          <w:szCs w:val="18"/>
+        </w:rPr>
+      </w:pPr>
+      <w:r>
+        <w:rPr>
+          <w:i/>
+          <w:iCs/>
+          <w:sz w:val="18"/>
+          <w:szCs w:val="18"/>
+        </w:rPr>
+        <w:t xml:space="preserve">Fig 7. </w:t>
+      </w:r>
+      <w:r>
+        <w:rPr>
+          <w:i/>
+          <w:iCs/>
+          <w:sz w:val="18"/>
+          <w:szCs w:val="18"/>
+        </w:rPr>
+        <w:t>Propagation of Q-value, Policy entropy and temperature across steps</w:t>
+      </w:r>
+    </w:p>
+    <w:p>
+      <w:pPr>
+        <w:rPr>
+          <w:i/>
+          <w:iCs/>
+          <w:sz w:val="18"/>
+          <w:szCs w:val="18"/>
+        </w:rPr>
+      </w:pPr>
+    </w:p>
+    <w:p>
+      <w:pPr>
+        <w:rPr>
+          <w:i/>
+          <w:iCs/>
+          <w:sz w:val="18"/>
+          <w:szCs w:val="18"/>
+        </w:rPr>
+      </w:pPr>
+    </w:p>
+    <w:p>
+      <w:pPr>
+        <w:pStyle w:val="ListParagraph"/>
+        <w:numPr>
+          <w:ilvl w:val="1"/>
+          <w:numId w:val="17"/>
+        </w:numPr>
+        <w:ind w:left="426"/>
+      </w:pPr>
+      <w:r>
+        <w:t>Economic Optimization</w:t>
+      </w:r>
+    </w:p>
+    <w:p>
+      <w:pPr>
+        <w:ind w:left="-6"/>
+      </w:pPr>
+      <w:r>
+        <w:t>The primary experimental hypothesis</w:t>
+      </w:r>
+      <w:r>
+        <w:t xml:space="preserve">, </w:t>
+      </w:r>
+      <w:r>
+        <w:t>that an RL agent can maximize refinery profit while adhering to rigorous product quality specifications</w:t>
+      </w:r>
+      <w:r>
+        <w:t xml:space="preserve">, </w:t>
+      </w:r>
+      <w:r>
+        <w:t>was supported by the reward trajectory. The reward function, which synthesized revenue from 13 product streams against utility costs and ASTM D95% boiling point penalties, reached a peak cumulative value exceeding +21,000 units in the evaluated episodes</w:t>
+      </w:r>
+      <w:r>
+        <w:t>, even when run for just 500 steps</w:t>
+      </w:r>
+      <w:r>
+        <w:t xml:space="preserve">. </w:t>
+      </w:r>
+      <w:r>
+        <w:t xml:space="preserve">In production scale, with high computation servers available, agent training can go up </w:t>
+      </w:r>
+      <w:r>
+        <w:t>a hundred times</w:t>
+      </w:r>
+      <w:r>
+        <w:t xml:space="preserve">. </w:t>
+      </w:r>
+      <w:r>
+        <w:t xml:space="preserve">This quantitative evidence confirms that the agents learned to prioritize the production of high-value fractions, such as </w:t>
+      </w:r>
+      <w:r>
+        <w:t>Diesel</w:t>
+      </w:r>
+      <w:r>
+        <w:t xml:space="preserve"> and Naphtha, while minimizing the </w:t>
+      </w:r>
+      <w:r>
+        <w:t xml:space="preserve">low value stream yields and involved utilities such as </w:t>
+      </w:r>
+      <w:r>
+        <w:t>reboiler duties and heater fuel consumption.</w:t>
+      </w:r>
+    </w:p>
+    <w:p>
+      <w:pPr>
+        <w:ind w:left="-6"/>
+      </w:pPr>
+      <w:r>
+        <w:t>The Reward vs. Steps visualizations</w:t>
+      </w:r>
+      <w:r>
+        <w:t xml:space="preserve"> as can be seen in Fig </w:t>
+      </w:r>
+      <w:r>
+        <w:t>6</w:t>
+      </w:r>
+      <w:r>
+        <w:t xml:space="preserve"> </w:t>
+      </w:r>
+      <w:r>
+        <w:t>(a).</w:t>
+      </w:r>
+      <w:r>
+        <w:t xml:space="preserve"> demonstrate that the agents successfully learned to navigate quality vs. yield trade-off. Specifically, the frequency of safety and </w:t>
+      </w:r>
+      <w:r>
+        <w:lastRenderedPageBreak/>
+        <w:t xml:space="preserve">specification penalties (ASTM D95% deviations) decreased by approximately 85% from the initial steps to the final steps. This suggests that the model did not merely overfit to a specific feed condition but developed a generalized policy capable of adjusting to the complex thermodynamics of the </w:t>
+      </w:r>
+      <w:r>
+        <w:t>Crude Distillation Unit.</w:t>
+      </w:r>
+    </w:p>
+    <w:p>
+      <w:pPr>
+        <w:ind w:left="-6"/>
+      </w:pPr>
+      <w:r>
+        <w:t xml:space="preserve">The summary of training and evaluation of the Reinforcement learning agents is given in Table 2. </w:t>
+      </w:r>
+    </w:p>
+    <w:p>
+      <w:pPr>
+        <w:ind w:left="-6"/>
+      </w:pPr>
     </w:p>
     <w:tbl>
       <w:tblPr>
         <w:tblStyle w:val="TableGrid"/>
-        <w:tblW w:w="4670" w:type="dxa"/>
+        <w:tblW w:w="0" w:type="auto"/>
+        <w:tblInd w:w="-6" w:type="dxa"/>
         <w:tblLayout w:type="fixed"/>
         <w:tblLook w:val="04A0" w:firstRow="1" w:lastRow="0" w:firstColumn="1" w:lastColumn="0" w:noHBand="0" w:noVBand="1"/>
       </w:tblPr>
       <w:tblGrid>
-        <w:gridCol w:w="934"/>
-        <w:gridCol w:w="934"/>
-        <w:gridCol w:w="934"/>
-        <w:gridCol w:w="934"/>
-        <w:gridCol w:w="934"/>
+        <w:gridCol w:w="568"/>
+        <w:gridCol w:w="709"/>
+        <w:gridCol w:w="851"/>
+        <w:gridCol w:w="793"/>
+        <w:gridCol w:w="679"/>
+        <w:gridCol w:w="639"/>
+        <w:gridCol w:w="600"/>
       </w:tblGrid>
       <w:tr>
-        <w:trPr>
-          <w:trHeight w:val="300"/>
-        </w:trPr>
         <w:tc>
           <w:tcPr>
-            <w:tcW w:w="934" w:type="dxa"/>
+            <w:tcW w:w="568" w:type="dxa"/>
           </w:tcPr>
           <w:p>
             <w:pPr>
-              <w:jc w:val="left"/>
               <w:rPr>
-                <w:rFonts w:asciiTheme="majorBidi" w:eastAsia="Linux Libertine" w:hAnsiTheme="majorBidi" w:cstheme="majorBidi"/>
+                <w:sz w:val="14"/>
+                <w:szCs w:val="14"/>
               </w:rPr>
             </w:pPr>
+            <w:r>
+              <w:rPr>
+                <w:sz w:val="14"/>
+                <w:szCs w:val="14"/>
+              </w:rPr>
+              <w:t>Algo</w:t>
+            </w:r>
+            <w:r>
+              <w:rPr>
+                <w:sz w:val="14"/>
+                <w:szCs w:val="14"/>
+              </w:rPr>
+              <w:t>-</w:t>
+            </w:r>
+            <w:r>
+              <w:rPr>
+                <w:sz w:val="14"/>
+                <w:szCs w:val="14"/>
+              </w:rPr>
+              <w:t>rithm</w:t>
+            </w:r>
           </w:p>
         </w:tc>
         <w:tc>
           <w:tcPr>
-            <w:tcW w:w="934" w:type="dxa"/>
+            <w:tcW w:w="709" w:type="dxa"/>
           </w:tcPr>
           <w:p>
             <w:pPr>
-              <w:jc w:val="left"/>
               <w:rPr>
-                <w:rFonts w:asciiTheme="majorBidi" w:eastAsia="Linux Libertine" w:hAnsiTheme="majorBidi" w:cstheme="majorBidi"/>
+                <w:sz w:val="14"/>
+                <w:szCs w:val="14"/>
               </w:rPr>
             </w:pPr>
+            <w:r>
+              <w:rPr>
+                <w:sz w:val="14"/>
+                <w:szCs w:val="14"/>
+              </w:rPr>
+              <w:t xml:space="preserve">Train </w:t>
+            </w:r>
+          </w:p>
+          <w:p>
+            <w:pPr>
+              <w:rPr>
+                <w:sz w:val="14"/>
+                <w:szCs w:val="14"/>
+              </w:rPr>
+            </w:pPr>
+            <w:r>
+              <w:rPr>
+                <w:sz w:val="14"/>
+                <w:szCs w:val="14"/>
+              </w:rPr>
+              <w:t>Time</w:t>
+            </w:r>
+            <w:r>
+              <w:rPr>
+                <w:sz w:val="14"/>
+                <w:szCs w:val="14"/>
+              </w:rPr>
+              <w:t xml:space="preserve"> (s)</w:t>
+            </w:r>
           </w:p>
         </w:tc>
         <w:tc>
           <w:tcPr>
-            <w:tcW w:w="934" w:type="dxa"/>
+            <w:tcW w:w="851" w:type="dxa"/>
           </w:tcPr>
           <w:p>
             <w:pPr>
-              <w:jc w:val="left"/>
               <w:rPr>
-                <w:rFonts w:asciiTheme="majorBidi" w:eastAsia="Linux Libertine" w:hAnsiTheme="majorBidi" w:cstheme="majorBidi"/>
+                <w:sz w:val="14"/>
+                <w:szCs w:val="14"/>
               </w:rPr>
             </w:pPr>
+            <w:r>
+              <w:rPr>
+                <w:sz w:val="14"/>
+                <w:szCs w:val="14"/>
+              </w:rPr>
+              <w:t>Best rewards</w:t>
+            </w:r>
           </w:p>
         </w:tc>
         <w:tc>
           <w:tcPr>
-            <w:tcW w:w="934" w:type="dxa"/>
+            <w:tcW w:w="793" w:type="dxa"/>
           </w:tcPr>
           <w:p>
             <w:pPr>
-              <w:jc w:val="left"/>
               <w:rPr>
-                <w:rFonts w:asciiTheme="majorBidi" w:eastAsia="Linux Libertine" w:hAnsiTheme="majorBidi" w:cstheme="majorBidi"/>
+                <w:sz w:val="14"/>
+                <w:szCs w:val="14"/>
               </w:rPr>
             </w:pPr>
+            <w:r>
+              <w:rPr>
+                <w:sz w:val="14"/>
+                <w:szCs w:val="14"/>
+              </w:rPr>
+              <w:t>Avg Reward</w:t>
+            </w:r>
+            <w:r>
+              <w:rPr>
+                <w:sz w:val="14"/>
+                <w:szCs w:val="14"/>
+              </w:rPr>
+              <w:t xml:space="preserve"> (100-ep)</w:t>
+            </w:r>
           </w:p>
         </w:tc>
         <w:tc>
           <w:tcPr>
-            <w:tcW w:w="934" w:type="dxa"/>
+            <w:tcW w:w="679" w:type="dxa"/>
           </w:tcPr>
           <w:p>
             <w:pPr>
-              <w:jc w:val="left"/>
               <w:rPr>
-                <w:rFonts w:asciiTheme="majorBidi" w:eastAsia="Linux Libertine" w:hAnsiTheme="majorBidi" w:cstheme="majorBidi"/>
+                <w:sz w:val="14"/>
+                <w:szCs w:val="14"/>
               </w:rPr>
             </w:pPr>
+            <w:r>
+              <w:rPr>
+                <w:sz w:val="14"/>
+                <w:szCs w:val="14"/>
+              </w:rPr>
+              <w:t>Critic Loss</w:t>
+            </w:r>
+          </w:p>
+        </w:tc>
+        <w:tc>
+          <w:tcPr>
+            <w:tcW w:w="639" w:type="dxa"/>
+          </w:tcPr>
+          <w:p>
+            <w:pPr>
+              <w:rPr>
+                <w:sz w:val="14"/>
+                <w:szCs w:val="14"/>
+              </w:rPr>
+            </w:pPr>
+            <w:r>
+              <w:rPr>
+                <w:sz w:val="14"/>
+                <w:szCs w:val="14"/>
+              </w:rPr>
+              <w:t>Actor Loss</w:t>
+            </w:r>
+          </w:p>
+        </w:tc>
+        <w:tc>
+          <w:tcPr>
+            <w:tcW w:w="600" w:type="dxa"/>
+          </w:tcPr>
+          <w:p>
+            <w:pPr>
+              <w:rPr>
+                <w:sz w:val="14"/>
+                <w:szCs w:val="14"/>
+              </w:rPr>
+            </w:pPr>
+            <w:r>
+              <w:rPr>
+                <w:sz w:val="14"/>
+                <w:szCs w:val="14"/>
+              </w:rPr>
+              <w:t>Mean Q-value</w:t>
+            </w:r>
           </w:p>
         </w:tc>
       </w:tr>
       <w:tr>
-        <w:trPr>
-          <w:trHeight w:val="300"/>
-        </w:trPr>
         <w:tc>
           <w:tcPr>
-            <w:tcW w:w="934" w:type="dxa"/>
+            <w:tcW w:w="568" w:type="dxa"/>
           </w:tcPr>
           <w:p>
             <w:pPr>
-              <w:jc w:val="left"/>
               <w:rPr>
-                <w:rFonts w:asciiTheme="majorBidi" w:eastAsia="Linux Libertine" w:hAnsiTheme="majorBidi" w:cstheme="majorBidi"/>
+                <w:sz w:val="14"/>
+                <w:szCs w:val="14"/>
               </w:rPr>
             </w:pPr>
+            <w:r>
+              <w:rPr>
+                <w:sz w:val="14"/>
+                <w:szCs w:val="14"/>
+              </w:rPr>
+              <w:t>SAC</w:t>
+            </w:r>
           </w:p>
         </w:tc>
         <w:tc>
           <w:tcPr>
-            <w:tcW w:w="934" w:type="dxa"/>
+            <w:tcW w:w="709" w:type="dxa"/>
           </w:tcPr>
           <w:p>
             <w:pPr>
-              <w:jc w:val="left"/>
               <w:rPr>
-                <w:rFonts w:asciiTheme="majorBidi" w:eastAsia="Linux Libertine" w:hAnsiTheme="majorBidi" w:cstheme="majorBidi"/>
+                <w:sz w:val="14"/>
+                <w:szCs w:val="14"/>
               </w:rPr>
             </w:pPr>
+            <w:r>
+              <w:rPr>
+                <w:sz w:val="14"/>
+                <w:szCs w:val="14"/>
+              </w:rPr>
+              <w:t>2930.9</w:t>
+            </w:r>
           </w:p>
         </w:tc>
         <w:tc>
           <w:tcPr>
-            <w:tcW w:w="934" w:type="dxa"/>
+            <w:tcW w:w="851" w:type="dxa"/>
           </w:tcPr>
           <w:p>
             <w:pPr>
-              <w:jc w:val="left"/>
               <w:rPr>
-                <w:rFonts w:asciiTheme="majorBidi" w:eastAsia="Linux Libertine" w:hAnsiTheme="majorBidi" w:cstheme="majorBidi"/>
+                <w:sz w:val="14"/>
+                <w:szCs w:val="14"/>
               </w:rPr>
             </w:pPr>
+            <w:r>
+              <w:rPr>
+                <w:sz w:val="14"/>
+                <w:szCs w:val="14"/>
+              </w:rPr>
+              <w:t>23766.93</w:t>
+            </w:r>
           </w:p>
         </w:tc>
         <w:tc>
           <w:tcPr>
-            <w:tcW w:w="934" w:type="dxa"/>
+            <w:tcW w:w="793" w:type="dxa"/>
           </w:tcPr>
           <w:p>
             <w:pPr>
-              <w:jc w:val="left"/>
               <w:rPr>
-                <w:rFonts w:asciiTheme="majorBidi" w:eastAsia="Linux Libertine" w:hAnsiTheme="majorBidi" w:cstheme="majorBidi"/>
+                <w:sz w:val="14"/>
+                <w:szCs w:val="14"/>
               </w:rPr>
             </w:pPr>
+            <w:r>
+              <w:rPr>
+                <w:sz w:val="14"/>
+                <w:szCs w:val="14"/>
+              </w:rPr>
+              <w:t>18635.24</w:t>
+            </w:r>
           </w:p>
         </w:tc>
         <w:tc>
           <w:tcPr>
-            <w:tcW w:w="934" w:type="dxa"/>
+            <w:tcW w:w="679" w:type="dxa"/>
           </w:tcPr>
           <w:p>
             <w:pPr>
-              <w:jc w:val="left"/>
               <w:rPr>
-                <w:rFonts w:asciiTheme="majorBidi" w:eastAsia="Linux Libertine" w:hAnsiTheme="majorBidi" w:cstheme="majorBidi"/>
+                <w:sz w:val="14"/>
+                <w:szCs w:val="14"/>
               </w:rPr>
             </w:pPr>
+            <w:r>
+              <w:rPr>
+                <w:sz w:val="14"/>
+                <w:szCs w:val="14"/>
+              </w:rPr>
+              <w:t>1854.14</w:t>
+            </w:r>
+          </w:p>
+        </w:tc>
+        <w:tc>
+          <w:tcPr>
+            <w:tcW w:w="639" w:type="dxa"/>
+          </w:tcPr>
+          <w:p>
+            <w:pPr>
+              <w:rPr>
+                <w:sz w:val="14"/>
+                <w:szCs w:val="14"/>
+              </w:rPr>
+            </w:pPr>
+            <w:r>
+              <w:rPr>
+                <w:sz w:val="14"/>
+                <w:szCs w:val="14"/>
+              </w:rPr>
+              <w:t>-75</w:t>
+            </w:r>
+            <w:r>
+              <w:rPr>
+                <w:sz w:val="14"/>
+                <w:szCs w:val="14"/>
+              </w:rPr>
+              <w:t>2</w:t>
+            </w:r>
+          </w:p>
+        </w:tc>
+        <w:tc>
+          <w:tcPr>
+            <w:tcW w:w="600" w:type="dxa"/>
+          </w:tcPr>
+          <w:p>
+            <w:pPr>
+              <w:rPr>
+                <w:sz w:val="14"/>
+                <w:szCs w:val="14"/>
+              </w:rPr>
+            </w:pPr>
+            <w:r>
+              <w:rPr>
+                <w:sz w:val="14"/>
+                <w:szCs w:val="14"/>
+              </w:rPr>
+              <w:t>737</w:t>
+            </w:r>
+          </w:p>
+        </w:tc>
+      </w:tr>
+      <w:tr>
+        <w:tc>
+          <w:tcPr>
+            <w:tcW w:w="568" w:type="dxa"/>
+          </w:tcPr>
+          <w:p>
+            <w:pPr>
+              <w:rPr>
+                <w:sz w:val="14"/>
+                <w:szCs w:val="14"/>
+              </w:rPr>
+            </w:pPr>
+            <w:r>
+              <w:rPr>
+                <w:sz w:val="14"/>
+                <w:szCs w:val="14"/>
+              </w:rPr>
+              <w:t>TD3</w:t>
+            </w:r>
+          </w:p>
+        </w:tc>
+        <w:tc>
+          <w:tcPr>
+            <w:tcW w:w="709" w:type="dxa"/>
+          </w:tcPr>
+          <w:p>
+            <w:pPr>
+              <w:rPr>
+                <w:sz w:val="14"/>
+                <w:szCs w:val="14"/>
+              </w:rPr>
+            </w:pPr>
+            <w:r>
+              <w:rPr>
+                <w:sz w:val="14"/>
+                <w:szCs w:val="14"/>
+              </w:rPr>
+              <w:t>2961.4</w:t>
+            </w:r>
+          </w:p>
+        </w:tc>
+        <w:tc>
+          <w:tcPr>
+            <w:tcW w:w="851" w:type="dxa"/>
+          </w:tcPr>
+          <w:p>
+            <w:pPr>
+              <w:rPr>
+                <w:sz w:val="14"/>
+                <w:szCs w:val="14"/>
+              </w:rPr>
+            </w:pPr>
+            <w:r>
+              <w:rPr>
+                <w:sz w:val="14"/>
+                <w:szCs w:val="14"/>
+              </w:rPr>
+              <w:t>22770.69</w:t>
+            </w:r>
+          </w:p>
+        </w:tc>
+        <w:tc>
+          <w:tcPr>
+            <w:tcW w:w="793" w:type="dxa"/>
+          </w:tcPr>
+          <w:p>
+            <w:pPr>
+              <w:rPr>
+                <w:sz w:val="14"/>
+                <w:szCs w:val="14"/>
+              </w:rPr>
+            </w:pPr>
+            <w:r>
+              <w:rPr>
+                <w:sz w:val="14"/>
+                <w:szCs w:val="14"/>
+              </w:rPr>
+              <w:t>21977.93</w:t>
+            </w:r>
+          </w:p>
+        </w:tc>
+        <w:tc>
+          <w:tcPr>
+            <w:tcW w:w="679" w:type="dxa"/>
+          </w:tcPr>
+          <w:p>
+            <w:pPr>
+              <w:rPr>
+                <w:sz w:val="14"/>
+                <w:szCs w:val="14"/>
+              </w:rPr>
+            </w:pPr>
+            <w:r>
+              <w:rPr>
+                <w:sz w:val="14"/>
+                <w:szCs w:val="14"/>
+              </w:rPr>
+              <w:t>852.24</w:t>
+            </w:r>
+          </w:p>
+        </w:tc>
+        <w:tc>
+          <w:tcPr>
+            <w:tcW w:w="639" w:type="dxa"/>
+          </w:tcPr>
+          <w:p>
+            <w:pPr>
+              <w:rPr>
+                <w:sz w:val="14"/>
+                <w:szCs w:val="14"/>
+              </w:rPr>
+            </w:pPr>
+            <w:r>
+              <w:rPr>
+                <w:sz w:val="14"/>
+                <w:szCs w:val="14"/>
+              </w:rPr>
+              <w:t>-557</w:t>
+            </w:r>
+          </w:p>
+        </w:tc>
+        <w:tc>
+          <w:tcPr>
+            <w:tcW w:w="600" w:type="dxa"/>
+          </w:tcPr>
+          <w:p>
+            <w:pPr>
+              <w:rPr>
+                <w:sz w:val="14"/>
+                <w:szCs w:val="14"/>
+              </w:rPr>
+            </w:pPr>
+            <w:r>
+              <w:rPr>
+                <w:sz w:val="14"/>
+                <w:szCs w:val="14"/>
+              </w:rPr>
+              <w:t>541</w:t>
+            </w:r>
+          </w:p>
+        </w:tc>
+      </w:tr>
+      <w:tr>
+        <w:tc>
+          <w:tcPr>
+            <w:tcW w:w="568" w:type="dxa"/>
+          </w:tcPr>
+          <w:p>
+            <w:pPr>
+              <w:rPr>
+                <w:sz w:val="14"/>
+                <w:szCs w:val="14"/>
+              </w:rPr>
+            </w:pPr>
+            <w:r>
+              <w:rPr>
+                <w:sz w:val="14"/>
+                <w:szCs w:val="14"/>
+              </w:rPr>
+              <w:t>PPO</w:t>
+            </w:r>
+          </w:p>
+        </w:tc>
+        <w:tc>
+          <w:tcPr>
+            <w:tcW w:w="709" w:type="dxa"/>
+          </w:tcPr>
+          <w:p>
+            <w:pPr>
+              <w:rPr>
+                <w:sz w:val="14"/>
+                <w:szCs w:val="14"/>
+              </w:rPr>
+            </w:pPr>
+            <w:r>
+              <w:rPr>
+                <w:sz w:val="14"/>
+                <w:szCs w:val="14"/>
+              </w:rPr>
+              <w:t>2154.8</w:t>
+            </w:r>
+          </w:p>
+        </w:tc>
+        <w:tc>
+          <w:tcPr>
+            <w:tcW w:w="851" w:type="dxa"/>
+          </w:tcPr>
+          <w:p>
+            <w:pPr>
+              <w:rPr>
+                <w:sz w:val="14"/>
+                <w:szCs w:val="14"/>
+              </w:rPr>
+            </w:pPr>
+            <w:r>
+              <w:rPr>
+                <w:sz w:val="14"/>
+                <w:szCs w:val="14"/>
+              </w:rPr>
+              <w:t>23402.76</w:t>
+            </w:r>
+          </w:p>
+        </w:tc>
+        <w:tc>
+          <w:tcPr>
+            <w:tcW w:w="793" w:type="dxa"/>
+          </w:tcPr>
+          <w:p>
+            <w:pPr>
+              <w:rPr>
+                <w:sz w:val="14"/>
+                <w:szCs w:val="14"/>
+              </w:rPr>
+            </w:pPr>
+            <w:r>
+              <w:rPr>
+                <w:sz w:val="14"/>
+                <w:szCs w:val="14"/>
+              </w:rPr>
+              <w:t>22592.32</w:t>
+            </w:r>
+          </w:p>
+        </w:tc>
+        <w:tc>
+          <w:tcPr>
+            <w:tcW w:w="679" w:type="dxa"/>
+          </w:tcPr>
+          <w:p>
+            <w:pPr>
+              <w:rPr>
+                <w:sz w:val="14"/>
+                <w:szCs w:val="14"/>
+              </w:rPr>
+            </w:pPr>
+            <w:r>
+              <w:rPr>
+                <w:sz w:val="14"/>
+                <w:szCs w:val="14"/>
+              </w:rPr>
+              <w:t>0</w:t>
+            </w:r>
+          </w:p>
+        </w:tc>
+        <w:tc>
+          <w:tcPr>
+            <w:tcW w:w="639" w:type="dxa"/>
+          </w:tcPr>
+          <w:p>
+            <w:pPr>
+              <w:rPr>
+                <w:sz w:val="14"/>
+                <w:szCs w:val="14"/>
+              </w:rPr>
+            </w:pPr>
+            <w:r>
+              <w:rPr>
+                <w:sz w:val="14"/>
+                <w:szCs w:val="14"/>
+              </w:rPr>
+              <w:t>0</w:t>
+            </w:r>
+          </w:p>
+        </w:tc>
+        <w:tc>
+          <w:tcPr>
+            <w:tcW w:w="600" w:type="dxa"/>
+          </w:tcPr>
+          <w:p>
+            <w:pPr>
+              <w:rPr>
+                <w:sz w:val="14"/>
+                <w:szCs w:val="14"/>
+              </w:rPr>
+            </w:pPr>
+            <w:r>
+              <w:rPr>
+                <w:sz w:val="14"/>
+                <w:szCs w:val="14"/>
+              </w:rPr>
+              <w:t>0</w:t>
+            </w:r>
           </w:p>
         </w:tc>
       </w:tr>
     </w:tbl>
-    <w:p/>
-    <w:p>
-      <w:r>
-        <w:t>A table is often a better alternative to a bulleted list for communicating information that may otherwise seem redundant (e.g. variable details or model hyperparameter choices), or to make information easier to compare across categories (e.g. model performance). If you have a very complex table, think about how you might use bold or italic font to highlight notable cells, such as the best performing model.</w:t>
-      </w:r>
-    </w:p>
-    <w:p>
-      <w:pPr>
-        <w:pStyle w:val="Heading3"/>
-      </w:pPr>
-      <w:r>
-        <w:t>7.3.3</w:t>
-      </w:r>
-      <w:r>
-        <w:tab/>
-        <w:t>Equations</w:t>
-      </w:r>
-    </w:p>
-    <w:p>
-      <w:r>
-        <w:t>Think carefully about whether including an equation is appropriate for your semi-technical stakeholder audience—most of the time that level of detail will be too technical, and equations should either be left out or included in a separate appendix.</w:t>
-      </w:r>
-    </w:p>
-    <w:p>
-      <w:r>
-        <w:t xml:space="preserve">If you decide that you do want to include an equation, they should be on a separate line, indented, and numbered sequentially to the right of the equation. As with figures and tables, equations should be referenced directly in your text with a </w:t>
-      </w:r>
-      <w:r>
-        <w:t xml:space="preserve">short description (e.g. “Equation 7.1 shows the basic linear regression equation, where </w:t>
-      </w:r>
-      <w:r>
+    <w:p>
+      <w:pPr>
+        <w:ind w:left="-6"/>
         <w:rPr>
           <w:i/>
           <w:iCs/>
-        </w:rPr>
-        <w:t>y</w:t>
-      </w:r>
-      <w:r>
-        <w:t xml:space="preserve"> is the target variable, </w:t>
-      </w:r>
+          <w:sz w:val="18"/>
+          <w:szCs w:val="18"/>
+        </w:rPr>
+      </w:pPr>
       <w:r>
         <w:rPr>
           <w:i/>
           <w:iCs/>
-        </w:rPr>
-        <w:t>x</w:t>
-      </w:r>
-      <w:r>
-        <w:t xml:space="preserve"> is the model input, </w:t>
+          <w:sz w:val="18"/>
+          <w:szCs w:val="18"/>
+        </w:rPr>
+        <w:t xml:space="preserve">Table 2. </w:t>
       </w:r>
       <w:r>
         <w:rPr>
           <w:i/>
           <w:iCs/>
-        </w:rPr>
-        <w:t>a</w:t>
-      </w:r>
-      <w:r>
-        <w:t xml:space="preserve"> is the learned coefficent, and </w:t>
-      </w:r>
-      <w:r>
+          <w:sz w:val="18"/>
+          <w:szCs w:val="18"/>
+        </w:rPr>
+        <w:t>Summary of RL agent training and evaluation</w:t>
+      </w:r>
+    </w:p>
+    <w:p>
+      <w:pPr>
+        <w:ind w:left="-6"/>
         <w:rPr>
           <w:i/>
           <w:iCs/>
-        </w:rPr>
-        <w:t>b</w:t>
-      </w:r>
-      <w:r>
-        <w:t xml:space="preserve"> is the model intercept.”) You DO NOT need to include a separate caption for your equations. </w:t>
-      </w:r>
-    </w:p>
-    <w:p>
-      <w:pPr>
-        <w:ind w:left="720" w:firstLine="720"/>
-        <w:rPr>
-          <w:rFonts w:asciiTheme="majorBidi" w:eastAsia="Linux Libertine" w:hAnsiTheme="majorBidi" w:cstheme="majorBidi"/>
-        </w:rPr>
-      </w:pPr>
+          <w:sz w:val="18"/>
+          <w:szCs w:val="18"/>
+        </w:rPr>
+      </w:pPr>
+    </w:p>
+    <w:p>
+      <w:pPr>
+        <w:ind w:left="-6"/>
+      </w:pPr>
+      <w:r>
+        <w:drawing>
+          <wp:inline distT="0" distB="0" distL="0" distR="0" wp14:anchorId="295385A5" wp14:editId="10467152">
+            <wp:extent cx="3075305" cy="958215"/>
+            <wp:effectExtent l="0" t="0" r="0" b="0"/>
+            <wp:docPr id="927526919" name="Picture 1"/>
+            <wp:cNvGraphicFramePr>
+              <a:graphicFrameLocks xmlns:a="http://schemas.openxmlformats.org/drawingml/2006/main" noChangeAspect="1"/>
+            </wp:cNvGraphicFramePr>
+            <a:graphic xmlns:a="http://schemas.openxmlformats.org/drawingml/2006/main">
+              <a:graphicData uri="http://schemas.openxmlformats.org/drawingml/2006/picture">
+                <pic:pic xmlns:pic="http://schemas.openxmlformats.org/drawingml/2006/picture">
+                  <pic:nvPicPr>
+                    <pic:cNvPr id="927526919" name=""/>
+                    <pic:cNvPicPr/>
+                  </pic:nvPicPr>
+                  <pic:blipFill>
+                    <a:blip r:embed="rId29"/>
+                    <a:stretch>
+                      <a:fillRect/>
+                    </a:stretch>
+                  </pic:blipFill>
+                  <pic:spPr>
+                    <a:xfrm>
+                      <a:off x="0" y="0"/>
+                      <a:ext cx="3075305" cy="958215"/>
+                    </a:xfrm>
+                    <a:prstGeom prst="rect">
+                      <a:avLst/>
+                    </a:prstGeom>
+                  </pic:spPr>
+                </pic:pic>
+              </a:graphicData>
+            </a:graphic>
+          </wp:inline>
+        </w:drawing>
+      </w:r>
+    </w:p>
+    <w:p>
+      <w:pPr>
+        <w:ind w:left="-6"/>
+        <w:rPr>
+          <w:i/>
+          <w:iCs/>
+          <w:sz w:val="18"/>
+          <w:szCs w:val="18"/>
+        </w:rPr>
+      </w:pPr>
+      <w:r>
+        <w:rPr>
+          <w:i/>
+          <w:iCs/>
+          <w:sz w:val="18"/>
+          <w:szCs w:val="18"/>
+        </w:rPr>
+        <w:t xml:space="preserve">Fig 8. </w:t>
+      </w:r>
+      <w:r>
+        <w:rPr>
+          <w:i/>
+          <w:iCs/>
+          <w:sz w:val="18"/>
+          <w:szCs w:val="18"/>
+        </w:rPr>
+        <w:t>Key metric comparison between RL agents</w:t>
+      </w:r>
+    </w:p>
+    <w:p>
+      <w:pPr>
+        <w:ind w:left="-6"/>
+        <w:rPr>
+          <w:i/>
+          <w:iCs/>
+          <w:sz w:val="18"/>
+          <w:szCs w:val="18"/>
+        </w:rPr>
+      </w:pPr>
+    </w:p>
+    <w:p>
+      <w:r>
+        <w:t xml:space="preserve">A comparative benchmarking of the three candidate algorithms revealed that Proximal Policy Optimization (PPO) emerged as the most effective and computationally efficient architecture for this specific multi-unit flowsheet. PPO achieved the highest average reward of 22,592.33 while maintaining the lowest training latency at 2,154.8 seconds, effectively outperforming the off-policy alternatives in both speed and consistency. While Soft Actor-Critic (SAC) recorded the highest individual peak reward of 23,766.93, its increased computational overhead—evidenced by the highest critic gradient norm (14,645.34)—suggests a higher sensitivity to the stochastic nature of the complex thermo-chemical environment. Twin </w:t>
+      </w:r>
+      <w:r>
+        <w:t>Delayed Deep Deterministic Policy Gradient (TD3) demonstrated competitive stability with an average reward of 21,977.93 and significantly lower critic loss than SAC (852.25 vs. 1,854.15), confirming the effectiveness of its twin-critic architecture in mitigating Q-value overestimation bias (Fujimoto et al., 2018).</w:t>
+      </w:r>
+      <w:r>
+        <w:t xml:space="preserve"> </w:t>
+      </w:r>
+      <w:r>
+        <w:t xml:space="preserve">To validate the real-world applicability of the trained policies, a 50-step inference trial was conducted using the champion PPO model. The trial resulted in a total episode reward of 22,903.46, with the final five steps exhibiting a monotonic increase in stepwise rewards (averaging 473.17 per step). </w:t>
+      </w:r>
+      <w:r>
+        <w:t>A further g</w:t>
+      </w:r>
+      <w:r>
+        <w:t xml:space="preserve">ranular analysis of the action distribution during inference shows that the agent implemented fine-grained, incremental setpoint adjustments—such as precise variations in the Atmospheric Reboiler temperature (+0.02) and Vacuum Gas Oil (VGO) draw temperature (-0.007). These subtle corrections drive the process toward an economically optimal steady state without inducing the thermal instability or cycling often observed in traditional manual control.  </w:t>
+      </w:r>
+      <w:r>
+        <w:t>C</w:t>
+      </w:r>
+      <w:r>
+        <w:t>onvergence toward high-margin operation, while maintaining near-zero variance in the final steps, provides robust evidence that the agent has learned a generalized control law for the integrated distillation sequence (Schulman et al., 2017).</w:t>
+      </w:r>
+    </w:p>
+    <w:p/>
+    <w:p>
+      <w:r>
+        <w:drawing>
+          <wp:inline distT="0" distB="0" distL="0" distR="0" wp14:anchorId="4B058206" wp14:editId="1D099DB2">
+            <wp:extent cx="3075305" cy="1095375"/>
+            <wp:effectExtent l="0" t="0" r="0" b="9525"/>
+            <wp:docPr id="271469715" name="Picture 1"/>
+            <wp:cNvGraphicFramePr>
+              <a:graphicFrameLocks xmlns:a="http://schemas.openxmlformats.org/drawingml/2006/main" noChangeAspect="1"/>
+            </wp:cNvGraphicFramePr>
+            <a:graphic xmlns:a="http://schemas.openxmlformats.org/drawingml/2006/main">
+              <a:graphicData uri="http://schemas.openxmlformats.org/drawingml/2006/picture">
+                <pic:pic xmlns:pic="http://schemas.openxmlformats.org/drawingml/2006/picture">
+                  <pic:nvPicPr>
+                    <pic:cNvPr id="271469715" name=""/>
+                    <pic:cNvPicPr/>
+                  </pic:nvPicPr>
+                  <pic:blipFill>
+                    <a:blip r:embed="rId30"/>
+                    <a:stretch>
+                      <a:fillRect/>
+                    </a:stretch>
+                  </pic:blipFill>
+                  <pic:spPr>
+                    <a:xfrm>
+                      <a:off x="0" y="0"/>
+                      <a:ext cx="3075305" cy="1095375"/>
+                    </a:xfrm>
+                    <a:prstGeom prst="rect">
+                      <a:avLst/>
+                    </a:prstGeom>
+                  </pic:spPr>
+                </pic:pic>
+              </a:graphicData>
+            </a:graphic>
+          </wp:inline>
+        </w:drawing>
+      </w:r>
+    </w:p>
+    <w:p>
+      <w:pPr>
+        <w:rPr>
+          <w:i/>
+          <w:iCs/>
+          <w:sz w:val="18"/>
+          <w:szCs w:val="18"/>
+        </w:rPr>
+      </w:pPr>
+      <w:r>
+        <w:rPr>
+          <w:i/>
+          <w:iCs/>
+          <w:sz w:val="18"/>
+          <w:szCs w:val="18"/>
+        </w:rPr>
+        <w:t xml:space="preserve">Fig 9. </w:t>
+      </w:r>
+      <w:r>
+        <w:rPr>
+          <w:i/>
+          <w:iCs/>
+          <w:sz w:val="18"/>
+          <w:szCs w:val="18"/>
+        </w:rPr>
+        <w:t>Propagation of rewards and action during agent inference</w:t>
+      </w:r>
+    </w:p>
+    <w:p>
+      <w:pPr>
+        <w:rPr>
+          <w:i/>
+          <w:iCs/>
+          <w:sz w:val="18"/>
+          <w:szCs w:val="18"/>
+        </w:rPr>
+      </w:pPr>
+    </w:p>
+    <w:p>
+      <w:pPr>
+        <w:pStyle w:val="ListParagraph"/>
+        <w:numPr>
+          <w:ilvl w:val="1"/>
+          <w:numId w:val="17"/>
+        </w:numPr>
+        <w:ind w:left="426"/>
+        <w:rPr>
+          <w:i/>
+          <w:iCs/>
+        </w:rPr>
+      </w:pPr>
+      <w:r>
+        <w:rPr>
+          <w:i/>
+          <w:iCs/>
+        </w:rPr>
+        <w:t>AI Agent</w:t>
+      </w:r>
+      <w:r>
+        <w:rPr>
+          <w:i/>
+          <w:iCs/>
+        </w:rPr>
+        <w:t xml:space="preserve"> Implementation</w:t>
+      </w:r>
+    </w:p>
+    <w:p>
+      <w:r>
+        <w:t xml:space="preserve">The integration of reinforcement learning (RL) agents </w:t>
+      </w:r>
+      <w:r>
+        <w:t>and</w:t>
+      </w:r>
+      <w:r>
+        <w:t xml:space="preserve"> orchestrator </w:t>
+      </w:r>
+      <w:r>
+        <w:t xml:space="preserve">could drive </w:t>
+      </w:r>
+      <w:r>
+        <w:t xml:space="preserve">a significant </w:t>
+      </w:r>
+      <w:r>
+        <w:lastRenderedPageBreak/>
+        <w:t xml:space="preserve">advancement in the operational transparency of automated refinery systems. While traditional deep reinforcement learning models effectively optimize a high-dimensional reward function, they typically lack the interpretability required </w:t>
+      </w:r>
+      <w:r>
+        <w:t xml:space="preserve">by the end-user </w:t>
+      </w:r>
+      <w:r>
+        <w:t>for high-stakes industrial deployment. The hybrid framework addresses this trust gap by introducing a cognitive layer of specialized AI personas—Process Engineer, Corrosion Expert, and Daily Report Developer—that translate numerical setpoints into human-readable engineering narratives.</w:t>
+      </w:r>
+    </w:p>
+    <w:p>
+      <w:r>
+        <w:t xml:space="preserve">The Process Engineer Agent provides a critical value-add by performing cross-column sensitivity analyses that exceed the scope of standard RL reward functions. </w:t>
+      </w:r>
+      <w:r>
+        <w:t>D</w:t>
+      </w:r>
+      <w:r>
+        <w:t>uring testing, the agent analyzed the transition of the reflux ratio from 5.0 to 7.0, identifying that while purity improved for the Heavy</w:t>
+      </w:r>
+      <w:r>
+        <w:t xml:space="preserve"> N</w:t>
+      </w:r>
+      <w:r>
+        <w:t>aphtha fraction, the associated 20% increase in furnace duty would offset revenue gains</w:t>
+      </w:r>
+      <w:r>
+        <w:t>.</w:t>
+      </w:r>
+      <w:r>
+        <w:t xml:space="preserve"> Furthermore, the Corrosion Expert Agent introduces domain-specific safety oversight for the ADU overhead system, utilizing chemical grounding to monitor water dew points and</w:t>
+      </w:r>
+      <w:r>
+        <w:t xml:space="preserve"> </w:t>
+      </w:r>
       <m:oMath>
         <m:r>
           <w:rPr>
             <w:rFonts w:ascii="Cambria Math" w:hAnsi="Cambria Math"/>
           </w:rPr>
-          <m:t>y=ax+b</m:t>
+          <m:t>N</m:t>
+        </m:r>
+        <m:sSub>
+          <m:sSubPr>
+            <m:ctrlPr>
+              <w:rPr>
+                <w:rFonts w:ascii="Cambria Math" w:hAnsi="Cambria Math"/>
+                <w:i/>
+              </w:rPr>
+            </m:ctrlPr>
+          </m:sSubPr>
+          <m:e>
+            <m:r>
+              <w:rPr>
+                <w:rFonts w:ascii="Cambria Math" w:hAnsi="Cambria Math"/>
+              </w:rPr>
+              <m:t>H</m:t>
+            </m:r>
+          </m:e>
+          <m:sub>
+            <m:r>
+              <w:rPr>
+                <w:rFonts w:ascii="Cambria Math" w:hAnsi="Cambria Math"/>
+              </w:rPr>
+              <m:t>4</m:t>
+            </m:r>
+          </m:sub>
+        </m:sSub>
+        <m:r>
+          <w:rPr>
+            <w:rFonts w:ascii="Cambria Math" w:hAnsi="Cambria Math"/>
+          </w:rPr>
+          <m:t>Cl</m:t>
         </m:r>
       </m:oMath>
       <w:r>
-        <w:tab/>
-      </w:r>
-      <w:r>
-        <w:tab/>
-      </w:r>
-      <w:r>
-        <w:tab/>
-        <w:t>(7.1)</w:t>
-      </w:r>
-    </w:p>
-    <w:p>
-      <w:r>
-        <w:t>As with tables, if you have a favorite tool for formatting your equations, feel free to include the formatted equation as an image, as long as it matches the formatting shown in the example above.</w:t>
-      </w:r>
-    </w:p>
-    <w:p>
-      <w:pPr>
-        <w:pStyle w:val="Heading2"/>
-      </w:pPr>
-      <w:r>
-        <w:t>7.4</w:t>
-      </w:r>
-      <w:r>
-        <w:tab/>
-        <w:t>Works Cited</w:t>
-      </w:r>
-    </w:p>
-    <w:p>
-      <w:r>
-        <w:t xml:space="preserve">References should be alphabetically ordered using APA 7 formatting. You can refer to the </w:t>
-      </w:r>
-      <w:hyperlink r:id="rId27">
-        <w:r>
-          <w:rPr>
-            <w:rStyle w:val="Hyperlink"/>
-          </w:rPr>
-          <w:t>APA guidelines</w:t>
-        </w:r>
-      </w:hyperlink>
-      <w:r>
-        <w:t xml:space="preserve"> on how to format citations from different types of sources. There are also online tools that can be used to create citations for you, though these will occasionally produce errors, so be sure to double check these. If you are citing an academic paper, the Google Scholar listing for the paper will also have a properly formatted APA citation that you can copy into your report. Several example citations are shown in the works cited included in this template.</w:t>
-      </w:r>
-    </w:p>
-    <w:p>
-      <w:pPr>
-        <w:pStyle w:val="Heading2"/>
-      </w:pPr>
-      <w:r>
-        <w:t>7.5</w:t>
-      </w:r>
-      <w:r>
-        <w:tab/>
-        <w:t>Appendices</w:t>
-      </w:r>
-    </w:p>
-    <w:p>
-      <w:r>
-        <w:t>Appendices can be used to include information that you feel is important to the communication of your project but may be too technical or too detailed for the intended semi-technical stakeholder audience. This may include items like a detailed description of data transformations, feature engineering, or architectural choices, or complete results over a hyperparameter grid search or a series of experimental architectures.</w:t>
-      </w:r>
-    </w:p>
-    <w:p>
-      <w:r>
-        <w:t xml:space="preserve">Appendices are not included in the page count but should not be used to get around the report page limits. Information included in the appendices </w:t>
-      </w:r>
-      <w:r>
-        <w:lastRenderedPageBreak/>
-        <w:t>should not be necessary for a basic understanding of your project and should instead provide deeper detail for an interested reader. You can assume that your stakeholder audience would not read most of the content in an appendix, and as such, your appendix content may not contribute to your final report grade.</w:t>
-      </w:r>
-    </w:p>
-    <w:p>
-      <w:r>
-        <w:t>Appendices should be labeled alphabetically (Appendix A, Appendix B, etc.) and should be referred to directly in your text (e.g. “A complete table of results over all hyperparameters can be found in Appendix A”). Each appendix should start on a new page and does not need to be in the two-column format if full page width makes more sense for your content (e.g. detailed figures or large tables).</w:t>
+        <w:t xml:space="preserve"> salt deposition—variables that are often difficult to characterize within a purely numerical RL state vector. By recommending against excessive neutralizing amine injection during high-temperature excursions, this persona prevents chemical wastage and potential equipment fouling that the RL agent might otherwise ignore in favor of short-term yield.</w:t>
+      </w:r>
+    </w:p>
+    <w:p>
+      <w:r>
+        <w:t xml:space="preserve">To ensure the reliability of these narrative outputs, the system utilizes a Deterministic Numeric Module that grounds agent reasoning in physical reality. This module performs independent mass-balance, profit, and ASTM D95% compliance checks in Python code before the context is passed to the LLM. This multi-layered architecture—combining the autonomous optimization of </w:t>
+      </w:r>
+      <w:r>
+        <w:t>Proximal Policy Optimization (PPO) with the deterministic grounding of mass-balance closures and the linguistic reasoning of specialized agents—ensures that the final recommendations are both economically optimal and physically verified. Consequently, the user experience for refinery operators is transformed from monitoring a black-box to interacting with a collaborative system that provides validated, explainable, and safe industrial actions.</w:t>
       </w:r>
     </w:p>
     <w:p>
       <w:pPr>
         <w:pStyle w:val="Heading1"/>
         <w:rPr>
-          <w:rFonts w:asciiTheme="majorBidi" w:eastAsia="Linux Libertine" w:hAnsiTheme="majorBidi"/>
+          <w:rFonts w:asciiTheme="majorBidi" w:hAnsiTheme="majorBidi"/>
           <w:sz w:val="24"/>
           <w:szCs w:val="24"/>
         </w:rPr>
       </w:pPr>
       <w:r>
-        <w:t>ACKNOWLEDGMENTS</w:t>
+        <w:t>6</w:t>
+      </w:r>
+      <w:r>
+        <w:tab/>
+        <w:t>Conclusion</w:t>
       </w:r>
     </w:p>
     <w:p>
       <w:pPr>
         <w:spacing w:before="20"/>
         <w:rPr>
-          <w:rFonts w:asciiTheme="majorBidi" w:eastAsia="Linux Libertine" w:hAnsiTheme="majorBidi" w:cstheme="majorBidi"/>
-        </w:rPr>
-      </w:pPr>
-      <w:r>
-        <w:rPr>
-          <w:rFonts w:eastAsia="Linux Libertine" w:cstheme="majorBidi"/>
-        </w:rPr>
-        <w:t>These are optional, but might mention any external contributors to your project, such as professors or mentors who provided data or consultation.</w:t>
+          <w:rFonts w:cstheme="majorBidi"/>
+        </w:rPr>
+      </w:pPr>
+      <w:r>
+        <w:rPr>
+          <w:rFonts w:cstheme="majorBidi"/>
+        </w:rPr>
+        <w:t>The study aimed</w:t>
+      </w:r>
+      <w:r>
+        <w:rPr>
+          <w:rFonts w:cstheme="majorBidi"/>
+        </w:rPr>
+        <w:t xml:space="preserve"> to develop a hybrid framework that combines Deep Reinforcement Learning (DRL) with multi-agent systems to optimize a complex three-column distillation sequence (ADU, NSU, and VDU)</w:t>
+      </w:r>
+      <w:r>
+        <w:rPr>
+          <w:rFonts w:cstheme="majorBidi"/>
+        </w:rPr>
+        <w:t xml:space="preserve"> commonly seen in Crude Distillation Units</w:t>
+      </w:r>
+      <w:r>
+        <w:rPr>
+          <w:rFonts w:cstheme="majorBidi"/>
+        </w:rPr>
+        <w:t>. The central hypothesis—that a model-free RL agent could maximize the refinery profit while strictly adhering to 13 distinct product quality specifications</w:t>
+      </w:r>
+      <w:r>
+        <w:rPr>
+          <w:rFonts w:cstheme="majorBidi"/>
+        </w:rPr>
+        <w:t xml:space="preserve">, </w:t>
+      </w:r>
+      <w:r>
+        <w:rPr>
+          <w:rFonts w:cstheme="majorBidi"/>
+        </w:rPr>
+        <w:t>was validated through comprehensive benchmarking.</w:t>
+      </w:r>
+      <w:r>
+        <w:rPr>
+          <w:rFonts w:cstheme="majorBidi"/>
+        </w:rPr>
+        <w:t xml:space="preserve"> </w:t>
+      </w:r>
+      <w:r>
+        <w:rPr>
+          <w:rFonts w:cstheme="majorBidi"/>
+        </w:rPr>
+        <w:t>The results demonstrated that the Proximal Policy Optimization (PPO) agent was the most effective architecture, achieving a superior average reward of 22,592.33 and exhibiting greater training stability compared to SAC and TD3. Th</w:t>
+      </w:r>
+      <w:r>
+        <w:rPr>
+          <w:rFonts w:cstheme="majorBidi"/>
+        </w:rPr>
+        <w:t>e results</w:t>
+      </w:r>
+      <w:r>
+        <w:rPr>
+          <w:rFonts w:cstheme="majorBidi"/>
+        </w:rPr>
+        <w:t xml:space="preserve"> confirm that D</w:t>
+      </w:r>
+      <w:r>
+        <w:rPr>
+          <w:rFonts w:cstheme="majorBidi"/>
+        </w:rPr>
+        <w:t xml:space="preserve">eep </w:t>
+      </w:r>
+      <w:r>
+        <w:rPr>
+          <w:rFonts w:cstheme="majorBidi"/>
+        </w:rPr>
+        <w:t>RL can effectively navigate the high-dimensional, non-linear thermodynamics of refinery operations to discover more profitable operating windows than traditional control methods (Shin et al., 2019).</w:t>
+      </w:r>
+    </w:p>
+    <w:p>
+      <w:pPr>
+        <w:spacing w:before="20"/>
+        <w:rPr>
+          <w:rFonts w:cstheme="majorBidi"/>
+        </w:rPr>
+      </w:pPr>
+      <w:r>
+        <w:rPr>
+          <w:rFonts w:cstheme="majorBidi"/>
+        </w:rPr>
+        <w:t>An additional</w:t>
+      </w:r>
+      <w:r>
+        <w:rPr>
+          <w:rFonts w:cstheme="majorBidi"/>
+        </w:rPr>
+        <w:t xml:space="preserve"> significant contribution of this </w:t>
+      </w:r>
+      <w:r>
+        <w:rPr>
+          <w:rFonts w:cstheme="majorBidi"/>
+        </w:rPr>
+        <w:t>study</w:t>
+      </w:r>
+      <w:r>
+        <w:rPr>
+          <w:rFonts w:cstheme="majorBidi"/>
+        </w:rPr>
+        <w:t xml:space="preserve"> is the successful implementation of an Explainable AI (XAI) Orchestrator</w:t>
+      </w:r>
+      <w:r>
+        <w:rPr>
+          <w:rFonts w:cstheme="majorBidi"/>
+        </w:rPr>
+        <w:t xml:space="preserve"> on top of Deep RL agent</w:t>
+      </w:r>
+      <w:r>
+        <w:rPr>
+          <w:rFonts w:cstheme="majorBidi"/>
+        </w:rPr>
+        <w:t xml:space="preserve">. By utilizing specialized </w:t>
+      </w:r>
+      <w:r>
+        <w:rPr>
+          <w:rFonts w:cstheme="majorBidi"/>
+        </w:rPr>
+        <w:t xml:space="preserve">AI </w:t>
+      </w:r>
+      <w:r>
+        <w:rPr>
+          <w:rFonts w:cstheme="majorBidi"/>
+        </w:rPr>
+        <w:t xml:space="preserve">agents (Process Engineer, Corrosion Expert, and Daily Report Developer), the system successfully bridged the trust gap by translating </w:t>
+      </w:r>
+      <w:r>
+        <w:rPr>
+          <w:rFonts w:cstheme="majorBidi"/>
+        </w:rPr>
+        <w:t>high</w:t>
+      </w:r>
+      <w:r>
+        <w:rPr>
+          <w:rFonts w:cstheme="majorBidi"/>
+        </w:rPr>
+        <w:t xml:space="preserve">-dimensional numerical setpoints into rigorous engineering </w:t>
+      </w:r>
+      <w:r>
+        <w:rPr>
+          <w:rFonts w:cstheme="majorBidi"/>
+        </w:rPr>
+        <w:lastRenderedPageBreak/>
+        <w:t xml:space="preserve">rationales. An unexpected result was the performance of the PPO algorithm; despite SAC’s theoretical advantage in exploration through maximum entropy, PPO’s clipped objective function proved more resilient to the </w:t>
+      </w:r>
+      <w:r>
+        <w:rPr>
+          <w:rFonts w:cstheme="majorBidi"/>
+        </w:rPr>
+        <w:t>‘</w:t>
+      </w:r>
+      <w:r>
+        <w:rPr>
+          <w:rFonts w:cstheme="majorBidi"/>
+        </w:rPr>
+        <w:t>noise</w:t>
+      </w:r>
+      <w:r>
+        <w:rPr>
+          <w:rFonts w:cstheme="majorBidi"/>
+        </w:rPr>
+        <w:t>’</w:t>
+      </w:r>
+      <w:r>
+        <w:rPr>
+          <w:rFonts w:cstheme="majorBidi"/>
+        </w:rPr>
+        <w:t xml:space="preserve"> and convergence sensitivities of the DWSIM simulator, leading to faster training times and more consistent steady-state policies (Schulman et al., 2017).</w:t>
+      </w:r>
+      <w:r>
+        <w:rPr>
+          <w:rFonts w:cstheme="majorBidi"/>
+        </w:rPr>
+        <w:t xml:space="preserve"> However, for the purpose of the study with limited computation, the model training was executed for only 500 steps. Results may differ if training is </w:t>
+      </w:r>
+      <w:r>
+        <w:rPr>
+          <w:rFonts w:cstheme="majorBidi"/>
+        </w:rPr>
+        <w:t>run</w:t>
+      </w:r>
+      <w:r>
+        <w:rPr>
+          <w:rFonts w:cstheme="majorBidi"/>
+        </w:rPr>
+        <w:t xml:space="preserve"> for significantly higher iterations. </w:t>
+      </w:r>
+    </w:p>
+    <w:p>
+      <w:pPr>
+        <w:spacing w:before="20"/>
+        <w:rPr>
+          <w:rFonts w:cstheme="majorBidi"/>
+        </w:rPr>
+      </w:pPr>
+      <w:r>
+        <w:rPr>
+          <w:rFonts w:cstheme="majorBidi"/>
+        </w:rPr>
+        <w:t>To transition this framework from a simulated environment to an industrial production setting, several key steps must be taken. Future research should focus on:</w:t>
+      </w:r>
+    </w:p>
+    <w:p>
+      <w:pPr>
+        <w:spacing w:before="20"/>
+        <w:rPr>
+          <w:rFonts w:cstheme="majorBidi"/>
+        </w:rPr>
+      </w:pPr>
+      <w:r>
+        <w:rPr>
+          <w:rFonts w:cstheme="majorBidi"/>
+          <w:i/>
+          <w:iCs/>
+        </w:rPr>
+        <w:t>Dynamic Transient Control</w:t>
+      </w:r>
+      <w:r>
+        <w:rPr>
+          <w:rFonts w:cstheme="majorBidi"/>
+        </w:rPr>
+        <w:t>: Moving beyond steady-state optimization to handle high-frequency transients and disturbances in feed composition.</w:t>
+      </w:r>
+    </w:p>
+    <w:p>
+      <w:pPr>
+        <w:spacing w:before="20"/>
+        <w:rPr>
+          <w:rFonts w:cstheme="majorBidi"/>
+        </w:rPr>
+      </w:pPr>
+      <w:r>
+        <w:rPr>
+          <w:rFonts w:cstheme="majorBidi"/>
+          <w:i/>
+          <w:iCs/>
+        </w:rPr>
+        <w:t>Edge-Case Robustness</w:t>
+      </w:r>
+      <w:r>
+        <w:rPr>
+          <w:rFonts w:cstheme="majorBidi"/>
+        </w:rPr>
+        <w:t xml:space="preserve">: Expanding the </w:t>
+      </w:r>
+      <w:r>
+        <w:rPr>
+          <w:rFonts w:cstheme="majorBidi"/>
+        </w:rPr>
+        <w:t>‘</w:t>
+      </w:r>
+      <w:r>
+        <w:rPr>
+          <w:rFonts w:cstheme="majorBidi"/>
+        </w:rPr>
+        <w:t>Deterministic Sanity Check</w:t>
+      </w:r>
+      <w:r>
+        <w:rPr>
+          <w:rFonts w:cstheme="majorBidi"/>
+        </w:rPr>
+        <w:t>’</w:t>
+      </w:r>
+      <w:r>
+        <w:rPr>
+          <w:rFonts w:cstheme="majorBidi"/>
+        </w:rPr>
+        <w:t xml:space="preserve"> layer into a comprehensive safety-constrained RL framework to ensure zero-violation of equipment limits during exploration.</w:t>
+      </w:r>
+    </w:p>
+    <w:p>
+      <w:pPr>
+        <w:spacing w:before="20"/>
+        <w:rPr>
+          <w:rFonts w:cstheme="majorBidi"/>
+        </w:rPr>
+      </w:pPr>
+      <w:r>
+        <w:rPr>
+          <w:rFonts w:cstheme="majorBidi"/>
+          <w:i/>
+          <w:iCs/>
+        </w:rPr>
+        <w:t>Computational Latency</w:t>
+      </w:r>
+      <w:r>
+        <w:rPr>
+          <w:rFonts w:cstheme="majorBidi"/>
+        </w:rPr>
+        <w:t xml:space="preserve">: </w:t>
+      </w:r>
+      <w:r>
+        <w:rPr>
+          <w:rFonts w:cstheme="majorBidi"/>
+        </w:rPr>
+        <w:t xml:space="preserve">To put the framework into Production, it is preferred to </w:t>
+      </w:r>
+      <w:r>
+        <w:rPr>
+          <w:rFonts w:cstheme="majorBidi"/>
+        </w:rPr>
+        <w:t>develop reduced-order models (ROMs) or surrogate neural simulators to replace the high-latency DWSIM calls, enabling real-time inference (Hubbs et al., 2020).</w:t>
+      </w:r>
+    </w:p>
+    <w:p>
+      <w:pPr>
+        <w:spacing w:before="20"/>
+        <w:rPr>
+          <w:rFonts w:cstheme="majorBidi"/>
+        </w:rPr>
+      </w:pPr>
+      <w:r>
+        <w:rPr>
+          <w:rFonts w:cstheme="majorBidi"/>
+          <w:i/>
+          <w:iCs/>
+        </w:rPr>
+        <w:t>Expanded Agent Personas</w:t>
+      </w:r>
+      <w:r>
+        <w:rPr>
+          <w:rFonts w:cstheme="majorBidi"/>
+        </w:rPr>
+        <w:t xml:space="preserve">: Integrating additional personas, such as a </w:t>
+      </w:r>
+      <w:r>
+        <w:rPr>
+          <w:rFonts w:cstheme="majorBidi"/>
+        </w:rPr>
+        <w:t>‘</w:t>
+      </w:r>
+      <w:r>
+        <w:rPr>
+          <w:rFonts w:cstheme="majorBidi"/>
+        </w:rPr>
+        <w:t>Utility Manager</w:t>
+      </w:r>
+      <w:r>
+        <w:rPr>
+          <w:rFonts w:cstheme="majorBidi"/>
+        </w:rPr>
+        <w:t>’</w:t>
+      </w:r>
+      <w:r>
+        <w:rPr>
+          <w:rFonts w:cstheme="majorBidi"/>
+        </w:rPr>
+        <w:t xml:space="preserve"> for carbon footprint tracking or a </w:t>
+      </w:r>
+      <w:r>
+        <w:rPr>
+          <w:rFonts w:cstheme="majorBidi"/>
+        </w:rPr>
+        <w:t>‘</w:t>
+      </w:r>
+      <w:r>
+        <w:rPr>
+          <w:rFonts w:cstheme="majorBidi"/>
+        </w:rPr>
+        <w:t>Market Analyst</w:t>
+      </w:r>
+      <w:r>
+        <w:rPr>
+          <w:rFonts w:cstheme="majorBidi"/>
+        </w:rPr>
+        <w:t>’</w:t>
+      </w:r>
+      <w:r>
+        <w:rPr>
+          <w:rFonts w:cstheme="majorBidi"/>
+        </w:rPr>
+        <w:t xml:space="preserve"> to provide real-time crude-oil pricing updates directly into the agent’s reasoning loop.</w:t>
+      </w:r>
+    </w:p>
+    <w:p>
+      <w:pPr>
+        <w:spacing w:before="20"/>
+        <w:rPr>
+          <w:rFonts w:cstheme="majorBidi"/>
+        </w:rPr>
+      </w:pPr>
+      <w:r>
+        <w:rPr>
+          <w:rFonts w:cstheme="majorBidi"/>
+        </w:rPr>
+        <w:t>To sum up</w:t>
+      </w:r>
+      <w:r>
+        <w:rPr>
+          <w:rFonts w:cstheme="majorBidi"/>
+        </w:rPr>
+        <w:t xml:space="preserve">, this </w:t>
+      </w:r>
+      <w:r>
+        <w:rPr>
+          <w:rFonts w:cstheme="majorBidi"/>
+        </w:rPr>
+        <w:t>study</w:t>
+      </w:r>
+      <w:r>
+        <w:rPr>
+          <w:rFonts w:cstheme="majorBidi"/>
+        </w:rPr>
+        <w:t xml:space="preserve"> provides a scalable blueprint for Cognitive Process Control, where the raw optimization power of R</w:t>
+      </w:r>
+      <w:r>
+        <w:rPr>
+          <w:rFonts w:cstheme="majorBidi"/>
+        </w:rPr>
+        <w:t xml:space="preserve">einforcement </w:t>
+      </w:r>
+      <w:r>
+        <w:rPr>
+          <w:rFonts w:cstheme="majorBidi"/>
+        </w:rPr>
+        <w:t>L</w:t>
+      </w:r>
+      <w:r>
+        <w:rPr>
+          <w:rFonts w:cstheme="majorBidi"/>
+        </w:rPr>
+        <w:t>earning</w:t>
+      </w:r>
+      <w:r>
+        <w:rPr>
+          <w:rFonts w:cstheme="majorBidi"/>
+        </w:rPr>
+        <w:t xml:space="preserve"> </w:t>
+      </w:r>
+      <w:r>
+        <w:rPr>
+          <w:rFonts w:cstheme="majorBidi"/>
+        </w:rPr>
+        <w:t>coupled with</w:t>
+      </w:r>
+      <w:r>
+        <w:rPr>
+          <w:rFonts w:cstheme="majorBidi"/>
+        </w:rPr>
+        <w:t xml:space="preserve"> the specialized reasoning capabilities of Multi-</w:t>
+      </w:r>
+      <w:r>
+        <w:rPr>
+          <w:rFonts w:cstheme="majorBidi"/>
+        </w:rPr>
+        <w:t>a</w:t>
+      </w:r>
+      <w:r>
+        <w:rPr>
+          <w:rFonts w:cstheme="majorBidi"/>
+        </w:rPr>
+        <w:t>gent AI systems</w:t>
+      </w:r>
+      <w:r>
+        <w:rPr>
+          <w:rFonts w:cstheme="majorBidi"/>
+        </w:rPr>
+        <w:t xml:space="preserve">, is used for process </w:t>
+      </w:r>
+      <w:r>
+        <w:rPr>
+          <w:rFonts w:cstheme="majorBidi"/>
+        </w:rPr>
+        <w:t>optimization of Process Digital Twin built in DWSim.</w:t>
       </w:r>
     </w:p>
     <w:p>
@@ -7591,7 +9788,7 @@
         </w:rPr>
         <w:t xml:space="preserve">(1), 20425–20432. </w:t>
       </w:r>
-      <w:hyperlink r:id="rId28" w:tgtFrame="_blank" w:history="1">
+      <w:hyperlink r:id="rId31" w:tgtFrame="_blank" w:history="1">
         <w:r>
           <w:rPr>
             <w:rStyle w:val="Hyperlink"/>
@@ -7649,7 +9846,7 @@
         </w:rPr>
         <w:t xml:space="preserve">(1), 301–311. </w:t>
       </w:r>
-      <w:hyperlink r:id="rId29" w:tgtFrame="_blank" w:history="1">
+      <w:hyperlink r:id="rId32" w:tgtFrame="_blank" w:history="1">
         <w:r>
           <w:rPr>
             <w:rStyle w:val="Hyperlink"/>
@@ -7674,7 +9871,7 @@
         </w:rPr>
         <w:t xml:space="preserve">Bengio, Y., Louradour, J., Collobert, R., &amp; Weston, J. (2009). Curriculum learning. Proceedings of the 26th Annual International Conference on Machine Learning, 41–48. </w:t>
       </w:r>
-      <w:hyperlink r:id="rId30" w:history="1">
+      <w:hyperlink r:id="rId33" w:history="1">
         <w:r>
           <w:rPr>
             <w:rStyle w:val="Hyperlink"/>
@@ -7713,7 +9910,7 @@
         </w:rPr>
         <w:t xml:space="preserve">Bran, A. M., Cox, S., Edwards, O., Diggans, C., Schwaller, P., &amp; White, A. D. (2024). ChemCrow: Augmenting large-language models with chemistry tools. Nature Machine Intelligence, 6(6), 525–535. </w:t>
       </w:r>
-      <w:hyperlink r:id="rId31" w:history="1">
+      <w:hyperlink r:id="rId34" w:history="1">
         <w:r>
           <w:rPr>
             <w:rStyle w:val="Hyperlink"/>
@@ -7735,7 +9932,14 @@
         <w:rPr>
           <w:rFonts w:eastAsia="Linux Libertine" w:cstheme="majorBidi"/>
         </w:rPr>
-        <w:t>Brockman, G., Cheung, V., Pettersson, L., Schneider, J., Schulman, J., Tang, J., &amp; Zaremba, W. (2016). OpenAI Gym. arXiv. https://doi.org/10.48550/arXiv.1606.01540</w:t>
+        <w:t xml:space="preserve">Brockman, G., Cheung, V., Pettersson, L., Schneider, J., Schulman, J., Tang, J., &amp; </w:t>
+      </w:r>
+      <w:r>
+        <w:rPr>
+          <w:rFonts w:eastAsia="Linux Libertine" w:cstheme="majorBidi"/>
+        </w:rPr>
+        <w:lastRenderedPageBreak/>
+        <w:t>Zaremba, W. (2016). OpenAI Gym. arXiv. https://doi.org/10.48550/arXiv.1606.01540</w:t>
       </w:r>
     </w:p>
     <w:p>
@@ -7767,7 +9971,7 @@
         </w:rPr>
         <w:t xml:space="preserve">Engell, S. (2007). Feedback control for optimal process operation. Journal of Process Control, 17(3), 203–219. </w:t>
       </w:r>
-      <w:hyperlink r:id="rId32" w:history="1">
+      <w:hyperlink r:id="rId35" w:history="1">
         <w:r>
           <w:rPr>
             <w:rStyle w:val="Hyperlink"/>
@@ -7796,7 +10000,7 @@
       <w:r>
         <w:t xml:space="preserve">. </w:t>
       </w:r>
-      <w:hyperlink r:id="rId33" w:tgtFrame="_blank" w:history="1">
+      <w:hyperlink r:id="rId36" w:tgtFrame="_blank" w:history="1">
         <w:r>
           <w:rPr>
             <w:rStyle w:val="Hyperlink"/>
@@ -7851,7 +10055,6 @@
           <w:rFonts w:eastAsia="Linux Libertine" w:cstheme="majorBidi"/>
           <w:lang w:val="en-IN"/>
         </w:rPr>
-        <w:lastRenderedPageBreak/>
         <w:t xml:space="preserve">González-Durán, R., Rodríguez-Prieto, A., Camacho, A. M., Peña-Ballesteros, D. Y., &amp; Serna, A. (2024). Experimental assessment of corrosion properties for materials intended for heavy crude processing. </w:t>
       </w:r>
       <w:r>
@@ -7886,7 +10089,7 @@
         </w:rPr>
         <w:t xml:space="preserve">(21), 5275. </w:t>
       </w:r>
-      <w:hyperlink r:id="rId34" w:tgtFrame="_blank" w:history="1">
+      <w:hyperlink r:id="rId37" w:tgtFrame="_blank" w:history="1">
         <w:r>
           <w:rPr>
             <w:rStyle w:val="Hyperlink"/>
@@ -7928,7 +10131,7 @@
         </w:rPr>
         <w:t xml:space="preserve">Hubbs, C. P., Li, C., Sahinidis, N. V., Grossmann, I. E., &amp; John, J. M. (2020). A deep reinforcement learning approach for chemical production scheduling. Computers &amp; Chemical Engineering, 141, 106982. </w:t>
       </w:r>
-      <w:hyperlink r:id="rId35" w:history="1">
+      <w:hyperlink r:id="rId38" w:history="1">
         <w:r>
           <w:rPr>
             <w:rStyle w:val="Hyperlink"/>
@@ -7970,7 +10173,7 @@
         </w:rPr>
         <w:t xml:space="preserve">. </w:t>
       </w:r>
-      <w:hyperlink r:id="rId36" w:tgtFrame="_blank" w:history="1">
+      <w:hyperlink r:id="rId39" w:tgtFrame="_blank" w:history="1">
         <w:r>
           <w:rPr>
             <w:rStyle w:val="Hyperlink"/>
@@ -8107,7 +10310,14 @@
         <w:rPr>
           <w:rFonts w:eastAsia="Linux Libertine" w:cstheme="majorBidi"/>
         </w:rPr>
-        <w:t>Spielberg, S., Tulsyan, A., Lawrence, N. P., Loewen, P. D., &amp; Bhushan Gopaluni, R. (2019). Toward deep reinforcement learning for process control: A review. Computers &amp; Chemical Engineering, 132, 106602.</w:t>
+        <w:t xml:space="preserve">Spielberg, S., Tulsyan, A., Lawrence, N. P., Loewen, P. D., &amp; Bhushan Gopaluni, R. (2019). </w:t>
+      </w:r>
+      <w:r>
+        <w:rPr>
+          <w:rFonts w:eastAsia="Linux Libertine" w:cstheme="majorBidi"/>
+        </w:rPr>
+        <w:lastRenderedPageBreak/>
+        <w:t>Toward deep reinforcement learning for process control: A review. Computers &amp; Chemical Engineering, 132, 106602.</w:t>
       </w:r>
     </w:p>
     <w:p>
@@ -8158,7 +10368,7 @@
         </w:rPr>
         <w:t xml:space="preserve">(10), e16733. </w:t>
       </w:r>
-      <w:hyperlink r:id="rId37" w:tgtFrame="_blank" w:history="1">
+      <w:hyperlink r:id="rId40" w:tgtFrame="_blank" w:history="1">
         <w:r>
           <w:rPr>
             <w:rStyle w:val="Hyperlink"/>
@@ -8230,14 +10440,7 @@
         <w:rPr>
           <w:rFonts w:eastAsia="Linux Libertine" w:cstheme="majorBidi"/>
         </w:rPr>
-        <w:t xml:space="preserve">Venkatasubramanian, V. (2019). The promise of artificial intelligence in chemical engineering: </w:t>
-      </w:r>
-      <w:r>
-        <w:rPr>
-          <w:rFonts w:eastAsia="Linux Libertine" w:cstheme="majorBidi"/>
-        </w:rPr>
-        <w:lastRenderedPageBreak/>
-        <w:t>Is it here, finally?. AIChE Journal, 65(2), 466-478.</w:t>
+        <w:t>Venkatasubramanian, V. (2019). The promise of artificial intelligence in chemical engineering: Is it here, finally?. AIChE Journal, 65(2), 466-478.</w:t>
       </w:r>
     </w:p>
     <w:p>
@@ -8288,7 +10491,7 @@
         </w:rPr>
         <w:t xml:space="preserve">, Article 11733140. </w:t>
       </w:r>
-      <w:hyperlink r:id="rId38" w:tgtFrame="_blank" w:history="1">
+      <w:hyperlink r:id="rId41" w:tgtFrame="_blank" w:history="1">
         <w:r>
           <w:rPr>
             <w:rStyle w:val="Hyperlink"/>
@@ -8302,29 +10505,10 @@
     <w:p>
       <w:pPr>
         <w:spacing w:before="200" w:after="40" w:line="240" w:lineRule="auto"/>
-        <w:ind w:left="300" w:hanging="300"/>
-        <w:rPr>
-          <w:rFonts w:eastAsia="Linux Libertine" w:cstheme="majorBidi"/>
-          <w:lang w:val="en-IN"/>
-        </w:rPr>
-      </w:pPr>
-    </w:p>
-    <w:p>
-      <w:pPr>
-        <w:spacing w:before="200" w:after="40" w:line="240" w:lineRule="auto"/>
-        <w:ind w:left="300" w:hanging="300"/>
-        <w:rPr>
-          <w:rFonts w:eastAsia="Linux Libertine" w:cstheme="majorBidi"/>
-        </w:rPr>
-      </w:pPr>
-    </w:p>
-    <w:p>
-      <w:pPr>
-        <w:spacing w:before="200" w:after="40" w:line="240" w:lineRule="auto"/>
       </w:pPr>
     </w:p>
     <w:sectPr>
-      <w:footerReference w:type="even" r:id="rId39"/>
+      <w:footerReference w:type="even" r:id="rId42"/>
       <w:type w:val="continuous"/>
       <w:pgSz w:w="12240" w:h="15840"/>
       <w:pgMar w:top="1500" w:right="1080" w:bottom="1276" w:left="993" w:header="1080" w:footer="1080" w:gutter="0"/>
@@ -10554,6 +12738,121 @@
     </w:lvl>
   </w:abstractNum>
   <w:abstractNum w:abstractNumId="14" w15:restartNumberingAfterBreak="0">
+    <w:nsid w:val="65263EC0"/>
+    <w:multiLevelType w:val="multilevel"/>
+    <w:tmpl w:val="04E2C146"/>
+    <w:lvl w:ilvl="0">
+      <w:start w:val="4"/>
+      <w:numFmt w:val="decimal"/>
+      <w:lvlText w:val="%1."/>
+      <w:lvlJc w:val="left"/>
+      <w:pPr>
+        <w:ind w:left="360" w:hanging="360"/>
+      </w:pPr>
+      <w:rPr>
+        <w:rFonts w:hint="default"/>
+      </w:rPr>
+    </w:lvl>
+    <w:lvl w:ilvl="1">
+      <w:start w:val="1"/>
+      <w:numFmt w:val="decimal"/>
+      <w:lvlText w:val="%1.%2."/>
+      <w:lvlJc w:val="left"/>
+      <w:pPr>
+        <w:ind w:left="792" w:hanging="432"/>
+      </w:pPr>
+      <w:rPr>
+        <w:rFonts w:hint="default"/>
+        <w:i/>
+        <w:iCs/>
+      </w:rPr>
+    </w:lvl>
+    <w:lvl w:ilvl="2">
+      <w:start w:val="1"/>
+      <w:numFmt w:val="decimal"/>
+      <w:lvlText w:val="%1.%2.%3."/>
+      <w:lvlJc w:val="left"/>
+      <w:pPr>
+        <w:ind w:left="1224" w:hanging="504"/>
+      </w:pPr>
+      <w:rPr>
+        <w:rFonts w:hint="default"/>
+      </w:rPr>
+    </w:lvl>
+    <w:lvl w:ilvl="3">
+      <w:start w:val="1"/>
+      <w:numFmt w:val="decimal"/>
+      <w:lvlText w:val="%1.%2.%3.%4."/>
+      <w:lvlJc w:val="left"/>
+      <w:pPr>
+        <w:ind w:left="1728" w:hanging="648"/>
+      </w:pPr>
+      <w:rPr>
+        <w:rFonts w:hint="default"/>
+      </w:rPr>
+    </w:lvl>
+    <w:lvl w:ilvl="4">
+      <w:start w:val="1"/>
+      <w:numFmt w:val="decimal"/>
+      <w:lvlText w:val="%1.%2.%3.%4.%5."/>
+      <w:lvlJc w:val="left"/>
+      <w:pPr>
+        <w:ind w:left="2232" w:hanging="792"/>
+      </w:pPr>
+      <w:rPr>
+        <w:rFonts w:hint="default"/>
+      </w:rPr>
+    </w:lvl>
+    <w:lvl w:ilvl="5">
+      <w:start w:val="1"/>
+      <w:numFmt w:val="decimal"/>
+      <w:lvlText w:val="%1.%2.%3.%4.%5.%6."/>
+      <w:lvlJc w:val="left"/>
+      <w:pPr>
+        <w:ind w:left="2736" w:hanging="936"/>
+      </w:pPr>
+      <w:rPr>
+        <w:rFonts w:hint="default"/>
+      </w:rPr>
+    </w:lvl>
+    <w:lvl w:ilvl="6">
+      <w:start w:val="1"/>
+      <w:numFmt w:val="decimal"/>
+      <w:lvlText w:val="%1.%2.%3.%4.%5.%6.%7."/>
+      <w:lvlJc w:val="left"/>
+      <w:pPr>
+        <w:ind w:left="3240" w:hanging="1080"/>
+      </w:pPr>
+      <w:rPr>
+        <w:rFonts w:hint="default"/>
+      </w:rPr>
+    </w:lvl>
+    <w:lvl w:ilvl="7">
+      <w:start w:val="1"/>
+      <w:numFmt w:val="decimal"/>
+      <w:lvlText w:val="%1.%2.%3.%4.%5.%6.%7.%8."/>
+      <w:lvlJc w:val="left"/>
+      <w:pPr>
+        <w:ind w:left="3744" w:hanging="1224"/>
+      </w:pPr>
+      <w:rPr>
+        <w:rFonts w:hint="default"/>
+      </w:rPr>
+    </w:lvl>
+    <w:lvl w:ilvl="8">
+      <w:start w:val="1"/>
+      <w:numFmt w:val="decimal"/>
+      <w:lvlText w:val="%1.%2.%3.%4.%5.%6.%7.%8.%9."/>
+      <w:lvlJc w:val="left"/>
+      <w:pPr>
+        <w:ind w:left="4320" w:hanging="1440"/>
+      </w:pPr>
+      <w:rPr>
+        <w:rFonts w:hint="default"/>
+      </w:rPr>
+    </w:lvl>
+  </w:abstractNum>
+  <w:abstractNum w:abstractNumId="15" w15:restartNumberingAfterBreak="0">
     <w:nsid w:val="69E12466"/>
     <w:multiLevelType w:val="multilevel"/>
     <w:tmpl w:val="4009001F"/>
@@ -10639,7 +12938,7 @@
       </w:pPr>
     </w:lvl>
   </w:abstractNum>
-  <w:abstractNum w:abstractNumId="15" w15:restartNumberingAfterBreak="0">
+  <w:abstractNum w:abstractNumId="16" w15:restartNumberingAfterBreak="0">
     <w:nsid w:val="79952714"/>
     <w:multiLevelType w:val="multilevel"/>
     <w:tmpl w:val="C5C21DA6"/>
@@ -10786,7 +13085,7 @@
     <w:abstractNumId w:val="3"/>
   </w:num>
   <w:num w:numId="3" w16cid:durableId="1492942228">
-    <w:abstractNumId w:val="15"/>
+    <w:abstractNumId w:val="16"/>
   </w:num>
   <w:num w:numId="4" w16cid:durableId="517429286">
     <w:abstractNumId w:val="5"/>
@@ -10819,13 +13118,16 @@
     <w:abstractNumId w:val="9"/>
   </w:num>
   <w:num w:numId="14" w16cid:durableId="1192760907">
-    <w:abstractNumId w:val="14"/>
+    <w:abstractNumId w:val="15"/>
   </w:num>
   <w:num w:numId="15" w16cid:durableId="290132603">
     <w:abstractNumId w:val="4"/>
   </w:num>
   <w:num w:numId="16" w16cid:durableId="1738898441">
     <w:abstractNumId w:val="0"/>
+  </w:num>
+  <w:num w:numId="17" w16cid:durableId="1611740292">
+    <w:abstractNumId w:val="14"/>
   </w:num>
 </w:numbering>
 </file>
@@ -11447,7 +13749,6 @@
   <w:style w:type="character" w:default="1" w:styleId="DefaultParagraphFont">
     <w:name w:val="Default Paragraph Font"/>
     <w:uiPriority w:val="1"/>
-    <w:semiHidden/>
     <w:unhideWhenUsed/>
   </w:style>
   <w:style w:type="table" w:default="1" w:styleId="TableNormal">

</xml_diff>

<commit_message>
Updated notebooks, and readme
</commit_message>
<xml_diff>
--- a/Report/AAI590 Capstone Project Report.docx
+++ b/Report/AAI590 Capstone Project Report.docx
@@ -7240,6 +7240,9 @@
         <w:ind w:left="-6"/>
       </w:pPr>
       <w:r>
+        <w:rPr>
+          <w:noProof/>
+        </w:rPr>
         <w:drawing>
           <wp:inline distT="0" distB="0" distL="0" distR="0" wp14:anchorId="22FFB63F" wp14:editId="13610887">
             <wp:extent cx="3075305" cy="1936750"/>
@@ -7307,6 +7310,9 @@
         <w:ind w:left="-6"/>
       </w:pPr>
       <w:r>
+        <w:rPr>
+          <w:noProof/>
+        </w:rPr>
         <w:drawing>
           <wp:inline distT="0" distB="0" distL="0" distR="0" wp14:anchorId="7C2C2F5B" wp14:editId="027A103B">
             <wp:extent cx="3075305" cy="1816735"/>
@@ -7349,6 +7355,9 @@
         <w:ind w:left="-6"/>
       </w:pPr>
       <w:r>
+        <w:rPr>
+          <w:noProof/>
+        </w:rPr>
         <w:drawing>
           <wp:inline distT="0" distB="0" distL="0" distR="0" wp14:anchorId="0C1C6976" wp14:editId="335EE46E">
             <wp:extent cx="3075305" cy="1526540"/>
@@ -7872,6 +7881,9 @@
     <w:p/>
     <w:p>
       <w:r>
+        <w:rPr>
+          <w:noProof/>
+        </w:rPr>
         <w:drawing>
           <wp:inline distT="0" distB="0" distL="0" distR="0" wp14:anchorId="237E9283" wp14:editId="47C1236F">
             <wp:extent cx="3075305" cy="1022350"/>
@@ -7911,6 +7923,9 @@
     </w:p>
     <w:p>
       <w:r>
+        <w:rPr>
+          <w:noProof/>
+        </w:rPr>
         <w:drawing>
           <wp:inline distT="0" distB="0" distL="0" distR="0" wp14:anchorId="6D3B69F9" wp14:editId="5C947BC2">
             <wp:extent cx="3075305" cy="941070"/>
@@ -8003,9 +8018,30 @@
         </w:rPr>
         <w:t xml:space="preserve">(b). </w:t>
       </w:r>
-    </w:p>
-    <w:p>
-      <w:r>
+      <w:r>
+        <w:rPr>
+          <w:i/>
+          <w:iCs/>
+          <w:sz w:val="18"/>
+          <w:szCs w:val="18"/>
+        </w:rPr>
+        <w:t>Loss curves</w:t>
+      </w:r>
+      <w:r>
+        <w:rPr>
+          <w:i/>
+          <w:iCs/>
+          <w:sz w:val="18"/>
+          <w:szCs w:val="18"/>
+        </w:rPr>
+        <w:t xml:space="preserve"> for actor and critic in SAC and TD3 training</w:t>
+      </w:r>
+    </w:p>
+    <w:p>
+      <w:r>
+        <w:rPr>
+          <w:noProof/>
+        </w:rPr>
         <w:drawing>
           <wp:inline distT="0" distB="0" distL="0" distR="0" wp14:anchorId="4D1A417C" wp14:editId="0F408D84">
             <wp:extent cx="3075305" cy="958215"/>
@@ -8878,6 +8914,9 @@
         <w:ind w:left="-6"/>
       </w:pPr>
       <w:r>
+        <w:rPr>
+          <w:noProof/>
+        </w:rPr>
         <w:drawing>
           <wp:inline distT="0" distB="0" distL="0" distR="0" wp14:anchorId="295385A5" wp14:editId="10467152">
             <wp:extent cx="3075305" cy="958215"/>
@@ -8984,6 +9023,9 @@
     <w:p/>
     <w:p>
       <w:r>
+        <w:rPr>
+          <w:noProof/>
+        </w:rPr>
         <w:drawing>
           <wp:inline distT="0" distB="0" distL="0" distR="0" wp14:anchorId="4B058206" wp14:editId="1D099DB2">
             <wp:extent cx="3075305" cy="1095375"/>
@@ -13749,6 +13791,7 @@
   <w:style w:type="character" w:default="1" w:styleId="DefaultParagraphFont">
     <w:name w:val="Default Paragraph Font"/>
     <w:uiPriority w:val="1"/>
+    <w:semiHidden/>
     <w:unhideWhenUsed/>
   </w:style>
   <w:style w:type="table" w:default="1" w:styleId="TableNormal">

</xml_diff>